<commit_message>
Archive des niveaux d'alerte du 2026-10-23
</commit_message>
<xml_diff>
--- a/web/rapports/GRSCI/2026-10.docx
+++ b/web/rapports/GRSCI/2026-10.docx
@@ -217,7 +217,7 @@
           <w:szCs w:val="40"/>
           <w:rFonts w:ascii="Calibri" w:cs="Calibri" w:eastAsia="Calibri" w:hAnsi="Calibri"/>
         </w:rPr>
-        <w:t xml:space="preserve">21 OCTOBRE 2026</w:t>
+        <w:t xml:space="preserve">23 OCTOBRE 2026</w:t>
       </w:r>
     </w:p>
     <w:p>
@@ -410,7 +410,7 @@
                 <w:szCs w:val="20"/>
                 <w:rFonts w:ascii="Calibri" w:cs="Calibri" w:eastAsia="Calibri" w:hAnsi="Calibri"/>
               </w:rPr>
-              <w:t xml:space="preserve">POLITIQUE</w:t>
+              <w:t xml:space="preserve">SÉCURITÉ</w:t>
             </w:r>
           </w:p>
           <w:p>
@@ -433,23 +433,7 @@
                 <w:szCs w:val="18"/>
                 <w:rFonts w:ascii="Calibri" w:cs="Calibri" w:eastAsia="Calibri" w:hAnsi="Calibri"/>
               </w:rPr>
-              <w:t xml:space="preserve">CÔTE D’IVOIRE: DOUZE PERSONNES INCULPÉES DANS L'AFFAIRE DE L'ASSASSINAT D'UN GEND…</w:t>
-            </w:r>
-          </w:p>
-          <w:p>
-            <w:pPr>
-              <w:spacing w:before="100"/>
-            </w:pPr>
-            <w:r>
-              <w:rPr>
-                <w:b/>
-                <w:bCs/>
-                <w:color w:val="1F6B5E"/>
-                <w:sz w:val="20"/>
-                <w:szCs w:val="20"/>
-                <w:rFonts w:ascii="Calibri" w:cs="Calibri" w:eastAsia="Calibri" w:hAnsi="Calibri"/>
-              </w:rPr>
-              <w:t xml:space="preserve">SOCIAL</w:t>
+              <w:t xml:space="preserve">AGRO-INDUSTRIE/BRUNO KONÉ - « LA TRANSFORMATION NE SE FERA PAS SANS LES ACTEURS D…</w:t>
             </w:r>
           </w:p>
           <w:p>
@@ -472,7 +456,7 @@
                 <w:szCs w:val="18"/>
                 <w:rFonts w:ascii="Calibri" w:cs="Calibri" w:eastAsia="Calibri" w:hAnsi="Calibri"/>
               </w:rPr>
-              <w:t xml:space="preserve">DALOA : LES COMMERÇANTES MANIFESTENT CONTRE LA HAUSSE DU PRIX DU POISSON, LE PRÉF…</w:t>
+              <w:t xml:space="preserve">AUDIENCE ATTENDUE SUR L'ÉLECTION DE TIDJANE THIAM À LA TÊTE DU PARTI D'OPPOSITION…</w:t>
             </w:r>
           </w:p>
         </w:tc>
@@ -541,7 +525,7 @@
                 <w:szCs w:val="18"/>
                 <w:rFonts w:ascii="Calibri" w:cs="Calibri" w:eastAsia="Calibri" w:hAnsi="Calibri"/>
               </w:rPr>
-              <w:t xml:space="preserve">LE BURKINA FASO RÉTABLIT LA PEINE DE MORT, ABOLIE EN 2018 !</w:t>
+              <w:t xml:space="preserve">LE PAYS RÉTABLIT LA PEINE DE MORT</w:t>
             </w:r>
           </w:p>
           <w:p>
@@ -580,7 +564,7 @@
                 <w:szCs w:val="18"/>
                 <w:rFonts w:ascii="Calibri" w:cs="Calibri" w:eastAsia="Calibri" w:hAnsi="Calibri"/>
               </w:rPr>
-              <w:t xml:space="preserve">MASSACRE IN MALI: ISLAMIC STATE MILITANTS KILL AT LEAST 48 CIVILIANS IN MÉNAKA</w:t>
+              <w:t xml:space="preserve">GRÈVE JUGÉE HORS-CADRE À KOLOKANI : L’ADMINISTRATION SCOLAIRE FIXE UN ULTIMATUM A…</w:t>
             </w:r>
           </w:p>
           <w:p>
@@ -619,7 +603,7 @@
                 <w:szCs w:val="18"/>
                 <w:rFonts w:ascii="Calibri" w:cs="Calibri" w:eastAsia="Calibri" w:hAnsi="Calibri"/>
               </w:rPr>
-              <w:t xml:space="preserve">DIFFA : VND/NUR, DES RIVES DU LAC TCHAD À L’ACTION HUMANITAIRE, LA RÉSILIENCE, LA…</w:t>
+              <w:t xml:space="preserve">SWISS AND AUSTRIAN WOMEN IN LIBYA AFTER RELEASE FROM NIGER KIDNAP ORDEAL</w:t>
             </w:r>
           </w:p>
           <w:p>
@@ -658,7 +642,7 @@
                 <w:szCs w:val="18"/>
                 <w:rFonts w:ascii="Calibri" w:cs="Calibri" w:eastAsia="Calibri" w:hAnsi="Calibri"/>
               </w:rPr>
-              <w:t xml:space="preserve">GOVERNANCE BY PROTEST, REGULATION BY SILENCE: INSIDE THE MANUFACTURED WATER CRISIS</w:t>
+              <w:t xml:space="preserve">KPANDAI: ONE REPORTEDLY KILLED IN KUMDI FARMLAND DISPUTE</w:t>
             </w:r>
           </w:p>
           <w:p>
@@ -697,7 +681,7 @@
                 <w:szCs w:val="18"/>
                 <w:rFonts w:ascii="Calibri" w:cs="Calibri" w:eastAsia="Calibri" w:hAnsi="Calibri"/>
               </w:rPr>
-              <w:t xml:space="preserve">KLOTO : L’UE ET LE LUXEMBOURG AUX CÔTÉS DU TOGO POUR LA CONSTRUCTION DU SIÈGE DE …</w:t>
+              <w:t xml:space="preserve">TOGO- 31, 7 MILLIARDS FCFA POUR DÉSENCLAVER LES SAVANES : DES TRAVAUX ABANDONNÉS …</w:t>
             </w:r>
           </w:p>
           <w:p>
@@ -718,6 +702,29 @@
           </w:p>
           <w:p>
             <w:pPr>
+              <w:ind w:left="240"/>
+            </w:pPr>
+            <w:r>
+              <w:rPr>
+                <w:color w:val="1F2937"/>
+                <w:sz w:val="18"/>
+                <w:szCs w:val="18"/>
+                <w:rFonts w:ascii="Calibri" w:cs="Calibri" w:eastAsia="Calibri" w:hAnsi="Calibri"/>
+              </w:rPr>
+              <w:t xml:space="preserve">❑  </w:t>
+            </w:r>
+            <w:r>
+              <w:rPr>
+                <w:color w:val="1F2937"/>
+                <w:sz w:val="18"/>
+                <w:szCs w:val="18"/>
+                <w:rFonts w:ascii="Calibri" w:cs="Calibri" w:eastAsia="Calibri" w:hAnsi="Calibri"/>
+              </w:rPr>
+              <w:t xml:space="preserve">PORT DE COTONOU : L’ENLÈVEMENT DES MARCHANDISES DÉSORMAIS POSSIBLE LES WEEK-ENDS</w:t>
+            </w:r>
+          </w:p>
+          <w:p>
+            <w:pPr>
               <w:spacing w:before="100"/>
             </w:pPr>
             <w:r>
@@ -752,7 +759,7 @@
                 <w:szCs w:val="18"/>
                 <w:rFonts w:ascii="Calibri" w:cs="Calibri" w:eastAsia="Calibri" w:hAnsi="Calibri"/>
               </w:rPr>
-              <w:t xml:space="preserve">GUINÉE : LA HAC S’ATTAQUE À LA PROLIFÉRATION ILLÉGALE DES WEB TV</w:t>
+              <w:t xml:space="preserve">KINDIA : UNE DISPUTE AUTOUR D’UN SUPPOSÉ RIVAL VIRE AU MEURTRE, LE SUSPECT RACONTE</w:t>
             </w:r>
           </w:p>
           <w:p>
@@ -773,6 +780,29 @@
           </w:p>
           <w:p>
             <w:pPr>
+              <w:ind w:left="240"/>
+            </w:pPr>
+            <w:r>
+              <w:rPr>
+                <w:color w:val="1F2937"/>
+                <w:sz w:val="18"/>
+                <w:szCs w:val="18"/>
+                <w:rFonts w:ascii="Calibri" w:cs="Calibri" w:eastAsia="Calibri" w:hAnsi="Calibri"/>
+              </w:rPr>
+              <w:t xml:space="preserve">❑  </w:t>
+            </w:r>
+            <w:r>
+              <w:rPr>
+                <w:color w:val="1F2937"/>
+                <w:sz w:val="18"/>
+                <w:szCs w:val="18"/>
+                <w:rFonts w:ascii="Calibri" w:cs="Calibri" w:eastAsia="Calibri" w:hAnsi="Calibri"/>
+              </w:rPr>
+              <w:t xml:space="preserve">LIBERIA: WAR VICTIMS, SURVIVORS PROTEST AT COURT OFFICE, CAPITOL AS HOUSE CHAIRMA…</w:t>
+            </w:r>
+          </w:p>
+          <w:p>
+            <w:pPr>
               <w:spacing w:before="100"/>
             </w:pPr>
             <w:r>
@@ -807,7 +837,7 @@
                 <w:szCs w:val="18"/>
                 <w:rFonts w:ascii="Calibri" w:cs="Calibri" w:eastAsia="Calibri" w:hAnsi="Calibri"/>
               </w:rPr>
-              <w:t xml:space="preserve">8 MILLIONS VOLÉS ET ATTAQUE À LA MACHETTE : DEUX BRAQUEURS DU POINT WAVE DE DAHRA…</w:t>
+              <w:t xml:space="preserve">MAMADOU GUÈYE ANCIEN DIRECTEUR DES DOMAINES RESTE LIBRE : COUP D'ARRÊT DE LA COUR…</w:t>
             </w:r>
           </w:p>
         </w:tc>
@@ -970,7 +1000,7 @@
                 <w:szCs w:val="44"/>
                 <w:rFonts w:ascii="Arial Narrow" w:cs="Arial Narrow" w:eastAsia="Arial Narrow" w:hAnsi="Arial Narrow"/>
               </w:rPr>
-              <w:t xml:space="preserve">I</w:t>
+              <w:t xml:space="preserve">III</w:t>
             </w:r>
           </w:p>
         </w:tc>
@@ -997,7 +1027,7 @@
                 <w:szCs w:val="56"/>
                 <w:rFonts w:ascii="Arial Narrow" w:cs="Arial Narrow" w:eastAsia="Arial Narrow" w:hAnsi="Arial Narrow"/>
               </w:rPr>
-              <w:t xml:space="preserve">- POLITIQUE</w:t>
+              <w:t xml:space="preserve">- SÉCURITÉ</w:t>
             </w:r>
           </w:p>
         </w:tc>
@@ -1144,7 +1174,7 @@
           <w:szCs w:val="28"/>
           <w:rFonts w:ascii="Calibri" w:cs="Calibri" w:eastAsia="Calibri" w:hAnsi="Calibri"/>
         </w:rPr>
-        <w:t xml:space="preserve">CÔTE D’IVOIRE: DOUZE PERSONNES INCULPÉES DANS L'AFFAIRE DE L'ASSASSINAT D'UN GENDARME</w:t>
+        <w:t xml:space="preserve">AGRO-INDUSTRIE/BRUNO KONÉ - « LA TRANSFORMATION NE SE FERA PAS SANS LES ACTEURS DU SECTEUR INFORMEL »</w:t>
       </w:r>
     </w:p>
     <w:p>
@@ -1160,7 +1190,7 @@
         </w:rPr>
         <w:t xml:space="preserve">▪  Source : </w:t>
       </w:r>
-      <w:hyperlink w:history="1" r:id="rId1xn--kf4ktfkyamlpwsih">
+      <w:hyperlink w:history="1" r:id="rIdikwr4y3y-dt-7r4p5eqlc">
         <w:r>
           <w:rPr>
             <w:u w:val="single"/>
@@ -1169,7 +1199,7 @@
             <w:szCs w:val="26"/>
             <w:rFonts w:ascii="Calibri" w:cs="Calibri" w:eastAsia="Calibri" w:hAnsi="Calibri"/>
           </w:rPr>
-          <w:t xml:space="preserve">RFI Afrique</w:t>
+          <w:t xml:space="preserve">AllAfrica (CI)</w:t>
         </w:r>
       </w:hyperlink>
       <w:r>
@@ -1179,208 +1209,7 @@
           <w:szCs w:val="26"/>
           <w:rFonts w:ascii="Calibri" w:cs="Calibri" w:eastAsia="Calibri" w:hAnsi="Calibri"/>
         </w:rPr>
-        <w:t xml:space="preserve"> — 21 octobre 2026, 10 h UTC</w:t>
-      </w:r>
-    </w:p>
-    <w:p>
-      <w:pPr>
-        <w:pageBreakBefore/>
-        <w:spacing w:after="0" w:before="0"/>
-        <w:rPr>
-          <w:sz w:val="2"/>
-          <w:szCs w:val="2"/>
-        </w:rPr>
-      </w:pPr>
-    </w:p>
-    <w:tbl>
-      <w:tblPr>
-        <w:tblW w:type="dxa" w:w="17680"/>
-        <w:tblBorders>
-          <w:top w:val="single" w:color="auto" w:sz="4"/>
-          <w:left w:val="single" w:color="auto" w:sz="4"/>
-          <w:bottom w:val="single" w:color="auto" w:sz="4"/>
-          <w:right w:val="single" w:color="auto" w:sz="4"/>
-          <w:insideH w:val="single" w:color="auto" w:sz="4"/>
-          <w:insideV w:val="single" w:color="auto" w:sz="4"/>
-        </w:tblBorders>
-      </w:tblPr>
-      <w:tblGrid>
-        <w:gridCol w:w="1000"/>
-        <w:gridCol w:w="15180"/>
-        <w:gridCol w:w="1500"/>
-      </w:tblGrid>
-      <w:tr>
-        <w:tc>
-          <w:tcPr>
-            <w:tcW w:type="dxa" w:w="1000"/>
-            <w:tcBorders>
-              <w:top w:val="none" w:color="FFFFFF" w:sz="0"/>
-              <w:left w:val="none" w:color="FFFFFF" w:sz="0"/>
-              <w:bottom w:val="none" w:color="FFFFFF" w:sz="0"/>
-              <w:right w:val="none" w:color="FFFFFF" w:sz="0"/>
-            </w:tcBorders>
-            <w:shd w:fill="1F6B5E" w:color="auto" w:val="clear"/>
-            <w:vAlign w:val="center"/>
-          </w:tcPr>
-          <w:p>
-            <w:pPr>
-              <w:jc w:val="center"/>
-            </w:pPr>
-            <w:r>
-              <w:rPr>
-                <w:color w:val="FFFFFF"/>
-                <w:sz w:val="44"/>
-                <w:szCs w:val="44"/>
-                <w:rFonts w:ascii="Arial Narrow" w:cs="Arial Narrow" w:eastAsia="Arial Narrow" w:hAnsi="Arial Narrow"/>
-              </w:rPr>
-              <w:t xml:space="preserve">II</w:t>
-            </w:r>
-          </w:p>
-        </w:tc>
-        <w:tc>
-          <w:tcPr>
-            <w:tcW w:type="dxa" w:w="15180"/>
-            <w:tcBorders>
-              <w:top w:val="none" w:color="FFFFFF" w:sz="0"/>
-              <w:left w:val="none" w:color="FFFFFF" w:sz="0"/>
-              <w:bottom w:val="none" w:color="FFFFFF" w:sz="0"/>
-              <w:right w:val="none" w:color="FFFFFF" w:sz="0"/>
-            </w:tcBorders>
-            <w:vAlign w:val="center"/>
-          </w:tcPr>
-          <w:p>
-            <w:pPr>
-              <w:ind w:left="200"/>
-            </w:pPr>
-            <w:r>
-              <w:rPr>
-                <w:u w:val="single"/>
-                <w:color w:val="1F6B5E"/>
-                <w:sz w:val="56"/>
-                <w:szCs w:val="56"/>
-                <w:rFonts w:ascii="Arial Narrow" w:cs="Arial Narrow" w:eastAsia="Arial Narrow" w:hAnsi="Arial Narrow"/>
-              </w:rPr>
-              <w:t xml:space="preserve">- SOCIAL</w:t>
-            </w:r>
-          </w:p>
-        </w:tc>
-        <w:tc>
-          <w:tcPr>
-            <w:tcW w:type="dxa" w:w="1500"/>
-            <w:tcBorders>
-              <w:top w:val="none" w:color="FFFFFF" w:sz="0"/>
-              <w:left w:val="none" w:color="FFFFFF" w:sz="0"/>
-              <w:bottom w:val="none" w:color="FFFFFF" w:sz="0"/>
-              <w:right w:val="none" w:color="FFFFFF" w:sz="0"/>
-            </w:tcBorders>
-            <w:vAlign w:val="center"/>
-          </w:tcPr>
-          <w:tbl>
-            <w:tblPr>
-              <w:tblW w:type="dxa" w:w="1200"/>
-              <w:tblBorders>
-                <w:top w:val="single" w:color="auto" w:sz="4"/>
-                <w:left w:val="single" w:color="auto" w:sz="4"/>
-                <w:bottom w:val="single" w:color="auto" w:sz="4"/>
-                <w:right w:val="single" w:color="auto" w:sz="4"/>
-                <w:insideH w:val="single" w:color="auto" w:sz="4"/>
-                <w:insideV w:val="single" w:color="auto" w:sz="4"/>
-              </w:tblBorders>
-            </w:tblPr>
-            <w:tblGrid>
-              <w:gridCol w:w="400"/>
-              <w:gridCol w:w="400"/>
-              <w:gridCol w:w="400"/>
-            </w:tblGrid>
-            <w:tr>
-              <w:trPr>
-                <w:trHeight w:val="600" w:hRule="exact"/>
-              </w:trPr>
-              <w:tc>
-                <w:tcPr>
-                  <w:tcW w:type="dxa" w:w="400"/>
-                  <w:tcBorders>
-                    <w:top w:val="single" w:color="1F2937" w:sz="6"/>
-                    <w:left w:val="single" w:color="1F2937" w:sz="6"/>
-                    <w:bottom w:val="single" w:color="1F2937" w:sz="6"/>
-                    <w:right w:val="single" w:color="1F2937" w:sz="6"/>
-                  </w:tcBorders>
-                  <w:shd w:fill="F77F00" w:color="auto" w:val="clear"/>
-                </w:tcPr>
-                <w:p>
-                  <w:r>
-                    <w:rPr>
-                      <w:color w:val="1F2937"/>
-                      <w:sz w:val="2"/>
-                      <w:szCs w:val="2"/>
-                      <w:rFonts w:ascii="Calibri" w:cs="Calibri" w:eastAsia="Calibri" w:hAnsi="Calibri"/>
-                    </w:rPr>
-                  </w:r>
-                </w:p>
-              </w:tc>
-              <w:tc>
-                <w:tcPr>
-                  <w:tcW w:type="dxa" w:w="400"/>
-                  <w:tcBorders>
-                    <w:top w:val="single" w:color="1F2937" w:sz="6"/>
-                    <w:left w:val="single" w:color="1F2937" w:sz="6"/>
-                    <w:bottom w:val="single" w:color="1F2937" w:sz="6"/>
-                    <w:right w:val="single" w:color="1F2937" w:sz="6"/>
-                  </w:tcBorders>
-                  <w:shd w:fill="FFFFFF" w:color="auto" w:val="clear"/>
-                </w:tcPr>
-                <w:p>
-                  <w:r>
-                    <w:rPr>
-                      <w:color w:val="1F2937"/>
-                      <w:sz w:val="2"/>
-                      <w:szCs w:val="2"/>
-                      <w:rFonts w:ascii="Calibri" w:cs="Calibri" w:eastAsia="Calibri" w:hAnsi="Calibri"/>
-                    </w:rPr>
-                  </w:r>
-                </w:p>
-              </w:tc>
-              <w:tc>
-                <w:tcPr>
-                  <w:tcW w:type="dxa" w:w="400"/>
-                  <w:tcBorders>
-                    <w:top w:val="single" w:color="1F2937" w:sz="6"/>
-                    <w:left w:val="single" w:color="1F2937" w:sz="6"/>
-                    <w:bottom w:val="single" w:color="1F2937" w:sz="6"/>
-                    <w:right w:val="single" w:color="1F2937" w:sz="6"/>
-                  </w:tcBorders>
-                  <w:shd w:fill="009E60" w:color="auto" w:val="clear"/>
-                </w:tcPr>
-                <w:p>
-                  <w:r>
-                    <w:rPr>
-                      <w:color w:val="1F2937"/>
-                      <w:sz w:val="2"/>
-                      <w:szCs w:val="2"/>
-                      <w:rFonts w:ascii="Calibri" w:cs="Calibri" w:eastAsia="Calibri" w:hAnsi="Calibri"/>
-                    </w:rPr>
-                  </w:r>
-                </w:p>
-              </w:tc>
-            </w:tr>
-          </w:tbl>
-          <w:p/>
-        </w:tc>
-      </w:tr>
-    </w:tbl>
-    <w:p>
-      <w:pPr>
-        <w:pBdr>
-          <w:bottom w:val="single" w:color="A3A3A3" w:sz="4" w:space="1"/>
-        </w:pBdr>
-      </w:pPr>
-      <w:r>
-        <w:rPr>
-          <w:color w:val="1F2937"/>
-          <w:sz w:val="12"/>
-          <w:szCs w:val="12"/>
-          <w:rFonts w:ascii="Calibri" w:cs="Calibri" w:eastAsia="Calibri" w:hAnsi="Calibri"/>
-        </w:rPr>
+        <w:t xml:space="preserve"> — 22 octobre 2026, 22 h UTC</w:t>
       </w:r>
     </w:p>
     <w:p>
@@ -1407,7 +1236,7 @@
           <w:szCs w:val="28"/>
           <w:rFonts w:ascii="Calibri" w:cs="Calibri" w:eastAsia="Calibri" w:hAnsi="Calibri"/>
         </w:rPr>
-        <w:t xml:space="preserve">DALOA : LES COMMERÇANTES MANIFESTENT CONTRE LA HAUSSE DU PRIX DU POISSON, LE PRÉFET APPELLE AU CALME</w:t>
+        <w:t xml:space="preserve">AUDIENCE ATTENDUE SUR L'ÉLECTION DE TIDJANE THIAM À LA TÊTE DU PARTI D'OPPOSITION PDCI</w:t>
       </w:r>
     </w:p>
     <w:p>
@@ -1423,7 +1252,7 @@
         </w:rPr>
         <w:t xml:space="preserve">▪  Source : </w:t>
       </w:r>
-      <w:hyperlink w:history="1" r:id="rId0y-0h9oadq-ea6x2v2y8s">
+      <w:hyperlink w:history="1" r:id="rIdm4rnmb6amifg9fdloek6l">
         <w:r>
           <w:rPr>
             <w:u w:val="single"/>
@@ -1432,7 +1261,7 @@
             <w:szCs w:val="26"/>
             <w:rFonts w:ascii="Calibri" w:cs="Calibri" w:eastAsia="Calibri" w:hAnsi="Calibri"/>
           </w:rPr>
-          <w:t xml:space="preserve">Linfodrome</w:t>
+          <w:t xml:space="preserve">AllAfrica (CI)</w:t>
         </w:r>
       </w:hyperlink>
       <w:r>
@@ -1442,7 +1271,7 @@
           <w:szCs w:val="26"/>
           <w:rFonts w:ascii="Calibri" w:cs="Calibri" w:eastAsia="Calibri" w:hAnsi="Calibri"/>
         </w:rPr>
-        <w:t xml:space="preserve"> — 21 octobre 2026, 12 h UTC</w:t>
+        <w:t xml:space="preserve"> — 22 octobre 2026, 8 h UTC</w:t>
       </w:r>
     </w:p>
     <w:p>
@@ -1756,7 +1585,7 @@
           <w:szCs w:val="28"/>
           <w:rFonts w:ascii="Calibri" w:cs="Calibri" w:eastAsia="Calibri" w:hAnsi="Calibri"/>
         </w:rPr>
-        <w:t xml:space="preserve">LE BURKINA FASO RÉTABLIT LA PEINE DE MORT, ABOLIE EN 2018 !</w:t>
+        <w:t xml:space="preserve">LE PAYS RÉTABLIT LA PEINE DE MORT</w:t>
       </w:r>
     </w:p>
     <w:p>
@@ -1772,7 +1601,7 @@
         </w:rPr>
         <w:t xml:space="preserve">▪  Source : </w:t>
       </w:r>
-      <w:hyperlink w:history="1" r:id="rIdvcskb0ibjtmwqbhyijzpr">
+      <w:hyperlink w:history="1" r:id="rIdskjkflg1p0fwo_uat7l6x">
         <w:r>
           <w:rPr>
             <w:u w:val="single"/>
@@ -1781,7 +1610,7 @@
             <w:szCs w:val="26"/>
             <w:rFonts w:ascii="Calibri" w:cs="Calibri" w:eastAsia="Calibri" w:hAnsi="Calibri"/>
           </w:rPr>
-          <w:t xml:space="preserve">Actu Cameroun</w:t>
+          <w:t xml:space="preserve">AllAfrica (BF)</w:t>
         </w:r>
       </w:hyperlink>
       <w:r>
@@ -1791,7 +1620,7 @@
           <w:szCs w:val="26"/>
           <w:rFonts w:ascii="Calibri" w:cs="Calibri" w:eastAsia="Calibri" w:hAnsi="Calibri"/>
         </w:rPr>
-        <w:t xml:space="preserve"> — 21 octobre 2026, 10 h UTC</w:t>
+        <w:t xml:space="preserve"> — 22 octobre 2026, 15 h UTC</w:t>
       </w:r>
     </w:p>
     <w:p>
@@ -1818,7 +1647,7 @@
           <w:szCs w:val="28"/>
           <w:rFonts w:ascii="Calibri" w:cs="Calibri" w:eastAsia="Calibri" w:hAnsi="Calibri"/>
         </w:rPr>
-        <w:t xml:space="preserve">« LE SENTIMENTALISME, C’EST FINI » : AU BURKINA FASO, IBRAHIM TRAORÉ RÉTABLIT LA PEINE DE MORT</w:t>
+        <w:t xml:space="preserve">AÉROPORT INTERNATIONAL DE OUAGADOUGOU : LA SAFA RENFORCE LA PRÉPARATION AUX SITUATIONS D’URGENCE</w:t>
       </w:r>
     </w:p>
     <w:p>
@@ -1834,7 +1663,7 @@
         </w:rPr>
         <w:t xml:space="preserve">▪  Source : </w:t>
       </w:r>
-      <w:hyperlink w:history="1" r:id="rIdmtfot__2kinggvzjq6oc_">
+      <w:hyperlink w:history="1" r:id="rId8-qmlq_eupya63-cuz0rz">
         <w:r>
           <w:rPr>
             <w:u w:val="single"/>
@@ -1843,7 +1672,7 @@
             <w:szCs w:val="26"/>
             <w:rFonts w:ascii="Calibri" w:cs="Calibri" w:eastAsia="Calibri" w:hAnsi="Calibri"/>
           </w:rPr>
-          <w:t xml:space="preserve">Jeune Afrique</w:t>
+          <w:t xml:space="preserve">Faso7</w:t>
         </w:r>
       </w:hyperlink>
       <w:r>
@@ -1853,684 +1682,7 @@
           <w:szCs w:val="26"/>
           <w:rFonts w:ascii="Calibri" w:cs="Calibri" w:eastAsia="Calibri" w:hAnsi="Calibri"/>
         </w:rPr>
-        <w:t xml:space="preserve"> — 21 octobre 2026, 9 h UTC</w:t>
-      </w:r>
-    </w:p>
-    <w:p>
-      <w:pPr>
-        <w:spacing w:before="160"/>
-        <w:ind w:left="360"/>
-      </w:pPr>
-      <w:r>
-        <w:rPr>
-          <w:color w:val="1F6B5E"/>
-          <w:sz w:val="28"/>
-          <w:szCs w:val="28"/>
-          <w:rFonts w:ascii="Calibri" w:cs="Calibri" w:eastAsia="Calibri" w:hAnsi="Calibri"/>
-        </w:rPr>
-        <w:t xml:space="preserve">❑  </w:t>
-      </w:r>
-      <w:r>
-        <w:rPr>
-          <w:b/>
-          <w:bCs/>
-          <w:u w:val="single"/>
-          <w:color w:val="1F6B5E"/>
-          <w:sz w:val="28"/>
-          <w:szCs w:val="28"/>
-          <w:rFonts w:ascii="Calibri" w:cs="Calibri" w:eastAsia="Calibri" w:hAnsi="Calibri"/>
-        </w:rPr>
-        <w:t xml:space="preserve">BURKINA FASO : LA PEINE DE MORT RÉTABLIE DANS LE NOUVEAU CODE PÉNAL</w:t>
-      </w:r>
-    </w:p>
-    <w:p>
-      <w:pPr>
-        <w:ind w:left="720"/>
-      </w:pPr>
-      <w:r>
-        <w:rPr>
-          <w:color w:val="1F2937"/>
-          <w:sz w:val="26"/>
-          <w:szCs w:val="26"/>
-          <w:rFonts w:ascii="Calibri" w:cs="Calibri" w:eastAsia="Calibri" w:hAnsi="Calibri"/>
-        </w:rPr>
-        <w:t xml:space="preserve">▪  Source : </w:t>
-      </w:r>
-      <w:hyperlink w:history="1" r:id="rIdvfieoac3jyuxhe6zvydde">
-        <w:r>
-          <w:rPr>
-            <w:u w:val="single"/>
-            <w:color w:val="1F6B5E"/>
-            <w:sz w:val="26"/>
-            <w:szCs w:val="26"/>
-            <w:rFonts w:ascii="Calibri" w:cs="Calibri" w:eastAsia="Calibri" w:hAnsi="Calibri"/>
-          </w:rPr>
-          <w:t xml:space="preserve">Maliactu</w:t>
-        </w:r>
-      </w:hyperlink>
-      <w:r>
-        <w:rPr>
-          <w:color w:val="1F2937"/>
-          <w:sz w:val="26"/>
-          <w:szCs w:val="26"/>
-          <w:rFonts w:ascii="Calibri" w:cs="Calibri" w:eastAsia="Calibri" w:hAnsi="Calibri"/>
-        </w:rPr>
-        <w:t xml:space="preserve"> — 21 octobre 2026, 8 h UTC</w:t>
-      </w:r>
-    </w:p>
-    <w:p>
-      <w:pPr>
-        <w:spacing w:before="160"/>
-        <w:ind w:left="360"/>
-      </w:pPr>
-      <w:r>
-        <w:rPr>
-          <w:color w:val="1F6B5E"/>
-          <w:sz w:val="28"/>
-          <w:szCs w:val="28"/>
-          <w:rFonts w:ascii="Calibri" w:cs="Calibri" w:eastAsia="Calibri" w:hAnsi="Calibri"/>
-        </w:rPr>
-        <w:t xml:space="preserve">❑  </w:t>
-      </w:r>
-      <w:r>
-        <w:rPr>
-          <w:b/>
-          <w:bCs/>
-          <w:u w:val="single"/>
-          <w:color w:val="1F6B5E"/>
-          <w:sz w:val="28"/>
-          <w:szCs w:val="28"/>
-          <w:rFonts w:ascii="Calibri" w:cs="Calibri" w:eastAsia="Calibri" w:hAnsi="Calibri"/>
-        </w:rPr>
-        <w:t xml:space="preserve">BURKINA FASO : LE PARLEMENT VOTE LE RÉTABLISSEMENT DE LA PEINE DE MORT</w:t>
-      </w:r>
-    </w:p>
-    <w:p>
-      <w:pPr>
-        <w:ind w:left="720"/>
-      </w:pPr>
-      <w:r>
-        <w:rPr>
-          <w:color w:val="1F2937"/>
-          <w:sz w:val="26"/>
-          <w:szCs w:val="26"/>
-          <w:rFonts w:ascii="Calibri" w:cs="Calibri" w:eastAsia="Calibri" w:hAnsi="Calibri"/>
-        </w:rPr>
-        <w:t xml:space="preserve">▪  Source : </w:t>
-      </w:r>
-      <w:hyperlink w:history="1" r:id="rIdggpfhuppuq21rlmuudkcw">
-        <w:r>
-          <w:rPr>
-            <w:u w:val="single"/>
-            <w:color w:val="1F6B5E"/>
-            <w:sz w:val="26"/>
-            <w:szCs w:val="26"/>
-            <w:rFonts w:ascii="Calibri" w:cs="Calibri" w:eastAsia="Calibri" w:hAnsi="Calibri"/>
-          </w:rPr>
-          <w:t xml:space="preserve">Africanews — Chaine panafricaine</w:t>
-        </w:r>
-      </w:hyperlink>
-      <w:r>
-        <w:rPr>
-          <w:color w:val="1F2937"/>
-          <w:sz w:val="26"/>
-          <w:szCs w:val="26"/>
-          <w:rFonts w:ascii="Calibri" w:cs="Calibri" w:eastAsia="Calibri" w:hAnsi="Calibri"/>
-        </w:rPr>
-        <w:t xml:space="preserve"> — 21 octobre 2026, 7 h UTC</w:t>
-      </w:r>
-    </w:p>
-    <w:p>
-      <w:pPr>
-        <w:spacing w:before="160"/>
-        <w:ind w:left="360"/>
-      </w:pPr>
-      <w:r>
-        <w:rPr>
-          <w:color w:val="1F6B5E"/>
-          <w:sz w:val="28"/>
-          <w:szCs w:val="28"/>
-          <w:rFonts w:ascii="Calibri" w:cs="Calibri" w:eastAsia="Calibri" w:hAnsi="Calibri"/>
-        </w:rPr>
-        <w:t xml:space="preserve">❑  </w:t>
-      </w:r>
-      <w:r>
-        <w:rPr>
-          <w:b/>
-          <w:bCs/>
-          <w:u w:val="single"/>
-          <w:color w:val="1F6B5E"/>
-          <w:sz w:val="28"/>
-          <w:szCs w:val="28"/>
-          <w:rFonts w:ascii="Calibri" w:cs="Calibri" w:eastAsia="Calibri" w:hAnsi="Calibri"/>
-        </w:rPr>
-        <w:t xml:space="preserve">BURKINA FASO: LA JUNTE AU POUVOIR RÉTABLIT LA PEINE DE MORT</w:t>
-      </w:r>
-    </w:p>
-    <w:p>
-      <w:pPr>
-        <w:ind w:left="720"/>
-      </w:pPr>
-      <w:r>
-        <w:rPr>
-          <w:color w:val="1F2937"/>
-          <w:sz w:val="26"/>
-          <w:szCs w:val="26"/>
-          <w:rFonts w:ascii="Calibri" w:cs="Calibri" w:eastAsia="Calibri" w:hAnsi="Calibri"/>
-        </w:rPr>
-        <w:t xml:space="preserve">▪  Source : </w:t>
-      </w:r>
-      <w:hyperlink w:history="1" r:id="rIdlwnc6-909jvafluib3_il">
-        <w:r>
-          <w:rPr>
-            <w:u w:val="single"/>
-            <w:color w:val="1F6B5E"/>
-            <w:sz w:val="26"/>
-            <w:szCs w:val="26"/>
-            <w:rFonts w:ascii="Calibri" w:cs="Calibri" w:eastAsia="Calibri" w:hAnsi="Calibri"/>
-          </w:rPr>
-          <w:t xml:space="preserve">RFI Afrique</w:t>
-        </w:r>
-      </w:hyperlink>
-      <w:r>
-        <w:rPr>
-          <w:color w:val="1F2937"/>
-          <w:sz w:val="26"/>
-          <w:szCs w:val="26"/>
-          <w:rFonts w:ascii="Calibri" w:cs="Calibri" w:eastAsia="Calibri" w:hAnsi="Calibri"/>
-        </w:rPr>
-        <w:t xml:space="preserve"> — 21 octobre 2026, 3 h UTC</w:t>
-      </w:r>
-    </w:p>
-    <w:p>
-      <w:pPr>
-        <w:pageBreakBefore/>
-        <w:spacing w:after="0" w:before="0"/>
-        <w:rPr>
-          <w:sz w:val="2"/>
-          <w:szCs w:val="2"/>
-        </w:rPr>
-      </w:pPr>
-    </w:p>
-    <w:tbl>
-      <w:tblPr>
-        <w:tblW w:type="dxa" w:w="17680"/>
-        <w:tblBorders>
-          <w:top w:val="single" w:color="auto" w:sz="4"/>
-          <w:left w:val="single" w:color="auto" w:sz="4"/>
-          <w:bottom w:val="single" w:color="auto" w:sz="4"/>
-          <w:right w:val="single" w:color="auto" w:sz="4"/>
-          <w:insideH w:val="single" w:color="auto" w:sz="4"/>
-          <w:insideV w:val="single" w:color="auto" w:sz="4"/>
-        </w:tblBorders>
-      </w:tblPr>
-      <w:tblGrid>
-        <w:gridCol w:w="1000"/>
-        <w:gridCol w:w="15180"/>
-        <w:gridCol w:w="1500"/>
-      </w:tblGrid>
-      <w:tr>
-        <w:tc>
-          <w:tcPr>
-            <w:tcW w:type="dxa" w:w="1000"/>
-            <w:tcBorders>
-              <w:top w:val="none" w:color="FFFFFF" w:sz="0"/>
-              <w:left w:val="none" w:color="FFFFFF" w:sz="0"/>
-              <w:bottom w:val="none" w:color="FFFFFF" w:sz="0"/>
-              <w:right w:val="none" w:color="FFFFFF" w:sz="0"/>
-            </w:tcBorders>
-            <w:shd w:fill="1F6B5E" w:color="auto" w:val="clear"/>
-            <w:vAlign w:val="center"/>
-          </w:tcPr>
-          <w:p>
-            <w:pPr>
-              <w:jc w:val="center"/>
-            </w:pPr>
-            <w:r>
-              <w:rPr>
-                <w:color w:val="FFFFFF"/>
-                <w:sz w:val="44"/>
-                <w:szCs w:val="44"/>
-                <w:rFonts w:ascii="Arial Narrow" w:cs="Arial Narrow" w:eastAsia="Arial Narrow" w:hAnsi="Arial Narrow"/>
-              </w:rPr>
-              <w:t xml:space="preserve">I</w:t>
-            </w:r>
-          </w:p>
-        </w:tc>
-        <w:tc>
-          <w:tcPr>
-            <w:tcW w:type="dxa" w:w="15180"/>
-            <w:tcBorders>
-              <w:top w:val="none" w:color="FFFFFF" w:sz="0"/>
-              <w:left w:val="none" w:color="FFFFFF" w:sz="0"/>
-              <w:bottom w:val="none" w:color="FFFFFF" w:sz="0"/>
-              <w:right w:val="none" w:color="FFFFFF" w:sz="0"/>
-            </w:tcBorders>
-            <w:vAlign w:val="center"/>
-          </w:tcPr>
-          <w:p>
-            <w:pPr>
-              <w:ind w:left="200"/>
-            </w:pPr>
-            <w:r>
-              <w:rPr>
-                <w:color w:val="1F6B5E"/>
-                <w:sz w:val="56"/>
-                <w:szCs w:val="56"/>
-                <w:rFonts w:ascii="Arial Narrow" w:cs="Arial Narrow" w:eastAsia="Arial Narrow" w:hAnsi="Arial Narrow"/>
-              </w:rPr>
-              <w:t xml:space="preserve">Burkina Faso</w:t>
-            </w:r>
-          </w:p>
-        </w:tc>
-        <w:tc>
-          <w:tcPr>
-            <w:tcW w:type="dxa" w:w="1500"/>
-            <w:tcBorders>
-              <w:top w:val="none" w:color="FFFFFF" w:sz="0"/>
-              <w:left w:val="none" w:color="FFFFFF" w:sz="0"/>
-              <w:bottom w:val="none" w:color="FFFFFF" w:sz="0"/>
-              <w:right w:val="none" w:color="FFFFFF" w:sz="0"/>
-            </w:tcBorders>
-            <w:vAlign w:val="center"/>
-          </w:tcPr>
-          <w:tbl>
-            <w:tblPr>
-              <w:tblW w:type="dxa" w:w="1200"/>
-              <w:tblBorders>
-                <w:top w:val="single" w:color="auto" w:sz="4"/>
-                <w:left w:val="single" w:color="auto" w:sz="4"/>
-                <w:bottom w:val="single" w:color="auto" w:sz="4"/>
-                <w:right w:val="single" w:color="auto" w:sz="4"/>
-                <w:insideH w:val="single" w:color="auto" w:sz="4"/>
-                <w:insideV w:val="single" w:color="auto" w:sz="4"/>
-              </w:tblBorders>
-            </w:tblPr>
-            <w:tblGrid>
-              <w:gridCol w:w="1200"/>
-            </w:tblGrid>
-            <w:tr>
-              <w:trPr>
-                <w:trHeight w:val="300" w:hRule="exact"/>
-              </w:trPr>
-              <w:tc>
-                <w:tcPr>
-                  <w:tcW w:type="dxa" w:w="1200"/>
-                  <w:tcBorders>
-                    <w:top w:val="single" w:color="1F2937" w:sz="6"/>
-                    <w:left w:val="single" w:color="1F2937" w:sz="6"/>
-                    <w:bottom w:val="single" w:color="1F2937" w:sz="6"/>
-                    <w:right w:val="single" w:color="1F2937" w:sz="6"/>
-                  </w:tcBorders>
-                  <w:shd w:fill="EF2B2D" w:color="auto" w:val="clear"/>
-                </w:tcPr>
-                <w:p>
-                  <w:r>
-                    <w:rPr>
-                      <w:color w:val="1F2937"/>
-                      <w:sz w:val="2"/>
-                      <w:szCs w:val="2"/>
-                      <w:rFonts w:ascii="Calibri" w:cs="Calibri" w:eastAsia="Calibri" w:hAnsi="Calibri"/>
-                    </w:rPr>
-                  </w:r>
-                </w:p>
-              </w:tc>
-            </w:tr>
-            <w:tr>
-              <w:trPr>
-                <w:trHeight w:val="300" w:hRule="exact"/>
-              </w:trPr>
-              <w:tc>
-                <w:tcPr>
-                  <w:tcW w:type="dxa" w:w="1200"/>
-                  <w:tcBorders>
-                    <w:top w:val="single" w:color="1F2937" w:sz="6"/>
-                    <w:left w:val="single" w:color="1F2937" w:sz="6"/>
-                    <w:bottom w:val="single" w:color="1F2937" w:sz="6"/>
-                    <w:right w:val="single" w:color="1F2937" w:sz="6"/>
-                  </w:tcBorders>
-                  <w:shd w:fill="009E49" w:color="auto" w:val="clear"/>
-                </w:tcPr>
-                <w:p>
-                  <w:r>
-                    <w:rPr>
-                      <w:color w:val="1F2937"/>
-                      <w:sz w:val="2"/>
-                      <w:szCs w:val="2"/>
-                      <w:rFonts w:ascii="Calibri" w:cs="Calibri" w:eastAsia="Calibri" w:hAnsi="Calibri"/>
-                    </w:rPr>
-                  </w:r>
-                </w:p>
-              </w:tc>
-            </w:tr>
-          </w:tbl>
-          <w:p/>
-        </w:tc>
-      </w:tr>
-    </w:tbl>
-    <w:p>
-      <w:pPr>
-        <w:pBdr>
-          <w:bottom w:val="single" w:color="A3A3A3" w:sz="4" w:space="1"/>
-        </w:pBdr>
-      </w:pPr>
-      <w:r>
-        <w:rPr>
-          <w:color w:val="1F2937"/>
-          <w:sz w:val="12"/>
-          <w:szCs w:val="12"/>
-          <w:rFonts w:ascii="Calibri" w:cs="Calibri" w:eastAsia="Calibri" w:hAnsi="Calibri"/>
-        </w:rPr>
-      </w:r>
-    </w:p>
-    <w:p>
-      <w:pPr>
-        <w:spacing w:before="160"/>
-        <w:ind w:left="360"/>
-      </w:pPr>
-      <w:r>
-        <w:rPr>
-          <w:color w:val="1F6B5E"/>
-          <w:sz w:val="28"/>
-          <w:szCs w:val="28"/>
-          <w:rFonts w:ascii="Calibri" w:cs="Calibri" w:eastAsia="Calibri" w:hAnsi="Calibri"/>
-        </w:rPr>
-        <w:t xml:space="preserve">❑  </w:t>
-      </w:r>
-      <w:r>
-        <w:rPr>
-          <w:b/>
-          <w:bCs/>
-          <w:u w:val="single"/>
-          <w:color w:val="1F6B5E"/>
-          <w:sz w:val="28"/>
-          <w:szCs w:val="28"/>
-          <w:rFonts w:ascii="Calibri" w:cs="Calibri" w:eastAsia="Calibri" w:hAnsi="Calibri"/>
-        </w:rPr>
-        <w:t xml:space="preserve">BURKINA FASO : LA PEINE DE MORT RÉINTRODUITE DANS LE CODE PÉNAL</w:t>
-      </w:r>
-    </w:p>
-    <w:p>
-      <w:pPr>
-        <w:ind w:left="720"/>
-      </w:pPr>
-      <w:r>
-        <w:rPr>
-          <w:color w:val="1F2937"/>
-          <w:sz w:val="26"/>
-          <w:szCs w:val="26"/>
-          <w:rFonts w:ascii="Calibri" w:cs="Calibri" w:eastAsia="Calibri" w:hAnsi="Calibri"/>
-        </w:rPr>
-        <w:t xml:space="preserve">▪  Source : </w:t>
-      </w:r>
-      <w:hyperlink w:history="1" r:id="rId2jgnjifgujualtqtsegx_">
-        <w:r>
-          <w:rPr>
-            <w:u w:val="single"/>
-            <w:color w:val="1F6B5E"/>
-            <w:sz w:val="26"/>
-            <w:szCs w:val="26"/>
-            <w:rFonts w:ascii="Calibri" w:cs="Calibri" w:eastAsia="Calibri" w:hAnsi="Calibri"/>
-          </w:rPr>
-          <w:t xml:space="preserve">Guineematin.com</w:t>
-        </w:r>
-      </w:hyperlink>
-      <w:r>
-        <w:rPr>
-          <w:color w:val="1F2937"/>
-          <w:sz w:val="26"/>
-          <w:szCs w:val="26"/>
-          <w:rFonts w:ascii="Calibri" w:cs="Calibri" w:eastAsia="Calibri" w:hAnsi="Calibri"/>
-        </w:rPr>
-        <w:t xml:space="preserve"> — 20 octobre 2026, 22 h UTC</w:t>
-      </w:r>
-    </w:p>
-    <w:p>
-      <w:pPr>
-        <w:spacing w:before="160"/>
-        <w:ind w:left="360"/>
-      </w:pPr>
-      <w:r>
-        <w:rPr>
-          <w:color w:val="1F6B5E"/>
-          <w:sz w:val="28"/>
-          <w:szCs w:val="28"/>
-          <w:rFonts w:ascii="Calibri" w:cs="Calibri" w:eastAsia="Calibri" w:hAnsi="Calibri"/>
-        </w:rPr>
-        <w:t xml:space="preserve">❑  </w:t>
-      </w:r>
-      <w:r>
-        <w:rPr>
-          <w:b/>
-          <w:bCs/>
-          <w:u w:val="single"/>
-          <w:color w:val="1F6B5E"/>
-          <w:sz w:val="28"/>
-          <w:szCs w:val="28"/>
-          <w:rFonts w:ascii="Calibri" w:cs="Calibri" w:eastAsia="Calibri" w:hAnsi="Calibri"/>
-        </w:rPr>
-        <w:t xml:space="preserve">OUAGADOUGOU : LA CARAVANE « GRAINE DE COHÉSION » POURSUIT SON COMBAT POUR LA PAIX</w:t>
-      </w:r>
-    </w:p>
-    <w:p>
-      <w:pPr>
-        <w:ind w:left="720"/>
-      </w:pPr>
-      <w:r>
-        <w:rPr>
-          <w:color w:val="1F2937"/>
-          <w:sz w:val="26"/>
-          <w:szCs w:val="26"/>
-          <w:rFonts w:ascii="Calibri" w:cs="Calibri" w:eastAsia="Calibri" w:hAnsi="Calibri"/>
-        </w:rPr>
-        <w:t xml:space="preserve">▪  Source : </w:t>
-      </w:r>
-      <w:hyperlink w:history="1" r:id="rIdp6c_wvfdt-u2gevfisjrg">
-        <w:r>
-          <w:rPr>
-            <w:u w:val="single"/>
-            <w:color w:val="1F6B5E"/>
-            <w:sz w:val="26"/>
-            <w:szCs w:val="26"/>
-            <w:rFonts w:ascii="Calibri" w:cs="Calibri" w:eastAsia="Calibri" w:hAnsi="Calibri"/>
-          </w:rPr>
-          <w:t xml:space="preserve">Burkina24</w:t>
-        </w:r>
-      </w:hyperlink>
-      <w:r>
-        <w:rPr>
-          <w:color w:val="1F2937"/>
-          <w:sz w:val="26"/>
-          <w:szCs w:val="26"/>
-          <w:rFonts w:ascii="Calibri" w:cs="Calibri" w:eastAsia="Calibri" w:hAnsi="Calibri"/>
-        </w:rPr>
-        <w:t xml:space="preserve"> — 21 octobre 2026, 11 h UTC</w:t>
-      </w:r>
-    </w:p>
-    <w:p>
-      <w:pPr>
-        <w:spacing w:before="160"/>
-        <w:ind w:left="360"/>
-      </w:pPr>
-      <w:r>
-        <w:rPr>
-          <w:color w:val="1F6B5E"/>
-          <w:sz w:val="28"/>
-          <w:szCs w:val="28"/>
-          <w:rFonts w:ascii="Calibri" w:cs="Calibri" w:eastAsia="Calibri" w:hAnsi="Calibri"/>
-        </w:rPr>
-        <w:t xml:space="preserve">❑  </w:t>
-      </w:r>
-      <w:r>
-        <w:rPr>
-          <w:b/>
-          <w:bCs/>
-          <w:u w:val="single"/>
-          <w:color w:val="1F6B5E"/>
-          <w:sz w:val="28"/>
-          <w:szCs w:val="28"/>
-          <w:rFonts w:ascii="Calibri" w:cs="Calibri" w:eastAsia="Calibri" w:hAnsi="Calibri"/>
-        </w:rPr>
-        <w:t xml:space="preserve">BURKINA FASO : LE PREMIER MINISTRE INAUGURE LA RIZERIE GÉANTE DE BAGRÉ ET IMPULSE LA SOUVERAINETÉ ALIMENTAIRE DANS LE NAKAMBÉ</w:t>
-      </w:r>
-    </w:p>
-    <w:p>
-      <w:pPr>
-        <w:ind w:left="720"/>
-      </w:pPr>
-      <w:r>
-        <w:rPr>
-          <w:color w:val="1F2937"/>
-          <w:sz w:val="26"/>
-          <w:szCs w:val="26"/>
-          <w:rFonts w:ascii="Calibri" w:cs="Calibri" w:eastAsia="Calibri" w:hAnsi="Calibri"/>
-        </w:rPr>
-        <w:t xml:space="preserve">▪  Source : </w:t>
-      </w:r>
-      <w:hyperlink w:history="1" r:id="rIdra0m7adjz5isc1dtlbnwv">
-        <w:r>
-          <w:rPr>
-            <w:u w:val="single"/>
-            <w:color w:val="1F6B5E"/>
-            <w:sz w:val="26"/>
-            <w:szCs w:val="26"/>
-            <w:rFonts w:ascii="Calibri" w:cs="Calibri" w:eastAsia="Calibri" w:hAnsi="Calibri"/>
-          </w:rPr>
-          <w:t xml:space="preserve">Burkina24</w:t>
-        </w:r>
-      </w:hyperlink>
-      <w:r>
-        <w:rPr>
-          <w:color w:val="1F2937"/>
-          <w:sz w:val="26"/>
-          <w:szCs w:val="26"/>
-          <w:rFonts w:ascii="Calibri" w:cs="Calibri" w:eastAsia="Calibri" w:hAnsi="Calibri"/>
-        </w:rPr>
-        <w:t xml:space="preserve"> — 21 octobre 2026, 11 h UTC</w:t>
-      </w:r>
-    </w:p>
-    <w:p>
-      <w:pPr>
-        <w:spacing w:before="160"/>
-        <w:ind w:left="360"/>
-      </w:pPr>
-      <w:r>
-        <w:rPr>
-          <w:color w:val="1F6B5E"/>
-          <w:sz w:val="28"/>
-          <w:szCs w:val="28"/>
-          <w:rFonts w:ascii="Calibri" w:cs="Calibri" w:eastAsia="Calibri" w:hAnsi="Calibri"/>
-        </w:rPr>
-        <w:t xml:space="preserve">❑  </w:t>
-      </w:r>
-      <w:r>
-        <w:rPr>
-          <w:b/>
-          <w:bCs/>
-          <w:u w:val="single"/>
-          <w:color w:val="1F6B5E"/>
-          <w:sz w:val="28"/>
-          <w:szCs w:val="28"/>
-          <w:rFonts w:ascii="Calibri" w:cs="Calibri" w:eastAsia="Calibri" w:hAnsi="Calibri"/>
-        </w:rPr>
-        <w:t xml:space="preserve">SEMAINE DE L’ÉTUDIANT AU BURKINA FASO : LA COOPÉRATION SINO-BURKINABÈ ET LA SÉCURITÉ DES ÉTUDIANTS AU CŒUR DE LA PREMIÈRE ÉDITION</w:t>
-      </w:r>
-    </w:p>
-    <w:p>
-      <w:pPr>
-        <w:ind w:left="720"/>
-      </w:pPr>
-      <w:r>
-        <w:rPr>
-          <w:color w:val="1F2937"/>
-          <w:sz w:val="26"/>
-          <w:szCs w:val="26"/>
-          <w:rFonts w:ascii="Calibri" w:cs="Calibri" w:eastAsia="Calibri" w:hAnsi="Calibri"/>
-        </w:rPr>
-        <w:t xml:space="preserve">▪  Source : </w:t>
-      </w:r>
-      <w:hyperlink w:history="1" r:id="rIdwgoaow_ogruhsfyquq6wh">
-        <w:r>
-          <w:rPr>
-            <w:u w:val="single"/>
-            <w:color w:val="1F6B5E"/>
-            <w:sz w:val="26"/>
-            <w:szCs w:val="26"/>
-            <w:rFonts w:ascii="Calibri" w:cs="Calibri" w:eastAsia="Calibri" w:hAnsi="Calibri"/>
-          </w:rPr>
-          <w:t xml:space="preserve">Burkina24</w:t>
-        </w:r>
-      </w:hyperlink>
-      <w:r>
-        <w:rPr>
-          <w:color w:val="1F2937"/>
-          <w:sz w:val="26"/>
-          <w:szCs w:val="26"/>
-          <w:rFonts w:ascii="Calibri" w:cs="Calibri" w:eastAsia="Calibri" w:hAnsi="Calibri"/>
-        </w:rPr>
-        <w:t xml:space="preserve"> — 21 octobre 2026, 10 h UTC</w:t>
-      </w:r>
-    </w:p>
-    <w:p>
-      <w:pPr>
-        <w:spacing w:before="160"/>
-        <w:ind w:left="360"/>
-      </w:pPr>
-      <w:r>
-        <w:rPr>
-          <w:color w:val="1F6B5E"/>
-          <w:sz w:val="28"/>
-          <w:szCs w:val="28"/>
-          <w:rFonts w:ascii="Calibri" w:cs="Calibri" w:eastAsia="Calibri" w:hAnsi="Calibri"/>
-        </w:rPr>
-        <w:t xml:space="preserve">❑  </w:t>
-      </w:r>
-      <w:r>
-        <w:rPr>
-          <w:b/>
-          <w:bCs/>
-          <w:u w:val="single"/>
-          <w:color w:val="1F6B5E"/>
-          <w:sz w:val="28"/>
-          <w:szCs w:val="28"/>
-          <w:rFonts w:ascii="Calibri" w:cs="Calibri" w:eastAsia="Calibri" w:hAnsi="Calibri"/>
-        </w:rPr>
-        <w:t xml:space="preserve">OFFENSIVE AGROPASTORALE : LE PREMIER MINISTRE LANCE LA RÉCOLTE MÉCANISÉE DU MAÏS À BAGRÉ</w:t>
-      </w:r>
-    </w:p>
-    <w:p>
-      <w:pPr>
-        <w:ind w:left="720"/>
-      </w:pPr>
-      <w:r>
-        <w:rPr>
-          <w:color w:val="1F2937"/>
-          <w:sz w:val="26"/>
-          <w:szCs w:val="26"/>
-          <w:rFonts w:ascii="Calibri" w:cs="Calibri" w:eastAsia="Calibri" w:hAnsi="Calibri"/>
-        </w:rPr>
-        <w:t xml:space="preserve">▪  Source : </w:t>
-      </w:r>
-      <w:hyperlink w:history="1" r:id="rIdluc3txendhiytmalfwr3w">
-        <w:r>
-          <w:rPr>
-            <w:u w:val="single"/>
-            <w:color w:val="1F6B5E"/>
-            <w:sz w:val="26"/>
-            <w:szCs w:val="26"/>
-            <w:rFonts w:ascii="Calibri" w:cs="Calibri" w:eastAsia="Calibri" w:hAnsi="Calibri"/>
-          </w:rPr>
-          <w:t xml:space="preserve">Gouvernement de transition Burkina Faso</w:t>
-        </w:r>
-      </w:hyperlink>
-      <w:r>
-        <w:rPr>
-          <w:color w:val="1F2937"/>
-          <w:sz w:val="26"/>
-          <w:szCs w:val="26"/>
-          <w:rFonts w:ascii="Calibri" w:cs="Calibri" w:eastAsia="Calibri" w:hAnsi="Calibri"/>
-        </w:rPr>
-        <w:t xml:space="preserve"> — 20 octobre 2026, 20 h UTC</w:t>
+        <w:t xml:space="preserve"> — 22 octobre 2026, 16 h UTC</w:t>
       </w:r>
     </w:p>
     <w:p>
@@ -2757,7 +1909,7 @@
           <w:szCs w:val="28"/>
           <w:rFonts w:ascii="Calibri" w:cs="Calibri" w:eastAsia="Calibri" w:hAnsi="Calibri"/>
         </w:rPr>
-        <w:t xml:space="preserve">MASSACRE IN MALI: ISLAMIC STATE MILITANTS KILL AT LEAST 48 CIVILIANS IN MÉNAKA</w:t>
+        <w:t xml:space="preserve">GRÈVE JUGÉE HORS-CADRE À KOLOKANI : L’ADMINISTRATION SCOLAIRE FIXE UN ULTIMATUM AUX ENSEIGNANTS COMMUNAUTAIRES</w:t>
       </w:r>
     </w:p>
     <w:p>
@@ -2773,7 +1925,7 @@
         </w:rPr>
         <w:t xml:space="preserve">▪  Source : </w:t>
       </w:r>
-      <w:hyperlink w:history="1" r:id="rId4r3bvd00mq69h9wzcvb6q">
+      <w:hyperlink w:history="1" r:id="rId-q_-n-qybvlbyr7ks3lco">
         <w:r>
           <w:rPr>
             <w:u w:val="single"/>
@@ -2782,7 +1934,7 @@
             <w:szCs w:val="26"/>
             <w:rFonts w:ascii="Calibri" w:cs="Calibri" w:eastAsia="Calibri" w:hAnsi="Calibri"/>
           </w:rPr>
-          <w:t xml:space="preserve">The Africa Report</w:t>
+          <w:t xml:space="preserve">Maliactu</w:t>
         </w:r>
       </w:hyperlink>
       <w:r>
@@ -2792,7 +1944,7 @@
           <w:szCs w:val="26"/>
           <w:rFonts w:ascii="Calibri" w:cs="Calibri" w:eastAsia="Calibri" w:hAnsi="Calibri"/>
         </w:rPr>
-        <w:t xml:space="preserve"> — 21 octobre 2026, 10 h UTC</w:t>
+        <w:t xml:space="preserve"> — 23 octobre 2026, 6 h UTC</w:t>
       </w:r>
     </w:p>
     <w:p>
@@ -2819,7 +1971,7 @@
           <w:szCs w:val="28"/>
           <w:rFonts w:ascii="Calibri" w:cs="Calibri" w:eastAsia="Calibri" w:hAnsi="Calibri"/>
         </w:rPr>
-        <w:t xml:space="preserve">MASSACRE AU MALI : L’ÉTAT ISLAMIQUE S’ATTAQUE À LA COMMUNAUTÉ IDAKSAHAK DANS LA RÉGION DE MÉNAKA</w:t>
+        <w:t xml:space="preserve">COUP DE FORCE À LA FRONTIÈRE : L'ARMÉE ALGÉRIENNE FERME TINZAOUATEN ET TIMIAOUINE POUR TRAQUER LES TRAFIQUANTS</w:t>
       </w:r>
     </w:p>
     <w:p>
@@ -2835,7 +1987,193 @@
         </w:rPr>
         <w:t xml:space="preserve">▪  Source : </w:t>
       </w:r>
-      <w:hyperlink w:history="1" r:id="rIduthy9xjdmech2geywakgf">
+      <w:hyperlink w:history="1" r:id="rIdeq6tmlcquslvt5kfptqe6">
+        <w:r>
+          <w:rPr>
+            <w:u w:val="single"/>
+            <w:color w:val="1F6B5E"/>
+            <w:sz w:val="26"/>
+            <w:szCs w:val="26"/>
+            <w:rFonts w:ascii="Calibri" w:cs="Calibri" w:eastAsia="Calibri" w:hAnsi="Calibri"/>
+          </w:rPr>
+          <w:t xml:space="preserve">Malijet</w:t>
+        </w:r>
+      </w:hyperlink>
+      <w:r>
+        <w:rPr>
+          <w:color w:val="1F2937"/>
+          <w:sz w:val="26"/>
+          <w:szCs w:val="26"/>
+          <w:rFonts w:ascii="Calibri" w:cs="Calibri" w:eastAsia="Calibri" w:hAnsi="Calibri"/>
+        </w:rPr>
+        <w:t xml:space="preserve"> — 22 octobre 2026, 16 h UTC</w:t>
+      </w:r>
+    </w:p>
+    <w:p>
+      <w:pPr>
+        <w:spacing w:before="160"/>
+        <w:ind w:left="360"/>
+      </w:pPr>
+      <w:r>
+        <w:rPr>
+          <w:color w:val="1F6B5E"/>
+          <w:sz w:val="28"/>
+          <w:szCs w:val="28"/>
+          <w:rFonts w:ascii="Calibri" w:cs="Calibri" w:eastAsia="Calibri" w:hAnsi="Calibri"/>
+        </w:rPr>
+        <w:t xml:space="preserve">❑  </w:t>
+      </w:r>
+      <w:r>
+        <w:rPr>
+          <w:b/>
+          <w:bCs/>
+          <w:u w:val="single"/>
+          <w:color w:val="1F6B5E"/>
+          <w:sz w:val="28"/>
+          <w:szCs w:val="28"/>
+          <w:rFonts w:ascii="Calibri" w:cs="Calibri" w:eastAsia="Calibri" w:hAnsi="Calibri"/>
+        </w:rPr>
+        <w:t xml:space="preserve">CYBERCRIMINALITÉ : INTERPOL DÉVOILE LE BILAN D’ENVERGURE DE L’OPÉRATION « SERENGETI III » EN AFRIQUE</w:t>
+      </w:r>
+    </w:p>
+    <w:p>
+      <w:pPr>
+        <w:ind w:left="720"/>
+      </w:pPr>
+      <w:r>
+        <w:rPr>
+          <w:color w:val="1F2937"/>
+          <w:sz w:val="26"/>
+          <w:szCs w:val="26"/>
+          <w:rFonts w:ascii="Calibri" w:cs="Calibri" w:eastAsia="Calibri" w:hAnsi="Calibri"/>
+        </w:rPr>
+        <w:t xml:space="preserve">▪  Source : </w:t>
+      </w:r>
+      <w:hyperlink w:history="1" r:id="rIdnujukfxqgvuuiy-_ftb9l">
+        <w:r>
+          <w:rPr>
+            <w:u w:val="single"/>
+            <w:color w:val="1F6B5E"/>
+            <w:sz w:val="26"/>
+            <w:szCs w:val="26"/>
+            <w:rFonts w:ascii="Calibri" w:cs="Calibri" w:eastAsia="Calibri" w:hAnsi="Calibri"/>
+          </w:rPr>
+          <w:t xml:space="preserve">Maliactu</w:t>
+        </w:r>
+      </w:hyperlink>
+      <w:r>
+        <w:rPr>
+          <w:color w:val="1F2937"/>
+          <w:sz w:val="26"/>
+          <w:szCs w:val="26"/>
+          <w:rFonts w:ascii="Calibri" w:cs="Calibri" w:eastAsia="Calibri" w:hAnsi="Calibri"/>
+        </w:rPr>
+        <w:t xml:space="preserve"> — 22 octobre 2026, 19 h UTC</w:t>
+      </w:r>
+    </w:p>
+    <w:p>
+      <w:pPr>
+        <w:spacing w:before="160"/>
+        <w:ind w:left="360"/>
+      </w:pPr>
+      <w:r>
+        <w:rPr>
+          <w:color w:val="1F6B5E"/>
+          <w:sz w:val="28"/>
+          <w:szCs w:val="28"/>
+          <w:rFonts w:ascii="Calibri" w:cs="Calibri" w:eastAsia="Calibri" w:hAnsi="Calibri"/>
+        </w:rPr>
+        <w:t xml:space="preserve">❑  </w:t>
+      </w:r>
+      <w:r>
+        <w:rPr>
+          <w:b/>
+          <w:bCs/>
+          <w:u w:val="single"/>
+          <w:color w:val="1F6B5E"/>
+          <w:sz w:val="28"/>
+          <w:szCs w:val="28"/>
+          <w:rFonts w:ascii="Calibri" w:cs="Calibri" w:eastAsia="Calibri" w:hAnsi="Calibri"/>
+        </w:rPr>
+        <w:t xml:space="preserve">MOPTI : LE PARI DU RETOUR AU PAYS, OU COMMENT 40 FAMILLES RÉINVENTENT LEUR AVENIR DANS LE CENTRE DU MALI</w:t>
+      </w:r>
+    </w:p>
+    <w:p>
+      <w:pPr>
+        <w:ind w:left="720"/>
+      </w:pPr>
+      <w:r>
+        <w:rPr>
+          <w:color w:val="1F2937"/>
+          <w:sz w:val="26"/>
+          <w:szCs w:val="26"/>
+          <w:rFonts w:ascii="Calibri" w:cs="Calibri" w:eastAsia="Calibri" w:hAnsi="Calibri"/>
+        </w:rPr>
+        <w:t xml:space="preserve">▪  Source : </w:t>
+      </w:r>
+      <w:hyperlink w:history="1" r:id="rIdx1navmrkubkrrxav5lasw">
+        <w:r>
+          <w:rPr>
+            <w:u w:val="single"/>
+            <w:color w:val="1F6B5E"/>
+            <w:sz w:val="26"/>
+            <w:szCs w:val="26"/>
+            <w:rFonts w:ascii="Calibri" w:cs="Calibri" w:eastAsia="Calibri" w:hAnsi="Calibri"/>
+          </w:rPr>
+          <w:t xml:space="preserve">Maliactu</w:t>
+        </w:r>
+      </w:hyperlink>
+      <w:r>
+        <w:rPr>
+          <w:color w:val="1F2937"/>
+          <w:sz w:val="26"/>
+          <w:szCs w:val="26"/>
+          <w:rFonts w:ascii="Calibri" w:cs="Calibri" w:eastAsia="Calibri" w:hAnsi="Calibri"/>
+        </w:rPr>
+        <w:t xml:space="preserve"> — 22 octobre 2026, 18 h UTC</w:t>
+      </w:r>
+    </w:p>
+    <w:p>
+      <w:pPr>
+        <w:spacing w:before="160"/>
+        <w:ind w:left="360"/>
+      </w:pPr>
+      <w:r>
+        <w:rPr>
+          <w:color w:val="1F6B5E"/>
+          <w:sz w:val="28"/>
+          <w:szCs w:val="28"/>
+          <w:rFonts w:ascii="Calibri" w:cs="Calibri" w:eastAsia="Calibri" w:hAnsi="Calibri"/>
+        </w:rPr>
+        <w:t xml:space="preserve">❑  </w:t>
+      </w:r>
+      <w:r>
+        <w:rPr>
+          <w:b/>
+          <w:bCs/>
+          <w:u w:val="single"/>
+          <w:color w:val="1F6B5E"/>
+          <w:sz w:val="28"/>
+          <w:szCs w:val="28"/>
+          <w:rFonts w:ascii="Calibri" w:cs="Calibri" w:eastAsia="Calibri" w:hAnsi="Calibri"/>
+        </w:rPr>
+        <w:t xml:space="preserve">MALI : LES RAISONS DES TENSIONS ENTRE ISMAËL WAGUÉ ET SÉKOU BOLLY</w:t>
+      </w:r>
+    </w:p>
+    <w:p>
+      <w:pPr>
+        <w:ind w:left="720"/>
+      </w:pPr>
+      <w:r>
+        <w:rPr>
+          <w:color w:val="1F2937"/>
+          <w:sz w:val="26"/>
+          <w:szCs w:val="26"/>
+          <w:rFonts w:ascii="Calibri" w:cs="Calibri" w:eastAsia="Calibri" w:hAnsi="Calibri"/>
+        </w:rPr>
+        <w:t xml:space="preserve">▪  Source : </w:t>
+      </w:r>
+      <w:hyperlink w:history="1" r:id="rIdaqdvsta9r0auiag07t2mi">
         <w:r>
           <w:rPr>
             <w:u w:val="single"/>
@@ -2854,703 +2192,7 @@
           <w:szCs w:val="26"/>
           <w:rFonts w:ascii="Calibri" w:cs="Calibri" w:eastAsia="Calibri" w:hAnsi="Calibri"/>
         </w:rPr>
-        <w:t xml:space="preserve"> — 20 octobre 2026, 16 h UTC</w:t>
-      </w:r>
-    </w:p>
-    <w:p>
-      <w:pPr>
-        <w:spacing w:before="160"/>
-        <w:ind w:left="360"/>
-      </w:pPr>
-      <w:r>
-        <w:rPr>
-          <w:color w:val="1F6B5E"/>
-          <w:sz w:val="28"/>
-          <w:szCs w:val="28"/>
-          <w:rFonts w:ascii="Calibri" w:cs="Calibri" w:eastAsia="Calibri" w:hAnsi="Calibri"/>
-        </w:rPr>
-        <w:t xml:space="preserve">❑  </w:t>
-      </w:r>
-      <w:r>
-        <w:rPr>
-          <w:b/>
-          <w:bCs/>
-          <w:u w:val="single"/>
-          <w:color w:val="1F6B5E"/>
-          <w:sz w:val="28"/>
-          <w:szCs w:val="28"/>
-          <w:rFonts w:ascii="Calibri" w:cs="Calibri" w:eastAsia="Calibri" w:hAnsi="Calibri"/>
-        </w:rPr>
-        <w:t xml:space="preserve">MALI : UNE QUARANTAINE DE CIVILS TUÉE DANS UN CAMP DANS LA RÉGION DE MENAKA</w:t>
-      </w:r>
-    </w:p>
-    <w:p>
-      <w:pPr>
-        <w:ind w:left="720"/>
-      </w:pPr>
-      <w:r>
-        <w:rPr>
-          <w:color w:val="1F2937"/>
-          <w:sz w:val="26"/>
-          <w:szCs w:val="26"/>
-          <w:rFonts w:ascii="Calibri" w:cs="Calibri" w:eastAsia="Calibri" w:hAnsi="Calibri"/>
-        </w:rPr>
-        <w:t xml:space="preserve">▪  Source : </w:t>
-      </w:r>
-      <w:hyperlink w:history="1" r:id="rIdi8_g6cfl1ecjrwrjxrb3i">
-        <w:r>
-          <w:rPr>
-            <w:u w:val="single"/>
-            <w:color w:val="1F6B5E"/>
-            <w:sz w:val="26"/>
-            <w:szCs w:val="26"/>
-            <w:rFonts w:ascii="Calibri" w:cs="Calibri" w:eastAsia="Calibri" w:hAnsi="Calibri"/>
-          </w:rPr>
-          <w:t xml:space="preserve">fr.saharamedias.net</w:t>
-        </w:r>
-      </w:hyperlink>
-      <w:r>
-        <w:rPr>
-          <w:color w:val="1F2937"/>
-          <w:sz w:val="26"/>
-          <w:szCs w:val="26"/>
-          <w:rFonts w:ascii="Calibri" w:cs="Calibri" w:eastAsia="Calibri" w:hAnsi="Calibri"/>
-        </w:rPr>
-        <w:t xml:space="preserve"> — 20 octobre 2026, 14 h UTC</w:t>
-      </w:r>
-    </w:p>
-    <w:p>
-      <w:pPr>
-        <w:spacing w:before="160"/>
-        <w:ind w:left="360"/>
-      </w:pPr>
-      <w:r>
-        <w:rPr>
-          <w:color w:val="1F6B5E"/>
-          <w:sz w:val="28"/>
-          <w:szCs w:val="28"/>
-          <w:rFonts w:ascii="Calibri" w:cs="Calibri" w:eastAsia="Calibri" w:hAnsi="Calibri"/>
-        </w:rPr>
-        <w:t xml:space="preserve">❑  </w:t>
-      </w:r>
-      <w:r>
-        <w:rPr>
-          <w:b/>
-          <w:bCs/>
-          <w:u w:val="single"/>
-          <w:color w:val="1F6B5E"/>
-          <w:sz w:val="28"/>
-          <w:szCs w:val="28"/>
-          <w:rFonts w:ascii="Calibri" w:cs="Calibri" w:eastAsia="Calibri" w:hAnsi="Calibri"/>
-        </w:rPr>
-        <w:t xml:space="preserve">OPÉRATION DOUGOUKOLOKO : PLUSIEURS ÉLÉMENTS TERRORISTES NEUTRALISÉS DANS LA FORÊT DE OUAGADOU</w:t>
-      </w:r>
-    </w:p>
-    <w:p>
-      <w:pPr>
-        <w:ind w:left="720"/>
-      </w:pPr>
-      <w:r>
-        <w:rPr>
-          <w:color w:val="1F2937"/>
-          <w:sz w:val="26"/>
-          <w:szCs w:val="26"/>
-          <w:rFonts w:ascii="Calibri" w:cs="Calibri" w:eastAsia="Calibri" w:hAnsi="Calibri"/>
-        </w:rPr>
-        <w:t xml:space="preserve">▪  Source : </w:t>
-      </w:r>
-      <w:hyperlink w:history="1" r:id="rIdkmpshhvm9x2jf97qtf5hf">
-        <w:r>
-          <w:rPr>
-            <w:u w:val="single"/>
-            <w:color w:val="1F6B5E"/>
-            <w:sz w:val="26"/>
-            <w:szCs w:val="26"/>
-            <w:rFonts w:ascii="Calibri" w:cs="Calibri" w:eastAsia="Calibri" w:hAnsi="Calibri"/>
-          </w:rPr>
-          <w:t xml:space="preserve">AMAP — Agence Malienne Presse</w:t>
-        </w:r>
-      </w:hyperlink>
-      <w:r>
-        <w:rPr>
-          <w:color w:val="1F2937"/>
-          <w:sz w:val="26"/>
-          <w:szCs w:val="26"/>
-          <w:rFonts w:ascii="Calibri" w:cs="Calibri" w:eastAsia="Calibri" w:hAnsi="Calibri"/>
-        </w:rPr>
-        <w:t xml:space="preserve"> — 21 octobre 2026, 11 h UTC</w:t>
-      </w:r>
-    </w:p>
-    <w:p>
-      <w:pPr>
-        <w:spacing w:before="160"/>
-        <w:ind w:left="360"/>
-      </w:pPr>
-      <w:r>
-        <w:rPr>
-          <w:color w:val="1F6B5E"/>
-          <w:sz w:val="28"/>
-          <w:szCs w:val="28"/>
-          <w:rFonts w:ascii="Calibri" w:cs="Calibri" w:eastAsia="Calibri" w:hAnsi="Calibri"/>
-        </w:rPr>
-        <w:t xml:space="preserve">❑  </w:t>
-      </w:r>
-      <w:r>
-        <w:rPr>
-          <w:b/>
-          <w:bCs/>
-          <w:u w:val="single"/>
-          <w:color w:val="1F6B5E"/>
-          <w:sz w:val="28"/>
-          <w:szCs w:val="28"/>
-          <w:rFonts w:ascii="Calibri" w:cs="Calibri" w:eastAsia="Calibri" w:hAnsi="Calibri"/>
-        </w:rPr>
-        <w:t xml:space="preserve">JUSTICE À MOPTI : SÉVICES GRAVES, PÉDOPHILIE ET TRAFIC D’ARMES AU RÔLE DU TRIBUNAL MILITAIRE</w:t>
-      </w:r>
-    </w:p>
-    <w:p>
-      <w:pPr>
-        <w:ind w:left="720"/>
-      </w:pPr>
-      <w:r>
-        <w:rPr>
-          <w:color w:val="1F2937"/>
-          <w:sz w:val="26"/>
-          <w:szCs w:val="26"/>
-          <w:rFonts w:ascii="Calibri" w:cs="Calibri" w:eastAsia="Calibri" w:hAnsi="Calibri"/>
-        </w:rPr>
-        <w:t xml:space="preserve">▪  Source : </w:t>
-      </w:r>
-      <w:hyperlink w:history="1" r:id="rIddfmyypmhzosk9u-xegnhz">
-        <w:r>
-          <w:rPr>
-            <w:u w:val="single"/>
-            <w:color w:val="1F6B5E"/>
-            <w:sz w:val="26"/>
-            <w:szCs w:val="26"/>
-            <w:rFonts w:ascii="Calibri" w:cs="Calibri" w:eastAsia="Calibri" w:hAnsi="Calibri"/>
-          </w:rPr>
-          <w:t xml:space="preserve">Maliactu</w:t>
-        </w:r>
-      </w:hyperlink>
-      <w:r>
-        <w:rPr>
-          <w:color w:val="1F2937"/>
-          <w:sz w:val="26"/>
-          <w:szCs w:val="26"/>
-          <w:rFonts w:ascii="Calibri" w:cs="Calibri" w:eastAsia="Calibri" w:hAnsi="Calibri"/>
-        </w:rPr>
-        <w:t xml:space="preserve"> — 21 octobre 2026, 11 h UTC</w:t>
-      </w:r>
-    </w:p>
-    <w:p>
-      <w:pPr>
-        <w:pageBreakBefore/>
-        <w:spacing w:after="0" w:before="0"/>
-        <w:rPr>
-          <w:sz w:val="2"/>
-          <w:szCs w:val="2"/>
-        </w:rPr>
-      </w:pPr>
-    </w:p>
-    <w:tbl>
-      <w:tblPr>
-        <w:tblW w:type="dxa" w:w="17680"/>
-        <w:tblBorders>
-          <w:top w:val="single" w:color="auto" w:sz="4"/>
-          <w:left w:val="single" w:color="auto" w:sz="4"/>
-          <w:bottom w:val="single" w:color="auto" w:sz="4"/>
-          <w:right w:val="single" w:color="auto" w:sz="4"/>
-          <w:insideH w:val="single" w:color="auto" w:sz="4"/>
-          <w:insideV w:val="single" w:color="auto" w:sz="4"/>
-        </w:tblBorders>
-      </w:tblPr>
-      <w:tblGrid>
-        <w:gridCol w:w="1000"/>
-        <w:gridCol w:w="15180"/>
-        <w:gridCol w:w="1500"/>
-      </w:tblGrid>
-      <w:tr>
-        <w:tc>
-          <w:tcPr>
-            <w:tcW w:type="dxa" w:w="1000"/>
-            <w:tcBorders>
-              <w:top w:val="none" w:color="FFFFFF" w:sz="0"/>
-              <w:left w:val="none" w:color="FFFFFF" w:sz="0"/>
-              <w:bottom w:val="none" w:color="FFFFFF" w:sz="0"/>
-              <w:right w:val="none" w:color="FFFFFF" w:sz="0"/>
-            </w:tcBorders>
-            <w:shd w:fill="1F6B5E" w:color="auto" w:val="clear"/>
-            <w:vAlign w:val="center"/>
-          </w:tcPr>
-          <w:p>
-            <w:pPr>
-              <w:jc w:val="center"/>
-            </w:pPr>
-            <w:r>
-              <w:rPr>
-                <w:color w:val="FFFFFF"/>
-                <w:sz w:val="44"/>
-                <w:szCs w:val="44"/>
-                <w:rFonts w:ascii="Arial Narrow" w:cs="Arial Narrow" w:eastAsia="Arial Narrow" w:hAnsi="Arial Narrow"/>
-              </w:rPr>
-              <w:t xml:space="preserve">II</w:t>
-            </w:r>
-          </w:p>
-        </w:tc>
-        <w:tc>
-          <w:tcPr>
-            <w:tcW w:type="dxa" w:w="15180"/>
-            <w:tcBorders>
-              <w:top w:val="none" w:color="FFFFFF" w:sz="0"/>
-              <w:left w:val="none" w:color="FFFFFF" w:sz="0"/>
-              <w:bottom w:val="none" w:color="FFFFFF" w:sz="0"/>
-              <w:right w:val="none" w:color="FFFFFF" w:sz="0"/>
-            </w:tcBorders>
-            <w:vAlign w:val="center"/>
-          </w:tcPr>
-          <w:p>
-            <w:pPr>
-              <w:ind w:left="200"/>
-            </w:pPr>
-            <w:r>
-              <w:rPr>
-                <w:color w:val="1F6B5E"/>
-                <w:sz w:val="56"/>
-                <w:szCs w:val="56"/>
-                <w:rFonts w:ascii="Arial Narrow" w:cs="Arial Narrow" w:eastAsia="Arial Narrow" w:hAnsi="Arial Narrow"/>
-              </w:rPr>
-              <w:t xml:space="preserve">Mali</w:t>
-            </w:r>
-          </w:p>
-        </w:tc>
-        <w:tc>
-          <w:tcPr>
-            <w:tcW w:type="dxa" w:w="1500"/>
-            <w:tcBorders>
-              <w:top w:val="none" w:color="FFFFFF" w:sz="0"/>
-              <w:left w:val="none" w:color="FFFFFF" w:sz="0"/>
-              <w:bottom w:val="none" w:color="FFFFFF" w:sz="0"/>
-              <w:right w:val="none" w:color="FFFFFF" w:sz="0"/>
-            </w:tcBorders>
-            <w:vAlign w:val="center"/>
-          </w:tcPr>
-          <w:tbl>
-            <w:tblPr>
-              <w:tblW w:type="dxa" w:w="1200"/>
-              <w:tblBorders>
-                <w:top w:val="single" w:color="auto" w:sz="4"/>
-                <w:left w:val="single" w:color="auto" w:sz="4"/>
-                <w:bottom w:val="single" w:color="auto" w:sz="4"/>
-                <w:right w:val="single" w:color="auto" w:sz="4"/>
-                <w:insideH w:val="single" w:color="auto" w:sz="4"/>
-                <w:insideV w:val="single" w:color="auto" w:sz="4"/>
-              </w:tblBorders>
-            </w:tblPr>
-            <w:tblGrid>
-              <w:gridCol w:w="400"/>
-              <w:gridCol w:w="400"/>
-              <w:gridCol w:w="400"/>
-            </w:tblGrid>
-            <w:tr>
-              <w:trPr>
-                <w:trHeight w:val="600" w:hRule="exact"/>
-              </w:trPr>
-              <w:tc>
-                <w:tcPr>
-                  <w:tcW w:type="dxa" w:w="400"/>
-                  <w:tcBorders>
-                    <w:top w:val="single" w:color="1F2937" w:sz="6"/>
-                    <w:left w:val="single" w:color="1F2937" w:sz="6"/>
-                    <w:bottom w:val="single" w:color="1F2937" w:sz="6"/>
-                    <w:right w:val="single" w:color="1F2937" w:sz="6"/>
-                  </w:tcBorders>
-                  <w:shd w:fill="14B53A" w:color="auto" w:val="clear"/>
-                </w:tcPr>
-                <w:p>
-                  <w:r>
-                    <w:rPr>
-                      <w:color w:val="1F2937"/>
-                      <w:sz w:val="2"/>
-                      <w:szCs w:val="2"/>
-                      <w:rFonts w:ascii="Calibri" w:cs="Calibri" w:eastAsia="Calibri" w:hAnsi="Calibri"/>
-                    </w:rPr>
-                  </w:r>
-                </w:p>
-              </w:tc>
-              <w:tc>
-                <w:tcPr>
-                  <w:tcW w:type="dxa" w:w="400"/>
-                  <w:tcBorders>
-                    <w:top w:val="single" w:color="1F2937" w:sz="6"/>
-                    <w:left w:val="single" w:color="1F2937" w:sz="6"/>
-                    <w:bottom w:val="single" w:color="1F2937" w:sz="6"/>
-                    <w:right w:val="single" w:color="1F2937" w:sz="6"/>
-                  </w:tcBorders>
-                  <w:shd w:fill="FCD116" w:color="auto" w:val="clear"/>
-                </w:tcPr>
-                <w:p>
-                  <w:r>
-                    <w:rPr>
-                      <w:color w:val="1F2937"/>
-                      <w:sz w:val="2"/>
-                      <w:szCs w:val="2"/>
-                      <w:rFonts w:ascii="Calibri" w:cs="Calibri" w:eastAsia="Calibri" w:hAnsi="Calibri"/>
-                    </w:rPr>
-                  </w:r>
-                </w:p>
-              </w:tc>
-              <w:tc>
-                <w:tcPr>
-                  <w:tcW w:type="dxa" w:w="400"/>
-                  <w:tcBorders>
-                    <w:top w:val="single" w:color="1F2937" w:sz="6"/>
-                    <w:left w:val="single" w:color="1F2937" w:sz="6"/>
-                    <w:bottom w:val="single" w:color="1F2937" w:sz="6"/>
-                    <w:right w:val="single" w:color="1F2937" w:sz="6"/>
-                  </w:tcBorders>
-                  <w:shd w:fill="CE1126" w:color="auto" w:val="clear"/>
-                </w:tcPr>
-                <w:p>
-                  <w:r>
-                    <w:rPr>
-                      <w:color w:val="1F2937"/>
-                      <w:sz w:val="2"/>
-                      <w:szCs w:val="2"/>
-                      <w:rFonts w:ascii="Calibri" w:cs="Calibri" w:eastAsia="Calibri" w:hAnsi="Calibri"/>
-                    </w:rPr>
-                  </w:r>
-                </w:p>
-              </w:tc>
-            </w:tr>
-          </w:tbl>
-          <w:p/>
-        </w:tc>
-      </w:tr>
-    </w:tbl>
-    <w:p>
-      <w:pPr>
-        <w:pBdr>
-          <w:bottom w:val="single" w:color="A3A3A3" w:sz="4" w:space="1"/>
-        </w:pBdr>
-      </w:pPr>
-      <w:r>
-        <w:rPr>
-          <w:color w:val="1F2937"/>
-          <w:sz w:val="12"/>
-          <w:szCs w:val="12"/>
-          <w:rFonts w:ascii="Calibri" w:cs="Calibri" w:eastAsia="Calibri" w:hAnsi="Calibri"/>
-        </w:rPr>
-      </w:r>
-    </w:p>
-    <w:p>
-      <w:pPr>
-        <w:spacing w:before="160"/>
-        <w:ind w:left="360"/>
-      </w:pPr>
-      <w:r>
-        <w:rPr>
-          <w:color w:val="1F6B5E"/>
-          <w:sz w:val="28"/>
-          <w:szCs w:val="28"/>
-          <w:rFonts w:ascii="Calibri" w:cs="Calibri" w:eastAsia="Calibri" w:hAnsi="Calibri"/>
-        </w:rPr>
-        <w:t xml:space="preserve">❑  </w:t>
-      </w:r>
-      <w:r>
-        <w:rPr>
-          <w:b/>
-          <w:bCs/>
-          <w:u w:val="single"/>
-          <w:color w:val="1F6B5E"/>
-          <w:sz w:val="28"/>
-          <w:szCs w:val="28"/>
-          <w:rFonts w:ascii="Calibri" w:cs="Calibri" w:eastAsia="Calibri" w:hAnsi="Calibri"/>
-        </w:rPr>
-        <w:t xml:space="preserve">OFFENSIVE AGROPASTORALE : LE PREMIER MINISTRE LANCE L’AMÉNAGEMENT DE 50000 HECTARES IRRIGUÉS</w:t>
-      </w:r>
-    </w:p>
-    <w:p>
-      <w:pPr>
-        <w:ind w:left="720"/>
-      </w:pPr>
-      <w:r>
-        <w:rPr>
-          <w:color w:val="1F2937"/>
-          <w:sz w:val="26"/>
-          <w:szCs w:val="26"/>
-          <w:rFonts w:ascii="Calibri" w:cs="Calibri" w:eastAsia="Calibri" w:hAnsi="Calibri"/>
-        </w:rPr>
-        <w:t xml:space="preserve">▪  Source : </w:t>
-      </w:r>
-      <w:hyperlink w:history="1" r:id="rId67k9qrssiukwokdnljev1">
-        <w:r>
-          <w:rPr>
-            <w:u w:val="single"/>
-            <w:color w:val="1F6B5E"/>
-            <w:sz w:val="26"/>
-            <w:szCs w:val="26"/>
-            <w:rFonts w:ascii="Calibri" w:cs="Calibri" w:eastAsia="Calibri" w:hAnsi="Calibri"/>
-          </w:rPr>
-          <w:t xml:space="preserve">Mali 24</w:t>
-        </w:r>
-      </w:hyperlink>
-      <w:r>
-        <w:rPr>
-          <w:color w:val="1F2937"/>
-          <w:sz w:val="26"/>
-          <w:szCs w:val="26"/>
-          <w:rFonts w:ascii="Calibri" w:cs="Calibri" w:eastAsia="Calibri" w:hAnsi="Calibri"/>
-        </w:rPr>
-        <w:t xml:space="preserve"> — 21 octobre 2026, 10 h UTC</w:t>
-      </w:r>
-    </w:p>
-    <w:p>
-      <w:pPr>
-        <w:spacing w:before="160"/>
-        <w:ind w:left="360"/>
-      </w:pPr>
-      <w:r>
-        <w:rPr>
-          <w:color w:val="1F6B5E"/>
-          <w:sz w:val="28"/>
-          <w:szCs w:val="28"/>
-          <w:rFonts w:ascii="Calibri" w:cs="Calibri" w:eastAsia="Calibri" w:hAnsi="Calibri"/>
-        </w:rPr>
-        <w:t xml:space="preserve">❑  </w:t>
-      </w:r>
-      <w:r>
-        <w:rPr>
-          <w:b/>
-          <w:bCs/>
-          <w:u w:val="single"/>
-          <w:color w:val="1F6B5E"/>
-          <w:sz w:val="28"/>
-          <w:szCs w:val="28"/>
-          <w:rFonts w:ascii="Calibri" w:cs="Calibri" w:eastAsia="Calibri" w:hAnsi="Calibri"/>
-        </w:rPr>
-        <w:t xml:space="preserve">MALI : 20 AGENTS DU CECOGEC FORMÉS À LA SÉCURISATION DES COMMUNICATIONS</w:t>
-      </w:r>
-    </w:p>
-    <w:p>
-      <w:pPr>
-        <w:ind w:left="720"/>
-      </w:pPr>
-      <w:r>
-        <w:rPr>
-          <w:color w:val="1F2937"/>
-          <w:sz w:val="26"/>
-          <w:szCs w:val="26"/>
-          <w:rFonts w:ascii="Calibri" w:cs="Calibri" w:eastAsia="Calibri" w:hAnsi="Calibri"/>
-        </w:rPr>
-        <w:t xml:space="preserve">▪  Source : </w:t>
-      </w:r>
-      <w:hyperlink w:history="1" r:id="rIdpytdmpcwyryqo0g1isdt-">
-        <w:r>
-          <w:rPr>
-            <w:u w:val="single"/>
-            <w:color w:val="1F6B5E"/>
-            <w:sz w:val="26"/>
-            <w:szCs w:val="26"/>
-            <w:rFonts w:ascii="Calibri" w:cs="Calibri" w:eastAsia="Calibri" w:hAnsi="Calibri"/>
-          </w:rPr>
-          <w:t xml:space="preserve">Malijet</w:t>
-        </w:r>
-      </w:hyperlink>
-      <w:r>
-        <w:rPr>
-          <w:color w:val="1F2937"/>
-          <w:sz w:val="26"/>
-          <w:szCs w:val="26"/>
-          <w:rFonts w:ascii="Calibri" w:cs="Calibri" w:eastAsia="Calibri" w:hAnsi="Calibri"/>
-        </w:rPr>
-        <w:t xml:space="preserve"> — 21 octobre 2026, 11 h UTC</w:t>
-      </w:r>
-    </w:p>
-    <w:p>
-      <w:pPr>
-        <w:spacing w:before="160"/>
-        <w:ind w:left="360"/>
-      </w:pPr>
-      <w:r>
-        <w:rPr>
-          <w:color w:val="1F6B5E"/>
-          <w:sz w:val="28"/>
-          <w:szCs w:val="28"/>
-          <w:rFonts w:ascii="Calibri" w:cs="Calibri" w:eastAsia="Calibri" w:hAnsi="Calibri"/>
-        </w:rPr>
-        <w:t xml:space="preserve">❑  </w:t>
-      </w:r>
-      <w:r>
-        <w:rPr>
-          <w:b/>
-          <w:bCs/>
-          <w:u w:val="single"/>
-          <w:color w:val="1F6B5E"/>
-          <w:sz w:val="28"/>
-          <w:szCs w:val="28"/>
-          <w:rFonts w:ascii="Calibri" w:cs="Calibri" w:eastAsia="Calibri" w:hAnsi="Calibri"/>
-        </w:rPr>
-        <w:t xml:space="preserve">MALI : UN COLLOQUE INTERNATIONAL SUR LE RÔLE DU JUGE CONSTITUTIONNEL DANS LA REFONDATION DE L’ÉTAT</w:t>
-      </w:r>
-    </w:p>
-    <w:p>
-      <w:pPr>
-        <w:ind w:left="720"/>
-      </w:pPr>
-      <w:r>
-        <w:rPr>
-          <w:color w:val="1F2937"/>
-          <w:sz w:val="26"/>
-          <w:szCs w:val="26"/>
-          <w:rFonts w:ascii="Calibri" w:cs="Calibri" w:eastAsia="Calibri" w:hAnsi="Calibri"/>
-        </w:rPr>
-        <w:t xml:space="preserve">▪  Source : </w:t>
-      </w:r>
-      <w:hyperlink w:history="1" r:id="rIdlzwav5kto_o_v-ex5bwct">
-        <w:r>
-          <w:rPr>
-            <w:u w:val="single"/>
-            <w:color w:val="1F6B5E"/>
-            <w:sz w:val="26"/>
-            <w:szCs w:val="26"/>
-            <w:rFonts w:ascii="Calibri" w:cs="Calibri" w:eastAsia="Calibri" w:hAnsi="Calibri"/>
-          </w:rPr>
-          <w:t xml:space="preserve">Malijet</w:t>
-        </w:r>
-      </w:hyperlink>
-      <w:r>
-        <w:rPr>
-          <w:color w:val="1F2937"/>
-          <w:sz w:val="26"/>
-          <w:szCs w:val="26"/>
-          <w:rFonts w:ascii="Calibri" w:cs="Calibri" w:eastAsia="Calibri" w:hAnsi="Calibri"/>
-        </w:rPr>
-        <w:t xml:space="preserve"> — 20 octobre 2026, 20 h UTC</w:t>
-      </w:r>
-    </w:p>
-    <w:p>
-      <w:pPr>
-        <w:spacing w:before="160"/>
-        <w:ind w:left="360"/>
-      </w:pPr>
-      <w:r>
-        <w:rPr>
-          <w:color w:val="1F6B5E"/>
-          <w:sz w:val="28"/>
-          <w:szCs w:val="28"/>
-          <w:rFonts w:ascii="Calibri" w:cs="Calibri" w:eastAsia="Calibri" w:hAnsi="Calibri"/>
-        </w:rPr>
-        <w:t xml:space="preserve">❑  </w:t>
-      </w:r>
-      <w:r>
-        <w:rPr>
-          <w:b/>
-          <w:bCs/>
-          <w:u w:val="single"/>
-          <w:color w:val="1F6B5E"/>
-          <w:sz w:val="28"/>
-          <w:szCs w:val="28"/>
-          <w:rFonts w:ascii="Calibri" w:cs="Calibri" w:eastAsia="Calibri" w:hAnsi="Calibri"/>
-        </w:rPr>
-        <w:t xml:space="preserve">CESEC : LA 6ᵉ MANDATURE EXAMINE LE BILAN QUINQUENNAL</w:t>
-      </w:r>
-    </w:p>
-    <w:p>
-      <w:pPr>
-        <w:ind w:left="720"/>
-      </w:pPr>
-      <w:r>
-        <w:rPr>
-          <w:color w:val="1F2937"/>
-          <w:sz w:val="26"/>
-          <w:szCs w:val="26"/>
-          <w:rFonts w:ascii="Calibri" w:cs="Calibri" w:eastAsia="Calibri" w:hAnsi="Calibri"/>
-        </w:rPr>
-        <w:t xml:space="preserve">▪  Source : </w:t>
-      </w:r>
-      <w:hyperlink w:history="1" r:id="rIdxu80bjb_thl9ljhb7ttco">
-        <w:r>
-          <w:rPr>
-            <w:u w:val="single"/>
-            <w:color w:val="1F6B5E"/>
-            <w:sz w:val="26"/>
-            <w:szCs w:val="26"/>
-            <w:rFonts w:ascii="Calibri" w:cs="Calibri" w:eastAsia="Calibri" w:hAnsi="Calibri"/>
-          </w:rPr>
-          <w:t xml:space="preserve">AMAP — Agence Malienne Presse</w:t>
-        </w:r>
-      </w:hyperlink>
-      <w:r>
-        <w:rPr>
-          <w:color w:val="1F2937"/>
-          <w:sz w:val="26"/>
-          <w:szCs w:val="26"/>
-          <w:rFonts w:ascii="Calibri" w:cs="Calibri" w:eastAsia="Calibri" w:hAnsi="Calibri"/>
-        </w:rPr>
-        <w:t xml:space="preserve"> — 20 octobre 2026, 19 h UTC</w:t>
-      </w:r>
-    </w:p>
-    <w:p>
-      <w:pPr>
-        <w:spacing w:before="160"/>
-        <w:ind w:left="360"/>
-      </w:pPr>
-      <w:r>
-        <w:rPr>
-          <w:color w:val="1F6B5E"/>
-          <w:sz w:val="28"/>
-          <w:szCs w:val="28"/>
-          <w:rFonts w:ascii="Calibri" w:cs="Calibri" w:eastAsia="Calibri" w:hAnsi="Calibri"/>
-        </w:rPr>
-        <w:t xml:space="preserve">❑  </w:t>
-      </w:r>
-      <w:r>
-        <w:rPr>
-          <w:b/>
-          <w:bCs/>
-          <w:u w:val="single"/>
-          <w:color w:val="1F6B5E"/>
-          <w:sz w:val="28"/>
-          <w:szCs w:val="28"/>
-          <w:rFonts w:ascii="Calibri" w:cs="Calibri" w:eastAsia="Calibri" w:hAnsi="Calibri"/>
-        </w:rPr>
-        <w:t xml:space="preserve">VIOLENCES DANS LE CENTRE DU PAYS - « NOUS AVONS FUI EN PIROGUE AU MILIEU DE LA NUIT »</w:t>
-      </w:r>
-    </w:p>
-    <w:p>
-      <w:pPr>
-        <w:ind w:left="720"/>
-      </w:pPr>
-      <w:r>
-        <w:rPr>
-          <w:color w:val="1F2937"/>
-          <w:sz w:val="26"/>
-          <w:szCs w:val="26"/>
-          <w:rFonts w:ascii="Calibri" w:cs="Calibri" w:eastAsia="Calibri" w:hAnsi="Calibri"/>
-        </w:rPr>
-        <w:t xml:space="preserve">▪  Source : </w:t>
-      </w:r>
-      <w:hyperlink w:history="1" r:id="rIdbcreq8kxmjnawwvdzr02n">
-        <w:r>
-          <w:rPr>
-            <w:u w:val="single"/>
-            <w:color w:val="1F6B5E"/>
-            <w:sz w:val="26"/>
-            <w:szCs w:val="26"/>
-            <w:rFonts w:ascii="Calibri" w:cs="Calibri" w:eastAsia="Calibri" w:hAnsi="Calibri"/>
-          </w:rPr>
-          <w:t xml:space="preserve">AllAfrica (ML)</w:t>
-        </w:r>
-      </w:hyperlink>
-      <w:r>
-        <w:rPr>
-          <w:color w:val="1F2937"/>
-          <w:sz w:val="26"/>
-          <w:szCs w:val="26"/>
-          <w:rFonts w:ascii="Calibri" w:cs="Calibri" w:eastAsia="Calibri" w:hAnsi="Calibri"/>
-        </w:rPr>
-        <w:t xml:space="preserve"> — 20 octobre 2026, 15 h UTC</w:t>
+        <w:t xml:space="preserve"> — 22 octobre 2026, 7 h UTC</w:t>
       </w:r>
     </w:p>
     <w:p>
@@ -3785,7 +2427,7 @@
           <w:szCs w:val="28"/>
           <w:rFonts w:ascii="Calibri" w:cs="Calibri" w:eastAsia="Calibri" w:hAnsi="Calibri"/>
         </w:rPr>
-        <w:t xml:space="preserve">DIFFA : VND/NUR, DES RIVES DU LAC TCHAD À L’ACTION HUMANITAIRE, LA RÉSILIENCE, LA PAIX ET LE DÉVELOPPEMENT.</w:t>
+        <w:t xml:space="preserve">SWISS AND AUSTRIAN WOMEN IN LIBYA AFTER RELEASE FROM NIGER KIDNAP ORDEAL</w:t>
       </w:r>
     </w:p>
     <w:p>
@@ -3801,7 +2443,69 @@
         </w:rPr>
         <w:t xml:space="preserve">▪  Source : </w:t>
       </w:r>
-      <w:hyperlink w:history="1" r:id="rIdwhejgcwdk6zod7rbek2oa">
+      <w:hyperlink w:history="1" r:id="rId9mkidn4wafzyedvb_-zwj">
+        <w:r>
+          <w:rPr>
+            <w:u w:val="single"/>
+            <w:color w:val="1F6B5E"/>
+            <w:sz w:val="26"/>
+            <w:szCs w:val="26"/>
+            <w:rFonts w:ascii="Calibri" w:cs="Calibri" w:eastAsia="Calibri" w:hAnsi="Calibri"/>
+          </w:rPr>
+          <w:t xml:space="preserve">Africanews</w:t>
+        </w:r>
+      </w:hyperlink>
+      <w:r>
+        <w:rPr>
+          <w:color w:val="1F2937"/>
+          <w:sz w:val="26"/>
+          <w:szCs w:val="26"/>
+          <w:rFonts w:ascii="Calibri" w:cs="Calibri" w:eastAsia="Calibri" w:hAnsi="Calibri"/>
+        </w:rPr>
+        <w:t xml:space="preserve"> — 22 octobre 2026, 16 h UTC</w:t>
+      </w:r>
+    </w:p>
+    <w:p>
+      <w:pPr>
+        <w:spacing w:before="160"/>
+        <w:ind w:left="360"/>
+      </w:pPr>
+      <w:r>
+        <w:rPr>
+          <w:color w:val="1F6B5E"/>
+          <w:sz w:val="28"/>
+          <w:szCs w:val="28"/>
+          <w:rFonts w:ascii="Calibri" w:cs="Calibri" w:eastAsia="Calibri" w:hAnsi="Calibri"/>
+        </w:rPr>
+        <w:t xml:space="preserve">❑  </w:t>
+      </w:r>
+      <w:r>
+        <w:rPr>
+          <w:b/>
+          <w:bCs/>
+          <w:u w:val="single"/>
+          <w:color w:val="1F6B5E"/>
+          <w:sz w:val="28"/>
+          <w:szCs w:val="28"/>
+          <w:rFonts w:ascii="Calibri" w:cs="Calibri" w:eastAsia="Calibri" w:hAnsi="Calibri"/>
+        </w:rPr>
+        <w:t xml:space="preserve">PROJET DE GESTION DURABLE DES DÉCHETS ET DE RÉDUCTION DES POLLUANTS : LA BOAD ÉVALUE À NIAMEY L’ÉTAT D’AVANCEMENT DE L’ÉXECUTION DU PROJET</w:t>
+      </w:r>
+    </w:p>
+    <w:p>
+      <w:pPr>
+        <w:ind w:left="720"/>
+      </w:pPr>
+      <w:r>
+        <w:rPr>
+          <w:color w:val="1F2937"/>
+          <w:sz w:val="26"/>
+          <w:szCs w:val="26"/>
+          <w:rFonts w:ascii="Calibri" w:cs="Calibri" w:eastAsia="Calibri" w:hAnsi="Calibri"/>
+        </w:rPr>
+        <w:t xml:space="preserve">▪  Source : </w:t>
+      </w:r>
+      <w:hyperlink w:history="1" r:id="rIdkhvocdegh5hhtr5y-ydz0">
         <w:r>
           <w:rPr>
             <w:u w:val="single"/>
@@ -3820,7 +2524,193 @@
           <w:szCs w:val="26"/>
           <w:rFonts w:ascii="Calibri" w:cs="Calibri" w:eastAsia="Calibri" w:hAnsi="Calibri"/>
         </w:rPr>
-        <w:t xml:space="preserve"> — 20 octobre 2026, 22 h UTC</w:t>
+        <w:t xml:space="preserve"> — 22 octobre 2026, 15 h UTC</w:t>
+      </w:r>
+    </w:p>
+    <w:p>
+      <w:pPr>
+        <w:spacing w:before="160"/>
+        <w:ind w:left="360"/>
+      </w:pPr>
+      <w:r>
+        <w:rPr>
+          <w:color w:val="1F6B5E"/>
+          <w:sz w:val="28"/>
+          <w:szCs w:val="28"/>
+          <w:rFonts w:ascii="Calibri" w:cs="Calibri" w:eastAsia="Calibri" w:hAnsi="Calibri"/>
+        </w:rPr>
+        <w:t xml:space="preserve">❑  </w:t>
+      </w:r>
+      <w:r>
+        <w:rPr>
+          <w:b/>
+          <w:bCs/>
+          <w:u w:val="single"/>
+          <w:color w:val="1F6B5E"/>
+          <w:sz w:val="28"/>
+          <w:szCs w:val="28"/>
+          <w:rFonts w:ascii="Calibri" w:cs="Calibri" w:eastAsia="Calibri" w:hAnsi="Calibri"/>
+        </w:rPr>
+        <w:t xml:space="preserve">NIGER : LE PRÉSIDENT DE LA RÉPUBLIQUE PRÉSIDE LA CÉRÉMONIE OFFICIELLE DE LA RENTRÉE JUDICAIRE 2026-2027</w:t>
+      </w:r>
+    </w:p>
+    <w:p>
+      <w:pPr>
+        <w:ind w:left="720"/>
+      </w:pPr>
+      <w:r>
+        <w:rPr>
+          <w:color w:val="1F2937"/>
+          <w:sz w:val="26"/>
+          <w:szCs w:val="26"/>
+          <w:rFonts w:ascii="Calibri" w:cs="Calibri" w:eastAsia="Calibri" w:hAnsi="Calibri"/>
+        </w:rPr>
+        <w:t xml:space="preserve">▪  Source : </w:t>
+      </w:r>
+      <w:hyperlink w:history="1" r:id="rIdq8swnc4vvcav0zq6k1_g9">
+        <w:r>
+          <w:rPr>
+            <w:u w:val="single"/>
+            <w:color w:val="1F6B5E"/>
+            <w:sz w:val="26"/>
+            <w:szCs w:val="26"/>
+            <w:rFonts w:ascii="Calibri" w:cs="Calibri" w:eastAsia="Calibri" w:hAnsi="Calibri"/>
+          </w:rPr>
+          <w:t xml:space="preserve">ANP — Agence Nigérienne Presse</w:t>
+        </w:r>
+      </w:hyperlink>
+      <w:r>
+        <w:rPr>
+          <w:color w:val="1F2937"/>
+          <w:sz w:val="26"/>
+          <w:szCs w:val="26"/>
+          <w:rFonts w:ascii="Calibri" w:cs="Calibri" w:eastAsia="Calibri" w:hAnsi="Calibri"/>
+        </w:rPr>
+        <w:t xml:space="preserve"> — 22 octobre 2026, 15 h UTC</w:t>
+      </w:r>
+    </w:p>
+    <w:p>
+      <w:pPr>
+        <w:spacing w:before="160"/>
+        <w:ind w:left="360"/>
+      </w:pPr>
+      <w:r>
+        <w:rPr>
+          <w:color w:val="1F6B5E"/>
+          <w:sz w:val="28"/>
+          <w:szCs w:val="28"/>
+          <w:rFonts w:ascii="Calibri" w:cs="Calibri" w:eastAsia="Calibri" w:hAnsi="Calibri"/>
+        </w:rPr>
+        <w:t xml:space="preserve">❑  </w:t>
+      </w:r>
+      <w:r>
+        <w:rPr>
+          <w:b/>
+          <w:bCs/>
+          <w:u w:val="single"/>
+          <w:color w:val="1F6B5E"/>
+          <w:sz w:val="28"/>
+          <w:szCs w:val="28"/>
+          <w:rFonts w:ascii="Calibri" w:cs="Calibri" w:eastAsia="Calibri" w:hAnsi="Calibri"/>
+        </w:rPr>
+        <w:t xml:space="preserve">RENTRÉE JUDICIAIRE 2026-2027 : LE PRÉSIDENT TIANI EXHORTE LES ACTEURS DU DOMAINE À S’INSCRIRE DANS LA DYNAMIQUE DE LA REFONDATION NATIONALE</w:t>
+      </w:r>
+    </w:p>
+    <w:p>
+      <w:pPr>
+        <w:ind w:left="720"/>
+      </w:pPr>
+      <w:r>
+        <w:rPr>
+          <w:color w:val="1F2937"/>
+          <w:sz w:val="26"/>
+          <w:szCs w:val="26"/>
+          <w:rFonts w:ascii="Calibri" w:cs="Calibri" w:eastAsia="Calibri" w:hAnsi="Calibri"/>
+        </w:rPr>
+        <w:t xml:space="preserve">▪  Source : </w:t>
+      </w:r>
+      <w:hyperlink w:history="1" r:id="rIdcdm3mksxwyudlbllpv4rh">
+        <w:r>
+          <w:rPr>
+            <w:u w:val="single"/>
+            <w:color w:val="1F6B5E"/>
+            <w:sz w:val="26"/>
+            <w:szCs w:val="26"/>
+            <w:rFonts w:ascii="Calibri" w:cs="Calibri" w:eastAsia="Calibri" w:hAnsi="Calibri"/>
+          </w:rPr>
+          <w:t xml:space="preserve">ANP — Agence Nigérienne Presse</w:t>
+        </w:r>
+      </w:hyperlink>
+      <w:r>
+        <w:rPr>
+          <w:color w:val="1F2937"/>
+          <w:sz w:val="26"/>
+          <w:szCs w:val="26"/>
+          <w:rFonts w:ascii="Calibri" w:cs="Calibri" w:eastAsia="Calibri" w:hAnsi="Calibri"/>
+        </w:rPr>
+        <w:t xml:space="preserve"> — 22 octobre 2026, 14 h UTC</w:t>
+      </w:r>
+    </w:p>
+    <w:p>
+      <w:pPr>
+        <w:spacing w:before="160"/>
+        <w:ind w:left="360"/>
+      </w:pPr>
+      <w:r>
+        <w:rPr>
+          <w:color w:val="1F6B5E"/>
+          <w:sz w:val="28"/>
+          <w:szCs w:val="28"/>
+          <w:rFonts w:ascii="Calibri" w:cs="Calibri" w:eastAsia="Calibri" w:hAnsi="Calibri"/>
+        </w:rPr>
+        <w:t xml:space="preserve">❑  </w:t>
+      </w:r>
+      <w:r>
+        <w:rPr>
+          <w:b/>
+          <w:bCs/>
+          <w:u w:val="single"/>
+          <w:color w:val="1F6B5E"/>
+          <w:sz w:val="28"/>
+          <w:szCs w:val="28"/>
+          <w:rFonts w:ascii="Calibri" w:cs="Calibri" w:eastAsia="Calibri" w:hAnsi="Calibri"/>
+        </w:rPr>
+        <w:t xml:space="preserve">AU PALAIS DE LA PRÉSIDENCE : LE CHEF DE L’ETAT REÇOIT L’ARTISTE SÉNÉGALAISE COUMBA GAWLO SECK</w:t>
+      </w:r>
+    </w:p>
+    <w:p>
+      <w:pPr>
+        <w:ind w:left="720"/>
+      </w:pPr>
+      <w:r>
+        <w:rPr>
+          <w:color w:val="1F2937"/>
+          <w:sz w:val="26"/>
+          <w:szCs w:val="26"/>
+          <w:rFonts w:ascii="Calibri" w:cs="Calibri" w:eastAsia="Calibri" w:hAnsi="Calibri"/>
+        </w:rPr>
+        <w:t xml:space="preserve">▪  Source : </w:t>
+      </w:r>
+      <w:hyperlink w:history="1" r:id="rIdhy3_izjacnjl5oatub5wb">
+        <w:r>
+          <w:rPr>
+            <w:u w:val="single"/>
+            <w:color w:val="1F6B5E"/>
+            <w:sz w:val="26"/>
+            <w:szCs w:val="26"/>
+            <w:rFonts w:ascii="Calibri" w:cs="Calibri" w:eastAsia="Calibri" w:hAnsi="Calibri"/>
+          </w:rPr>
+          <w:t xml:space="preserve">Le Sahel</w:t>
+        </w:r>
+      </w:hyperlink>
+      <w:r>
+        <w:rPr>
+          <w:color w:val="1F2937"/>
+          <w:sz w:val="26"/>
+          <w:szCs w:val="26"/>
+          <w:rFonts w:ascii="Calibri" w:cs="Calibri" w:eastAsia="Calibri" w:hAnsi="Calibri"/>
+        </w:rPr>
+        <w:t xml:space="preserve"> — 22 octobre 2026, 8 h UTC</w:t>
       </w:r>
     </w:p>
     <w:p>
@@ -4055,7 +2945,7 @@
           <w:szCs w:val="28"/>
           <w:rFonts w:ascii="Calibri" w:cs="Calibri" w:eastAsia="Calibri" w:hAnsi="Calibri"/>
         </w:rPr>
-        <w:t xml:space="preserve">GOVERNANCE BY PROTEST, REGULATION BY SILENCE: INSIDE THE MANUFACTURED WATER CRISIS</w:t>
+        <w:t xml:space="preserve">KPANDAI: ONE REPORTEDLY KILLED IN KUMDI FARMLAND DISPUTE</w:t>
       </w:r>
     </w:p>
     <w:p>
@@ -4071,7 +2961,193 @@
         </w:rPr>
         <w:t xml:space="preserve">▪  Source : </w:t>
       </w:r>
-      <w:hyperlink w:history="1" r:id="rIdhljd6m9a2_thjx1j20nc9">
+      <w:hyperlink w:history="1" r:id="rIdtqv5hfjw5cvbb32sub0gj">
+        <w:r>
+          <w:rPr>
+            <w:u w:val="single"/>
+            <w:color w:val="1F6B5E"/>
+            <w:sz w:val="26"/>
+            <w:szCs w:val="26"/>
+            <w:rFonts w:ascii="Calibri" w:cs="Calibri" w:eastAsia="Calibri" w:hAnsi="Calibri"/>
+          </w:rPr>
+          <w:t xml:space="preserve">JoyOnline</w:t>
+        </w:r>
+      </w:hyperlink>
+      <w:r>
+        <w:rPr>
+          <w:color w:val="1F2937"/>
+          <w:sz w:val="26"/>
+          <w:szCs w:val="26"/>
+          <w:rFonts w:ascii="Calibri" w:cs="Calibri" w:eastAsia="Calibri" w:hAnsi="Calibri"/>
+        </w:rPr>
+        <w:t xml:space="preserve"> — 23 octobre 2026, 5 h UTC</w:t>
+      </w:r>
+    </w:p>
+    <w:p>
+      <w:pPr>
+        <w:spacing w:before="160"/>
+        <w:ind w:left="360"/>
+      </w:pPr>
+      <w:r>
+        <w:rPr>
+          <w:color w:val="1F6B5E"/>
+          <w:sz w:val="28"/>
+          <w:szCs w:val="28"/>
+          <w:rFonts w:ascii="Calibri" w:cs="Calibri" w:eastAsia="Calibri" w:hAnsi="Calibri"/>
+        </w:rPr>
+        <w:t xml:space="preserve">❑  </w:t>
+      </w:r>
+      <w:r>
+        <w:rPr>
+          <w:b/>
+          <w:bCs/>
+          <w:u w:val="single"/>
+          <w:color w:val="1F6B5E"/>
+          <w:sz w:val="28"/>
+          <w:szCs w:val="28"/>
+          <w:rFonts w:ascii="Calibri" w:cs="Calibri" w:eastAsia="Calibri" w:hAnsi="Calibri"/>
+        </w:rPr>
+        <w:t xml:space="preserve">NAIMOS VOWS SELF-DEFENCE AGAINST HOSTILE ATTACKS AS ANTI-GALAMSEY OPERATIONS INTENSIFY</w:t>
+      </w:r>
+    </w:p>
+    <w:p>
+      <w:pPr>
+        <w:ind w:left="720"/>
+      </w:pPr>
+      <w:r>
+        <w:rPr>
+          <w:color w:val="1F2937"/>
+          <w:sz w:val="26"/>
+          <w:szCs w:val="26"/>
+          <w:rFonts w:ascii="Calibri" w:cs="Calibri" w:eastAsia="Calibri" w:hAnsi="Calibri"/>
+        </w:rPr>
+        <w:t xml:space="preserve">▪  Source : </w:t>
+      </w:r>
+      <w:hyperlink w:history="1" r:id="rIdsauluccooeemkg41wi3sv">
+        <w:r>
+          <w:rPr>
+            <w:u w:val="single"/>
+            <w:color w:val="1F6B5E"/>
+            <w:sz w:val="26"/>
+            <w:szCs w:val="26"/>
+            <w:rFonts w:ascii="Calibri" w:cs="Calibri" w:eastAsia="Calibri" w:hAnsi="Calibri"/>
+          </w:rPr>
+          <w:t xml:space="preserve">GBC Ghana Online</w:t>
+        </w:r>
+      </w:hyperlink>
+      <w:r>
+        <w:rPr>
+          <w:color w:val="1F2937"/>
+          <w:sz w:val="26"/>
+          <w:szCs w:val="26"/>
+          <w:rFonts w:ascii="Calibri" w:cs="Calibri" w:eastAsia="Calibri" w:hAnsi="Calibri"/>
+        </w:rPr>
+        <w:t xml:space="preserve"> — 22 octobre 2026, 16 h UTC</w:t>
+      </w:r>
+    </w:p>
+    <w:p>
+      <w:pPr>
+        <w:spacing w:before="160"/>
+        <w:ind w:left="360"/>
+      </w:pPr>
+      <w:r>
+        <w:rPr>
+          <w:color w:val="1F6B5E"/>
+          <w:sz w:val="28"/>
+          <w:szCs w:val="28"/>
+          <w:rFonts w:ascii="Calibri" w:cs="Calibri" w:eastAsia="Calibri" w:hAnsi="Calibri"/>
+        </w:rPr>
+        <w:t xml:space="preserve">❑  </w:t>
+      </w:r>
+      <w:r>
+        <w:rPr>
+          <w:b/>
+          <w:bCs/>
+          <w:u w:val="single"/>
+          <w:color w:val="1F6B5E"/>
+          <w:sz w:val="28"/>
+          <w:szCs w:val="28"/>
+          <w:rFonts w:ascii="Calibri" w:cs="Calibri" w:eastAsia="Calibri" w:hAnsi="Calibri"/>
+        </w:rPr>
+        <w:t xml:space="preserve">GES TO REOPEN OBUASI SHTS NEXT WEEK AFTER AUGUST VIOLENCE</w:t>
+      </w:r>
+    </w:p>
+    <w:p>
+      <w:pPr>
+        <w:ind w:left="720"/>
+      </w:pPr>
+      <w:r>
+        <w:rPr>
+          <w:color w:val="1F2937"/>
+          <w:sz w:val="26"/>
+          <w:szCs w:val="26"/>
+          <w:rFonts w:ascii="Calibri" w:cs="Calibri" w:eastAsia="Calibri" w:hAnsi="Calibri"/>
+        </w:rPr>
+        <w:t xml:space="preserve">▪  Source : </w:t>
+      </w:r>
+      <w:hyperlink w:history="1" r:id="rId_pz3uwx5__edaplao1k74">
+        <w:r>
+          <w:rPr>
+            <w:u w:val="single"/>
+            <w:color w:val="1F6B5E"/>
+            <w:sz w:val="26"/>
+            <w:szCs w:val="26"/>
+            <w:rFonts w:ascii="Calibri" w:cs="Calibri" w:eastAsia="Calibri" w:hAnsi="Calibri"/>
+          </w:rPr>
+          <w:t xml:space="preserve">GBC Ghana Online</w:t>
+        </w:r>
+      </w:hyperlink>
+      <w:r>
+        <w:rPr>
+          <w:color w:val="1F2937"/>
+          <w:sz w:val="26"/>
+          <w:szCs w:val="26"/>
+          <w:rFonts w:ascii="Calibri" w:cs="Calibri" w:eastAsia="Calibri" w:hAnsi="Calibri"/>
+        </w:rPr>
+        <w:t xml:space="preserve"> — 23 octobre 2026, 4 h UTC</w:t>
+      </w:r>
+    </w:p>
+    <w:p>
+      <w:pPr>
+        <w:spacing w:before="160"/>
+        <w:ind w:left="360"/>
+      </w:pPr>
+      <w:r>
+        <w:rPr>
+          <w:color w:val="1F6B5E"/>
+          <w:sz w:val="28"/>
+          <w:szCs w:val="28"/>
+          <w:rFonts w:ascii="Calibri" w:cs="Calibri" w:eastAsia="Calibri" w:hAnsi="Calibri"/>
+        </w:rPr>
+        <w:t xml:space="preserve">❑  </w:t>
+      </w:r>
+      <w:r>
+        <w:rPr>
+          <w:b/>
+          <w:bCs/>
+          <w:u w:val="single"/>
+          <w:color w:val="1F6B5E"/>
+          <w:sz w:val="28"/>
+          <w:szCs w:val="28"/>
+          <w:rFonts w:ascii="Calibri" w:cs="Calibri" w:eastAsia="Calibri" w:hAnsi="Calibri"/>
+        </w:rPr>
+        <w:t xml:space="preserve">OBUASI SHTS HEADMASTER RAPE CASE SENT TO ATTORNEY GENERAL’S OFFICE</w:t>
+      </w:r>
+    </w:p>
+    <w:p>
+      <w:pPr>
+        <w:ind w:left="720"/>
+      </w:pPr>
+      <w:r>
+        <w:rPr>
+          <w:color w:val="1F2937"/>
+          <w:sz w:val="26"/>
+          <w:szCs w:val="26"/>
+          <w:rFonts w:ascii="Calibri" w:cs="Calibri" w:eastAsia="Calibri" w:hAnsi="Calibri"/>
+        </w:rPr>
+        <w:t xml:space="preserve">▪  Source : </w:t>
+      </w:r>
+      <w:hyperlink w:history="1" r:id="rIdbhjak0yale-3kt0tnhbsm">
         <w:r>
           <w:rPr>
             <w:u w:val="single"/>
@@ -4090,131 +3166,7 @@
           <w:szCs w:val="26"/>
           <w:rFonts w:ascii="Calibri" w:cs="Calibri" w:eastAsia="Calibri" w:hAnsi="Calibri"/>
         </w:rPr>
-        <w:t xml:space="preserve"> — 21 octobre 2026, 6 h UTC</w:t>
-      </w:r>
-    </w:p>
-    <w:p>
-      <w:pPr>
-        <w:spacing w:before="160"/>
-        <w:ind w:left="360"/>
-      </w:pPr>
-      <w:r>
-        <w:rPr>
-          <w:color w:val="1F6B5E"/>
-          <w:sz w:val="28"/>
-          <w:szCs w:val="28"/>
-          <w:rFonts w:ascii="Calibri" w:cs="Calibri" w:eastAsia="Calibri" w:hAnsi="Calibri"/>
-        </w:rPr>
-        <w:t xml:space="preserve">❑  </w:t>
-      </w:r>
-      <w:r>
-        <w:rPr>
-          <w:b/>
-          <w:bCs/>
-          <w:u w:val="single"/>
-          <w:color w:val="1F6B5E"/>
-          <w:sz w:val="28"/>
-          <w:szCs w:val="28"/>
-          <w:rFonts w:ascii="Calibri" w:cs="Calibri" w:eastAsia="Calibri" w:hAnsi="Calibri"/>
-        </w:rPr>
-        <w:t xml:space="preserve">OBUASI SHTS CLOSURE LEAVES FINAL-YEAR STUDENTS FACING UNCERTAINTY AHEAD OF WASSCE</w:t>
-      </w:r>
-    </w:p>
-    <w:p>
-      <w:pPr>
-        <w:ind w:left="720"/>
-      </w:pPr>
-      <w:r>
-        <w:rPr>
-          <w:color w:val="1F2937"/>
-          <w:sz w:val="26"/>
-          <w:szCs w:val="26"/>
-          <w:rFonts w:ascii="Calibri" w:cs="Calibri" w:eastAsia="Calibri" w:hAnsi="Calibri"/>
-        </w:rPr>
-        <w:t xml:space="preserve">▪  Source : </w:t>
-      </w:r>
-      <w:hyperlink w:history="1" r:id="rIdm-8dy1u36mzq4mt_xlaby">
-        <w:r>
-          <w:rPr>
-            <w:u w:val="single"/>
-            <w:color w:val="1F6B5E"/>
-            <w:sz w:val="26"/>
-            <w:szCs w:val="26"/>
-            <w:rFonts w:ascii="Calibri" w:cs="Calibri" w:eastAsia="Calibri" w:hAnsi="Calibri"/>
-          </w:rPr>
-          <w:t xml:space="preserve">JoyOnline</w:t>
-        </w:r>
-      </w:hyperlink>
-      <w:r>
-        <w:rPr>
-          <w:color w:val="1F2937"/>
-          <w:sz w:val="26"/>
-          <w:szCs w:val="26"/>
-          <w:rFonts w:ascii="Calibri" w:cs="Calibri" w:eastAsia="Calibri" w:hAnsi="Calibri"/>
-        </w:rPr>
-        <w:t xml:space="preserve"> — 21 octobre 2026, 12 h UTC</w:t>
-      </w:r>
-    </w:p>
-    <w:p>
-      <w:pPr>
-        <w:spacing w:before="160"/>
-        <w:ind w:left="360"/>
-      </w:pPr>
-      <w:r>
-        <w:rPr>
-          <w:color w:val="1F6B5E"/>
-          <w:sz w:val="28"/>
-          <w:szCs w:val="28"/>
-          <w:rFonts w:ascii="Calibri" w:cs="Calibri" w:eastAsia="Calibri" w:hAnsi="Calibri"/>
-        </w:rPr>
-        <w:t xml:space="preserve">❑  </w:t>
-      </w:r>
-      <w:r>
-        <w:rPr>
-          <w:b/>
-          <w:bCs/>
-          <w:u w:val="single"/>
-          <w:color w:val="1F6B5E"/>
-          <w:sz w:val="28"/>
-          <w:szCs w:val="28"/>
-          <w:rFonts w:ascii="Calibri" w:cs="Calibri" w:eastAsia="Calibri" w:hAnsi="Calibri"/>
-        </w:rPr>
-        <w:t xml:space="preserve">WOMEN GROUPS CONDEMN OBUASI SHTS SEXUAL ABUSE SCANDAL</w:t>
-      </w:r>
-    </w:p>
-    <w:p>
-      <w:pPr>
-        <w:ind w:left="720"/>
-      </w:pPr>
-      <w:r>
-        <w:rPr>
-          <w:color w:val="1F2937"/>
-          <w:sz w:val="26"/>
-          <w:szCs w:val="26"/>
-          <w:rFonts w:ascii="Calibri" w:cs="Calibri" w:eastAsia="Calibri" w:hAnsi="Calibri"/>
-        </w:rPr>
-        <w:t xml:space="preserve">▪  Source : </w:t>
-      </w:r>
-      <w:hyperlink w:history="1" r:id="rIddj6bx-hx5rp0x9p_vn23u">
-        <w:r>
-          <w:rPr>
-            <w:u w:val="single"/>
-            <w:color w:val="1F6B5E"/>
-            <w:sz w:val="26"/>
-            <w:szCs w:val="26"/>
-            <w:rFonts w:ascii="Calibri" w:cs="Calibri" w:eastAsia="Calibri" w:hAnsi="Calibri"/>
-          </w:rPr>
-          <w:t xml:space="preserve">Ghana Business News</w:t>
-        </w:r>
-      </w:hyperlink>
-      <w:r>
-        <w:rPr>
-          <w:color w:val="1F2937"/>
-          <w:sz w:val="26"/>
-          <w:szCs w:val="26"/>
-          <w:rFonts w:ascii="Calibri" w:cs="Calibri" w:eastAsia="Calibri" w:hAnsi="Calibri"/>
-        </w:rPr>
-        <w:t xml:space="preserve"> — 21 octobre 2026, 6 h UTC</w:t>
+        <w:t xml:space="preserve"> — 23 octobre 2026, 6 h UTC</w:t>
       </w:r>
     </w:p>
     <w:p>
@@ -4503,7 +3455,7 @@
           <w:szCs w:val="28"/>
           <w:rFonts w:ascii="Calibri" w:cs="Calibri" w:eastAsia="Calibri" w:hAnsi="Calibri"/>
         </w:rPr>
-        <w:t xml:space="preserve">KLOTO : L’UE ET LE LUXEMBOURG AUX CÔTÉS DU TOGO POUR LA CONSTRUCTION DU SIÈGE DE L’ONAP</w:t>
+        <w:t xml:space="preserve">TOGO- 31, 7 MILLIARDS FCFA POUR DÉSENCLAVER LES SAVANES : DES TRAVAUX ABANDONNÉS OU MAL FAITS</w:t>
       </w:r>
     </w:p>
     <w:p>
@@ -4519,7 +3471,7 @@
         </w:rPr>
         <w:t xml:space="preserve">▪  Source : </w:t>
       </w:r>
-      <w:hyperlink w:history="1" r:id="rIdxxpj6tvol7yo3jxm0ewbc">
+      <w:hyperlink w:history="1" r:id="rIdk_gcnsf6hbk98lmuzatdo">
         <w:r>
           <w:rPr>
             <w:u w:val="single"/>
@@ -4528,7 +3480,7 @@
             <w:szCs w:val="26"/>
             <w:rFonts w:ascii="Calibri" w:cs="Calibri" w:eastAsia="Calibri" w:hAnsi="Calibri"/>
           </w:rPr>
-          <w:t xml:space="preserve">ATOP — Agence Togolaise Presse</w:t>
+          <w:t xml:space="preserve">Togo Actualite</w:t>
         </w:r>
       </w:hyperlink>
       <w:r>
@@ -4538,7 +3490,7 @@
           <w:szCs w:val="26"/>
           <w:rFonts w:ascii="Calibri" w:cs="Calibri" w:eastAsia="Calibri" w:hAnsi="Calibri"/>
         </w:rPr>
-        <w:t xml:space="preserve"> — 21 octobre 2026, 12 h UTC</w:t>
+        <w:t xml:space="preserve"> — 22 octobre 2026, 12 h UTC</w:t>
       </w:r>
     </w:p>
     <w:p>
@@ -4565,7 +3517,7 @@
           <w:szCs w:val="28"/>
           <w:rFonts w:ascii="Calibri" w:cs="Calibri" w:eastAsia="Calibri" w:hAnsi="Calibri"/>
         </w:rPr>
-        <w:t xml:space="preserve">TOGO : UN VIOLENT INCENDIE RAVAGE UN BAR À TOKOIN RAMCO</w:t>
+        <w:t xml:space="preserve">TOGO : 407 PERSONNES OPÉRÉES GRATUITEMENT DE LA CATARACTE À LOMÉ, CAP SUR KARA</w:t>
       </w:r>
     </w:p>
     <w:p>
@@ -4581,7 +3533,7 @@
         </w:rPr>
         <w:t xml:space="preserve">▪  Source : </w:t>
       </w:r>
-      <w:hyperlink w:history="1" r:id="rIdlhtrhbpqr1c4amzz6fkzc">
+      <w:hyperlink w:history="1" r:id="rId2pqwk13wsuow6axc9pajt">
         <w:r>
           <w:rPr>
             <w:u w:val="single"/>
@@ -4600,641 +3552,7 @@
           <w:szCs w:val="26"/>
           <w:rFonts w:ascii="Calibri" w:cs="Calibri" w:eastAsia="Calibri" w:hAnsi="Calibri"/>
         </w:rPr>
-        <w:t xml:space="preserve"> — 21 octobre 2026, 0 h UTC</w:t>
-      </w:r>
-    </w:p>
-    <w:p>
-      <w:pPr>
-        <w:spacing w:before="160"/>
-        <w:ind w:left="360"/>
-      </w:pPr>
-      <w:r>
-        <w:rPr>
-          <w:color w:val="1F6B5E"/>
-          <w:sz w:val="28"/>
-          <w:szCs w:val="28"/>
-          <w:rFonts w:ascii="Calibri" w:cs="Calibri" w:eastAsia="Calibri" w:hAnsi="Calibri"/>
-        </w:rPr>
-        <w:t xml:space="preserve">❑  </w:t>
-      </w:r>
-      <w:r>
-        <w:rPr>
-          <w:b/>
-          <w:bCs/>
-          <w:u w:val="single"/>
-          <w:color w:val="1F6B5E"/>
-          <w:sz w:val="28"/>
-          <w:szCs w:val="28"/>
-          <w:rFonts w:ascii="Calibri" w:cs="Calibri" w:eastAsia="Calibri" w:hAnsi="Calibri"/>
-        </w:rPr>
-        <w:t xml:space="preserve">TOGO : ENTRE DEUX SOURDS : L’IMPASSE TOGOLAISE EN GRAND FORMAT</w:t>
-      </w:r>
-    </w:p>
-    <w:p>
-      <w:pPr>
-        <w:ind w:left="720"/>
-      </w:pPr>
-      <w:r>
-        <w:rPr>
-          <w:color w:val="1F2937"/>
-          <w:sz w:val="26"/>
-          <w:szCs w:val="26"/>
-          <w:rFonts w:ascii="Calibri" w:cs="Calibri" w:eastAsia="Calibri" w:hAnsi="Calibri"/>
-        </w:rPr>
-        <w:t xml:space="preserve">▪  Source : </w:t>
-      </w:r>
-      <w:hyperlink w:history="1" r:id="rId4flpcuhih_f8g9h0y4rg5">
-        <w:r>
-          <w:rPr>
-            <w:u w:val="single"/>
-            <w:color w:val="1F6B5E"/>
-            <w:sz w:val="26"/>
-            <w:szCs w:val="26"/>
-            <w:rFonts w:ascii="Calibri" w:cs="Calibri" w:eastAsia="Calibri" w:hAnsi="Calibri"/>
-          </w:rPr>
-          <w:t xml:space="preserve">Togo Actualite</w:t>
-        </w:r>
-      </w:hyperlink>
-      <w:r>
-        <w:rPr>
-          <w:color w:val="1F2937"/>
-          <w:sz w:val="26"/>
-          <w:szCs w:val="26"/>
-          <w:rFonts w:ascii="Calibri" w:cs="Calibri" w:eastAsia="Calibri" w:hAnsi="Calibri"/>
-        </w:rPr>
-        <w:t xml:space="preserve"> — 20 octobre 2026, 15 h UTC</w:t>
-      </w:r>
-    </w:p>
-    <w:p>
-      <w:pPr>
-        <w:spacing w:before="160"/>
-        <w:ind w:left="360"/>
-      </w:pPr>
-      <w:r>
-        <w:rPr>
-          <w:color w:val="1F6B5E"/>
-          <w:sz w:val="28"/>
-          <w:szCs w:val="28"/>
-          <w:rFonts w:ascii="Calibri" w:cs="Calibri" w:eastAsia="Calibri" w:hAnsi="Calibri"/>
-        </w:rPr>
-        <w:t xml:space="preserve">❑  </w:t>
-      </w:r>
-      <w:r>
-        <w:rPr>
-          <w:b/>
-          <w:bCs/>
-          <w:u w:val="single"/>
-          <w:color w:val="1F6B5E"/>
-          <w:sz w:val="28"/>
-          <w:szCs w:val="28"/>
-          <w:rFonts w:ascii="Calibri" w:cs="Calibri" w:eastAsia="Calibri" w:hAnsi="Calibri"/>
-        </w:rPr>
-        <w:t xml:space="preserve">RECRUDESCENCE DES ACCIDENTS DE LA ROUTE : UN FACTEUR IMPORTANT IGNORÉ</w:t>
-      </w:r>
-    </w:p>
-    <w:p>
-      <w:pPr>
-        <w:ind w:left="720"/>
-      </w:pPr>
-      <w:r>
-        <w:rPr>
-          <w:color w:val="1F2937"/>
-          <w:sz w:val="26"/>
-          <w:szCs w:val="26"/>
-          <w:rFonts w:ascii="Calibri" w:cs="Calibri" w:eastAsia="Calibri" w:hAnsi="Calibri"/>
-        </w:rPr>
-        <w:t xml:space="preserve">▪  Source : </w:t>
-      </w:r>
-      <w:hyperlink w:history="1" r:id="rIdk8su6yhkdurrk2a4tq1th">
-        <w:r>
-          <w:rPr>
-            <w:u w:val="single"/>
-            <w:color w:val="1F6B5E"/>
-            <w:sz w:val="26"/>
-            <w:szCs w:val="26"/>
-            <w:rFonts w:ascii="Calibri" w:cs="Calibri" w:eastAsia="Calibri" w:hAnsi="Calibri"/>
-          </w:rPr>
-          <w:t xml:space="preserve">Icilome</w:t>
-        </w:r>
-      </w:hyperlink>
-      <w:r>
-        <w:rPr>
-          <w:color w:val="1F2937"/>
-          <w:sz w:val="26"/>
-          <w:szCs w:val="26"/>
-          <w:rFonts w:ascii="Calibri" w:cs="Calibri" w:eastAsia="Calibri" w:hAnsi="Calibri"/>
-        </w:rPr>
-        <w:t xml:space="preserve"> — 21 octobre 2026, 11 h UTC</w:t>
-      </w:r>
-    </w:p>
-    <w:p>
-      <w:pPr>
-        <w:spacing w:before="160"/>
-        <w:ind w:left="360"/>
-      </w:pPr>
-      <w:r>
-        <w:rPr>
-          <w:color w:val="1F6B5E"/>
-          <w:sz w:val="28"/>
-          <w:szCs w:val="28"/>
-          <w:rFonts w:ascii="Calibri" w:cs="Calibri" w:eastAsia="Calibri" w:hAnsi="Calibri"/>
-        </w:rPr>
-        <w:t xml:space="preserve">❑  </w:t>
-      </w:r>
-      <w:r>
-        <w:rPr>
-          <w:b/>
-          <w:bCs/>
-          <w:u w:val="single"/>
-          <w:color w:val="1F6B5E"/>
-          <w:sz w:val="28"/>
-          <w:szCs w:val="28"/>
-          <w:rFonts w:ascii="Calibri" w:cs="Calibri" w:eastAsia="Calibri" w:hAnsi="Calibri"/>
-        </w:rPr>
-        <w:t xml:space="preserve">TOGO- LES LEADERS DU CNCC INVITÉS À REPORTER LEUR MEETING</w:t>
-      </w:r>
-    </w:p>
-    <w:p>
-      <w:pPr>
-        <w:ind w:left="720"/>
-      </w:pPr>
-      <w:r>
-        <w:rPr>
-          <w:color w:val="1F2937"/>
-          <w:sz w:val="26"/>
-          <w:szCs w:val="26"/>
-          <w:rFonts w:ascii="Calibri" w:cs="Calibri" w:eastAsia="Calibri" w:hAnsi="Calibri"/>
-        </w:rPr>
-        <w:t xml:space="preserve">▪  Source : </w:t>
-      </w:r>
-      <w:hyperlink w:history="1" r:id="rIdjcnwfk-5hbuh3pvxbmzmb">
-        <w:r>
-          <w:rPr>
-            <w:u w:val="single"/>
-            <w:color w:val="1F6B5E"/>
-            <w:sz w:val="26"/>
-            <w:szCs w:val="26"/>
-            <w:rFonts w:ascii="Calibri" w:cs="Calibri" w:eastAsia="Calibri" w:hAnsi="Calibri"/>
-          </w:rPr>
-          <w:t xml:space="preserve">Icilome</w:t>
-        </w:r>
-      </w:hyperlink>
-      <w:r>
-        <w:rPr>
-          <w:color w:val="1F2937"/>
-          <w:sz w:val="26"/>
-          <w:szCs w:val="26"/>
-          <w:rFonts w:ascii="Calibri" w:cs="Calibri" w:eastAsia="Calibri" w:hAnsi="Calibri"/>
-        </w:rPr>
-        <w:t xml:space="preserve"> — 21 octobre 2026, 6 h UTC</w:t>
-      </w:r>
-    </w:p>
-    <w:p>
-      <w:pPr>
-        <w:pageBreakBefore/>
-        <w:spacing w:after="0" w:before="0"/>
-        <w:rPr>
-          <w:sz w:val="2"/>
-          <w:szCs w:val="2"/>
-        </w:rPr>
-      </w:pPr>
-    </w:p>
-    <w:tbl>
-      <w:tblPr>
-        <w:tblW w:type="dxa" w:w="17680"/>
-        <w:tblBorders>
-          <w:top w:val="single" w:color="auto" w:sz="4"/>
-          <w:left w:val="single" w:color="auto" w:sz="4"/>
-          <w:bottom w:val="single" w:color="auto" w:sz="4"/>
-          <w:right w:val="single" w:color="auto" w:sz="4"/>
-          <w:insideH w:val="single" w:color="auto" w:sz="4"/>
-          <w:insideV w:val="single" w:color="auto" w:sz="4"/>
-        </w:tblBorders>
-      </w:tblPr>
-      <w:tblGrid>
-        <w:gridCol w:w="1000"/>
-        <w:gridCol w:w="15180"/>
-        <w:gridCol w:w="1500"/>
-      </w:tblGrid>
-      <w:tr>
-        <w:tc>
-          <w:tcPr>
-            <w:tcW w:type="dxa" w:w="1000"/>
-            <w:tcBorders>
-              <w:top w:val="none" w:color="FFFFFF" w:sz="0"/>
-              <w:left w:val="none" w:color="FFFFFF" w:sz="0"/>
-              <w:bottom w:val="none" w:color="FFFFFF" w:sz="0"/>
-              <w:right w:val="none" w:color="FFFFFF" w:sz="0"/>
-            </w:tcBorders>
-            <w:shd w:fill="1F6B5E" w:color="auto" w:val="clear"/>
-            <w:vAlign w:val="center"/>
-          </w:tcPr>
-          <w:p>
-            <w:pPr>
-              <w:jc w:val="center"/>
-            </w:pPr>
-            <w:r>
-              <w:rPr>
-                <w:color w:val="FFFFFF"/>
-                <w:sz w:val="44"/>
-                <w:szCs w:val="44"/>
-                <w:rFonts w:ascii="Arial Narrow" w:cs="Arial Narrow" w:eastAsia="Arial Narrow" w:hAnsi="Arial Narrow"/>
-              </w:rPr>
-              <w:t xml:space="preserve">V</w:t>
-            </w:r>
-          </w:p>
-        </w:tc>
-        <w:tc>
-          <w:tcPr>
-            <w:tcW w:type="dxa" w:w="15180"/>
-            <w:tcBorders>
-              <w:top w:val="none" w:color="FFFFFF" w:sz="0"/>
-              <w:left w:val="none" w:color="FFFFFF" w:sz="0"/>
-              <w:bottom w:val="none" w:color="FFFFFF" w:sz="0"/>
-              <w:right w:val="none" w:color="FFFFFF" w:sz="0"/>
-            </w:tcBorders>
-            <w:vAlign w:val="center"/>
-          </w:tcPr>
-          <w:p>
-            <w:pPr>
-              <w:ind w:left="200"/>
-            </w:pPr>
-            <w:r>
-              <w:rPr>
-                <w:color w:val="1F6B5E"/>
-                <w:sz w:val="56"/>
-                <w:szCs w:val="56"/>
-                <w:rFonts w:ascii="Arial Narrow" w:cs="Arial Narrow" w:eastAsia="Arial Narrow" w:hAnsi="Arial Narrow"/>
-              </w:rPr>
-              <w:t xml:space="preserve">Togo</w:t>
-            </w:r>
-          </w:p>
-        </w:tc>
-        <w:tc>
-          <w:tcPr>
-            <w:tcW w:type="dxa" w:w="1500"/>
-            <w:tcBorders>
-              <w:top w:val="none" w:color="FFFFFF" w:sz="0"/>
-              <w:left w:val="none" w:color="FFFFFF" w:sz="0"/>
-              <w:bottom w:val="none" w:color="FFFFFF" w:sz="0"/>
-              <w:right w:val="none" w:color="FFFFFF" w:sz="0"/>
-            </w:tcBorders>
-            <w:vAlign w:val="center"/>
-          </w:tcPr>
-          <w:tbl>
-            <w:tblPr>
-              <w:tblW w:type="dxa" w:w="1200"/>
-              <w:tblBorders>
-                <w:top w:val="single" w:color="auto" w:sz="4"/>
-                <w:left w:val="single" w:color="auto" w:sz="4"/>
-                <w:bottom w:val="single" w:color="auto" w:sz="4"/>
-                <w:right w:val="single" w:color="auto" w:sz="4"/>
-                <w:insideH w:val="single" w:color="auto" w:sz="4"/>
-                <w:insideV w:val="single" w:color="auto" w:sz="4"/>
-              </w:tblBorders>
-            </w:tblPr>
-            <w:tblGrid>
-              <w:gridCol w:w="1200"/>
-            </w:tblGrid>
-            <w:tr>
-              <w:trPr>
-                <w:trHeight w:val="120" w:hRule="exact"/>
-              </w:trPr>
-              <w:tc>
-                <w:tcPr>
-                  <w:tcW w:type="dxa" w:w="1200"/>
-                  <w:tcBorders>
-                    <w:top w:val="single" w:color="1F2937" w:sz="6"/>
-                    <w:left w:val="single" w:color="1F2937" w:sz="6"/>
-                    <w:bottom w:val="single" w:color="1F2937" w:sz="6"/>
-                    <w:right w:val="single" w:color="1F2937" w:sz="6"/>
-                  </w:tcBorders>
-                  <w:shd w:fill="006A4E" w:color="auto" w:val="clear"/>
-                </w:tcPr>
-                <w:p>
-                  <w:r>
-                    <w:rPr>
-                      <w:color w:val="1F2937"/>
-                      <w:sz w:val="2"/>
-                      <w:szCs w:val="2"/>
-                      <w:rFonts w:ascii="Calibri" w:cs="Calibri" w:eastAsia="Calibri" w:hAnsi="Calibri"/>
-                    </w:rPr>
-                  </w:r>
-                </w:p>
-              </w:tc>
-            </w:tr>
-            <w:tr>
-              <w:trPr>
-                <w:trHeight w:val="120" w:hRule="exact"/>
-              </w:trPr>
-              <w:tc>
-                <w:tcPr>
-                  <w:tcW w:type="dxa" w:w="1200"/>
-                  <w:tcBorders>
-                    <w:top w:val="single" w:color="1F2937" w:sz="6"/>
-                    <w:left w:val="single" w:color="1F2937" w:sz="6"/>
-                    <w:bottom w:val="single" w:color="1F2937" w:sz="6"/>
-                    <w:right w:val="single" w:color="1F2937" w:sz="6"/>
-                  </w:tcBorders>
-                  <w:shd w:fill="FFCE00" w:color="auto" w:val="clear"/>
-                </w:tcPr>
-                <w:p>
-                  <w:r>
-                    <w:rPr>
-                      <w:color w:val="1F2937"/>
-                      <w:sz w:val="2"/>
-                      <w:szCs w:val="2"/>
-                      <w:rFonts w:ascii="Calibri" w:cs="Calibri" w:eastAsia="Calibri" w:hAnsi="Calibri"/>
-                    </w:rPr>
-                  </w:r>
-                </w:p>
-              </w:tc>
-            </w:tr>
-            <w:tr>
-              <w:trPr>
-                <w:trHeight w:val="120" w:hRule="exact"/>
-              </w:trPr>
-              <w:tc>
-                <w:tcPr>
-                  <w:tcW w:type="dxa" w:w="1200"/>
-                  <w:tcBorders>
-                    <w:top w:val="single" w:color="1F2937" w:sz="6"/>
-                    <w:left w:val="single" w:color="1F2937" w:sz="6"/>
-                    <w:bottom w:val="single" w:color="1F2937" w:sz="6"/>
-                    <w:right w:val="single" w:color="1F2937" w:sz="6"/>
-                  </w:tcBorders>
-                  <w:shd w:fill="006A4E" w:color="auto" w:val="clear"/>
-                </w:tcPr>
-                <w:p>
-                  <w:r>
-                    <w:rPr>
-                      <w:color w:val="1F2937"/>
-                      <w:sz w:val="2"/>
-                      <w:szCs w:val="2"/>
-                      <w:rFonts w:ascii="Calibri" w:cs="Calibri" w:eastAsia="Calibri" w:hAnsi="Calibri"/>
-                    </w:rPr>
-                  </w:r>
-                </w:p>
-              </w:tc>
-            </w:tr>
-            <w:tr>
-              <w:trPr>
-                <w:trHeight w:val="120" w:hRule="exact"/>
-              </w:trPr>
-              <w:tc>
-                <w:tcPr>
-                  <w:tcW w:type="dxa" w:w="1200"/>
-                  <w:tcBorders>
-                    <w:top w:val="single" w:color="1F2937" w:sz="6"/>
-                    <w:left w:val="single" w:color="1F2937" w:sz="6"/>
-                    <w:bottom w:val="single" w:color="1F2937" w:sz="6"/>
-                    <w:right w:val="single" w:color="1F2937" w:sz="6"/>
-                  </w:tcBorders>
-                  <w:shd w:fill="FFCE00" w:color="auto" w:val="clear"/>
-                </w:tcPr>
-                <w:p>
-                  <w:r>
-                    <w:rPr>
-                      <w:color w:val="1F2937"/>
-                      <w:sz w:val="2"/>
-                      <w:szCs w:val="2"/>
-                      <w:rFonts w:ascii="Calibri" w:cs="Calibri" w:eastAsia="Calibri" w:hAnsi="Calibri"/>
-                    </w:rPr>
-                  </w:r>
-                </w:p>
-              </w:tc>
-            </w:tr>
-            <w:tr>
-              <w:trPr>
-                <w:trHeight w:val="120" w:hRule="exact"/>
-              </w:trPr>
-              <w:tc>
-                <w:tcPr>
-                  <w:tcW w:type="dxa" w:w="1200"/>
-                  <w:tcBorders>
-                    <w:top w:val="single" w:color="1F2937" w:sz="6"/>
-                    <w:left w:val="single" w:color="1F2937" w:sz="6"/>
-                    <w:bottom w:val="single" w:color="1F2937" w:sz="6"/>
-                    <w:right w:val="single" w:color="1F2937" w:sz="6"/>
-                  </w:tcBorders>
-                  <w:shd w:fill="006A4E" w:color="auto" w:val="clear"/>
-                </w:tcPr>
-                <w:p>
-                  <w:r>
-                    <w:rPr>
-                      <w:color w:val="1F2937"/>
-                      <w:sz w:val="2"/>
-                      <w:szCs w:val="2"/>
-                      <w:rFonts w:ascii="Calibri" w:cs="Calibri" w:eastAsia="Calibri" w:hAnsi="Calibri"/>
-                    </w:rPr>
-                  </w:r>
-                </w:p>
-              </w:tc>
-            </w:tr>
-          </w:tbl>
-          <w:p/>
-        </w:tc>
-      </w:tr>
-    </w:tbl>
-    <w:p>
-      <w:pPr>
-        <w:pBdr>
-          <w:bottom w:val="single" w:color="A3A3A3" w:sz="4" w:space="1"/>
-        </w:pBdr>
-      </w:pPr>
-      <w:r>
-        <w:rPr>
-          <w:color w:val="1F2937"/>
-          <w:sz w:val="12"/>
-          <w:szCs w:val="12"/>
-          <w:rFonts w:ascii="Calibri" w:cs="Calibri" w:eastAsia="Calibri" w:hAnsi="Calibri"/>
-        </w:rPr>
-      </w:r>
-    </w:p>
-    <w:p>
-      <w:pPr>
-        <w:spacing w:before="160"/>
-        <w:ind w:left="360"/>
-      </w:pPr>
-      <w:r>
-        <w:rPr>
-          <w:color w:val="1F6B5E"/>
-          <w:sz w:val="28"/>
-          <w:szCs w:val="28"/>
-          <w:rFonts w:ascii="Calibri" w:cs="Calibri" w:eastAsia="Calibri" w:hAnsi="Calibri"/>
-        </w:rPr>
-        <w:t xml:space="preserve">❑  </w:t>
-      </w:r>
-      <w:r>
-        <w:rPr>
-          <w:b/>
-          <w:bCs/>
-          <w:u w:val="single"/>
-          <w:color w:val="1F6B5E"/>
-          <w:sz w:val="28"/>
-          <w:szCs w:val="28"/>
-          <w:rFonts w:ascii="Calibri" w:cs="Calibri" w:eastAsia="Calibri" w:hAnsi="Calibri"/>
-        </w:rPr>
-        <w:t xml:space="preserve">SYSTÈMES AGROALIMENTAIRES : LE TOGO ENGAGÉ À TRADUIRE LA DÉCLARATION DE KAMPALA EN ACTIONS CONCRÈTES</w:t>
-      </w:r>
-    </w:p>
-    <w:p>
-      <w:pPr>
-        <w:ind w:left="720"/>
-      </w:pPr>
-      <w:r>
-        <w:rPr>
-          <w:color w:val="1F2937"/>
-          <w:sz w:val="26"/>
-          <w:szCs w:val="26"/>
-          <w:rFonts w:ascii="Calibri" w:cs="Calibri" w:eastAsia="Calibri" w:hAnsi="Calibri"/>
-        </w:rPr>
-        <w:t xml:space="preserve">▪  Source : </w:t>
-      </w:r>
-      <w:hyperlink w:history="1" r:id="rIdtthggbkdp5vfh0wazwrdn">
-        <w:r>
-          <w:rPr>
-            <w:u w:val="single"/>
-            <w:color w:val="1F6B5E"/>
-            <w:sz w:val="26"/>
-            <w:szCs w:val="26"/>
-            <w:rFonts w:ascii="Calibri" w:cs="Calibri" w:eastAsia="Calibri" w:hAnsi="Calibri"/>
-          </w:rPr>
-          <w:t xml:space="preserve">Togo-Presse</w:t>
-        </w:r>
-      </w:hyperlink>
-      <w:r>
-        <w:rPr>
-          <w:color w:val="1F2937"/>
-          <w:sz w:val="26"/>
-          <w:szCs w:val="26"/>
-          <w:rFonts w:ascii="Calibri" w:cs="Calibri" w:eastAsia="Calibri" w:hAnsi="Calibri"/>
-        </w:rPr>
-        <w:t xml:space="preserve"> — 20 octobre 2026, 20 h UTC</w:t>
-      </w:r>
-    </w:p>
-    <w:p>
-      <w:pPr>
-        <w:spacing w:before="160"/>
-        <w:ind w:left="360"/>
-      </w:pPr>
-      <w:r>
-        <w:rPr>
-          <w:color w:val="1F6B5E"/>
-          <w:sz w:val="28"/>
-          <w:szCs w:val="28"/>
-          <w:rFonts w:ascii="Calibri" w:cs="Calibri" w:eastAsia="Calibri" w:hAnsi="Calibri"/>
-        </w:rPr>
-        <w:t xml:space="preserve">❑  </w:t>
-      </w:r>
-      <w:r>
-        <w:rPr>
-          <w:b/>
-          <w:bCs/>
-          <w:u w:val="single"/>
-          <w:color w:val="1F6B5E"/>
-          <w:sz w:val="28"/>
-          <w:szCs w:val="28"/>
-          <w:rFonts w:ascii="Calibri" w:cs="Calibri" w:eastAsia="Calibri" w:hAnsi="Calibri"/>
-        </w:rPr>
-        <w:t xml:space="preserve">LOMÉ : UNE FLÈCHE VERTE AUX FEUX TRICOLORES POUR FLUIDIFIER LA CIRCULATION ET SÉCURISER LES CARREFOURS</w:t>
-      </w:r>
-    </w:p>
-    <w:p>
-      <w:pPr>
-        <w:ind w:left="720"/>
-      </w:pPr>
-      <w:r>
-        <w:rPr>
-          <w:color w:val="1F2937"/>
-          <w:sz w:val="26"/>
-          <w:szCs w:val="26"/>
-          <w:rFonts w:ascii="Calibri" w:cs="Calibri" w:eastAsia="Calibri" w:hAnsi="Calibri"/>
-        </w:rPr>
-        <w:t xml:space="preserve">▪  Source : </w:t>
-      </w:r>
-      <w:hyperlink w:history="1" r:id="rIdvipab6iyaqvoix7bsznij">
-        <w:r>
-          <w:rPr>
-            <w:u w:val="single"/>
-            <w:color w:val="1F6B5E"/>
-            <w:sz w:val="26"/>
-            <w:szCs w:val="26"/>
-            <w:rFonts w:ascii="Calibri" w:cs="Calibri" w:eastAsia="Calibri" w:hAnsi="Calibri"/>
-          </w:rPr>
-          <w:t xml:space="preserve">Le Nouveau Reporter</w:t>
-        </w:r>
-      </w:hyperlink>
-      <w:r>
-        <w:rPr>
-          <w:color w:val="1F2937"/>
-          <w:sz w:val="26"/>
-          <w:szCs w:val="26"/>
-          <w:rFonts w:ascii="Calibri" w:cs="Calibri" w:eastAsia="Calibri" w:hAnsi="Calibri"/>
-        </w:rPr>
-        <w:t xml:space="preserve"> — 20 octobre 2026, 16 h UTC</w:t>
-      </w:r>
-    </w:p>
-    <w:p>
-      <w:pPr>
-        <w:spacing w:before="160"/>
-        <w:ind w:left="360"/>
-      </w:pPr>
-      <w:r>
-        <w:rPr>
-          <w:color w:val="1F6B5E"/>
-          <w:sz w:val="28"/>
-          <w:szCs w:val="28"/>
-          <w:rFonts w:ascii="Calibri" w:cs="Calibri" w:eastAsia="Calibri" w:hAnsi="Calibri"/>
-        </w:rPr>
-        <w:t xml:space="preserve">❑  </w:t>
-      </w:r>
-      <w:r>
-        <w:rPr>
-          <w:b/>
-          <w:bCs/>
-          <w:u w:val="single"/>
-          <w:color w:val="1F6B5E"/>
-          <w:sz w:val="28"/>
-          <w:szCs w:val="28"/>
-          <w:rFonts w:ascii="Calibri" w:cs="Calibri" w:eastAsia="Calibri" w:hAnsi="Calibri"/>
-        </w:rPr>
-        <w:t xml:space="preserve">PINTADE, SÉCURITÉ ALIMENTAIRE ET REVENUS</w:t>
-      </w:r>
-    </w:p>
-    <w:p>
-      <w:pPr>
-        <w:ind w:left="720"/>
-      </w:pPr>
-      <w:r>
-        <w:rPr>
-          <w:color w:val="1F2937"/>
-          <w:sz w:val="26"/>
-          <w:szCs w:val="26"/>
-          <w:rFonts w:ascii="Calibri" w:cs="Calibri" w:eastAsia="Calibri" w:hAnsi="Calibri"/>
-        </w:rPr>
-        <w:t xml:space="preserve">▪  Source : </w:t>
-      </w:r>
-      <w:hyperlink w:history="1" r:id="rIdvgq6ep2ypcszbdqkvqdne">
-        <w:r>
-          <w:rPr>
-            <w:u w:val="single"/>
-            <w:color w:val="1F6B5E"/>
-            <w:sz w:val="26"/>
-            <w:szCs w:val="26"/>
-            <w:rFonts w:ascii="Calibri" w:cs="Calibri" w:eastAsia="Calibri" w:hAnsi="Calibri"/>
-          </w:rPr>
-          <w:t xml:space="preserve">AllAfrica (TG)</w:t>
-        </w:r>
-      </w:hyperlink>
-      <w:r>
-        <w:rPr>
-          <w:color w:val="1F2937"/>
-          <w:sz w:val="26"/>
-          <w:szCs w:val="26"/>
-          <w:rFonts w:ascii="Calibri" w:cs="Calibri" w:eastAsia="Calibri" w:hAnsi="Calibri"/>
-        </w:rPr>
-        <w:t xml:space="preserve"> — 20 octobre 2026, 9 h UTC</w:t>
+        <w:t xml:space="preserve"> — 22 octobre 2026, 7 h UTC</w:t>
       </w:r>
     </w:p>
     <w:p>
@@ -5457,17 +3775,63 @@
     <w:p>
       <w:pPr>
         <w:spacing w:before="160"/>
-      </w:pPr>
-      <w:r>
-        <w:rPr>
-          <w:i/>
-          <w:iCs/>
-          <w:color w:val="6B7280"/>
-          <w:sz w:val="24"/>
-          <w:szCs w:val="24"/>
-          <w:rFonts w:ascii="Calibri" w:cs="Calibri" w:eastAsia="Calibri" w:hAnsi="Calibri"/>
-        </w:rPr>
-        <w:t xml:space="preserve">Aucun fait marquant relevé sur la période.</w:t>
+        <w:ind w:left="360"/>
+      </w:pPr>
+      <w:r>
+        <w:rPr>
+          <w:color w:val="1F6B5E"/>
+          <w:sz w:val="28"/>
+          <w:szCs w:val="28"/>
+          <w:rFonts w:ascii="Calibri" w:cs="Calibri" w:eastAsia="Calibri" w:hAnsi="Calibri"/>
+        </w:rPr>
+        <w:t xml:space="preserve">❑  </w:t>
+      </w:r>
+      <w:r>
+        <w:rPr>
+          <w:b/>
+          <w:bCs/>
+          <w:u w:val="single"/>
+          <w:color w:val="1F6B5E"/>
+          <w:sz w:val="28"/>
+          <w:szCs w:val="28"/>
+          <w:rFonts w:ascii="Calibri" w:cs="Calibri" w:eastAsia="Calibri" w:hAnsi="Calibri"/>
+        </w:rPr>
+        <w:t xml:space="preserve">PORT DE COTONOU : L’ENLÈVEMENT DES MARCHANDISES DÉSORMAIS POSSIBLE LES WEEK-ENDS</w:t>
+      </w:r>
+    </w:p>
+    <w:p>
+      <w:pPr>
+        <w:ind w:left="720"/>
+      </w:pPr>
+      <w:r>
+        <w:rPr>
+          <w:color w:val="1F2937"/>
+          <w:sz w:val="26"/>
+          <w:szCs w:val="26"/>
+          <w:rFonts w:ascii="Calibri" w:cs="Calibri" w:eastAsia="Calibri" w:hAnsi="Calibri"/>
+        </w:rPr>
+        <w:t xml:space="preserve">▪  Source : </w:t>
+      </w:r>
+      <w:hyperlink w:history="1" r:id="rIdura4xfanrg6y0zcldid2f">
+        <w:r>
+          <w:rPr>
+            <w:u w:val="single"/>
+            <w:color w:val="1F6B5E"/>
+            <w:sz w:val="26"/>
+            <w:szCs w:val="26"/>
+            <w:rFonts w:ascii="Calibri" w:cs="Calibri" w:eastAsia="Calibri" w:hAnsi="Calibri"/>
+          </w:rPr>
+          <w:t xml:space="preserve">24heureinfo.com</w:t>
+        </w:r>
+      </w:hyperlink>
+      <w:r>
+        <w:rPr>
+          <w:color w:val="1F2937"/>
+          <w:sz w:val="26"/>
+          <w:szCs w:val="26"/>
+          <w:rFonts w:ascii="Calibri" w:cs="Calibri" w:eastAsia="Calibri" w:hAnsi="Calibri"/>
+        </w:rPr>
+        <w:t xml:space="preserve"> — 22 octobre 2026, 17 h UTC</w:t>
       </w:r>
     </w:p>
     <w:p>
@@ -5694,7 +4058,7 @@
           <w:szCs w:val="28"/>
           <w:rFonts w:ascii="Calibri" w:cs="Calibri" w:eastAsia="Calibri" w:hAnsi="Calibri"/>
         </w:rPr>
-        <w:t xml:space="preserve">GUINÉE : LA HAC S’ATTAQUE À LA PROLIFÉRATION ILLÉGALE DES WEB TV</w:t>
+        <w:t xml:space="preserve">KINDIA : UNE DISPUTE AUTOUR D’UN SUPPOSÉ RIVAL VIRE AU MEURTRE, LE SUSPECT RACONTE</w:t>
       </w:r>
     </w:p>
     <w:p>
@@ -5710,69 +4074,7 @@
         </w:rPr>
         <w:t xml:space="preserve">▪  Source : </w:t>
       </w:r>
-      <w:hyperlink w:history="1" r:id="rIdi6_dcxkwtorh8x8oai6fo">
-        <w:r>
-          <w:rPr>
-            <w:u w:val="single"/>
-            <w:color w:val="1F6B5E"/>
-            <w:sz w:val="26"/>
-            <w:szCs w:val="26"/>
-            <w:rFonts w:ascii="Calibri" w:cs="Calibri" w:eastAsia="Calibri" w:hAnsi="Calibri"/>
-          </w:rPr>
-          <w:t xml:space="preserve">Mali 24</w:t>
-        </w:r>
-      </w:hyperlink>
-      <w:r>
-        <w:rPr>
-          <w:color w:val="1F2937"/>
-          <w:sz w:val="26"/>
-          <w:szCs w:val="26"/>
-          <w:rFonts w:ascii="Calibri" w:cs="Calibri" w:eastAsia="Calibri" w:hAnsi="Calibri"/>
-        </w:rPr>
-        <w:t xml:space="preserve"> — 20 octobre 2026, 13 h UTC</w:t>
-      </w:r>
-    </w:p>
-    <w:p>
-      <w:pPr>
-        <w:spacing w:before="160"/>
-        <w:ind w:left="360"/>
-      </w:pPr>
-      <w:r>
-        <w:rPr>
-          <w:color w:val="1F6B5E"/>
-          <w:sz w:val="28"/>
-          <w:szCs w:val="28"/>
-          <w:rFonts w:ascii="Calibri" w:cs="Calibri" w:eastAsia="Calibri" w:hAnsi="Calibri"/>
-        </w:rPr>
-        <w:t xml:space="preserve">❑  </w:t>
-      </w:r>
-      <w:r>
-        <w:rPr>
-          <w:b/>
-          <w:bCs/>
-          <w:u w:val="single"/>
-          <w:color w:val="1F6B5E"/>
-          <w:sz w:val="28"/>
-          <w:szCs w:val="28"/>
-          <w:rFonts w:ascii="Calibri" w:cs="Calibri" w:eastAsia="Calibri" w:hAnsi="Calibri"/>
-        </w:rPr>
-        <w:t xml:space="preserve">IBRO DIABATÉ ÉVACUÉ À L’ÉTRANGER POUR UN MOIS DE SOINS PRIS EN CHARGE PAR L’ÉTAT</w:t>
-      </w:r>
-    </w:p>
-    <w:p>
-      <w:pPr>
-        <w:ind w:left="720"/>
-      </w:pPr>
-      <w:r>
-        <w:rPr>
-          <w:color w:val="1F2937"/>
-          <w:sz w:val="26"/>
-          <w:szCs w:val="26"/>
-          <w:rFonts w:ascii="Calibri" w:cs="Calibri" w:eastAsia="Calibri" w:hAnsi="Calibri"/>
-        </w:rPr>
-        <w:t xml:space="preserve">▪  Source : </w:t>
-      </w:r>
-      <w:hyperlink w:history="1" r:id="rIdvgiyxl7yco45833csn0wd">
+      <w:hyperlink w:history="1" r:id="rIdz7ho4fhyqqylltaqhunfm">
         <w:r>
           <w:rPr>
             <w:u w:val="single"/>
@@ -5791,7 +4093,7 @@
           <w:szCs w:val="26"/>
           <w:rFonts w:ascii="Calibri" w:cs="Calibri" w:eastAsia="Calibri" w:hAnsi="Calibri"/>
         </w:rPr>
-        <w:t xml:space="preserve"> — 21 octobre 2026, 10 h UTC</w:t>
+        <w:t xml:space="preserve"> — 22 octobre 2026, 11 h UTC</w:t>
       </w:r>
     </w:p>
     <w:p>
@@ -5818,7 +4120,7 @@
           <w:szCs w:val="28"/>
           <w:rFonts w:ascii="Calibri" w:cs="Calibri" w:eastAsia="Calibri" w:hAnsi="Calibri"/>
         </w:rPr>
-        <w:t xml:space="preserve">LE PROCUREUR GÉNÉRAL PRÈS LA COUR SUPRÊME DÉFEND LA PROCÉDURE VISANT L'EX-MAGISTRAT ALGASSIMOU DIALLO</w:t>
+        <w:t xml:space="preserve">TÉLIMÉLÉ : LE PRÉFET MOBILISE LES CADRES AUTOUR DE LA SÉCURITÉ ET DE LA GESTION DES BIENS PUBLICS</w:t>
       </w:r>
     </w:p>
     <w:p>
@@ -5834,69 +4136,7 @@
         </w:rPr>
         <w:t xml:space="preserve">▪  Source : </w:t>
       </w:r>
-      <w:hyperlink w:history="1" r:id="rId5wd_ffg6f9oorw-hj5lif">
-        <w:r>
-          <w:rPr>
-            <w:u w:val="single"/>
-            <w:color w:val="1F6B5E"/>
-            <w:sz w:val="26"/>
-            <w:szCs w:val="26"/>
-            <w:rFonts w:ascii="Calibri" w:cs="Calibri" w:eastAsia="Calibri" w:hAnsi="Calibri"/>
-          </w:rPr>
-          <w:t xml:space="preserve">AllAfrica (GN)</w:t>
-        </w:r>
-      </w:hyperlink>
-      <w:r>
-        <w:rPr>
-          <w:color w:val="1F2937"/>
-          <w:sz w:val="26"/>
-          <w:szCs w:val="26"/>
-          <w:rFonts w:ascii="Calibri" w:cs="Calibri" w:eastAsia="Calibri" w:hAnsi="Calibri"/>
-        </w:rPr>
-        <w:t xml:space="preserve"> — 21 octobre 2026, 10 h UTC</w:t>
-      </w:r>
-    </w:p>
-    <w:p>
-      <w:pPr>
-        <w:spacing w:before="160"/>
-        <w:ind w:left="360"/>
-      </w:pPr>
-      <w:r>
-        <w:rPr>
-          <w:color w:val="1F6B5E"/>
-          <w:sz w:val="28"/>
-          <w:szCs w:val="28"/>
-          <w:rFonts w:ascii="Calibri" w:cs="Calibri" w:eastAsia="Calibri" w:hAnsi="Calibri"/>
-        </w:rPr>
-        <w:t xml:space="preserve">❑  </w:t>
-      </w:r>
-      <w:r>
-        <w:rPr>
-          <w:b/>
-          <w:bCs/>
-          <w:u w:val="single"/>
-          <w:color w:val="1F6B5E"/>
-          <w:sz w:val="28"/>
-          <w:szCs w:val="28"/>
-          <w:rFonts w:ascii="Calibri" w:cs="Calibri" w:eastAsia="Calibri" w:hAnsi="Calibri"/>
-        </w:rPr>
-        <w:t xml:space="preserve">LÉLOUMA : DES ÉCOLES FERMÉES PAR MANQUE D’ENSEIGNANTS, PLUS DE 500 ÉLÈVES PRIVÉS DE SCOLARITÉ</w:t>
-      </w:r>
-    </w:p>
-    <w:p>
-      <w:pPr>
-        <w:ind w:left="720"/>
-      </w:pPr>
-      <w:r>
-        <w:rPr>
-          <w:color w:val="1F2937"/>
-          <w:sz w:val="26"/>
-          <w:szCs w:val="26"/>
-          <w:rFonts w:ascii="Calibri" w:cs="Calibri" w:eastAsia="Calibri" w:hAnsi="Calibri"/>
-        </w:rPr>
-        <w:t xml:space="preserve">▪  Source : </w:t>
-      </w:r>
-      <w:hyperlink w:history="1" r:id="rIdokdljxpzvvhvtjpwfbgs-">
+      <w:hyperlink w:history="1" r:id="rIdwnhbnf1mfq9fhu1meqcwe">
         <w:r>
           <w:rPr>
             <w:u w:val="single"/>
@@ -5915,7 +4155,131 @@
           <w:szCs w:val="26"/>
           <w:rFonts w:ascii="Calibri" w:cs="Calibri" w:eastAsia="Calibri" w:hAnsi="Calibri"/>
         </w:rPr>
-        <w:t xml:space="preserve"> — 20 octobre 2026, 22 h UTC</w:t>
+        <w:t xml:space="preserve"> — 23 octobre 2026, 6 h UTC</w:t>
+      </w:r>
+    </w:p>
+    <w:p>
+      <w:pPr>
+        <w:spacing w:before="160"/>
+        <w:ind w:left="360"/>
+      </w:pPr>
+      <w:r>
+        <w:rPr>
+          <w:color w:val="1F6B5E"/>
+          <w:sz w:val="28"/>
+          <w:szCs w:val="28"/>
+          <w:rFonts w:ascii="Calibri" w:cs="Calibri" w:eastAsia="Calibri" w:hAnsi="Calibri"/>
+        </w:rPr>
+        <w:t xml:space="preserve">❑  </w:t>
+      </w:r>
+      <w:r>
+        <w:rPr>
+          <w:b/>
+          <w:bCs/>
+          <w:u w:val="single"/>
+          <w:color w:val="1F6B5E"/>
+          <w:sz w:val="28"/>
+          <w:szCs w:val="28"/>
+          <w:rFonts w:ascii="Calibri" w:cs="Calibri" w:eastAsia="Calibri" w:hAnsi="Calibri"/>
+        </w:rPr>
+        <w:t xml:space="preserve">L’AGRASC ANNONCE DES VENTES AUX ENCHÈRES PUBLIQUES DE VÉHICULES, DES MOTOS ET DE TÉLÉPHONES LE 11 NOVEMBRE 2026</w:t>
+      </w:r>
+    </w:p>
+    <w:p>
+      <w:pPr>
+        <w:ind w:left="720"/>
+      </w:pPr>
+      <w:r>
+        <w:rPr>
+          <w:color w:val="1F2937"/>
+          <w:sz w:val="26"/>
+          <w:szCs w:val="26"/>
+          <w:rFonts w:ascii="Calibri" w:cs="Calibri" w:eastAsia="Calibri" w:hAnsi="Calibri"/>
+        </w:rPr>
+        <w:t xml:space="preserve">▪  Source : </w:t>
+      </w:r>
+      <w:hyperlink w:history="1" r:id="rIdvtib8csofgrhir93anidf">
+        <w:r>
+          <w:rPr>
+            <w:u w:val="single"/>
+            <w:color w:val="1F6B5E"/>
+            <w:sz w:val="26"/>
+            <w:szCs w:val="26"/>
+            <w:rFonts w:ascii="Calibri" w:cs="Calibri" w:eastAsia="Calibri" w:hAnsi="Calibri"/>
+          </w:rPr>
+          <w:t xml:space="preserve">Guineelive</w:t>
+        </w:r>
+      </w:hyperlink>
+      <w:r>
+        <w:rPr>
+          <w:color w:val="1F2937"/>
+          <w:sz w:val="26"/>
+          <w:szCs w:val="26"/>
+          <w:rFonts w:ascii="Calibri" w:cs="Calibri" w:eastAsia="Calibri" w:hAnsi="Calibri"/>
+        </w:rPr>
+        <w:t xml:space="preserve"> — 22 octobre 2026, 17 h UTC</w:t>
+      </w:r>
+    </w:p>
+    <w:p>
+      <w:pPr>
+        <w:spacing w:before="160"/>
+        <w:ind w:left="360"/>
+      </w:pPr>
+      <w:r>
+        <w:rPr>
+          <w:color w:val="1F6B5E"/>
+          <w:sz w:val="28"/>
+          <w:szCs w:val="28"/>
+          <w:rFonts w:ascii="Calibri" w:cs="Calibri" w:eastAsia="Calibri" w:hAnsi="Calibri"/>
+        </w:rPr>
+        <w:t xml:space="preserve">❑  </w:t>
+      </w:r>
+      <w:r>
+        <w:rPr>
+          <w:b/>
+          <w:bCs/>
+          <w:u w:val="single"/>
+          <w:color w:val="1F6B5E"/>
+          <w:sz w:val="28"/>
+          <w:szCs w:val="28"/>
+          <w:rFonts w:ascii="Calibri" w:cs="Calibri" w:eastAsia="Calibri" w:hAnsi="Calibri"/>
+        </w:rPr>
+        <w:t xml:space="preserve">CRIEF : MAMADOU SALIOU DIAKITÉ SUCCÈDE À FRANCIS KOVA ZOUMANIGUI AU POSTE DE PRÉSIDENT</w:t>
+      </w:r>
+    </w:p>
+    <w:p>
+      <w:pPr>
+        <w:ind w:left="720"/>
+      </w:pPr>
+      <w:r>
+        <w:rPr>
+          <w:color w:val="1F2937"/>
+          <w:sz w:val="26"/>
+          <w:szCs w:val="26"/>
+          <w:rFonts w:ascii="Calibri" w:cs="Calibri" w:eastAsia="Calibri" w:hAnsi="Calibri"/>
+        </w:rPr>
+        <w:t xml:space="preserve">▪  Source : </w:t>
+      </w:r>
+      <w:hyperlink w:history="1" r:id="rIdhtdwp9zfuljxuhdgsyt9c">
+        <w:r>
+          <w:rPr>
+            <w:u w:val="single"/>
+            <w:color w:val="1F6B5E"/>
+            <w:sz w:val="26"/>
+            <w:szCs w:val="26"/>
+            <w:rFonts w:ascii="Calibri" w:cs="Calibri" w:eastAsia="Calibri" w:hAnsi="Calibri"/>
+          </w:rPr>
+          <w:t xml:space="preserve">Guineelive</w:t>
+        </w:r>
+      </w:hyperlink>
+      <w:r>
+        <w:rPr>
+          <w:color w:val="1F2937"/>
+          <w:sz w:val="26"/>
+          <w:szCs w:val="26"/>
+          <w:rFonts w:ascii="Calibri" w:cs="Calibri" w:eastAsia="Calibri" w:hAnsi="Calibri"/>
+        </w:rPr>
+        <w:t xml:space="preserve"> — 22 octobre 2026, 0 h UTC</w:t>
       </w:r>
     </w:p>
     <w:p>
@@ -6183,17 +4547,125 @@
     <w:p>
       <w:pPr>
         <w:spacing w:before="160"/>
-      </w:pPr>
-      <w:r>
-        <w:rPr>
-          <w:i/>
-          <w:iCs/>
-          <w:color w:val="6B7280"/>
-          <w:sz w:val="24"/>
-          <w:szCs w:val="24"/>
-          <w:rFonts w:ascii="Calibri" w:cs="Calibri" w:eastAsia="Calibri" w:hAnsi="Calibri"/>
-        </w:rPr>
-        <w:t xml:space="preserve">Aucun fait marquant relevé sur la période.</w:t>
+        <w:ind w:left="360"/>
+      </w:pPr>
+      <w:r>
+        <w:rPr>
+          <w:color w:val="1F6B5E"/>
+          <w:sz w:val="28"/>
+          <w:szCs w:val="28"/>
+          <w:rFonts w:ascii="Calibri" w:cs="Calibri" w:eastAsia="Calibri" w:hAnsi="Calibri"/>
+        </w:rPr>
+        <w:t xml:space="preserve">❑  </w:t>
+      </w:r>
+      <w:r>
+        <w:rPr>
+          <w:b/>
+          <w:bCs/>
+          <w:u w:val="single"/>
+          <w:color w:val="1F6B5E"/>
+          <w:sz w:val="28"/>
+          <w:szCs w:val="28"/>
+          <w:rFonts w:ascii="Calibri" w:cs="Calibri" w:eastAsia="Calibri" w:hAnsi="Calibri"/>
+        </w:rPr>
+        <w:t xml:space="preserve">LIBERIA: WAR VICTIMS, SURVIVORS PROTEST AT COURT OFFICE, CAPITOL AS HOUSE CHAIRMAN PLEDGES TO PUT COURT BILL BEFORE PLENARY TUESDAY.</w:t>
+      </w:r>
+    </w:p>
+    <w:p>
+      <w:pPr>
+        <w:ind w:left="720"/>
+      </w:pPr>
+      <w:r>
+        <w:rPr>
+          <w:color w:val="1F2937"/>
+          <w:sz w:val="26"/>
+          <w:szCs w:val="26"/>
+          <w:rFonts w:ascii="Calibri" w:cs="Calibri" w:eastAsia="Calibri" w:hAnsi="Calibri"/>
+        </w:rPr>
+        <w:t xml:space="preserve">▪  Source : </w:t>
+      </w:r>
+      <w:hyperlink w:history="1" r:id="rIdvoyfpmzaihxmsvxbqmoup">
+        <w:r>
+          <w:rPr>
+            <w:u w:val="single"/>
+            <w:color w:val="1F6B5E"/>
+            <w:sz w:val="26"/>
+            <w:szCs w:val="26"/>
+            <w:rFonts w:ascii="Calibri" w:cs="Calibri" w:eastAsia="Calibri" w:hAnsi="Calibri"/>
+          </w:rPr>
+          <w:t xml:space="preserve">FrontPageAfrica — Liberia</w:t>
+        </w:r>
+      </w:hyperlink>
+      <w:r>
+        <w:rPr>
+          <w:color w:val="1F2937"/>
+          <w:sz w:val="26"/>
+          <w:szCs w:val="26"/>
+          <w:rFonts w:ascii="Calibri" w:cs="Calibri" w:eastAsia="Calibri" w:hAnsi="Calibri"/>
+        </w:rPr>
+        <w:t xml:space="preserve"> — 23 octobre 2026, 5 h UTC</w:t>
+      </w:r>
+    </w:p>
+    <w:p>
+      <w:pPr>
+        <w:spacing w:before="160"/>
+        <w:ind w:left="360"/>
+      </w:pPr>
+      <w:r>
+        <w:rPr>
+          <w:color w:val="1F6B5E"/>
+          <w:sz w:val="28"/>
+          <w:szCs w:val="28"/>
+          <w:rFonts w:ascii="Calibri" w:cs="Calibri" w:eastAsia="Calibri" w:hAnsi="Calibri"/>
+        </w:rPr>
+        <w:t xml:space="preserve">❑  </w:t>
+      </w:r>
+      <w:r>
+        <w:rPr>
+          <w:b/>
+          <w:bCs/>
+          <w:u w:val="single"/>
+          <w:color w:val="1F6B5E"/>
+          <w:sz w:val="28"/>
+          <w:szCs w:val="28"/>
+          <w:rFonts w:ascii="Calibri" w:cs="Calibri" w:eastAsia="Calibri" w:hAnsi="Calibri"/>
+        </w:rPr>
+        <w:t xml:space="preserve">AFL FIRES TWO SOLDIERS OVER ASSAULT</w:t>
+      </w:r>
+    </w:p>
+    <w:p>
+      <w:pPr>
+        <w:ind w:left="720"/>
+      </w:pPr>
+      <w:r>
+        <w:rPr>
+          <w:color w:val="1F2937"/>
+          <w:sz w:val="26"/>
+          <w:szCs w:val="26"/>
+          <w:rFonts w:ascii="Calibri" w:cs="Calibri" w:eastAsia="Calibri" w:hAnsi="Calibri"/>
+        </w:rPr>
+        <w:t xml:space="preserve">▪  Source : </w:t>
+      </w:r>
+      <w:hyperlink w:history="1" r:id="rIdkxheeimqjrt6vt_o_bybi">
+        <w:r>
+          <w:rPr>
+            <w:u w:val="single"/>
+            <w:color w:val="1F6B5E"/>
+            <w:sz w:val="26"/>
+            <w:szCs w:val="26"/>
+            <w:rFonts w:ascii="Calibri" w:cs="Calibri" w:eastAsia="Calibri" w:hAnsi="Calibri"/>
+          </w:rPr>
+          <w:t xml:space="preserve">Global News Network Liberia</w:t>
+        </w:r>
+      </w:hyperlink>
+      <w:r>
+        <w:rPr>
+          <w:color w:val="1F2937"/>
+          <w:sz w:val="26"/>
+          <w:szCs w:val="26"/>
+          <w:rFonts w:ascii="Calibri" w:cs="Calibri" w:eastAsia="Calibri" w:hAnsi="Calibri"/>
+        </w:rPr>
+        <w:t xml:space="preserve"> — 22 octobre 2026, 17 h UTC</w:t>
       </w:r>
     </w:p>
     <w:p>
@@ -6420,7 +4892,7 @@
           <w:szCs w:val="28"/>
           <w:rFonts w:ascii="Calibri" w:cs="Calibri" w:eastAsia="Calibri" w:hAnsi="Calibri"/>
         </w:rPr>
-        <w:t xml:space="preserve">8 MILLIONS VOLÉS ET ATTAQUE À LA MACHETTE : DEUX BRAQUEURS DU POINT WAVE DE DAHRA TOMBENT À TOUBA</w:t>
+        <w:t xml:space="preserve">MAMADOU GUÈYE ANCIEN DIRECTEUR DES DOMAINES RESTE LIBRE : COUP D'ARRÊT DE LA COUR SUPRÊME AU RECOURS CONTRE SA LIBERTÉ PROVISOIRE</w:t>
       </w:r>
     </w:p>
     <w:p>
@@ -6436,7 +4908,131 @@
         </w:rPr>
         <w:t xml:space="preserve">▪  Source : </w:t>
       </w:r>
-      <w:hyperlink w:history="1" r:id="rId78vkovr3qt87gbbrmaog5">
+      <w:hyperlink w:history="1" r:id="rIdzuqwiw9kwtny8zdlp-isl">
+        <w:r>
+          <w:rPr>
+            <w:u w:val="single"/>
+            <w:color w:val="1F6B5E"/>
+            <w:sz w:val="26"/>
+            <w:szCs w:val="26"/>
+            <w:rFonts w:ascii="Calibri" w:cs="Calibri" w:eastAsia="Calibri" w:hAnsi="Calibri"/>
+          </w:rPr>
+          <w:t xml:space="preserve">Dakar Actu</w:t>
+        </w:r>
+      </w:hyperlink>
+      <w:r>
+        <w:rPr>
+          <w:color w:val="1F2937"/>
+          <w:sz w:val="26"/>
+          <w:szCs w:val="26"/>
+          <w:rFonts w:ascii="Calibri" w:cs="Calibri" w:eastAsia="Calibri" w:hAnsi="Calibri"/>
+        </w:rPr>
+        <w:t xml:space="preserve"> — 22 octobre 2026, 19 h UTC</w:t>
+      </w:r>
+    </w:p>
+    <w:p>
+      <w:pPr>
+        <w:spacing w:before="160"/>
+        <w:ind w:left="360"/>
+      </w:pPr>
+      <w:r>
+        <w:rPr>
+          <w:color w:val="1F6B5E"/>
+          <w:sz w:val="28"/>
+          <w:szCs w:val="28"/>
+          <w:rFonts w:ascii="Calibri" w:cs="Calibri" w:eastAsia="Calibri" w:hAnsi="Calibri"/>
+        </w:rPr>
+        <w:t xml:space="preserve">❑  </w:t>
+      </w:r>
+      <w:r>
+        <w:rPr>
+          <w:b/>
+          <w:bCs/>
+          <w:u w:val="single"/>
+          <w:color w:val="1F6B5E"/>
+          <w:sz w:val="28"/>
+          <w:szCs w:val="28"/>
+          <w:rFonts w:ascii="Calibri" w:cs="Calibri" w:eastAsia="Calibri" w:hAnsi="Calibri"/>
+        </w:rPr>
+        <w:t xml:space="preserve">SÉNÉGAL: 14 MORTS ET 368 CAS DE DIPHTÉRIE DANS 13 RÉGIONS</w:t>
+      </w:r>
+    </w:p>
+    <w:p>
+      <w:pPr>
+        <w:ind w:left="720"/>
+      </w:pPr>
+      <w:r>
+        <w:rPr>
+          <w:color w:val="1F2937"/>
+          <w:sz w:val="26"/>
+          <w:szCs w:val="26"/>
+          <w:rFonts w:ascii="Calibri" w:cs="Calibri" w:eastAsia="Calibri" w:hAnsi="Calibri"/>
+        </w:rPr>
+        <w:t xml:space="preserve">▪  Source : </w:t>
+      </w:r>
+      <w:hyperlink w:history="1" r:id="rIdzajcy4eghkh7bgfwdxkt2">
+        <w:r>
+          <w:rPr>
+            <w:u w:val="single"/>
+            <w:color w:val="1F6B5E"/>
+            <w:sz w:val="26"/>
+            <w:szCs w:val="26"/>
+            <w:rFonts w:ascii="Calibri" w:cs="Calibri" w:eastAsia="Calibri" w:hAnsi="Calibri"/>
+          </w:rPr>
+          <w:t xml:space="preserve">Wakat Sera</w:t>
+        </w:r>
+      </w:hyperlink>
+      <w:r>
+        <w:rPr>
+          <w:color w:val="1F2937"/>
+          <w:sz w:val="26"/>
+          <w:szCs w:val="26"/>
+          <w:rFonts w:ascii="Calibri" w:cs="Calibri" w:eastAsia="Calibri" w:hAnsi="Calibri"/>
+        </w:rPr>
+        <w:t xml:space="preserve"> — 22 octobre 2026, 15 h UTC</w:t>
+      </w:r>
+    </w:p>
+    <w:p>
+      <w:pPr>
+        <w:spacing w:before="160"/>
+        <w:ind w:left="360"/>
+      </w:pPr>
+      <w:r>
+        <w:rPr>
+          <w:color w:val="1F6B5E"/>
+          <w:sz w:val="28"/>
+          <w:szCs w:val="28"/>
+          <w:rFonts w:ascii="Calibri" w:cs="Calibri" w:eastAsia="Calibri" w:hAnsi="Calibri"/>
+        </w:rPr>
+        <w:t xml:space="preserve">❑  </w:t>
+      </w:r>
+      <w:r>
+        <w:rPr>
+          <w:b/>
+          <w:bCs/>
+          <w:u w:val="single"/>
+          <w:color w:val="1F6B5E"/>
+          <w:sz w:val="28"/>
+          <w:szCs w:val="28"/>
+          <w:rFonts w:ascii="Calibri" w:cs="Calibri" w:eastAsia="Calibri" w:hAnsi="Calibri"/>
+        </w:rPr>
+        <w:t xml:space="preserve">EN GARDE À VUE : L’AVOCAT DE DIODIO GLOW SKIN ALERTE SUR SON ÉTAT DE SANTÉ</w:t>
+      </w:r>
+    </w:p>
+    <w:p>
+      <w:pPr>
+        <w:ind w:left="720"/>
+      </w:pPr>
+      <w:r>
+        <w:rPr>
+          <w:color w:val="1F2937"/>
+          <w:sz w:val="26"/>
+          <w:szCs w:val="26"/>
+          <w:rFonts w:ascii="Calibri" w:cs="Calibri" w:eastAsia="Calibri" w:hAnsi="Calibri"/>
+        </w:rPr>
+        <w:t xml:space="preserve">▪  Source : </w:t>
+      </w:r>
+      <w:hyperlink w:history="1" r:id="rIdbbaor8tadlddd_n5khuft">
         <w:r>
           <w:rPr>
             <w:u w:val="single"/>
@@ -6455,7 +5051,7 @@
           <w:szCs w:val="26"/>
           <w:rFonts w:ascii="Calibri" w:cs="Calibri" w:eastAsia="Calibri" w:hAnsi="Calibri"/>
         </w:rPr>
-        <w:t xml:space="preserve"> — 21 octobre 2026, 11 h UTC</w:t>
+        <w:t xml:space="preserve"> — 23 octobre 2026, 0 h UTC</w:t>
       </w:r>
     </w:p>
     <w:p>
@@ -6482,7 +5078,7 @@
           <w:szCs w:val="28"/>
           <w:rFonts w:ascii="Calibri" w:cs="Calibri" w:eastAsia="Calibri" w:hAnsi="Calibri"/>
         </w:rPr>
-        <w:t xml:space="preserve">SÉNÉGAL: UN DÉBUT DE GRÈVE GÉNÉRALE DANS UN CONTEXTE DE BRAS DE FER AVEC LE GOUVERNEMENT</w:t>
+        <w:t xml:space="preserve">ALERTE AUX UTILISATEURS : VOICI LA NOUVELLE VAGUE DE TENTATIVES D’ARNAQUES SUR LA MESSAGERIE WHATSAPP</w:t>
       </w:r>
     </w:p>
     <w:p>
@@ -6498,7 +5094,7 @@
         </w:rPr>
         <w:t xml:space="preserve">▪  Source : </w:t>
       </w:r>
-      <w:hyperlink w:history="1" r:id="rIdrz3fjudppqefzxwwm0ggv">
+      <w:hyperlink w:history="1" r:id="rIdhi14ahhwyotvjdvep9tgb">
         <w:r>
           <w:rPr>
             <w:u w:val="single"/>
@@ -6507,7 +5103,7 @@
             <w:szCs w:val="26"/>
             <w:rFonts w:ascii="Calibri" w:cs="Calibri" w:eastAsia="Calibri" w:hAnsi="Calibri"/>
           </w:rPr>
-          <w:t xml:space="preserve">RFI Afrique</w:t>
+          <w:t xml:space="preserve">SeneNews</w:t>
         </w:r>
       </w:hyperlink>
       <w:r>
@@ -6517,7 +5113,7 @@
           <w:szCs w:val="26"/>
           <w:rFonts w:ascii="Calibri" w:cs="Calibri" w:eastAsia="Calibri" w:hAnsi="Calibri"/>
         </w:rPr>
-        <w:t xml:space="preserve"> — 21 octobre 2026, 12 h UTC</w:t>
+        <w:t xml:space="preserve"> — 22 octobre 2026, 21 h UTC</w:t>
       </w:r>
     </w:p>
     <w:p>
@@ -6544,7 +5140,7 @@
           <w:szCs w:val="28"/>
           <w:rFonts w:ascii="Calibri" w:cs="Calibri" w:eastAsia="Calibri" w:hAnsi="Calibri"/>
         </w:rPr>
-        <w:t xml:space="preserve">MATAM : LE MOT D’ORDRE DE GRÈVE GÉNÉRALE LARGEMENT SUIVI À L’HÔPITAL DE OUROSSOGUI (SYNDICALISTE)</w:t>
+        <w:t xml:space="preserve">MBOUR : «J’AI L’HABITUDE DE COUCHER AVEC LES FEMMES DE MES FRÈRES»</w:t>
       </w:r>
     </w:p>
     <w:p>
@@ -6560,69 +5156,7 @@
         </w:rPr>
         <w:t xml:space="preserve">▪  Source : </w:t>
       </w:r>
-      <w:hyperlink w:history="1" r:id="rId2kfusgpyro6gdw3ffojzr">
-        <w:r>
-          <w:rPr>
-            <w:u w:val="single"/>
-            <w:color w:val="1F6B5E"/>
-            <w:sz w:val="26"/>
-            <w:szCs w:val="26"/>
-            <w:rFonts w:ascii="Calibri" w:cs="Calibri" w:eastAsia="Calibri" w:hAnsi="Calibri"/>
-          </w:rPr>
-          <w:t xml:space="preserve">APS — Agence Sénégalaise Presse</w:t>
-        </w:r>
-      </w:hyperlink>
-      <w:r>
-        <w:rPr>
-          <w:color w:val="1F2937"/>
-          <w:sz w:val="26"/>
-          <w:szCs w:val="26"/>
-          <w:rFonts w:ascii="Calibri" w:cs="Calibri" w:eastAsia="Calibri" w:hAnsi="Calibri"/>
-        </w:rPr>
-        <w:t xml:space="preserve"> — 21 octobre 2026, 12 h UTC</w:t>
-      </w:r>
-    </w:p>
-    <w:p>
-      <w:pPr>
-        <w:spacing w:before="160"/>
-        <w:ind w:left="360"/>
-      </w:pPr>
-      <w:r>
-        <w:rPr>
-          <w:color w:val="1F6B5E"/>
-          <w:sz w:val="28"/>
-          <w:szCs w:val="28"/>
-          <w:rFonts w:ascii="Calibri" w:cs="Calibri" w:eastAsia="Calibri" w:hAnsi="Calibri"/>
-        </w:rPr>
-        <w:t xml:space="preserve">❑  </w:t>
-      </w:r>
-      <w:r>
-        <w:rPr>
-          <w:b/>
-          <w:bCs/>
-          <w:u w:val="single"/>
-          <w:color w:val="1F6B5E"/>
-          <w:sz w:val="28"/>
-          <w:szCs w:val="28"/>
-          <w:rFonts w:ascii="Calibri" w:cs="Calibri" w:eastAsia="Calibri" w:hAnsi="Calibri"/>
-        </w:rPr>
-        <w:t xml:space="preserve">CONSEIL DE SÉCURITÉ : QUATRE-VINGTS ANS APRÈS, L’AFRIQUE N’A TOUJOURS PAS DE SIÈGE À LA TABLE</w:t>
-      </w:r>
-    </w:p>
-    <w:p>
-      <w:pPr>
-        <w:ind w:left="720"/>
-      </w:pPr>
-      <w:r>
-        <w:rPr>
-          <w:color w:val="1F2937"/>
-          <w:sz w:val="26"/>
-          <w:szCs w:val="26"/>
-          <w:rFonts w:ascii="Calibri" w:cs="Calibri" w:eastAsia="Calibri" w:hAnsi="Calibri"/>
-        </w:rPr>
-        <w:t xml:space="preserve">▪  Source : </w:t>
-      </w:r>
-      <w:hyperlink w:history="1" r:id="rIdxv31ilgihnsgjpplxvpxm">
+      <w:hyperlink w:history="1" r:id="rIdyxdtde8axsv_iukscztum">
         <w:r>
           <w:rPr>
             <w:u w:val="single"/>
@@ -6641,69 +5175,7 @@
           <w:szCs w:val="26"/>
           <w:rFonts w:ascii="Calibri" w:cs="Calibri" w:eastAsia="Calibri" w:hAnsi="Calibri"/>
         </w:rPr>
-        <w:t xml:space="preserve"> — 21 octobre 2026, 11 h UTC</w:t>
-      </w:r>
-    </w:p>
-    <w:p>
-      <w:pPr>
-        <w:spacing w:before="160"/>
-        <w:ind w:left="360"/>
-      </w:pPr>
-      <w:r>
-        <w:rPr>
-          <w:color w:val="1F6B5E"/>
-          <w:sz w:val="28"/>
-          <w:szCs w:val="28"/>
-          <w:rFonts w:ascii="Calibri" w:cs="Calibri" w:eastAsia="Calibri" w:hAnsi="Calibri"/>
-        </w:rPr>
-        <w:t xml:space="preserve">❑  </w:t>
-      </w:r>
-      <w:r>
-        <w:rPr>
-          <w:b/>
-          <w:bCs/>
-          <w:u w:val="single"/>
-          <w:color w:val="1F6B5E"/>
-          <w:sz w:val="28"/>
-          <w:szCs w:val="28"/>
-          <w:rFonts w:ascii="Calibri" w:cs="Calibri" w:eastAsia="Calibri" w:hAnsi="Calibri"/>
-        </w:rPr>
-        <w:t xml:space="preserve">PROTECTION DES LANCEURS D'ALERTE : RÉCOMPENSE DE 10 %, ANONYMAT ET GARDE-FOUS JURIDIQUES DÉTAILLÉS PAR MOUSSA SARR</w:t>
-      </w:r>
-    </w:p>
-    <w:p>
-      <w:pPr>
-        <w:ind w:left="720"/>
-      </w:pPr>
-      <w:r>
-        <w:rPr>
-          <w:color w:val="1F2937"/>
-          <w:sz w:val="26"/>
-          <w:szCs w:val="26"/>
-          <w:rFonts w:ascii="Calibri" w:cs="Calibri" w:eastAsia="Calibri" w:hAnsi="Calibri"/>
-        </w:rPr>
-        <w:t xml:space="preserve">▪  Source : </w:t>
-      </w:r>
-      <w:hyperlink w:history="1" r:id="rIdgqeh3g561swocmm0xu0qs">
-        <w:r>
-          <w:rPr>
-            <w:u w:val="single"/>
-            <w:color w:val="1F6B5E"/>
-            <w:sz w:val="26"/>
-            <w:szCs w:val="26"/>
-            <w:rFonts w:ascii="Calibri" w:cs="Calibri" w:eastAsia="Calibri" w:hAnsi="Calibri"/>
-          </w:rPr>
-          <w:t xml:space="preserve">Seneweb</w:t>
-        </w:r>
-      </w:hyperlink>
-      <w:r>
-        <w:rPr>
-          <w:color w:val="1F2937"/>
-          <w:sz w:val="26"/>
-          <w:szCs w:val="26"/>
-          <w:rFonts w:ascii="Calibri" w:cs="Calibri" w:eastAsia="Calibri" w:hAnsi="Calibri"/>
-        </w:rPr>
-        <w:t xml:space="preserve"> — 21 octobre 2026, 11 h UTC</w:t>
+        <w:t xml:space="preserve"> — 23 octobre 2026, 5 h UTC</w:t>
       </w:r>
     </w:p>
     <w:p>
@@ -6930,7 +5402,7 @@
           <w:szCs w:val="28"/>
           <w:rFonts w:ascii="Calibri" w:cs="Calibri" w:eastAsia="Calibri" w:hAnsi="Calibri"/>
         </w:rPr>
-        <w:t xml:space="preserve">​GRÈVE DU FSDT : LES MILITAIRES ET LES GENDARMES MOBILISÉS POUR ASSURER LA CONTINUITÉ DU TRANSPORT PUBLIC</w:t>
+        <w:t xml:space="preserve">CROUS SINE SALOUM - LES SYNDICALISTES DÉNONCENT LE RECOURS À LA RÉQUISITION !</w:t>
       </w:r>
     </w:p>
     <w:p>
@@ -6946,7 +5418,7 @@
         </w:rPr>
         <w:t xml:space="preserve">▪  Source : </w:t>
       </w:r>
-      <w:hyperlink w:history="1" r:id="rIdq-zp0dibmeqwq2p-vlsdc">
+      <w:hyperlink w:history="1" r:id="rIdfubacj94u9mbqyl1ezdg3">
         <w:r>
           <w:rPr>
             <w:u w:val="single"/>
@@ -6955,7 +5427,7 @@
             <w:szCs w:val="26"/>
             <w:rFonts w:ascii="Calibri" w:cs="Calibri" w:eastAsia="Calibri" w:hAnsi="Calibri"/>
           </w:rPr>
-          <w:t xml:space="preserve">Pressafrik</w:t>
+          <w:t xml:space="preserve">AllAfrica (SN)</w:t>
         </w:r>
       </w:hyperlink>
       <w:r>
@@ -6965,7 +5437,7 @@
           <w:szCs w:val="26"/>
           <w:rFonts w:ascii="Calibri" w:cs="Calibri" w:eastAsia="Calibri" w:hAnsi="Calibri"/>
         </w:rPr>
-        <w:t xml:space="preserve"> — 21 octobre 2026, 11 h UTC</w:t>
+        <w:t xml:space="preserve"> — 22 octobre 2026, 22 h UTC</w:t>
       </w:r>
     </w:p>
     <w:p>
@@ -6992,7 +5464,7 @@
           <w:szCs w:val="28"/>
           <w:rFonts w:ascii="Calibri" w:cs="Calibri" w:eastAsia="Calibri" w:hAnsi="Calibri"/>
         </w:rPr>
-        <w:t xml:space="preserve">ÉTHIQUE POLITIQUE : LES DANGERS DU CUMUL DE FONCTIONS EN PÉRIODE DE CRISE ÉCONOMIQUE</w:t>
+        <w:t xml:space="preserve">DÉBAT TÉLÉVISÉ SUR LA LFR : LA RÉPONSE DU PREMIER MINISTRE AL AMINOU LO À OUSMANE SONKO</w:t>
       </w:r>
     </w:p>
     <w:p>
@@ -7008,7 +5480,7 @@
         </w:rPr>
         <w:t xml:space="preserve">▪  Source : </w:t>
       </w:r>
-      <w:hyperlink w:history="1" r:id="rId1v4vmqiczbedrsrvfwi3k">
+      <w:hyperlink w:history="1" r:id="rIdcdskkdh_qflzv5x4yggq6">
         <w:r>
           <w:rPr>
             <w:u w:val="single"/>
@@ -7027,7 +5499,7 @@
           <w:szCs w:val="26"/>
           <w:rFonts w:ascii="Calibri" w:cs="Calibri" w:eastAsia="Calibri" w:hAnsi="Calibri"/>
         </w:rPr>
-        <w:t xml:space="preserve"> — 21 octobre 2026, 11 h UTC</w:t>
+        <w:t xml:space="preserve"> — 22 octobre 2026, 21 h UTC</w:t>
       </w:r>
     </w:p>
     <w:p>
@@ -7054,7 +5526,7 @@
           <w:szCs w:val="28"/>
           <w:rFonts w:ascii="Calibri" w:cs="Calibri" w:eastAsia="Calibri" w:hAnsi="Calibri"/>
         </w:rPr>
-        <w:t xml:space="preserve">​GRÈVE DE 72 HEURES DU FSDT : MAMADOU LAMINE DIANTÉ RECONNAÎT DES ENGAGEMENTS NON RÉALISÉS</w:t>
+        <w:t xml:space="preserve">SENEGALESE WORKERS MARCH AGAINST RISING LIVING COSTS AHEAD OF GENERAL STRIKE</w:t>
       </w:r>
     </w:p>
     <w:p>
@@ -7070,7 +5542,7 @@
         </w:rPr>
         <w:t xml:space="preserve">▪  Source : </w:t>
       </w:r>
-      <w:hyperlink w:history="1" r:id="rIdkm8d1buji6r9iv2xwtiea">
+      <w:hyperlink w:history="1" r:id="rIdrgvpsrdyv-usonmkjkox8">
         <w:r>
           <w:rPr>
             <w:u w:val="single"/>
@@ -7079,7 +5551,7 @@
             <w:szCs w:val="26"/>
             <w:rFonts w:ascii="Calibri" w:cs="Calibri" w:eastAsia="Calibri" w:hAnsi="Calibri"/>
           </w:rPr>
-          <w:t xml:space="preserve">Pressafrik</w:t>
+          <w:t xml:space="preserve">Gambia News - The Point</w:t>
         </w:r>
       </w:hyperlink>
       <w:r>
@@ -7089,131 +5561,7 @@
           <w:szCs w:val="26"/>
           <w:rFonts w:ascii="Calibri" w:cs="Calibri" w:eastAsia="Calibri" w:hAnsi="Calibri"/>
         </w:rPr>
-        <w:t xml:space="preserve"> — 21 octobre 2026, 10 h UTC</w:t>
-      </w:r>
-    </w:p>
-    <w:p>
-      <w:pPr>
-        <w:spacing w:before="160"/>
-        <w:ind w:left="360"/>
-      </w:pPr>
-      <w:r>
-        <w:rPr>
-          <w:color w:val="1F6B5E"/>
-          <w:sz w:val="28"/>
-          <w:szCs w:val="28"/>
-          <w:rFonts w:ascii="Calibri" w:cs="Calibri" w:eastAsia="Calibri" w:hAnsi="Calibri"/>
-        </w:rPr>
-        <w:t xml:space="preserve">❑  </w:t>
-      </w:r>
-      <w:r>
-        <w:rPr>
-          <w:b/>
-          <w:bCs/>
-          <w:u w:val="single"/>
-          <w:color w:val="1F6B5E"/>
-          <w:sz w:val="28"/>
-          <w:szCs w:val="28"/>
-          <w:rFonts w:ascii="Calibri" w:cs="Calibri" w:eastAsia="Calibri" w:hAnsi="Calibri"/>
-        </w:rPr>
-        <w:t xml:space="preserve">«GRÈVE GÉNÉRALE» DU FSDT : UN INSPECTEUR DU TRAVAIL EXPLIQUE CE «QUI PEUT METTRE À L’ABRI LES TRAVAILLEURS»</w:t>
-      </w:r>
-    </w:p>
-    <w:p>
-      <w:pPr>
-        <w:ind w:left="720"/>
-      </w:pPr>
-      <w:r>
-        <w:rPr>
-          <w:color w:val="1F2937"/>
-          <w:sz w:val="26"/>
-          <w:szCs w:val="26"/>
-          <w:rFonts w:ascii="Calibri" w:cs="Calibri" w:eastAsia="Calibri" w:hAnsi="Calibri"/>
-        </w:rPr>
-        <w:t xml:space="preserve">▪  Source : </w:t>
-      </w:r>
-      <w:hyperlink w:history="1" r:id="rIdtbg_ernpk9yiashgsr7_h">
-        <w:r>
-          <w:rPr>
-            <w:u w:val="single"/>
-            <w:color w:val="1F6B5E"/>
-            <w:sz w:val="26"/>
-            <w:szCs w:val="26"/>
-            <w:rFonts w:ascii="Calibri" w:cs="Calibri" w:eastAsia="Calibri" w:hAnsi="Calibri"/>
-          </w:rPr>
-          <w:t xml:space="preserve">Pressafrik</w:t>
-        </w:r>
-      </w:hyperlink>
-      <w:r>
-        <w:rPr>
-          <w:color w:val="1F2937"/>
-          <w:sz w:val="26"/>
-          <w:szCs w:val="26"/>
-          <w:rFonts w:ascii="Calibri" w:cs="Calibri" w:eastAsia="Calibri" w:hAnsi="Calibri"/>
-        </w:rPr>
-        <w:t xml:space="preserve"> — 21 octobre 2026, 10 h UTC</w:t>
-      </w:r>
-    </w:p>
-    <w:p>
-      <w:pPr>
-        <w:spacing w:before="160"/>
-        <w:ind w:left="360"/>
-      </w:pPr>
-      <w:r>
-        <w:rPr>
-          <w:color w:val="1F6B5E"/>
-          <w:sz w:val="28"/>
-          <w:szCs w:val="28"/>
-          <w:rFonts w:ascii="Calibri" w:cs="Calibri" w:eastAsia="Calibri" w:hAnsi="Calibri"/>
-        </w:rPr>
-        <w:t xml:space="preserve">❑  </w:t>
-      </w:r>
-      <w:r>
-        <w:rPr>
-          <w:b/>
-          <w:bCs/>
-          <w:u w:val="single"/>
-          <w:color w:val="1F6B5E"/>
-          <w:sz w:val="28"/>
-          <w:szCs w:val="28"/>
-          <w:rFonts w:ascii="Calibri" w:cs="Calibri" w:eastAsia="Calibri" w:hAnsi="Calibri"/>
-        </w:rPr>
-        <w:t xml:space="preserve">UNE GRÈVE GÉNÉRALE DE 72 HEURES ANNONCÉE SUR FOND DE CONTESTATION DES NOUVEAUX CODES DU TRAVAIL</w:t>
-      </w:r>
-    </w:p>
-    <w:p>
-      <w:pPr>
-        <w:ind w:left="720"/>
-      </w:pPr>
-      <w:r>
-        <w:rPr>
-          <w:color w:val="1F2937"/>
-          <w:sz w:val="26"/>
-          <w:szCs w:val="26"/>
-          <w:rFonts w:ascii="Calibri" w:cs="Calibri" w:eastAsia="Calibri" w:hAnsi="Calibri"/>
-        </w:rPr>
-        <w:t xml:space="preserve">▪  Source : </w:t>
-      </w:r>
-      <w:hyperlink w:history="1" r:id="rIdmk83-t3vg4hftb1j8yhon">
-        <w:r>
-          <w:rPr>
-            <w:u w:val="single"/>
-            <w:color w:val="1F6B5E"/>
-            <w:sz w:val="26"/>
-            <w:szCs w:val="26"/>
-            <w:rFonts w:ascii="Calibri" w:cs="Calibri" w:eastAsia="Calibri" w:hAnsi="Calibri"/>
-          </w:rPr>
-          <w:t xml:space="preserve">AllAfrica (SN)</w:t>
-        </w:r>
-      </w:hyperlink>
-      <w:r>
-        <w:rPr>
-          <w:color w:val="1F2937"/>
-          <w:sz w:val="26"/>
-          <w:szCs w:val="26"/>
-          <w:rFonts w:ascii="Calibri" w:cs="Calibri" w:eastAsia="Calibri" w:hAnsi="Calibri"/>
-        </w:rPr>
-        <w:t xml:space="preserve"> — 21 octobre 2026, 9 h UTC</w:t>
+        <w:t xml:space="preserve"> — 22 octobre 2026, 10 h UTC</w:t>
       </w:r>
     </w:p>
     <w:p>
@@ -7410,7 +5758,7 @@
               <w:szCs w:val="20"/>
               <w:rFonts w:ascii="Calibri" w:cs="Calibri" w:eastAsia="Calibri" w:hAnsi="Calibri"/>
             </w:rPr>
-            <w:t xml:space="preserve">|  21/10/26   |   </w:t>
+            <w:t xml:space="preserve">|  23/10/26   |   </w:t>
           </w:r>
           <w:r>
             <w:rPr>

</xml_diff>

<commit_message>
Archive des niveaux d'alerte du 2026-10-24
</commit_message>
<xml_diff>
--- a/web/rapports/GRSCI/2026-10.docx
+++ b/web/rapports/GRSCI/2026-10.docx
@@ -217,7 +217,7 @@
           <w:szCs w:val="40"/>
           <w:rFonts w:ascii="Calibri" w:cs="Calibri" w:eastAsia="Calibri" w:hAnsi="Calibri"/>
         </w:rPr>
-        <w:t xml:space="preserve">23 OCTOBRE 2026</w:t>
+        <w:t xml:space="preserve">24 OCTOBRE 2026</w:t>
       </w:r>
     </w:p>
     <w:p>
@@ -410,6 +410,84 @@
                 <w:szCs w:val="20"/>
                 <w:rFonts w:ascii="Calibri" w:cs="Calibri" w:eastAsia="Calibri" w:hAnsi="Calibri"/>
               </w:rPr>
+              <w:t xml:space="preserve">POLITIQUE</w:t>
+            </w:r>
+          </w:p>
+          <w:p>
+            <w:pPr>
+              <w:ind w:left="240"/>
+            </w:pPr>
+            <w:r>
+              <w:rPr>
+                <w:color w:val="1F2937"/>
+                <w:sz w:val="18"/>
+                <w:szCs w:val="18"/>
+                <w:rFonts w:ascii="Calibri" w:cs="Calibri" w:eastAsia="Calibri" w:hAnsi="Calibri"/>
+              </w:rPr>
+              <w:t xml:space="preserve">❑  </w:t>
+            </w:r>
+            <w:r>
+              <w:rPr>
+                <w:color w:val="1F2937"/>
+                <w:sz w:val="18"/>
+                <w:szCs w:val="18"/>
+                <w:rFonts w:ascii="Calibri" w:cs="Calibri" w:eastAsia="Calibri" w:hAnsi="Calibri"/>
+              </w:rPr>
+              <w:t xml:space="preserve">CRISE AU SEIN DU PDCI/RDA - « L'ÉLÉPHANT » SE CASSERA-T-IL UNE DEUXIÈME PATTE ?</w:t>
+            </w:r>
+          </w:p>
+          <w:p>
+            <w:pPr>
+              <w:spacing w:before="100"/>
+            </w:pPr>
+            <w:r>
+              <w:rPr>
+                <w:b/>
+                <w:bCs/>
+                <w:color w:val="1F6B5E"/>
+                <w:sz w:val="20"/>
+                <w:szCs w:val="20"/>
+                <w:rFonts w:ascii="Calibri" w:cs="Calibri" w:eastAsia="Calibri" w:hAnsi="Calibri"/>
+              </w:rPr>
+              <w:t xml:space="preserve">SOCIAL</w:t>
+            </w:r>
+          </w:p>
+          <w:p>
+            <w:pPr>
+              <w:ind w:left="240"/>
+            </w:pPr>
+            <w:r>
+              <w:rPr>
+                <w:color w:val="1F2937"/>
+                <w:sz w:val="18"/>
+                <w:szCs w:val="18"/>
+                <w:rFonts w:ascii="Calibri" w:cs="Calibri" w:eastAsia="Calibri" w:hAnsi="Calibri"/>
+              </w:rPr>
+              <w:t xml:space="preserve">❑  </w:t>
+            </w:r>
+            <w:r>
+              <w:rPr>
+                <w:color w:val="1F2937"/>
+                <w:sz w:val="18"/>
+                <w:szCs w:val="18"/>
+                <w:rFonts w:ascii="Calibri" w:cs="Calibri" w:eastAsia="Calibri" w:hAnsi="Calibri"/>
+              </w:rPr>
+              <w:t xml:space="preserve">DANANÉ/CHIRURGIE HUMANITAIRE - 134 PATIENTS OPÉRÉS GRATUITEMENT, DONT 114 POUR UN…</w:t>
+            </w:r>
+          </w:p>
+          <w:p>
+            <w:pPr>
+              <w:spacing w:before="100"/>
+            </w:pPr>
+            <w:r>
+              <w:rPr>
+                <w:b/>
+                <w:bCs/>
+                <w:color w:val="1F6B5E"/>
+                <w:sz w:val="20"/>
+                <w:szCs w:val="20"/>
+                <w:rFonts w:ascii="Calibri" w:cs="Calibri" w:eastAsia="Calibri" w:hAnsi="Calibri"/>
+              </w:rPr>
               <w:t xml:space="preserve">SÉCURITÉ</w:t>
             </w:r>
           </w:p>
@@ -433,30 +511,7 @@
                 <w:szCs w:val="18"/>
                 <w:rFonts w:ascii="Calibri" w:cs="Calibri" w:eastAsia="Calibri" w:hAnsi="Calibri"/>
               </w:rPr>
-              <w:t xml:space="preserve">AGRO-INDUSTRIE/BRUNO KONÉ - « LA TRANSFORMATION NE SE FERA PAS SANS LES ACTEURS D…</w:t>
-            </w:r>
-          </w:p>
-          <w:p>
-            <w:pPr>
-              <w:ind w:left="240"/>
-            </w:pPr>
-            <w:r>
-              <w:rPr>
-                <w:color w:val="1F2937"/>
-                <w:sz w:val="18"/>
-                <w:szCs w:val="18"/>
-                <w:rFonts w:ascii="Calibri" w:cs="Calibri" w:eastAsia="Calibri" w:hAnsi="Calibri"/>
-              </w:rPr>
-              <w:t xml:space="preserve">❑  </w:t>
-            </w:r>
-            <w:r>
-              <w:rPr>
-                <w:color w:val="1F2937"/>
-                <w:sz w:val="18"/>
-                <w:szCs w:val="18"/>
-                <w:rFonts w:ascii="Calibri" w:cs="Calibri" w:eastAsia="Calibri" w:hAnsi="Calibri"/>
-              </w:rPr>
-              <w:t xml:space="preserve">AUDIENCE ATTENDUE SUR L'ÉLECTION DE TIDJANE THIAM À LA TÊTE DU PARTI D'OPPOSITION…</w:t>
+              <w:t xml:space="preserve">L'AUDIENCE SUR L'ÉLECTION DE TIDJANE THIAM À LA TÊTE DU PDCI RENVOYÉE</w:t>
             </w:r>
           </w:p>
         </w:tc>
@@ -564,7 +619,7 @@
                 <w:szCs w:val="18"/>
                 <w:rFonts w:ascii="Calibri" w:cs="Calibri" w:eastAsia="Calibri" w:hAnsi="Calibri"/>
               </w:rPr>
-              <w:t xml:space="preserve">GRÈVE JUGÉE HORS-CADRE À KOLOKANI : L’ADMINISTRATION SCOLAIRE FIXE UN ULTIMATUM A…</w:t>
+              <w:t xml:space="preserve">BENSON DIAKITÉ, ANCIENNE GRANDE VOIX DE RFI, EST MORT</w:t>
             </w:r>
           </w:p>
           <w:p>
@@ -603,7 +658,7 @@
                 <w:szCs w:val="18"/>
                 <w:rFonts w:ascii="Calibri" w:cs="Calibri" w:eastAsia="Calibri" w:hAnsi="Calibri"/>
               </w:rPr>
-              <w:t xml:space="preserve">SWISS AND AUSTRIAN WOMEN IN LIBYA AFTER RELEASE FROM NIGER KIDNAP ORDEAL</w:t>
+              <w:t xml:space="preserve">LANCEMENT OFFICIEL DE LA CARAVANE DE SENSIBILISATION ET DE FORMATION SUR LES BONN…</w:t>
             </w:r>
           </w:p>
           <w:p>
@@ -642,7 +697,7 @@
                 <w:szCs w:val="18"/>
                 <w:rFonts w:ascii="Calibri" w:cs="Calibri" w:eastAsia="Calibri" w:hAnsi="Calibri"/>
               </w:rPr>
-              <w:t xml:space="preserve">KPANDAI: ONE REPORTEDLY KILLED IN KUMDI FARMLAND DISPUTE</w:t>
+              <w:t xml:space="preserve">SEVEN SHOT DEAD BY GUNMEN AT CHURCH FUNERAL IN JORDAN, OFFICIALS SAY</w:t>
             </w:r>
           </w:p>
           <w:p>
@@ -681,7 +736,7 @@
                 <w:szCs w:val="18"/>
                 <w:rFonts w:ascii="Calibri" w:cs="Calibri" w:eastAsia="Calibri" w:hAnsi="Calibri"/>
               </w:rPr>
-              <w:t xml:space="preserve">TOGO- 31, 7 MILLIARDS FCFA POUR DÉSENCLAVER LES SAVANES : DES TRAVAUX ABANDONNÉS …</w:t>
+              <w:t xml:space="preserve">TOGO : AGRICULTURE, NUCLÉAIRE… LES DÉPUTÉS ADOPTENT QUATRE TEXTES STRATÉGIQUES</w:t>
             </w:r>
           </w:p>
           <w:p>
@@ -698,29 +753,6 @@
                 <w:rFonts w:ascii="Calibri" w:cs="Calibri" w:eastAsia="Calibri" w:hAnsi="Calibri"/>
               </w:rPr>
               <w:t xml:space="preserve">BÉNIN</w:t>
-            </w:r>
-          </w:p>
-          <w:p>
-            <w:pPr>
-              <w:ind w:left="240"/>
-            </w:pPr>
-            <w:r>
-              <w:rPr>
-                <w:color w:val="1F2937"/>
-                <w:sz w:val="18"/>
-                <w:szCs w:val="18"/>
-                <w:rFonts w:ascii="Calibri" w:cs="Calibri" w:eastAsia="Calibri" w:hAnsi="Calibri"/>
-              </w:rPr>
-              <w:t xml:space="preserve">❑  </w:t>
-            </w:r>
-            <w:r>
-              <w:rPr>
-                <w:color w:val="1F2937"/>
-                <w:sz w:val="18"/>
-                <w:szCs w:val="18"/>
-                <w:rFonts w:ascii="Calibri" w:cs="Calibri" w:eastAsia="Calibri" w:hAnsi="Calibri"/>
-              </w:rPr>
-              <w:t xml:space="preserve">PORT DE COTONOU : L’ENLÈVEMENT DES MARCHANDISES DÉSORMAIS POSSIBLE LES WEEK-ENDS</w:t>
             </w:r>
           </w:p>
           <w:p>
@@ -759,7 +791,7 @@
                 <w:szCs w:val="18"/>
                 <w:rFonts w:ascii="Calibri" w:cs="Calibri" w:eastAsia="Calibri" w:hAnsi="Calibri"/>
               </w:rPr>
-              <w:t xml:space="preserve">KINDIA : UNE DISPUTE AUTOUR D’UN SUPPOSÉ RIVAL VIRE AU MEURTRE, LE SUSPECT RACONTE</w:t>
+              <w:t xml:space="preserve">CELLCOM GUINÉE : LA FESATEL ALERTE SUR LES SALAIRES IMPAYÉS ET RÉCLAME L’OUVERTUR…</w:t>
             </w:r>
           </w:p>
           <w:p>
@@ -798,7 +830,7 @@
                 <w:szCs w:val="18"/>
                 <w:rFonts w:ascii="Calibri" w:cs="Calibri" w:eastAsia="Calibri" w:hAnsi="Calibri"/>
               </w:rPr>
-              <w:t xml:space="preserve">LIBERIA: WAR VICTIMS, SURVIVORS PROTEST AT COURT OFFICE, CAPITOL AS HOUSE CHAIRMA…</w:t>
+              <w:t xml:space="preserve">LIBERIA: JUDGE CITES EVIDENCE IN FINDING NSA STAFF PETER BON JALLAH GUILTY OF STA…</w:t>
             </w:r>
           </w:p>
           <w:p>
@@ -837,7 +869,7 @@
                 <w:szCs w:val="18"/>
                 <w:rFonts w:ascii="Calibri" w:cs="Calibri" w:eastAsia="Calibri" w:hAnsi="Calibri"/>
               </w:rPr>
-              <w:t xml:space="preserve">MAMADOU GUÈYE ANCIEN DIRECTEUR DES DOMAINES RESTE LIBRE : COUP D'ARRÊT DE LA COUR…</w:t>
+              <w:t xml:space="preserve">ATTAQUE À TRAPPES ET À LA VERRIÈRE : QUI EST KÉVIN T., LE SUSPECT AUTEUR DE LA FU…</w:t>
             </w:r>
           </w:p>
         </w:tc>
@@ -998,6 +1030,532 @@
                 <w:color w:val="FFFFFF"/>
                 <w:sz w:val="44"/>
                 <w:szCs w:val="44"/>
+                <w:rFonts w:ascii="Arial Narrow" w:cs="Arial Narrow" w:eastAsia="Arial Narrow" w:hAnsi="Arial Narrow"/>
+              </w:rPr>
+              <w:t xml:space="preserve">I</w:t>
+            </w:r>
+          </w:p>
+        </w:tc>
+        <w:tc>
+          <w:tcPr>
+            <w:tcW w:type="dxa" w:w="15180"/>
+            <w:tcBorders>
+              <w:top w:val="none" w:color="FFFFFF" w:sz="0"/>
+              <w:left w:val="none" w:color="FFFFFF" w:sz="0"/>
+              <w:bottom w:val="none" w:color="FFFFFF" w:sz="0"/>
+              <w:right w:val="none" w:color="FFFFFF" w:sz="0"/>
+            </w:tcBorders>
+            <w:vAlign w:val="center"/>
+          </w:tcPr>
+          <w:p>
+            <w:pPr>
+              <w:ind w:left="200"/>
+            </w:pPr>
+            <w:r>
+              <w:rPr>
+                <w:u w:val="single"/>
+                <w:color w:val="1F6B5E"/>
+                <w:sz w:val="56"/>
+                <w:szCs w:val="56"/>
+                <w:rFonts w:ascii="Arial Narrow" w:cs="Arial Narrow" w:eastAsia="Arial Narrow" w:hAnsi="Arial Narrow"/>
+              </w:rPr>
+              <w:t xml:space="preserve">- POLITIQUE</w:t>
+            </w:r>
+          </w:p>
+        </w:tc>
+        <w:tc>
+          <w:tcPr>
+            <w:tcW w:type="dxa" w:w="1500"/>
+            <w:tcBorders>
+              <w:top w:val="none" w:color="FFFFFF" w:sz="0"/>
+              <w:left w:val="none" w:color="FFFFFF" w:sz="0"/>
+              <w:bottom w:val="none" w:color="FFFFFF" w:sz="0"/>
+              <w:right w:val="none" w:color="FFFFFF" w:sz="0"/>
+            </w:tcBorders>
+            <w:vAlign w:val="center"/>
+          </w:tcPr>
+          <w:tbl>
+            <w:tblPr>
+              <w:tblW w:type="dxa" w:w="1200"/>
+              <w:tblBorders>
+                <w:top w:val="single" w:color="auto" w:sz="4"/>
+                <w:left w:val="single" w:color="auto" w:sz="4"/>
+                <w:bottom w:val="single" w:color="auto" w:sz="4"/>
+                <w:right w:val="single" w:color="auto" w:sz="4"/>
+                <w:insideH w:val="single" w:color="auto" w:sz="4"/>
+                <w:insideV w:val="single" w:color="auto" w:sz="4"/>
+              </w:tblBorders>
+            </w:tblPr>
+            <w:tblGrid>
+              <w:gridCol w:w="400"/>
+              <w:gridCol w:w="400"/>
+              <w:gridCol w:w="400"/>
+            </w:tblGrid>
+            <w:tr>
+              <w:trPr>
+                <w:trHeight w:val="600" w:hRule="exact"/>
+              </w:trPr>
+              <w:tc>
+                <w:tcPr>
+                  <w:tcW w:type="dxa" w:w="400"/>
+                  <w:tcBorders>
+                    <w:top w:val="single" w:color="1F2937" w:sz="6"/>
+                    <w:left w:val="single" w:color="1F2937" w:sz="6"/>
+                    <w:bottom w:val="single" w:color="1F2937" w:sz="6"/>
+                    <w:right w:val="single" w:color="1F2937" w:sz="6"/>
+                  </w:tcBorders>
+                  <w:shd w:fill="F77F00" w:color="auto" w:val="clear"/>
+                </w:tcPr>
+                <w:p>
+                  <w:r>
+                    <w:rPr>
+                      <w:color w:val="1F2937"/>
+                      <w:sz w:val="2"/>
+                      <w:szCs w:val="2"/>
+                      <w:rFonts w:ascii="Calibri" w:cs="Calibri" w:eastAsia="Calibri" w:hAnsi="Calibri"/>
+                    </w:rPr>
+                  </w:r>
+                </w:p>
+              </w:tc>
+              <w:tc>
+                <w:tcPr>
+                  <w:tcW w:type="dxa" w:w="400"/>
+                  <w:tcBorders>
+                    <w:top w:val="single" w:color="1F2937" w:sz="6"/>
+                    <w:left w:val="single" w:color="1F2937" w:sz="6"/>
+                    <w:bottom w:val="single" w:color="1F2937" w:sz="6"/>
+                    <w:right w:val="single" w:color="1F2937" w:sz="6"/>
+                  </w:tcBorders>
+                  <w:shd w:fill="FFFFFF" w:color="auto" w:val="clear"/>
+                </w:tcPr>
+                <w:p>
+                  <w:r>
+                    <w:rPr>
+                      <w:color w:val="1F2937"/>
+                      <w:sz w:val="2"/>
+                      <w:szCs w:val="2"/>
+                      <w:rFonts w:ascii="Calibri" w:cs="Calibri" w:eastAsia="Calibri" w:hAnsi="Calibri"/>
+                    </w:rPr>
+                  </w:r>
+                </w:p>
+              </w:tc>
+              <w:tc>
+                <w:tcPr>
+                  <w:tcW w:type="dxa" w:w="400"/>
+                  <w:tcBorders>
+                    <w:top w:val="single" w:color="1F2937" w:sz="6"/>
+                    <w:left w:val="single" w:color="1F2937" w:sz="6"/>
+                    <w:bottom w:val="single" w:color="1F2937" w:sz="6"/>
+                    <w:right w:val="single" w:color="1F2937" w:sz="6"/>
+                  </w:tcBorders>
+                  <w:shd w:fill="009E60" w:color="auto" w:val="clear"/>
+                </w:tcPr>
+                <w:p>
+                  <w:r>
+                    <w:rPr>
+                      <w:color w:val="1F2937"/>
+                      <w:sz w:val="2"/>
+                      <w:szCs w:val="2"/>
+                      <w:rFonts w:ascii="Calibri" w:cs="Calibri" w:eastAsia="Calibri" w:hAnsi="Calibri"/>
+                    </w:rPr>
+                  </w:r>
+                </w:p>
+              </w:tc>
+            </w:tr>
+          </w:tbl>
+          <w:p/>
+        </w:tc>
+      </w:tr>
+    </w:tbl>
+    <w:p>
+      <w:pPr>
+        <w:pBdr>
+          <w:bottom w:val="single" w:color="A3A3A3" w:sz="4" w:space="1"/>
+        </w:pBdr>
+      </w:pPr>
+      <w:r>
+        <w:rPr>
+          <w:color w:val="1F2937"/>
+          <w:sz w:val="12"/>
+          <w:szCs w:val="12"/>
+          <w:rFonts w:ascii="Calibri" w:cs="Calibri" w:eastAsia="Calibri" w:hAnsi="Calibri"/>
+        </w:rPr>
+      </w:r>
+    </w:p>
+    <w:p>
+      <w:pPr>
+        <w:spacing w:before="160"/>
+        <w:ind w:left="360"/>
+      </w:pPr>
+      <w:r>
+        <w:rPr>
+          <w:color w:val="1F6B5E"/>
+          <w:sz w:val="28"/>
+          <w:szCs w:val="28"/>
+          <w:rFonts w:ascii="Calibri" w:cs="Calibri" w:eastAsia="Calibri" w:hAnsi="Calibri"/>
+        </w:rPr>
+        <w:t xml:space="preserve">❑  </w:t>
+      </w:r>
+      <w:r>
+        <w:rPr>
+          <w:b/>
+          <w:bCs/>
+          <w:u w:val="single"/>
+          <w:color w:val="1F6B5E"/>
+          <w:sz w:val="28"/>
+          <w:szCs w:val="28"/>
+          <w:rFonts w:ascii="Calibri" w:cs="Calibri" w:eastAsia="Calibri" w:hAnsi="Calibri"/>
+        </w:rPr>
+        <w:t xml:space="preserve">CRISE AU SEIN DU PDCI/RDA - « L'ÉLÉPHANT » SE CASSERA-T-IL UNE DEUXIÈME PATTE ?</w:t>
+      </w:r>
+    </w:p>
+    <w:p>
+      <w:pPr>
+        <w:ind w:left="720"/>
+      </w:pPr>
+      <w:r>
+        <w:rPr>
+          <w:color w:val="1F2937"/>
+          <w:sz w:val="26"/>
+          <w:szCs w:val="26"/>
+          <w:rFonts w:ascii="Calibri" w:cs="Calibri" w:eastAsia="Calibri" w:hAnsi="Calibri"/>
+        </w:rPr>
+        <w:t xml:space="preserve">▪  Source : </w:t>
+      </w:r>
+      <w:hyperlink w:history="1" r:id="rId_1eayjwimcocw44e1esur">
+        <w:r>
+          <w:rPr>
+            <w:u w:val="single"/>
+            <w:color w:val="1F6B5E"/>
+            <w:sz w:val="26"/>
+            <w:szCs w:val="26"/>
+            <w:rFonts w:ascii="Calibri" w:cs="Calibri" w:eastAsia="Calibri" w:hAnsi="Calibri"/>
+          </w:rPr>
+          <w:t xml:space="preserve">AllAfrica (CI)</w:t>
+        </w:r>
+      </w:hyperlink>
+      <w:r>
+        <w:rPr>
+          <w:color w:val="1F2937"/>
+          <w:sz w:val="26"/>
+          <w:szCs w:val="26"/>
+          <w:rFonts w:ascii="Calibri" w:cs="Calibri" w:eastAsia="Calibri" w:hAnsi="Calibri"/>
+        </w:rPr>
+        <w:t xml:space="preserve"> — 23 octobre 2026, 9 h UTC</w:t>
+      </w:r>
+    </w:p>
+    <w:p>
+      <w:pPr>
+        <w:pageBreakBefore/>
+        <w:spacing w:after="0" w:before="0"/>
+        <w:rPr>
+          <w:sz w:val="2"/>
+          <w:szCs w:val="2"/>
+        </w:rPr>
+      </w:pPr>
+    </w:p>
+    <w:tbl>
+      <w:tblPr>
+        <w:tblW w:type="dxa" w:w="17680"/>
+        <w:tblBorders>
+          <w:top w:val="single" w:color="auto" w:sz="4"/>
+          <w:left w:val="single" w:color="auto" w:sz="4"/>
+          <w:bottom w:val="single" w:color="auto" w:sz="4"/>
+          <w:right w:val="single" w:color="auto" w:sz="4"/>
+          <w:insideH w:val="single" w:color="auto" w:sz="4"/>
+          <w:insideV w:val="single" w:color="auto" w:sz="4"/>
+        </w:tblBorders>
+      </w:tblPr>
+      <w:tblGrid>
+        <w:gridCol w:w="1000"/>
+        <w:gridCol w:w="15180"/>
+        <w:gridCol w:w="1500"/>
+      </w:tblGrid>
+      <w:tr>
+        <w:tc>
+          <w:tcPr>
+            <w:tcW w:type="dxa" w:w="1000"/>
+            <w:tcBorders>
+              <w:top w:val="none" w:color="FFFFFF" w:sz="0"/>
+              <w:left w:val="none" w:color="FFFFFF" w:sz="0"/>
+              <w:bottom w:val="none" w:color="FFFFFF" w:sz="0"/>
+              <w:right w:val="none" w:color="FFFFFF" w:sz="0"/>
+            </w:tcBorders>
+            <w:shd w:fill="1F6B5E" w:color="auto" w:val="clear"/>
+            <w:vAlign w:val="center"/>
+          </w:tcPr>
+          <w:p>
+            <w:pPr>
+              <w:jc w:val="center"/>
+            </w:pPr>
+            <w:r>
+              <w:rPr>
+                <w:color w:val="FFFFFF"/>
+                <w:sz w:val="44"/>
+                <w:szCs w:val="44"/>
+                <w:rFonts w:ascii="Arial Narrow" w:cs="Arial Narrow" w:eastAsia="Arial Narrow" w:hAnsi="Arial Narrow"/>
+              </w:rPr>
+              <w:t xml:space="preserve">II</w:t>
+            </w:r>
+          </w:p>
+        </w:tc>
+        <w:tc>
+          <w:tcPr>
+            <w:tcW w:type="dxa" w:w="15180"/>
+            <w:tcBorders>
+              <w:top w:val="none" w:color="FFFFFF" w:sz="0"/>
+              <w:left w:val="none" w:color="FFFFFF" w:sz="0"/>
+              <w:bottom w:val="none" w:color="FFFFFF" w:sz="0"/>
+              <w:right w:val="none" w:color="FFFFFF" w:sz="0"/>
+            </w:tcBorders>
+            <w:vAlign w:val="center"/>
+          </w:tcPr>
+          <w:p>
+            <w:pPr>
+              <w:ind w:left="200"/>
+            </w:pPr>
+            <w:r>
+              <w:rPr>
+                <w:u w:val="single"/>
+                <w:color w:val="1F6B5E"/>
+                <w:sz w:val="56"/>
+                <w:szCs w:val="56"/>
+                <w:rFonts w:ascii="Arial Narrow" w:cs="Arial Narrow" w:eastAsia="Arial Narrow" w:hAnsi="Arial Narrow"/>
+              </w:rPr>
+              <w:t xml:space="preserve">- SOCIAL</w:t>
+            </w:r>
+          </w:p>
+        </w:tc>
+        <w:tc>
+          <w:tcPr>
+            <w:tcW w:type="dxa" w:w="1500"/>
+            <w:tcBorders>
+              <w:top w:val="none" w:color="FFFFFF" w:sz="0"/>
+              <w:left w:val="none" w:color="FFFFFF" w:sz="0"/>
+              <w:bottom w:val="none" w:color="FFFFFF" w:sz="0"/>
+              <w:right w:val="none" w:color="FFFFFF" w:sz="0"/>
+            </w:tcBorders>
+            <w:vAlign w:val="center"/>
+          </w:tcPr>
+          <w:tbl>
+            <w:tblPr>
+              <w:tblW w:type="dxa" w:w="1200"/>
+              <w:tblBorders>
+                <w:top w:val="single" w:color="auto" w:sz="4"/>
+                <w:left w:val="single" w:color="auto" w:sz="4"/>
+                <w:bottom w:val="single" w:color="auto" w:sz="4"/>
+                <w:right w:val="single" w:color="auto" w:sz="4"/>
+                <w:insideH w:val="single" w:color="auto" w:sz="4"/>
+                <w:insideV w:val="single" w:color="auto" w:sz="4"/>
+              </w:tblBorders>
+            </w:tblPr>
+            <w:tblGrid>
+              <w:gridCol w:w="400"/>
+              <w:gridCol w:w="400"/>
+              <w:gridCol w:w="400"/>
+            </w:tblGrid>
+            <w:tr>
+              <w:trPr>
+                <w:trHeight w:val="600" w:hRule="exact"/>
+              </w:trPr>
+              <w:tc>
+                <w:tcPr>
+                  <w:tcW w:type="dxa" w:w="400"/>
+                  <w:tcBorders>
+                    <w:top w:val="single" w:color="1F2937" w:sz="6"/>
+                    <w:left w:val="single" w:color="1F2937" w:sz="6"/>
+                    <w:bottom w:val="single" w:color="1F2937" w:sz="6"/>
+                    <w:right w:val="single" w:color="1F2937" w:sz="6"/>
+                  </w:tcBorders>
+                  <w:shd w:fill="F77F00" w:color="auto" w:val="clear"/>
+                </w:tcPr>
+                <w:p>
+                  <w:r>
+                    <w:rPr>
+                      <w:color w:val="1F2937"/>
+                      <w:sz w:val="2"/>
+                      <w:szCs w:val="2"/>
+                      <w:rFonts w:ascii="Calibri" w:cs="Calibri" w:eastAsia="Calibri" w:hAnsi="Calibri"/>
+                    </w:rPr>
+                  </w:r>
+                </w:p>
+              </w:tc>
+              <w:tc>
+                <w:tcPr>
+                  <w:tcW w:type="dxa" w:w="400"/>
+                  <w:tcBorders>
+                    <w:top w:val="single" w:color="1F2937" w:sz="6"/>
+                    <w:left w:val="single" w:color="1F2937" w:sz="6"/>
+                    <w:bottom w:val="single" w:color="1F2937" w:sz="6"/>
+                    <w:right w:val="single" w:color="1F2937" w:sz="6"/>
+                  </w:tcBorders>
+                  <w:shd w:fill="FFFFFF" w:color="auto" w:val="clear"/>
+                </w:tcPr>
+                <w:p>
+                  <w:r>
+                    <w:rPr>
+                      <w:color w:val="1F2937"/>
+                      <w:sz w:val="2"/>
+                      <w:szCs w:val="2"/>
+                      <w:rFonts w:ascii="Calibri" w:cs="Calibri" w:eastAsia="Calibri" w:hAnsi="Calibri"/>
+                    </w:rPr>
+                  </w:r>
+                </w:p>
+              </w:tc>
+              <w:tc>
+                <w:tcPr>
+                  <w:tcW w:type="dxa" w:w="400"/>
+                  <w:tcBorders>
+                    <w:top w:val="single" w:color="1F2937" w:sz="6"/>
+                    <w:left w:val="single" w:color="1F2937" w:sz="6"/>
+                    <w:bottom w:val="single" w:color="1F2937" w:sz="6"/>
+                    <w:right w:val="single" w:color="1F2937" w:sz="6"/>
+                  </w:tcBorders>
+                  <w:shd w:fill="009E60" w:color="auto" w:val="clear"/>
+                </w:tcPr>
+                <w:p>
+                  <w:r>
+                    <w:rPr>
+                      <w:color w:val="1F2937"/>
+                      <w:sz w:val="2"/>
+                      <w:szCs w:val="2"/>
+                      <w:rFonts w:ascii="Calibri" w:cs="Calibri" w:eastAsia="Calibri" w:hAnsi="Calibri"/>
+                    </w:rPr>
+                  </w:r>
+                </w:p>
+              </w:tc>
+            </w:tr>
+          </w:tbl>
+          <w:p/>
+        </w:tc>
+      </w:tr>
+    </w:tbl>
+    <w:p>
+      <w:pPr>
+        <w:pBdr>
+          <w:bottom w:val="single" w:color="A3A3A3" w:sz="4" w:space="1"/>
+        </w:pBdr>
+      </w:pPr>
+      <w:r>
+        <w:rPr>
+          <w:color w:val="1F2937"/>
+          <w:sz w:val="12"/>
+          <w:szCs w:val="12"/>
+          <w:rFonts w:ascii="Calibri" w:cs="Calibri" w:eastAsia="Calibri" w:hAnsi="Calibri"/>
+        </w:rPr>
+      </w:r>
+    </w:p>
+    <w:p>
+      <w:pPr>
+        <w:spacing w:before="160"/>
+        <w:ind w:left="360"/>
+      </w:pPr>
+      <w:r>
+        <w:rPr>
+          <w:color w:val="1F6B5E"/>
+          <w:sz w:val="28"/>
+          <w:szCs w:val="28"/>
+          <w:rFonts w:ascii="Calibri" w:cs="Calibri" w:eastAsia="Calibri" w:hAnsi="Calibri"/>
+        </w:rPr>
+        <w:t xml:space="preserve">❑  </w:t>
+      </w:r>
+      <w:r>
+        <w:rPr>
+          <w:b/>
+          <w:bCs/>
+          <w:u w:val="single"/>
+          <w:color w:val="1F6B5E"/>
+          <w:sz w:val="28"/>
+          <w:szCs w:val="28"/>
+          <w:rFonts w:ascii="Calibri" w:cs="Calibri" w:eastAsia="Calibri" w:hAnsi="Calibri"/>
+        </w:rPr>
+        <w:t xml:space="preserve">DANANÉ/CHIRURGIE HUMANITAIRE - 134 PATIENTS OPÉRÉS GRATUITEMENT, DONT 114 POUR UNE HERNIE</w:t>
+      </w:r>
+    </w:p>
+    <w:p>
+      <w:pPr>
+        <w:ind w:left="720"/>
+      </w:pPr>
+      <w:r>
+        <w:rPr>
+          <w:color w:val="1F2937"/>
+          <w:sz w:val="26"/>
+          <w:szCs w:val="26"/>
+          <w:rFonts w:ascii="Calibri" w:cs="Calibri" w:eastAsia="Calibri" w:hAnsi="Calibri"/>
+        </w:rPr>
+        <w:t xml:space="preserve">▪  Source : </w:t>
+      </w:r>
+      <w:hyperlink w:history="1" r:id="rIdeiisxno9jsyax6oyzbypv">
+        <w:r>
+          <w:rPr>
+            <w:u w:val="single"/>
+            <w:color w:val="1F6B5E"/>
+            <w:sz w:val="26"/>
+            <w:szCs w:val="26"/>
+            <w:rFonts w:ascii="Calibri" w:cs="Calibri" w:eastAsia="Calibri" w:hAnsi="Calibri"/>
+          </w:rPr>
+          <w:t xml:space="preserve">AllAfrica (CI)</w:t>
+        </w:r>
+      </w:hyperlink>
+      <w:r>
+        <w:rPr>
+          <w:color w:val="1F2937"/>
+          <w:sz w:val="26"/>
+          <w:szCs w:val="26"/>
+          <w:rFonts w:ascii="Calibri" w:cs="Calibri" w:eastAsia="Calibri" w:hAnsi="Calibri"/>
+        </w:rPr>
+        <w:t xml:space="preserve"> — 23 octobre 2026, 17 h UTC</w:t>
+      </w:r>
+    </w:p>
+    <w:p>
+      <w:pPr>
+        <w:pageBreakBefore/>
+        <w:spacing w:after="0" w:before="0"/>
+        <w:rPr>
+          <w:sz w:val="2"/>
+          <w:szCs w:val="2"/>
+        </w:rPr>
+      </w:pPr>
+    </w:p>
+    <w:tbl>
+      <w:tblPr>
+        <w:tblW w:type="dxa" w:w="17680"/>
+        <w:tblBorders>
+          <w:top w:val="single" w:color="auto" w:sz="4"/>
+          <w:left w:val="single" w:color="auto" w:sz="4"/>
+          <w:bottom w:val="single" w:color="auto" w:sz="4"/>
+          <w:right w:val="single" w:color="auto" w:sz="4"/>
+          <w:insideH w:val="single" w:color="auto" w:sz="4"/>
+          <w:insideV w:val="single" w:color="auto" w:sz="4"/>
+        </w:tblBorders>
+      </w:tblPr>
+      <w:tblGrid>
+        <w:gridCol w:w="1000"/>
+        <w:gridCol w:w="15180"/>
+        <w:gridCol w:w="1500"/>
+      </w:tblGrid>
+      <w:tr>
+        <w:tc>
+          <w:tcPr>
+            <w:tcW w:type="dxa" w:w="1000"/>
+            <w:tcBorders>
+              <w:top w:val="none" w:color="FFFFFF" w:sz="0"/>
+              <w:left w:val="none" w:color="FFFFFF" w:sz="0"/>
+              <w:bottom w:val="none" w:color="FFFFFF" w:sz="0"/>
+              <w:right w:val="none" w:color="FFFFFF" w:sz="0"/>
+            </w:tcBorders>
+            <w:shd w:fill="1F6B5E" w:color="auto" w:val="clear"/>
+            <w:vAlign w:val="center"/>
+          </w:tcPr>
+          <w:p>
+            <w:pPr>
+              <w:jc w:val="center"/>
+            </w:pPr>
+            <w:r>
+              <w:rPr>
+                <w:color w:val="FFFFFF"/>
+                <w:sz w:val="36"/>
+                <w:szCs w:val="36"/>
                 <w:rFonts w:ascii="Arial Narrow" w:cs="Arial Narrow" w:eastAsia="Arial Narrow" w:hAnsi="Arial Narrow"/>
               </w:rPr>
               <w:t xml:space="preserve">III</w:t>
@@ -1174,7 +1732,7 @@
           <w:szCs w:val="28"/>
           <w:rFonts w:ascii="Calibri" w:cs="Calibri" w:eastAsia="Calibri" w:hAnsi="Calibri"/>
         </w:rPr>
-        <w:t xml:space="preserve">AGRO-INDUSTRIE/BRUNO KONÉ - « LA TRANSFORMATION NE SE FERA PAS SANS LES ACTEURS DU SECTEUR INFORMEL »</w:t>
+        <w:t xml:space="preserve">L'AUDIENCE SUR L'ÉLECTION DE TIDJANE THIAM À LA TÊTE DU PDCI RENVOYÉE</w:t>
       </w:r>
     </w:p>
     <w:p>
@@ -1190,7 +1748,7 @@
         </w:rPr>
         <w:t xml:space="preserve">▪  Source : </w:t>
       </w:r>
-      <w:hyperlink w:history="1" r:id="rIdikwr4y3y-dt-7r4p5eqlc">
+      <w:hyperlink w:history="1" r:id="rIdgip5met8kx6mpsypjz0eh">
         <w:r>
           <w:rPr>
             <w:u w:val="single"/>
@@ -1209,69 +1767,7 @@
           <w:szCs w:val="26"/>
           <w:rFonts w:ascii="Calibri" w:cs="Calibri" w:eastAsia="Calibri" w:hAnsi="Calibri"/>
         </w:rPr>
-        <w:t xml:space="preserve"> — 22 octobre 2026, 22 h UTC</w:t>
-      </w:r>
-    </w:p>
-    <w:p>
-      <w:pPr>
-        <w:spacing w:before="160"/>
-        <w:ind w:left="360"/>
-      </w:pPr>
-      <w:r>
-        <w:rPr>
-          <w:color w:val="1F6B5E"/>
-          <w:sz w:val="28"/>
-          <w:szCs w:val="28"/>
-          <w:rFonts w:ascii="Calibri" w:cs="Calibri" w:eastAsia="Calibri" w:hAnsi="Calibri"/>
-        </w:rPr>
-        <w:t xml:space="preserve">❑  </w:t>
-      </w:r>
-      <w:r>
-        <w:rPr>
-          <w:b/>
-          <w:bCs/>
-          <w:u w:val="single"/>
-          <w:color w:val="1F6B5E"/>
-          <w:sz w:val="28"/>
-          <w:szCs w:val="28"/>
-          <w:rFonts w:ascii="Calibri" w:cs="Calibri" w:eastAsia="Calibri" w:hAnsi="Calibri"/>
-        </w:rPr>
-        <w:t xml:space="preserve">AUDIENCE ATTENDUE SUR L'ÉLECTION DE TIDJANE THIAM À LA TÊTE DU PARTI D'OPPOSITION PDCI</w:t>
-      </w:r>
-    </w:p>
-    <w:p>
-      <w:pPr>
-        <w:ind w:left="720"/>
-      </w:pPr>
-      <w:r>
-        <w:rPr>
-          <w:color w:val="1F2937"/>
-          <w:sz w:val="26"/>
-          <w:szCs w:val="26"/>
-          <w:rFonts w:ascii="Calibri" w:cs="Calibri" w:eastAsia="Calibri" w:hAnsi="Calibri"/>
-        </w:rPr>
-        <w:t xml:space="preserve">▪  Source : </w:t>
-      </w:r>
-      <w:hyperlink w:history="1" r:id="rIdm4rnmb6amifg9fdloek6l">
-        <w:r>
-          <w:rPr>
-            <w:u w:val="single"/>
-            <w:color w:val="1F6B5E"/>
-            <w:sz w:val="26"/>
-            <w:szCs w:val="26"/>
-            <w:rFonts w:ascii="Calibri" w:cs="Calibri" w:eastAsia="Calibri" w:hAnsi="Calibri"/>
-          </w:rPr>
-          <w:t xml:space="preserve">AllAfrica (CI)</w:t>
-        </w:r>
-      </w:hyperlink>
-      <w:r>
-        <w:rPr>
-          <w:color w:val="1F2937"/>
-          <w:sz w:val="26"/>
-          <w:szCs w:val="26"/>
-          <w:rFonts w:ascii="Calibri" w:cs="Calibri" w:eastAsia="Calibri" w:hAnsi="Calibri"/>
-        </w:rPr>
-        <w:t xml:space="preserve"> — 22 octobre 2026, 8 h UTC</w:t>
+        <w:t xml:space="preserve"> — 23 octobre 2026, 12 h UTC</w:t>
       </w:r>
     </w:p>
     <w:p>
@@ -1601,7 +2097,7 @@
         </w:rPr>
         <w:t xml:space="preserve">▪  Source : </w:t>
       </w:r>
-      <w:hyperlink w:history="1" r:id="rIdskjkflg1p0fwo_uat7l6x">
+      <w:hyperlink w:history="1" r:id="rIdugb7_jgosk__pzz72d9xa">
         <w:r>
           <w:rPr>
             <w:u w:val="single"/>
@@ -1647,7 +2143,7 @@
           <w:szCs w:val="28"/>
           <w:rFonts w:ascii="Calibri" w:cs="Calibri" w:eastAsia="Calibri" w:hAnsi="Calibri"/>
         </w:rPr>
-        <w:t xml:space="preserve">AÉROPORT INTERNATIONAL DE OUAGADOUGOU : LA SAFA RENFORCE LA PRÉPARATION AUX SITUATIONS D’URGENCE</w:t>
+        <w:t xml:space="preserve">BURKINA FASO-TURQUIE : UNE OFFENSIVE DIPLOMATIQUE D’ENVERGURE POUR CONSOLIDER LA COOPÉRATION BILATÉRALE</w:t>
       </w:r>
     </w:p>
     <w:p>
@@ -1663,7 +2159,7 @@
         </w:rPr>
         <w:t xml:space="preserve">▪  Source : </w:t>
       </w:r>
-      <w:hyperlink w:history="1" r:id="rId8-qmlq_eupya63-cuz0rz">
+      <w:hyperlink w:history="1" r:id="rIdo6rgbrvsh-tuzhzzsrxfh">
         <w:r>
           <w:rPr>
             <w:u w:val="single"/>
@@ -1672,7 +2168,7 @@
             <w:szCs w:val="26"/>
             <w:rFonts w:ascii="Calibri" w:cs="Calibri" w:eastAsia="Calibri" w:hAnsi="Calibri"/>
           </w:rPr>
-          <w:t xml:space="preserve">Faso7</w:t>
+          <w:t xml:space="preserve">Alwihda Info (Tchad)</w:t>
         </w:r>
       </w:hyperlink>
       <w:r>
@@ -1682,7 +2178,131 @@
           <w:szCs w:val="26"/>
           <w:rFonts w:ascii="Calibri" w:cs="Calibri" w:eastAsia="Calibri" w:hAnsi="Calibri"/>
         </w:rPr>
-        <w:t xml:space="preserve"> — 22 octobre 2026, 16 h UTC</w:t>
+        <w:t xml:space="preserve"> — 23 octobre 2026, 9 h UTC</w:t>
+      </w:r>
+    </w:p>
+    <w:p>
+      <w:pPr>
+        <w:spacing w:before="160"/>
+        <w:ind w:left="360"/>
+      </w:pPr>
+      <w:r>
+        <w:rPr>
+          <w:color w:val="1F6B5E"/>
+          <w:sz w:val="28"/>
+          <w:szCs w:val="28"/>
+          <w:rFonts w:ascii="Calibri" w:cs="Calibri" w:eastAsia="Calibri" w:hAnsi="Calibri"/>
+        </w:rPr>
+        <w:t xml:space="preserve">❑  </w:t>
+      </w:r>
+      <w:r>
+        <w:rPr>
+          <w:b/>
+          <w:bCs/>
+          <w:u w:val="single"/>
+          <w:color w:val="1F6B5E"/>
+          <w:sz w:val="28"/>
+          <w:szCs w:val="28"/>
+          <w:rFonts w:ascii="Calibri" w:cs="Calibri" w:eastAsia="Calibri" w:hAnsi="Calibri"/>
+        </w:rPr>
+        <w:t xml:space="preserve">MONTÉE TRIMESTRIELLE DES COULEURS DES FDS: LA DOUANE BURKINABÈ AU RENDEZ-VOUS DU DEVOIR PATRIOTIQUE</w:t>
+      </w:r>
+    </w:p>
+    <w:p>
+      <w:pPr>
+        <w:ind w:left="720"/>
+      </w:pPr>
+      <w:r>
+        <w:rPr>
+          <w:color w:val="1F2937"/>
+          <w:sz w:val="26"/>
+          <w:szCs w:val="26"/>
+          <w:rFonts w:ascii="Calibri" w:cs="Calibri" w:eastAsia="Calibri" w:hAnsi="Calibri"/>
+        </w:rPr>
+        <w:t xml:space="preserve">▪  Source : </w:t>
+      </w:r>
+      <w:hyperlink w:history="1" r:id="rId_ix5x9xeedz_6quftpzrh">
+        <w:r>
+          <w:rPr>
+            <w:u w:val="single"/>
+            <w:color w:val="1F6B5E"/>
+            <w:sz w:val="26"/>
+            <w:szCs w:val="26"/>
+            <w:rFonts w:ascii="Calibri" w:cs="Calibri" w:eastAsia="Calibri" w:hAnsi="Calibri"/>
+          </w:rPr>
+          <w:t xml:space="preserve">Wakat Sera</w:t>
+        </w:r>
+      </w:hyperlink>
+      <w:r>
+        <w:rPr>
+          <w:color w:val="1F2937"/>
+          <w:sz w:val="26"/>
+          <w:szCs w:val="26"/>
+          <w:rFonts w:ascii="Calibri" w:cs="Calibri" w:eastAsia="Calibri" w:hAnsi="Calibri"/>
+        </w:rPr>
+        <w:t xml:space="preserve"> — 23 octobre 2026, 12 h UTC</w:t>
+      </w:r>
+    </w:p>
+    <w:p>
+      <w:pPr>
+        <w:spacing w:before="160"/>
+        <w:ind w:left="360"/>
+      </w:pPr>
+      <w:r>
+        <w:rPr>
+          <w:color w:val="1F6B5E"/>
+          <w:sz w:val="28"/>
+          <w:szCs w:val="28"/>
+          <w:rFonts w:ascii="Calibri" w:cs="Calibri" w:eastAsia="Calibri" w:hAnsi="Calibri"/>
+        </w:rPr>
+        <w:t xml:space="preserve">❑  </w:t>
+      </w:r>
+      <w:r>
+        <w:rPr>
+          <w:b/>
+          <w:bCs/>
+          <w:u w:val="single"/>
+          <w:color w:val="1F6B5E"/>
+          <w:sz w:val="28"/>
+          <w:szCs w:val="28"/>
+          <w:rFonts w:ascii="Calibri" w:cs="Calibri" w:eastAsia="Calibri" w:hAnsi="Calibri"/>
+        </w:rPr>
+        <w:t xml:space="preserve">JUSTICE : LE PRÉSIDENT DE LA RÉPUBLIQUE S’ENTRETIENT AVEC LES MINISTRES EN CHARGE DE LA JUSTICE DES ETATS DE L’AES</w:t>
+      </w:r>
+    </w:p>
+    <w:p>
+      <w:pPr>
+        <w:ind w:left="720"/>
+      </w:pPr>
+      <w:r>
+        <w:rPr>
+          <w:color w:val="1F2937"/>
+          <w:sz w:val="26"/>
+          <w:szCs w:val="26"/>
+          <w:rFonts w:ascii="Calibri" w:cs="Calibri" w:eastAsia="Calibri" w:hAnsi="Calibri"/>
+        </w:rPr>
+        <w:t xml:space="preserve">▪  Source : </w:t>
+      </w:r>
+      <w:hyperlink w:history="1" r:id="rIdrulwxeblceivegdsmhy7y">
+        <w:r>
+          <w:rPr>
+            <w:u w:val="single"/>
+            <w:color w:val="1F6B5E"/>
+            <w:sz w:val="26"/>
+            <w:szCs w:val="26"/>
+            <w:rFonts w:ascii="Calibri" w:cs="Calibri" w:eastAsia="Calibri" w:hAnsi="Calibri"/>
+          </w:rPr>
+          <w:t xml:space="preserve">ANP — Agence Nigérienne Presse</w:t>
+        </w:r>
+      </w:hyperlink>
+      <w:r>
+        <w:rPr>
+          <w:color w:val="1F2937"/>
+          <w:sz w:val="26"/>
+          <w:szCs w:val="26"/>
+          <w:rFonts w:ascii="Calibri" w:cs="Calibri" w:eastAsia="Calibri" w:hAnsi="Calibri"/>
+        </w:rPr>
+        <w:t xml:space="preserve"> — 23 octobre 2026, 7 h UTC</w:t>
       </w:r>
     </w:p>
     <w:p>
@@ -1909,7 +2529,7 @@
           <w:szCs w:val="28"/>
           <w:rFonts w:ascii="Calibri" w:cs="Calibri" w:eastAsia="Calibri" w:hAnsi="Calibri"/>
         </w:rPr>
-        <w:t xml:space="preserve">GRÈVE JUGÉE HORS-CADRE À KOLOKANI : L’ADMINISTRATION SCOLAIRE FIXE UN ULTIMATUM AUX ENSEIGNANTS COMMUNAUTAIRES</w:t>
+        <w:t xml:space="preserve">BENSON DIAKITÉ, ANCIENNE GRANDE VOIX DE RFI, EST MORT</w:t>
       </w:r>
     </w:p>
     <w:p>
@@ -1925,7 +2545,69 @@
         </w:rPr>
         <w:t xml:space="preserve">▪  Source : </w:t>
       </w:r>
-      <w:hyperlink w:history="1" r:id="rId-q_-n-qybvlbyr7ks3lco">
+      <w:hyperlink w:history="1" r:id="rIdhcdllgdjhceihxdredj7s">
+        <w:r>
+          <w:rPr>
+            <w:u w:val="single"/>
+            <w:color w:val="1F6B5E"/>
+            <w:sz w:val="26"/>
+            <w:szCs w:val="26"/>
+            <w:rFonts w:ascii="Calibri" w:cs="Calibri" w:eastAsia="Calibri" w:hAnsi="Calibri"/>
+          </w:rPr>
+          <w:t xml:space="preserve">RFI Afrique</w:t>
+        </w:r>
+      </w:hyperlink>
+      <w:r>
+        <w:rPr>
+          <w:color w:val="1F2937"/>
+          <w:sz w:val="26"/>
+          <w:szCs w:val="26"/>
+          <w:rFonts w:ascii="Calibri" w:cs="Calibri" w:eastAsia="Calibri" w:hAnsi="Calibri"/>
+        </w:rPr>
+        <w:t xml:space="preserve"> — 23 octobre 2026, 17 h UTC</w:t>
+      </w:r>
+    </w:p>
+    <w:p>
+      <w:pPr>
+        <w:spacing w:before="160"/>
+        <w:ind w:left="360"/>
+      </w:pPr>
+      <w:r>
+        <w:rPr>
+          <w:color w:val="1F6B5E"/>
+          <w:sz w:val="28"/>
+          <w:szCs w:val="28"/>
+          <w:rFonts w:ascii="Calibri" w:cs="Calibri" w:eastAsia="Calibri" w:hAnsi="Calibri"/>
+        </w:rPr>
+        <w:t xml:space="preserve">❑  </w:t>
+      </w:r>
+      <w:r>
+        <w:rPr>
+          <w:b/>
+          <w:bCs/>
+          <w:u w:val="single"/>
+          <w:color w:val="1F6B5E"/>
+          <w:sz w:val="28"/>
+          <w:szCs w:val="28"/>
+          <w:rFonts w:ascii="Calibri" w:cs="Calibri" w:eastAsia="Calibri" w:hAnsi="Calibri"/>
+        </w:rPr>
+        <w:t xml:space="preserve">LUTTE CONTRE LE TERRORISME À KAYES : LA POLICE FRAPPE AU CŒUR DES RÉSEAUX DE SOUTIEN LOGISTIQUE DES GAT</w:t>
+      </w:r>
+    </w:p>
+    <w:p>
+      <w:pPr>
+        <w:ind w:left="720"/>
+      </w:pPr>
+      <w:r>
+        <w:rPr>
+          <w:color w:val="1F2937"/>
+          <w:sz w:val="26"/>
+          <w:szCs w:val="26"/>
+          <w:rFonts w:ascii="Calibri" w:cs="Calibri" w:eastAsia="Calibri" w:hAnsi="Calibri"/>
+        </w:rPr>
+        <w:t xml:space="preserve">▪  Source : </w:t>
+      </w:r>
+      <w:hyperlink w:history="1" r:id="rIdkkd5i56x8o_ttgyces4hc">
         <w:r>
           <w:rPr>
             <w:u w:val="single"/>
@@ -1944,7 +2626,7 @@
           <w:szCs w:val="26"/>
           <w:rFonts w:ascii="Calibri" w:cs="Calibri" w:eastAsia="Calibri" w:hAnsi="Calibri"/>
         </w:rPr>
-        <w:t xml:space="preserve"> — 23 octobre 2026, 6 h UTC</w:t>
+        <w:t xml:space="preserve"> — 23 octobre 2026, 14 h UTC</w:t>
       </w:r>
     </w:p>
     <w:p>
@@ -1971,7 +2653,7 @@
           <w:szCs w:val="28"/>
           <w:rFonts w:ascii="Calibri" w:cs="Calibri" w:eastAsia="Calibri" w:hAnsi="Calibri"/>
         </w:rPr>
-        <w:t xml:space="preserve">COUP DE FORCE À LA FRONTIÈRE : L'ARMÉE ALGÉRIENNE FERME TINZAOUATEN ET TIMIAOUINE POUR TRAQUER LES TRAFIQUANTS</w:t>
+        <w:t xml:space="preserve">SITUATION SÉCURITAIRE : PLUS DE 4.880 TERRORISTES NEUTRALISÉS ET 162 BASES DÉTRUITES PAR LES FAMA</w:t>
       </w:r>
     </w:p>
     <w:p>
@@ -1987,7 +2669,69 @@
         </w:rPr>
         <w:t xml:space="preserve">▪  Source : </w:t>
       </w:r>
-      <w:hyperlink w:history="1" r:id="rIdeq6tmlcquslvt5kfptqe6">
+      <w:hyperlink w:history="1" r:id="rIdov2g-kmzw5tlh0pqdbd7c">
+        <w:r>
+          <w:rPr>
+            <w:u w:val="single"/>
+            <w:color w:val="1F6B5E"/>
+            <w:sz w:val="26"/>
+            <w:szCs w:val="26"/>
+            <w:rFonts w:ascii="Calibri" w:cs="Calibri" w:eastAsia="Calibri" w:hAnsi="Calibri"/>
+          </w:rPr>
+          <w:t xml:space="preserve">AMAP — Agence Malienne Presse</w:t>
+        </w:r>
+      </w:hyperlink>
+      <w:r>
+        <w:rPr>
+          <w:color w:val="1F2937"/>
+          <w:sz w:val="26"/>
+          <w:szCs w:val="26"/>
+          <w:rFonts w:ascii="Calibri" w:cs="Calibri" w:eastAsia="Calibri" w:hAnsi="Calibri"/>
+        </w:rPr>
+        <w:t xml:space="preserve"> — 23 octobre 2026, 17 h UTC</w:t>
+      </w:r>
+    </w:p>
+    <w:p>
+      <w:pPr>
+        <w:spacing w:before="160"/>
+        <w:ind w:left="360"/>
+      </w:pPr>
+      <w:r>
+        <w:rPr>
+          <w:color w:val="1F6B5E"/>
+          <w:sz w:val="28"/>
+          <w:szCs w:val="28"/>
+          <w:rFonts w:ascii="Calibri" w:cs="Calibri" w:eastAsia="Calibri" w:hAnsi="Calibri"/>
+        </w:rPr>
+        <w:t xml:space="preserve">❑  </w:t>
+      </w:r>
+      <w:r>
+        <w:rPr>
+          <w:b/>
+          <w:bCs/>
+          <w:u w:val="single"/>
+          <w:color w:val="1F6B5E"/>
+          <w:sz w:val="28"/>
+          <w:szCs w:val="28"/>
+          <w:rFonts w:ascii="Calibri" w:cs="Calibri" w:eastAsia="Calibri" w:hAnsi="Calibri"/>
+        </w:rPr>
+        <w:t xml:space="preserve">POINT DE PRESSE: LES FAMA ANNONCENT PLUS DE 4 880 COMBATTANTS TERRORISTES NEUTRALISÉS</w:t>
+      </w:r>
+    </w:p>
+    <w:p>
+      <w:pPr>
+        <w:ind w:left="720"/>
+      </w:pPr>
+      <w:r>
+        <w:rPr>
+          <w:color w:val="1F2937"/>
+          <w:sz w:val="26"/>
+          <w:szCs w:val="26"/>
+          <w:rFonts w:ascii="Calibri" w:cs="Calibri" w:eastAsia="Calibri" w:hAnsi="Calibri"/>
+        </w:rPr>
+        <w:t xml:space="preserve">▪  Source : </w:t>
+      </w:r>
+      <w:hyperlink w:history="1" r:id="rIdq8i9ytgozqntkohpash28">
         <w:r>
           <w:rPr>
             <w:u w:val="single"/>
@@ -2006,7 +2750,7 @@
           <w:szCs w:val="26"/>
           <w:rFonts w:ascii="Calibri" w:cs="Calibri" w:eastAsia="Calibri" w:hAnsi="Calibri"/>
         </w:rPr>
-        <w:t xml:space="preserve"> — 22 octobre 2026, 16 h UTC</w:t>
+        <w:t xml:space="preserve"> — 23 octobre 2026, 14 h UTC</w:t>
       </w:r>
     </w:p>
     <w:p>
@@ -2033,7 +2777,7 @@
           <w:szCs w:val="28"/>
           <w:rFonts w:ascii="Calibri" w:cs="Calibri" w:eastAsia="Calibri" w:hAnsi="Calibri"/>
         </w:rPr>
-        <w:t xml:space="preserve">CYBERCRIMINALITÉ : INTERPOL DÉVOILE LE BILAN D’ENVERGURE DE L’OPÉRATION « SERENGETI III » EN AFRIQUE</w:t>
+        <w:t xml:space="preserve">MALI-FAO : UN PARTENARIAT STRATÉGIQUE RENOUVELÉ AU SERVICE DE LA SOUVERAINETÉ ALIMENTAIRE</w:t>
       </w:r>
     </w:p>
     <w:p>
@@ -2049,7 +2793,7 @@
         </w:rPr>
         <w:t xml:space="preserve">▪  Source : </w:t>
       </w:r>
-      <w:hyperlink w:history="1" r:id="rIdnujukfxqgvuuiy-_ftb9l">
+      <w:hyperlink w:history="1" r:id="rIdmnyl31byw2zdj21uhjwm_">
         <w:r>
           <w:rPr>
             <w:u w:val="single"/>
@@ -2058,7 +2802,7 @@
             <w:szCs w:val="26"/>
             <w:rFonts w:ascii="Calibri" w:cs="Calibri" w:eastAsia="Calibri" w:hAnsi="Calibri"/>
           </w:rPr>
-          <w:t xml:space="preserve">Maliactu</w:t>
+          <w:t xml:space="preserve">Mali 24</w:t>
         </w:r>
       </w:hyperlink>
       <w:r>
@@ -2068,131 +2812,7 @@
           <w:szCs w:val="26"/>
           <w:rFonts w:ascii="Calibri" w:cs="Calibri" w:eastAsia="Calibri" w:hAnsi="Calibri"/>
         </w:rPr>
-        <w:t xml:space="preserve"> — 22 octobre 2026, 19 h UTC</w:t>
-      </w:r>
-    </w:p>
-    <w:p>
-      <w:pPr>
-        <w:spacing w:before="160"/>
-        <w:ind w:left="360"/>
-      </w:pPr>
-      <w:r>
-        <w:rPr>
-          <w:color w:val="1F6B5E"/>
-          <w:sz w:val="28"/>
-          <w:szCs w:val="28"/>
-          <w:rFonts w:ascii="Calibri" w:cs="Calibri" w:eastAsia="Calibri" w:hAnsi="Calibri"/>
-        </w:rPr>
-        <w:t xml:space="preserve">❑  </w:t>
-      </w:r>
-      <w:r>
-        <w:rPr>
-          <w:b/>
-          <w:bCs/>
-          <w:u w:val="single"/>
-          <w:color w:val="1F6B5E"/>
-          <w:sz w:val="28"/>
-          <w:szCs w:val="28"/>
-          <w:rFonts w:ascii="Calibri" w:cs="Calibri" w:eastAsia="Calibri" w:hAnsi="Calibri"/>
-        </w:rPr>
-        <w:t xml:space="preserve">MOPTI : LE PARI DU RETOUR AU PAYS, OU COMMENT 40 FAMILLES RÉINVENTENT LEUR AVENIR DANS LE CENTRE DU MALI</w:t>
-      </w:r>
-    </w:p>
-    <w:p>
-      <w:pPr>
-        <w:ind w:left="720"/>
-      </w:pPr>
-      <w:r>
-        <w:rPr>
-          <w:color w:val="1F2937"/>
-          <w:sz w:val="26"/>
-          <w:szCs w:val="26"/>
-          <w:rFonts w:ascii="Calibri" w:cs="Calibri" w:eastAsia="Calibri" w:hAnsi="Calibri"/>
-        </w:rPr>
-        <w:t xml:space="preserve">▪  Source : </w:t>
-      </w:r>
-      <w:hyperlink w:history="1" r:id="rIdx1navmrkubkrrxav5lasw">
-        <w:r>
-          <w:rPr>
-            <w:u w:val="single"/>
-            <w:color w:val="1F6B5E"/>
-            <w:sz w:val="26"/>
-            <w:szCs w:val="26"/>
-            <w:rFonts w:ascii="Calibri" w:cs="Calibri" w:eastAsia="Calibri" w:hAnsi="Calibri"/>
-          </w:rPr>
-          <w:t xml:space="preserve">Maliactu</w:t>
-        </w:r>
-      </w:hyperlink>
-      <w:r>
-        <w:rPr>
-          <w:color w:val="1F2937"/>
-          <w:sz w:val="26"/>
-          <w:szCs w:val="26"/>
-          <w:rFonts w:ascii="Calibri" w:cs="Calibri" w:eastAsia="Calibri" w:hAnsi="Calibri"/>
-        </w:rPr>
-        <w:t xml:space="preserve"> — 22 octobre 2026, 18 h UTC</w:t>
-      </w:r>
-    </w:p>
-    <w:p>
-      <w:pPr>
-        <w:spacing w:before="160"/>
-        <w:ind w:left="360"/>
-      </w:pPr>
-      <w:r>
-        <w:rPr>
-          <w:color w:val="1F6B5E"/>
-          <w:sz w:val="28"/>
-          <w:szCs w:val="28"/>
-          <w:rFonts w:ascii="Calibri" w:cs="Calibri" w:eastAsia="Calibri" w:hAnsi="Calibri"/>
-        </w:rPr>
-        <w:t xml:space="preserve">❑  </w:t>
-      </w:r>
-      <w:r>
-        <w:rPr>
-          <w:b/>
-          <w:bCs/>
-          <w:u w:val="single"/>
-          <w:color w:val="1F6B5E"/>
-          <w:sz w:val="28"/>
-          <w:szCs w:val="28"/>
-          <w:rFonts w:ascii="Calibri" w:cs="Calibri" w:eastAsia="Calibri" w:hAnsi="Calibri"/>
-        </w:rPr>
-        <w:t xml:space="preserve">MALI : LES RAISONS DES TENSIONS ENTRE ISMAËL WAGUÉ ET SÉKOU BOLLY</w:t>
-      </w:r>
-    </w:p>
-    <w:p>
-      <w:pPr>
-        <w:ind w:left="720"/>
-      </w:pPr>
-      <w:r>
-        <w:rPr>
-          <w:color w:val="1F2937"/>
-          <w:sz w:val="26"/>
-          <w:szCs w:val="26"/>
-          <w:rFonts w:ascii="Calibri" w:cs="Calibri" w:eastAsia="Calibri" w:hAnsi="Calibri"/>
-        </w:rPr>
-        <w:t xml:space="preserve">▪  Source : </w:t>
-      </w:r>
-      <w:hyperlink w:history="1" r:id="rIdaqdvsta9r0auiag07t2mi">
-        <w:r>
-          <w:rPr>
-            <w:u w:val="single"/>
-            <w:color w:val="1F6B5E"/>
-            <w:sz w:val="26"/>
-            <w:szCs w:val="26"/>
-            <w:rFonts w:ascii="Calibri" w:cs="Calibri" w:eastAsia="Calibri" w:hAnsi="Calibri"/>
-          </w:rPr>
-          <w:t xml:space="preserve">Jeune Afrique</w:t>
-        </w:r>
-      </w:hyperlink>
-      <w:r>
-        <w:rPr>
-          <w:color w:val="1F2937"/>
-          <w:sz w:val="26"/>
-          <w:szCs w:val="26"/>
-          <w:rFonts w:ascii="Calibri" w:cs="Calibri" w:eastAsia="Calibri" w:hAnsi="Calibri"/>
-        </w:rPr>
-        <w:t xml:space="preserve"> — 22 octobre 2026, 7 h UTC</w:t>
+        <w:t xml:space="preserve"> — 23 octobre 2026, 11 h UTC</w:t>
       </w:r>
     </w:p>
     <w:p>
@@ -2244,6 +2864,454 @@
                 <w:color w:val="FFFFFF"/>
                 <w:sz w:val="44"/>
                 <w:szCs w:val="44"/>
+                <w:rFonts w:ascii="Arial Narrow" w:cs="Arial Narrow" w:eastAsia="Arial Narrow" w:hAnsi="Arial Narrow"/>
+              </w:rPr>
+              <w:t xml:space="preserve">II</w:t>
+            </w:r>
+          </w:p>
+        </w:tc>
+        <w:tc>
+          <w:tcPr>
+            <w:tcW w:type="dxa" w:w="15180"/>
+            <w:tcBorders>
+              <w:top w:val="none" w:color="FFFFFF" w:sz="0"/>
+              <w:left w:val="none" w:color="FFFFFF" w:sz="0"/>
+              <w:bottom w:val="none" w:color="FFFFFF" w:sz="0"/>
+              <w:right w:val="none" w:color="FFFFFF" w:sz="0"/>
+            </w:tcBorders>
+            <w:vAlign w:val="center"/>
+          </w:tcPr>
+          <w:p>
+            <w:pPr>
+              <w:ind w:left="200"/>
+            </w:pPr>
+            <w:r>
+              <w:rPr>
+                <w:color w:val="1F6B5E"/>
+                <w:sz w:val="56"/>
+                <w:szCs w:val="56"/>
+                <w:rFonts w:ascii="Arial Narrow" w:cs="Arial Narrow" w:eastAsia="Arial Narrow" w:hAnsi="Arial Narrow"/>
+              </w:rPr>
+              <w:t xml:space="preserve">Mali</w:t>
+            </w:r>
+          </w:p>
+        </w:tc>
+        <w:tc>
+          <w:tcPr>
+            <w:tcW w:type="dxa" w:w="1500"/>
+            <w:tcBorders>
+              <w:top w:val="none" w:color="FFFFFF" w:sz="0"/>
+              <w:left w:val="none" w:color="FFFFFF" w:sz="0"/>
+              <w:bottom w:val="none" w:color="FFFFFF" w:sz="0"/>
+              <w:right w:val="none" w:color="FFFFFF" w:sz="0"/>
+            </w:tcBorders>
+            <w:vAlign w:val="center"/>
+          </w:tcPr>
+          <w:tbl>
+            <w:tblPr>
+              <w:tblW w:type="dxa" w:w="1200"/>
+              <w:tblBorders>
+                <w:top w:val="single" w:color="auto" w:sz="4"/>
+                <w:left w:val="single" w:color="auto" w:sz="4"/>
+                <w:bottom w:val="single" w:color="auto" w:sz="4"/>
+                <w:right w:val="single" w:color="auto" w:sz="4"/>
+                <w:insideH w:val="single" w:color="auto" w:sz="4"/>
+                <w:insideV w:val="single" w:color="auto" w:sz="4"/>
+              </w:tblBorders>
+            </w:tblPr>
+            <w:tblGrid>
+              <w:gridCol w:w="400"/>
+              <w:gridCol w:w="400"/>
+              <w:gridCol w:w="400"/>
+            </w:tblGrid>
+            <w:tr>
+              <w:trPr>
+                <w:trHeight w:val="600" w:hRule="exact"/>
+              </w:trPr>
+              <w:tc>
+                <w:tcPr>
+                  <w:tcW w:type="dxa" w:w="400"/>
+                  <w:tcBorders>
+                    <w:top w:val="single" w:color="1F2937" w:sz="6"/>
+                    <w:left w:val="single" w:color="1F2937" w:sz="6"/>
+                    <w:bottom w:val="single" w:color="1F2937" w:sz="6"/>
+                    <w:right w:val="single" w:color="1F2937" w:sz="6"/>
+                  </w:tcBorders>
+                  <w:shd w:fill="14B53A" w:color="auto" w:val="clear"/>
+                </w:tcPr>
+                <w:p>
+                  <w:r>
+                    <w:rPr>
+                      <w:color w:val="1F2937"/>
+                      <w:sz w:val="2"/>
+                      <w:szCs w:val="2"/>
+                      <w:rFonts w:ascii="Calibri" w:cs="Calibri" w:eastAsia="Calibri" w:hAnsi="Calibri"/>
+                    </w:rPr>
+                  </w:r>
+                </w:p>
+              </w:tc>
+              <w:tc>
+                <w:tcPr>
+                  <w:tcW w:type="dxa" w:w="400"/>
+                  <w:tcBorders>
+                    <w:top w:val="single" w:color="1F2937" w:sz="6"/>
+                    <w:left w:val="single" w:color="1F2937" w:sz="6"/>
+                    <w:bottom w:val="single" w:color="1F2937" w:sz="6"/>
+                    <w:right w:val="single" w:color="1F2937" w:sz="6"/>
+                  </w:tcBorders>
+                  <w:shd w:fill="FCD116" w:color="auto" w:val="clear"/>
+                </w:tcPr>
+                <w:p>
+                  <w:r>
+                    <w:rPr>
+                      <w:color w:val="1F2937"/>
+                      <w:sz w:val="2"/>
+                      <w:szCs w:val="2"/>
+                      <w:rFonts w:ascii="Calibri" w:cs="Calibri" w:eastAsia="Calibri" w:hAnsi="Calibri"/>
+                    </w:rPr>
+                  </w:r>
+                </w:p>
+              </w:tc>
+              <w:tc>
+                <w:tcPr>
+                  <w:tcW w:type="dxa" w:w="400"/>
+                  <w:tcBorders>
+                    <w:top w:val="single" w:color="1F2937" w:sz="6"/>
+                    <w:left w:val="single" w:color="1F2937" w:sz="6"/>
+                    <w:bottom w:val="single" w:color="1F2937" w:sz="6"/>
+                    <w:right w:val="single" w:color="1F2937" w:sz="6"/>
+                  </w:tcBorders>
+                  <w:shd w:fill="CE1126" w:color="auto" w:val="clear"/>
+                </w:tcPr>
+                <w:p>
+                  <w:r>
+                    <w:rPr>
+                      <w:color w:val="1F2937"/>
+                      <w:sz w:val="2"/>
+                      <w:szCs w:val="2"/>
+                      <w:rFonts w:ascii="Calibri" w:cs="Calibri" w:eastAsia="Calibri" w:hAnsi="Calibri"/>
+                    </w:rPr>
+                  </w:r>
+                </w:p>
+              </w:tc>
+            </w:tr>
+          </w:tbl>
+          <w:p/>
+        </w:tc>
+      </w:tr>
+    </w:tbl>
+    <w:p>
+      <w:pPr>
+        <w:pBdr>
+          <w:bottom w:val="single" w:color="A3A3A3" w:sz="4" w:space="1"/>
+        </w:pBdr>
+      </w:pPr>
+      <w:r>
+        <w:rPr>
+          <w:color w:val="1F2937"/>
+          <w:sz w:val="12"/>
+          <w:szCs w:val="12"/>
+          <w:rFonts w:ascii="Calibri" w:cs="Calibri" w:eastAsia="Calibri" w:hAnsi="Calibri"/>
+        </w:rPr>
+      </w:r>
+    </w:p>
+    <w:p>
+      <w:pPr>
+        <w:spacing w:before="160"/>
+        <w:ind w:left="360"/>
+      </w:pPr>
+      <w:r>
+        <w:rPr>
+          <w:color w:val="1F6B5E"/>
+          <w:sz w:val="28"/>
+          <w:szCs w:val="28"/>
+          <w:rFonts w:ascii="Calibri" w:cs="Calibri" w:eastAsia="Calibri" w:hAnsi="Calibri"/>
+        </w:rPr>
+        <w:t xml:space="preserve">❑  </w:t>
+      </w:r>
+      <w:r>
+        <w:rPr>
+          <w:b/>
+          <w:bCs/>
+          <w:u w:val="single"/>
+          <w:color w:val="1F6B5E"/>
+          <w:sz w:val="28"/>
+          <w:szCs w:val="28"/>
+          <w:rFonts w:ascii="Calibri" w:cs="Calibri" w:eastAsia="Calibri" w:hAnsi="Calibri"/>
+        </w:rPr>
+        <w:t xml:space="preserve">MALI-QATAR : LA COOPÉRATION SÉCURITAIRE AU CENTRE DES ÉCHANGES</w:t>
+      </w:r>
+    </w:p>
+    <w:p>
+      <w:pPr>
+        <w:ind w:left="720"/>
+      </w:pPr>
+      <w:r>
+        <w:rPr>
+          <w:color w:val="1F2937"/>
+          <w:sz w:val="26"/>
+          <w:szCs w:val="26"/>
+          <w:rFonts w:ascii="Calibri" w:cs="Calibri" w:eastAsia="Calibri" w:hAnsi="Calibri"/>
+        </w:rPr>
+        <w:t xml:space="preserve">▪  Source : </w:t>
+      </w:r>
+      <w:hyperlink w:history="1" r:id="rIdvfyk1z6v1ft5ieic9yb37">
+        <w:r>
+          <w:rPr>
+            <w:u w:val="single"/>
+            <w:color w:val="1F6B5E"/>
+            <w:sz w:val="26"/>
+            <w:szCs w:val="26"/>
+            <w:rFonts w:ascii="Calibri" w:cs="Calibri" w:eastAsia="Calibri" w:hAnsi="Calibri"/>
+          </w:rPr>
+          <w:t xml:space="preserve">Malijet</w:t>
+        </w:r>
+      </w:hyperlink>
+      <w:r>
+        <w:rPr>
+          <w:color w:val="1F2937"/>
+          <w:sz w:val="26"/>
+          <w:szCs w:val="26"/>
+          <w:rFonts w:ascii="Calibri" w:cs="Calibri" w:eastAsia="Calibri" w:hAnsi="Calibri"/>
+        </w:rPr>
+        <w:t xml:space="preserve"> — 23 octobre 2026, 8 h UTC</w:t>
+      </w:r>
+    </w:p>
+    <w:p>
+      <w:pPr>
+        <w:spacing w:before="160"/>
+        <w:ind w:left="360"/>
+      </w:pPr>
+      <w:r>
+        <w:rPr>
+          <w:color w:val="1F6B5E"/>
+          <w:sz w:val="28"/>
+          <w:szCs w:val="28"/>
+          <w:rFonts w:ascii="Calibri" w:cs="Calibri" w:eastAsia="Calibri" w:hAnsi="Calibri"/>
+        </w:rPr>
+        <w:t xml:space="preserve">❑  </w:t>
+      </w:r>
+      <w:r>
+        <w:rPr>
+          <w:b/>
+          <w:bCs/>
+          <w:u w:val="single"/>
+          <w:color w:val="1F6B5E"/>
+          <w:sz w:val="28"/>
+          <w:szCs w:val="28"/>
+          <w:rFonts w:ascii="Calibri" w:cs="Calibri" w:eastAsia="Calibri" w:hAnsi="Calibri"/>
+        </w:rPr>
+        <w:t xml:space="preserve">COUPE DE LA CAF (2ᵉ TOUR RETOUR) : L’ES ZARZIS DÉJÀ SUR LE SOL BAMAKOIS, L’AS REAL SOUS PRESSION À DOMICILE</w:t>
+      </w:r>
+    </w:p>
+    <w:p>
+      <w:pPr>
+        <w:ind w:left="720"/>
+      </w:pPr>
+      <w:r>
+        <w:rPr>
+          <w:color w:val="1F2937"/>
+          <w:sz w:val="26"/>
+          <w:szCs w:val="26"/>
+          <w:rFonts w:ascii="Calibri" w:cs="Calibri" w:eastAsia="Calibri" w:hAnsi="Calibri"/>
+        </w:rPr>
+        <w:t xml:space="preserve">▪  Source : </w:t>
+      </w:r>
+      <w:hyperlink w:history="1" r:id="rIdk-_w2lri650ilobdw0fwd">
+        <w:r>
+          <w:rPr>
+            <w:u w:val="single"/>
+            <w:color w:val="1F6B5E"/>
+            <w:sz w:val="26"/>
+            <w:szCs w:val="26"/>
+            <w:rFonts w:ascii="Calibri" w:cs="Calibri" w:eastAsia="Calibri" w:hAnsi="Calibri"/>
+          </w:rPr>
+          <w:t xml:space="preserve">Maliactu</w:t>
+        </w:r>
+      </w:hyperlink>
+      <w:r>
+        <w:rPr>
+          <w:color w:val="1F2937"/>
+          <w:sz w:val="26"/>
+          <w:szCs w:val="26"/>
+          <w:rFonts w:ascii="Calibri" w:cs="Calibri" w:eastAsia="Calibri" w:hAnsi="Calibri"/>
+        </w:rPr>
+        <w:t xml:space="preserve"> — 23 octobre 2026, 14 h UTC</w:t>
+      </w:r>
+    </w:p>
+    <w:p>
+      <w:pPr>
+        <w:spacing w:before="160"/>
+        <w:ind w:left="360"/>
+      </w:pPr>
+      <w:r>
+        <w:rPr>
+          <w:color w:val="1F6B5E"/>
+          <w:sz w:val="28"/>
+          <w:szCs w:val="28"/>
+          <w:rFonts w:ascii="Calibri" w:cs="Calibri" w:eastAsia="Calibri" w:hAnsi="Calibri"/>
+        </w:rPr>
+        <w:t xml:space="preserve">❑  </w:t>
+      </w:r>
+      <w:r>
+        <w:rPr>
+          <w:b/>
+          <w:bCs/>
+          <w:u w:val="single"/>
+          <w:color w:val="1F6B5E"/>
+          <w:sz w:val="28"/>
+          <w:szCs w:val="28"/>
+          <w:rFonts w:ascii="Calibri" w:cs="Calibri" w:eastAsia="Calibri" w:hAnsi="Calibri"/>
+        </w:rPr>
+        <w:t xml:space="preserve">BANDIAGARA : LANCEMENT DES ACTIVITÉS DE LA 31ᵉ ÉDITION DU MOIS DE LA SOLIDARITÉ ET DE LA LUTTE CONTRE L’EXCLUSION</w:t>
+      </w:r>
+    </w:p>
+    <w:p>
+      <w:pPr>
+        <w:ind w:left="720"/>
+      </w:pPr>
+      <w:r>
+        <w:rPr>
+          <w:color w:val="1F2937"/>
+          <w:sz w:val="26"/>
+          <w:szCs w:val="26"/>
+          <w:rFonts w:ascii="Calibri" w:cs="Calibri" w:eastAsia="Calibri" w:hAnsi="Calibri"/>
+        </w:rPr>
+        <w:t xml:space="preserve">▪  Source : </w:t>
+      </w:r>
+      <w:hyperlink w:history="1" r:id="rIdfb9izn--pm76k5s6krcjo">
+        <w:r>
+          <w:rPr>
+            <w:u w:val="single"/>
+            <w:color w:val="1F6B5E"/>
+            <w:sz w:val="26"/>
+            <w:szCs w:val="26"/>
+            <w:rFonts w:ascii="Calibri" w:cs="Calibri" w:eastAsia="Calibri" w:hAnsi="Calibri"/>
+          </w:rPr>
+          <w:t xml:space="preserve">AMAP — Agence Malienne Presse</w:t>
+        </w:r>
+      </w:hyperlink>
+      <w:r>
+        <w:rPr>
+          <w:color w:val="1F2937"/>
+          <w:sz w:val="26"/>
+          <w:szCs w:val="26"/>
+          <w:rFonts w:ascii="Calibri" w:cs="Calibri" w:eastAsia="Calibri" w:hAnsi="Calibri"/>
+        </w:rPr>
+        <w:t xml:space="preserve"> — 23 octobre 2026, 10 h UTC</w:t>
+      </w:r>
+    </w:p>
+    <w:p>
+      <w:pPr>
+        <w:spacing w:before="160"/>
+        <w:ind w:left="360"/>
+      </w:pPr>
+      <w:r>
+        <w:rPr>
+          <w:color w:val="1F6B5E"/>
+          <w:sz w:val="28"/>
+          <w:szCs w:val="28"/>
+          <w:rFonts w:ascii="Calibri" w:cs="Calibri" w:eastAsia="Calibri" w:hAnsi="Calibri"/>
+        </w:rPr>
+        <w:t xml:space="preserve">❑  </w:t>
+      </w:r>
+      <w:r>
+        <w:rPr>
+          <w:b/>
+          <w:bCs/>
+          <w:u w:val="single"/>
+          <w:color w:val="1F6B5E"/>
+          <w:sz w:val="28"/>
+          <w:szCs w:val="28"/>
+          <w:rFonts w:ascii="Calibri" w:cs="Calibri" w:eastAsia="Calibri" w:hAnsi="Calibri"/>
+        </w:rPr>
+        <w:t xml:space="preserve">MALI : L’OCLEI REMET SES RAPPORTS 2021 ET 2024 À ASSIMI GOÏTA</w:t>
+      </w:r>
+    </w:p>
+    <w:p>
+      <w:pPr>
+        <w:ind w:left="720"/>
+      </w:pPr>
+      <w:r>
+        <w:rPr>
+          <w:color w:val="1F2937"/>
+          <w:sz w:val="26"/>
+          <w:szCs w:val="26"/>
+          <w:rFonts w:ascii="Calibri" w:cs="Calibri" w:eastAsia="Calibri" w:hAnsi="Calibri"/>
+        </w:rPr>
+        <w:t xml:space="preserve">▪  Source : </w:t>
+      </w:r>
+      <w:hyperlink w:history="1" r:id="rIdi3lt8990h27nqq0ny9hc3">
+        <w:r>
+          <w:rPr>
+            <w:u w:val="single"/>
+            <w:color w:val="1F6B5E"/>
+            <w:sz w:val="26"/>
+            <w:szCs w:val="26"/>
+            <w:rFonts w:ascii="Calibri" w:cs="Calibri" w:eastAsia="Calibri" w:hAnsi="Calibri"/>
+          </w:rPr>
+          <w:t xml:space="preserve">Malijet</w:t>
+        </w:r>
+      </w:hyperlink>
+      <w:r>
+        <w:rPr>
+          <w:color w:val="1F2937"/>
+          <w:sz w:val="26"/>
+          <w:szCs w:val="26"/>
+          <w:rFonts w:ascii="Calibri" w:cs="Calibri" w:eastAsia="Calibri" w:hAnsi="Calibri"/>
+        </w:rPr>
+        <w:t xml:space="preserve"> — 23 octobre 2026, 9 h UTC</w:t>
+      </w:r>
+    </w:p>
+    <w:p>
+      <w:pPr>
+        <w:pageBreakBefore/>
+        <w:spacing w:after="0" w:before="0"/>
+        <w:rPr>
+          <w:sz w:val="2"/>
+          <w:szCs w:val="2"/>
+        </w:rPr>
+      </w:pPr>
+    </w:p>
+    <w:tbl>
+      <w:tblPr>
+        <w:tblW w:type="dxa" w:w="17680"/>
+        <w:tblBorders>
+          <w:top w:val="single" w:color="auto" w:sz="4"/>
+          <w:left w:val="single" w:color="auto" w:sz="4"/>
+          <w:bottom w:val="single" w:color="auto" w:sz="4"/>
+          <w:right w:val="single" w:color="auto" w:sz="4"/>
+          <w:insideH w:val="single" w:color="auto" w:sz="4"/>
+          <w:insideV w:val="single" w:color="auto" w:sz="4"/>
+        </w:tblBorders>
+      </w:tblPr>
+      <w:tblGrid>
+        <w:gridCol w:w="1000"/>
+        <w:gridCol w:w="15180"/>
+        <w:gridCol w:w="1500"/>
+      </w:tblGrid>
+      <w:tr>
+        <w:tc>
+          <w:tcPr>
+            <w:tcW w:type="dxa" w:w="1000"/>
+            <w:tcBorders>
+              <w:top w:val="none" w:color="FFFFFF" w:sz="0"/>
+              <w:left w:val="none" w:color="FFFFFF" w:sz="0"/>
+              <w:bottom w:val="none" w:color="FFFFFF" w:sz="0"/>
+              <w:right w:val="none" w:color="FFFFFF" w:sz="0"/>
+            </w:tcBorders>
+            <w:shd w:fill="1F6B5E" w:color="auto" w:val="clear"/>
+            <w:vAlign w:val="center"/>
+          </w:tcPr>
+          <w:p>
+            <w:pPr>
+              <w:jc w:val="center"/>
+            </w:pPr>
+            <w:r>
+              <w:rPr>
+                <w:color w:val="FFFFFF"/>
+                <w:sz w:val="36"/>
+                <w:szCs w:val="36"/>
                 <w:rFonts w:ascii="Arial Narrow" w:cs="Arial Narrow" w:eastAsia="Arial Narrow" w:hAnsi="Arial Narrow"/>
               </w:rPr>
               <w:t xml:space="preserve">III</w:t>
@@ -2427,7 +3495,7 @@
           <w:szCs w:val="28"/>
           <w:rFonts w:ascii="Calibri" w:cs="Calibri" w:eastAsia="Calibri" w:hAnsi="Calibri"/>
         </w:rPr>
-        <w:t xml:space="preserve">SWISS AND AUSTRIAN WOMEN IN LIBYA AFTER RELEASE FROM NIGER KIDNAP ORDEAL</w:t>
+        <w:t xml:space="preserve">LANCEMENT OFFICIEL DE LA CARAVANE DE SENSIBILISATION ET DE FORMATION SUR LES BONNES PRATIQUES DE GREFFES ET PARQUETS ET L’ÉTABLISSEMENT DES PIÈCES D’EXÉCUTION</w:t>
       </w:r>
     </w:p>
     <w:p>
@@ -2443,69 +3511,7 @@
         </w:rPr>
         <w:t xml:space="preserve">▪  Source : </w:t>
       </w:r>
-      <w:hyperlink w:history="1" r:id="rId9mkidn4wafzyedvb_-zwj">
-        <w:r>
-          <w:rPr>
-            <w:u w:val="single"/>
-            <w:color w:val="1F6B5E"/>
-            <w:sz w:val="26"/>
-            <w:szCs w:val="26"/>
-            <w:rFonts w:ascii="Calibri" w:cs="Calibri" w:eastAsia="Calibri" w:hAnsi="Calibri"/>
-          </w:rPr>
-          <w:t xml:space="preserve">Africanews</w:t>
-        </w:r>
-      </w:hyperlink>
-      <w:r>
-        <w:rPr>
-          <w:color w:val="1F2937"/>
-          <w:sz w:val="26"/>
-          <w:szCs w:val="26"/>
-          <w:rFonts w:ascii="Calibri" w:cs="Calibri" w:eastAsia="Calibri" w:hAnsi="Calibri"/>
-        </w:rPr>
-        <w:t xml:space="preserve"> — 22 octobre 2026, 16 h UTC</w:t>
-      </w:r>
-    </w:p>
-    <w:p>
-      <w:pPr>
-        <w:spacing w:before="160"/>
-        <w:ind w:left="360"/>
-      </w:pPr>
-      <w:r>
-        <w:rPr>
-          <w:color w:val="1F6B5E"/>
-          <w:sz w:val="28"/>
-          <w:szCs w:val="28"/>
-          <w:rFonts w:ascii="Calibri" w:cs="Calibri" w:eastAsia="Calibri" w:hAnsi="Calibri"/>
-        </w:rPr>
-        <w:t xml:space="preserve">❑  </w:t>
-      </w:r>
-      <w:r>
-        <w:rPr>
-          <w:b/>
-          <w:bCs/>
-          <w:u w:val="single"/>
-          <w:color w:val="1F6B5E"/>
-          <w:sz w:val="28"/>
-          <w:szCs w:val="28"/>
-          <w:rFonts w:ascii="Calibri" w:cs="Calibri" w:eastAsia="Calibri" w:hAnsi="Calibri"/>
-        </w:rPr>
-        <w:t xml:space="preserve">PROJET DE GESTION DURABLE DES DÉCHETS ET DE RÉDUCTION DES POLLUANTS : LA BOAD ÉVALUE À NIAMEY L’ÉTAT D’AVANCEMENT DE L’ÉXECUTION DU PROJET</w:t>
-      </w:r>
-    </w:p>
-    <w:p>
-      <w:pPr>
-        <w:ind w:left="720"/>
-      </w:pPr>
-      <w:r>
-        <w:rPr>
-          <w:color w:val="1F2937"/>
-          <w:sz w:val="26"/>
-          <w:szCs w:val="26"/>
-          <w:rFonts w:ascii="Calibri" w:cs="Calibri" w:eastAsia="Calibri" w:hAnsi="Calibri"/>
-        </w:rPr>
-        <w:t xml:space="preserve">▪  Source : </w:t>
-      </w:r>
-      <w:hyperlink w:history="1" r:id="rIdkhvocdegh5hhtr5y-ydz0">
+      <w:hyperlink w:history="1" r:id="rIdqovlxpmbezmkhzbbvjbwp">
         <w:r>
           <w:rPr>
             <w:u w:val="single"/>
@@ -2524,7 +3530,7 @@
           <w:szCs w:val="26"/>
           <w:rFonts w:ascii="Calibri" w:cs="Calibri" w:eastAsia="Calibri" w:hAnsi="Calibri"/>
         </w:rPr>
-        <w:t xml:space="preserve"> — 22 octobre 2026, 15 h UTC</w:t>
+        <w:t xml:space="preserve"> — 23 octobre 2026, 20 h UTC</w:t>
       </w:r>
     </w:p>
     <w:p>
@@ -2551,7 +3557,7 @@
           <w:szCs w:val="28"/>
           <w:rFonts w:ascii="Calibri" w:cs="Calibri" w:eastAsia="Calibri" w:hAnsi="Calibri"/>
         </w:rPr>
-        <w:t xml:space="preserve">NIGER : LE PRÉSIDENT DE LA RÉPUBLIQUE PRÉSIDE LA CÉRÉMONIE OFFICIELLE DE LA RENTRÉE JUDICAIRE 2026-2027</w:t>
+        <w:t xml:space="preserve">CARBURANT : LE NIGER CHERCHE DES LEVIERS POUR SORTIR DE LA CRISE</w:t>
       </w:r>
     </w:p>
     <w:p>
@@ -2567,7 +3573,69 @@
         </w:rPr>
         <w:t xml:space="preserve">▪  Source : </w:t>
       </w:r>
-      <w:hyperlink w:history="1" r:id="rIdq8swnc4vvcav0zq6k1_g9">
+      <w:hyperlink w:history="1" r:id="rIdmoukrlrpsh2z9chslmwwv">
+        <w:r>
+          <w:rPr>
+            <w:u w:val="single"/>
+            <w:color w:val="1F6B5E"/>
+            <w:sz w:val="26"/>
+            <w:szCs w:val="26"/>
+            <w:rFonts w:ascii="Calibri" w:cs="Calibri" w:eastAsia="Calibri" w:hAnsi="Calibri"/>
+          </w:rPr>
+          <w:t xml:space="preserve">Jeune Afrique</w:t>
+        </w:r>
+      </w:hyperlink>
+      <w:r>
+        <w:rPr>
+          <w:color w:val="1F2937"/>
+          <w:sz w:val="26"/>
+          <w:szCs w:val="26"/>
+          <w:rFonts w:ascii="Calibri" w:cs="Calibri" w:eastAsia="Calibri" w:hAnsi="Calibri"/>
+        </w:rPr>
+        <w:t xml:space="preserve"> — 23 octobre 2026, 18 h UTC</w:t>
+      </w:r>
+    </w:p>
+    <w:p>
+      <w:pPr>
+        <w:spacing w:before="160"/>
+        <w:ind w:left="360"/>
+      </w:pPr>
+      <w:r>
+        <w:rPr>
+          <w:color w:val="1F6B5E"/>
+          <w:sz w:val="28"/>
+          <w:szCs w:val="28"/>
+          <w:rFonts w:ascii="Calibri" w:cs="Calibri" w:eastAsia="Calibri" w:hAnsi="Calibri"/>
+        </w:rPr>
+        <w:t xml:space="preserve">❑  </w:t>
+      </w:r>
+      <w:r>
+        <w:rPr>
+          <w:b/>
+          <w:bCs/>
+          <w:u w:val="single"/>
+          <w:color w:val="1F6B5E"/>
+          <w:sz w:val="28"/>
+          <w:szCs w:val="28"/>
+          <w:rFonts w:ascii="Calibri" w:cs="Calibri" w:eastAsia="Calibri" w:hAnsi="Calibri"/>
+        </w:rPr>
+        <w:t xml:space="preserve">TAHOUA : LES AUTORITÉS RÉGIONALES PRENNENT PART À UNE PRIÈRE COLLECTIVE POUR LA PAIX ET LA SÉCURITÉ AU NIGER</w:t>
+      </w:r>
+    </w:p>
+    <w:p>
+      <w:pPr>
+        <w:ind w:left="720"/>
+      </w:pPr>
+      <w:r>
+        <w:rPr>
+          <w:color w:val="1F2937"/>
+          <w:sz w:val="26"/>
+          <w:szCs w:val="26"/>
+          <w:rFonts w:ascii="Calibri" w:cs="Calibri" w:eastAsia="Calibri" w:hAnsi="Calibri"/>
+        </w:rPr>
+        <w:t xml:space="preserve">▪  Source : </w:t>
+      </w:r>
+      <w:hyperlink w:history="1" r:id="rIdi6xvw3e9aiuhoyvsgyxon">
         <w:r>
           <w:rPr>
             <w:u w:val="single"/>
@@ -2586,7 +3654,7 @@
           <w:szCs w:val="26"/>
           <w:rFonts w:ascii="Calibri" w:cs="Calibri" w:eastAsia="Calibri" w:hAnsi="Calibri"/>
         </w:rPr>
-        <w:t xml:space="preserve"> — 22 octobre 2026, 15 h UTC</w:t>
+        <w:t xml:space="preserve"> — 23 octobre 2026, 17 h UTC</w:t>
       </w:r>
     </w:p>
     <w:p>
@@ -2613,7 +3681,7 @@
           <w:szCs w:val="28"/>
           <w:rFonts w:ascii="Calibri" w:cs="Calibri" w:eastAsia="Calibri" w:hAnsi="Calibri"/>
         </w:rPr>
-        <w:t xml:space="preserve">RENTRÉE JUDICIAIRE 2026-2027 : LE PRÉSIDENT TIANI EXHORTE LES ACTEURS DU DOMAINE À S’INSCRIRE DANS LA DYNAMIQUE DE LA REFONDATION NATIONALE</w:t>
+        <w:t xml:space="preserve">L’AIR DU TEMPS : EDUCATION À LA CRISE</w:t>
       </w:r>
     </w:p>
     <w:p>
@@ -2629,69 +3697,7 @@
         </w:rPr>
         <w:t xml:space="preserve">▪  Source : </w:t>
       </w:r>
-      <w:hyperlink w:history="1" r:id="rIdcdm3mksxwyudlbllpv4rh">
-        <w:r>
-          <w:rPr>
-            <w:u w:val="single"/>
-            <w:color w:val="1F6B5E"/>
-            <w:sz w:val="26"/>
-            <w:szCs w:val="26"/>
-            <w:rFonts w:ascii="Calibri" w:cs="Calibri" w:eastAsia="Calibri" w:hAnsi="Calibri"/>
-          </w:rPr>
-          <w:t xml:space="preserve">ANP — Agence Nigérienne Presse</w:t>
-        </w:r>
-      </w:hyperlink>
-      <w:r>
-        <w:rPr>
-          <w:color w:val="1F2937"/>
-          <w:sz w:val="26"/>
-          <w:szCs w:val="26"/>
-          <w:rFonts w:ascii="Calibri" w:cs="Calibri" w:eastAsia="Calibri" w:hAnsi="Calibri"/>
-        </w:rPr>
-        <w:t xml:space="preserve"> — 22 octobre 2026, 14 h UTC</w:t>
-      </w:r>
-    </w:p>
-    <w:p>
-      <w:pPr>
-        <w:spacing w:before="160"/>
-        <w:ind w:left="360"/>
-      </w:pPr>
-      <w:r>
-        <w:rPr>
-          <w:color w:val="1F6B5E"/>
-          <w:sz w:val="28"/>
-          <w:szCs w:val="28"/>
-          <w:rFonts w:ascii="Calibri" w:cs="Calibri" w:eastAsia="Calibri" w:hAnsi="Calibri"/>
-        </w:rPr>
-        <w:t xml:space="preserve">❑  </w:t>
-      </w:r>
-      <w:r>
-        <w:rPr>
-          <w:b/>
-          <w:bCs/>
-          <w:u w:val="single"/>
-          <w:color w:val="1F6B5E"/>
-          <w:sz w:val="28"/>
-          <w:szCs w:val="28"/>
-          <w:rFonts w:ascii="Calibri" w:cs="Calibri" w:eastAsia="Calibri" w:hAnsi="Calibri"/>
-        </w:rPr>
-        <w:t xml:space="preserve">AU PALAIS DE LA PRÉSIDENCE : LE CHEF DE L’ETAT REÇOIT L’ARTISTE SÉNÉGALAISE COUMBA GAWLO SECK</w:t>
-      </w:r>
-    </w:p>
-    <w:p>
-      <w:pPr>
-        <w:ind w:left="720"/>
-      </w:pPr>
-      <w:r>
-        <w:rPr>
-          <w:color w:val="1F2937"/>
-          <w:sz w:val="26"/>
-          <w:szCs w:val="26"/>
-          <w:rFonts w:ascii="Calibri" w:cs="Calibri" w:eastAsia="Calibri" w:hAnsi="Calibri"/>
-        </w:rPr>
-        <w:t xml:space="preserve">▪  Source : </w:t>
-      </w:r>
-      <w:hyperlink w:history="1" r:id="rIdhy3_izjacnjl5oatub5wb">
+      <w:hyperlink w:history="1" r:id="rIdl2owmy2a9gihbpiuhbiy_">
         <w:r>
           <w:rPr>
             <w:u w:val="single"/>
@@ -2710,7 +3716,339 @@
           <w:szCs w:val="26"/>
           <w:rFonts w:ascii="Calibri" w:cs="Calibri" w:eastAsia="Calibri" w:hAnsi="Calibri"/>
         </w:rPr>
-        <w:t xml:space="preserve"> — 22 octobre 2026, 8 h UTC</w:t>
+        <w:t xml:space="preserve"> — 23 octobre 2026, 9 h UTC</w:t>
+      </w:r>
+    </w:p>
+    <w:p>
+      <w:pPr>
+        <w:spacing w:before="160"/>
+        <w:ind w:left="360"/>
+      </w:pPr>
+      <w:r>
+        <w:rPr>
+          <w:color w:val="1F6B5E"/>
+          <w:sz w:val="28"/>
+          <w:szCs w:val="28"/>
+          <w:rFonts w:ascii="Calibri" w:cs="Calibri" w:eastAsia="Calibri" w:hAnsi="Calibri"/>
+        </w:rPr>
+        <w:t xml:space="preserve">❑  </w:t>
+      </w:r>
+      <w:r>
+        <w:rPr>
+          <w:b/>
+          <w:bCs/>
+          <w:u w:val="single"/>
+          <w:color w:val="1F6B5E"/>
+          <w:sz w:val="28"/>
+          <w:szCs w:val="28"/>
+          <w:rFonts w:ascii="Calibri" w:cs="Calibri" w:eastAsia="Calibri" w:hAnsi="Calibri"/>
+        </w:rPr>
+        <w:t xml:space="preserve">RENTRÉE JUDICIAIRE 2026-2027 : LE PRÉSIDENT TIANI APPELLE LA JUSTICE À S’INSCRIRE DANS LA DYNAMIQUE DE LA REFONDATION…</w:t>
+      </w:r>
+    </w:p>
+    <w:p>
+      <w:pPr>
+        <w:ind w:left="720"/>
+      </w:pPr>
+      <w:r>
+        <w:rPr>
+          <w:color w:val="1F2937"/>
+          <w:sz w:val="26"/>
+          <w:szCs w:val="26"/>
+          <w:rFonts w:ascii="Calibri" w:cs="Calibri" w:eastAsia="Calibri" w:hAnsi="Calibri"/>
+        </w:rPr>
+        <w:t xml:space="preserve">▪  Source : </w:t>
+      </w:r>
+      <w:hyperlink w:history="1" r:id="rIdvkbo5uvl053uepuuat40i">
+        <w:r>
+          <w:rPr>
+            <w:u w:val="single"/>
+            <w:color w:val="1F6B5E"/>
+            <w:sz w:val="26"/>
+            <w:szCs w:val="26"/>
+            <w:rFonts w:ascii="Calibri" w:cs="Calibri" w:eastAsia="Calibri" w:hAnsi="Calibri"/>
+          </w:rPr>
+          <w:t xml:space="preserve">Tamtaminfo</w:t>
+        </w:r>
+      </w:hyperlink>
+      <w:r>
+        <w:rPr>
+          <w:color w:val="1F2937"/>
+          <w:sz w:val="26"/>
+          <w:szCs w:val="26"/>
+          <w:rFonts w:ascii="Calibri" w:cs="Calibri" w:eastAsia="Calibri" w:hAnsi="Calibri"/>
+        </w:rPr>
+        <w:t xml:space="preserve"> — 23 octobre 2026, 21 h UTC</w:t>
+      </w:r>
+    </w:p>
+    <w:p>
+      <w:pPr>
+        <w:pageBreakBefore/>
+        <w:spacing w:after="0" w:before="0"/>
+        <w:rPr>
+          <w:sz w:val="2"/>
+          <w:szCs w:val="2"/>
+        </w:rPr>
+      </w:pPr>
+    </w:p>
+    <w:tbl>
+      <w:tblPr>
+        <w:tblW w:type="dxa" w:w="17680"/>
+        <w:tblBorders>
+          <w:top w:val="single" w:color="auto" w:sz="4"/>
+          <w:left w:val="single" w:color="auto" w:sz="4"/>
+          <w:bottom w:val="single" w:color="auto" w:sz="4"/>
+          <w:right w:val="single" w:color="auto" w:sz="4"/>
+          <w:insideH w:val="single" w:color="auto" w:sz="4"/>
+          <w:insideV w:val="single" w:color="auto" w:sz="4"/>
+        </w:tblBorders>
+      </w:tblPr>
+      <w:tblGrid>
+        <w:gridCol w:w="1000"/>
+        <w:gridCol w:w="15180"/>
+        <w:gridCol w:w="1500"/>
+      </w:tblGrid>
+      <w:tr>
+        <w:tc>
+          <w:tcPr>
+            <w:tcW w:type="dxa" w:w="1000"/>
+            <w:tcBorders>
+              <w:top w:val="none" w:color="FFFFFF" w:sz="0"/>
+              <w:left w:val="none" w:color="FFFFFF" w:sz="0"/>
+              <w:bottom w:val="none" w:color="FFFFFF" w:sz="0"/>
+              <w:right w:val="none" w:color="FFFFFF" w:sz="0"/>
+            </w:tcBorders>
+            <w:shd w:fill="1F6B5E" w:color="auto" w:val="clear"/>
+            <w:vAlign w:val="center"/>
+          </w:tcPr>
+          <w:p>
+            <w:pPr>
+              <w:jc w:val="center"/>
+            </w:pPr>
+            <w:r>
+              <w:rPr>
+                <w:color w:val="FFFFFF"/>
+                <w:sz w:val="36"/>
+                <w:szCs w:val="36"/>
+                <w:rFonts w:ascii="Arial Narrow" w:cs="Arial Narrow" w:eastAsia="Arial Narrow" w:hAnsi="Arial Narrow"/>
+              </w:rPr>
+              <w:t xml:space="preserve">III</w:t>
+            </w:r>
+          </w:p>
+        </w:tc>
+        <w:tc>
+          <w:tcPr>
+            <w:tcW w:type="dxa" w:w="15180"/>
+            <w:tcBorders>
+              <w:top w:val="none" w:color="FFFFFF" w:sz="0"/>
+              <w:left w:val="none" w:color="FFFFFF" w:sz="0"/>
+              <w:bottom w:val="none" w:color="FFFFFF" w:sz="0"/>
+              <w:right w:val="none" w:color="FFFFFF" w:sz="0"/>
+            </w:tcBorders>
+            <w:vAlign w:val="center"/>
+          </w:tcPr>
+          <w:p>
+            <w:pPr>
+              <w:ind w:left="200"/>
+            </w:pPr>
+            <w:r>
+              <w:rPr>
+                <w:color w:val="1F6B5E"/>
+                <w:sz w:val="56"/>
+                <w:szCs w:val="56"/>
+                <w:rFonts w:ascii="Arial Narrow" w:cs="Arial Narrow" w:eastAsia="Arial Narrow" w:hAnsi="Arial Narrow"/>
+              </w:rPr>
+              <w:t xml:space="preserve">Niger</w:t>
+            </w:r>
+          </w:p>
+        </w:tc>
+        <w:tc>
+          <w:tcPr>
+            <w:tcW w:type="dxa" w:w="1500"/>
+            <w:tcBorders>
+              <w:top w:val="none" w:color="FFFFFF" w:sz="0"/>
+              <w:left w:val="none" w:color="FFFFFF" w:sz="0"/>
+              <w:bottom w:val="none" w:color="FFFFFF" w:sz="0"/>
+              <w:right w:val="none" w:color="FFFFFF" w:sz="0"/>
+            </w:tcBorders>
+            <w:vAlign w:val="center"/>
+          </w:tcPr>
+          <w:tbl>
+            <w:tblPr>
+              <w:tblW w:type="dxa" w:w="1200"/>
+              <w:tblBorders>
+                <w:top w:val="single" w:color="auto" w:sz="4"/>
+                <w:left w:val="single" w:color="auto" w:sz="4"/>
+                <w:bottom w:val="single" w:color="auto" w:sz="4"/>
+                <w:right w:val="single" w:color="auto" w:sz="4"/>
+                <w:insideH w:val="single" w:color="auto" w:sz="4"/>
+                <w:insideV w:val="single" w:color="auto" w:sz="4"/>
+              </w:tblBorders>
+            </w:tblPr>
+            <w:tblGrid>
+              <w:gridCol w:w="1200"/>
+            </w:tblGrid>
+            <w:tr>
+              <w:trPr>
+                <w:trHeight w:val="200" w:hRule="exact"/>
+              </w:trPr>
+              <w:tc>
+                <w:tcPr>
+                  <w:tcW w:type="dxa" w:w="1200"/>
+                  <w:tcBorders>
+                    <w:top w:val="single" w:color="1F2937" w:sz="6"/>
+                    <w:left w:val="single" w:color="1F2937" w:sz="6"/>
+                    <w:bottom w:val="single" w:color="1F2937" w:sz="6"/>
+                    <w:right w:val="single" w:color="1F2937" w:sz="6"/>
+                  </w:tcBorders>
+                  <w:shd w:fill="E05206" w:color="auto" w:val="clear"/>
+                </w:tcPr>
+                <w:p>
+                  <w:r>
+                    <w:rPr>
+                      <w:color w:val="1F2937"/>
+                      <w:sz w:val="2"/>
+                      <w:szCs w:val="2"/>
+                      <w:rFonts w:ascii="Calibri" w:cs="Calibri" w:eastAsia="Calibri" w:hAnsi="Calibri"/>
+                    </w:rPr>
+                  </w:r>
+                </w:p>
+              </w:tc>
+            </w:tr>
+            <w:tr>
+              <w:trPr>
+                <w:trHeight w:val="200" w:hRule="exact"/>
+              </w:trPr>
+              <w:tc>
+                <w:tcPr>
+                  <w:tcW w:type="dxa" w:w="1200"/>
+                  <w:tcBorders>
+                    <w:top w:val="single" w:color="1F2937" w:sz="6"/>
+                    <w:left w:val="single" w:color="1F2937" w:sz="6"/>
+                    <w:bottom w:val="single" w:color="1F2937" w:sz="6"/>
+                    <w:right w:val="single" w:color="1F2937" w:sz="6"/>
+                  </w:tcBorders>
+                  <w:shd w:fill="FFFFFF" w:color="auto" w:val="clear"/>
+                </w:tcPr>
+                <w:p>
+                  <w:r>
+                    <w:rPr>
+                      <w:color w:val="1F2937"/>
+                      <w:sz w:val="2"/>
+                      <w:szCs w:val="2"/>
+                      <w:rFonts w:ascii="Calibri" w:cs="Calibri" w:eastAsia="Calibri" w:hAnsi="Calibri"/>
+                    </w:rPr>
+                  </w:r>
+                </w:p>
+              </w:tc>
+            </w:tr>
+            <w:tr>
+              <w:trPr>
+                <w:trHeight w:val="200" w:hRule="exact"/>
+              </w:trPr>
+              <w:tc>
+                <w:tcPr>
+                  <w:tcW w:type="dxa" w:w="1200"/>
+                  <w:tcBorders>
+                    <w:top w:val="single" w:color="1F2937" w:sz="6"/>
+                    <w:left w:val="single" w:color="1F2937" w:sz="6"/>
+                    <w:bottom w:val="single" w:color="1F2937" w:sz="6"/>
+                    <w:right w:val="single" w:color="1F2937" w:sz="6"/>
+                  </w:tcBorders>
+                  <w:shd w:fill="0DB02B" w:color="auto" w:val="clear"/>
+                </w:tcPr>
+                <w:p>
+                  <w:r>
+                    <w:rPr>
+                      <w:color w:val="1F2937"/>
+                      <w:sz w:val="2"/>
+                      <w:szCs w:val="2"/>
+                      <w:rFonts w:ascii="Calibri" w:cs="Calibri" w:eastAsia="Calibri" w:hAnsi="Calibri"/>
+                    </w:rPr>
+                  </w:r>
+                </w:p>
+              </w:tc>
+            </w:tr>
+          </w:tbl>
+          <w:p/>
+        </w:tc>
+      </w:tr>
+    </w:tbl>
+    <w:p>
+      <w:pPr>
+        <w:pBdr>
+          <w:bottom w:val="single" w:color="A3A3A3" w:sz="4" w:space="1"/>
+        </w:pBdr>
+      </w:pPr>
+      <w:r>
+        <w:rPr>
+          <w:color w:val="1F2937"/>
+          <w:sz w:val="12"/>
+          <w:szCs w:val="12"/>
+          <w:rFonts w:ascii="Calibri" w:cs="Calibri" w:eastAsia="Calibri" w:hAnsi="Calibri"/>
+        </w:rPr>
+      </w:r>
+    </w:p>
+    <w:p>
+      <w:pPr>
+        <w:spacing w:before="160"/>
+        <w:ind w:left="360"/>
+      </w:pPr>
+      <w:r>
+        <w:rPr>
+          <w:color w:val="1F6B5E"/>
+          <w:sz w:val="28"/>
+          <w:szCs w:val="28"/>
+          <w:rFonts w:ascii="Calibri" w:cs="Calibri" w:eastAsia="Calibri" w:hAnsi="Calibri"/>
+        </w:rPr>
+        <w:t xml:space="preserve">❑  </w:t>
+      </w:r>
+      <w:r>
+        <w:rPr>
+          <w:b/>
+          <w:bCs/>
+          <w:u w:val="single"/>
+          <w:color w:val="1F6B5E"/>
+          <w:sz w:val="28"/>
+          <w:szCs w:val="28"/>
+          <w:rFonts w:ascii="Calibri" w:cs="Calibri" w:eastAsia="Calibri" w:hAnsi="Calibri"/>
+        </w:rPr>
+        <w:t xml:space="preserve">ALGERIA-NIGER ‘SECURITY PACT’: WHAT’S BEHIND ALGIERS’ MILITARY PUSH INTO THE SAHEL?</w:t>
+      </w:r>
+    </w:p>
+    <w:p>
+      <w:pPr>
+        <w:ind w:left="720"/>
+      </w:pPr>
+      <w:r>
+        <w:rPr>
+          <w:color w:val="1F2937"/>
+          <w:sz w:val="26"/>
+          <w:szCs w:val="26"/>
+          <w:rFonts w:ascii="Calibri" w:cs="Calibri" w:eastAsia="Calibri" w:hAnsi="Calibri"/>
+        </w:rPr>
+        <w:t xml:space="preserve">▪  Source : </w:t>
+      </w:r>
+      <w:hyperlink w:history="1" r:id="rIdx7zgyd4jn53nw26cgldqs">
+        <w:r>
+          <w:rPr>
+            <w:u w:val="single"/>
+            <w:color w:val="1F6B5E"/>
+            <w:sz w:val="26"/>
+            <w:szCs w:val="26"/>
+            <w:rFonts w:ascii="Calibri" w:cs="Calibri" w:eastAsia="Calibri" w:hAnsi="Calibri"/>
+          </w:rPr>
+          <w:t xml:space="preserve">The Africa Report</w:t>
+        </w:r>
+      </w:hyperlink>
+      <w:r>
+        <w:rPr>
+          <w:color w:val="1F2937"/>
+          <w:sz w:val="26"/>
+          <w:szCs w:val="26"/>
+          <w:rFonts w:ascii="Calibri" w:cs="Calibri" w:eastAsia="Calibri" w:hAnsi="Calibri"/>
+        </w:rPr>
+        <w:t xml:space="preserve"> — 23 octobre 2026, 11 h UTC</w:t>
       </w:r>
     </w:p>
     <w:p>
@@ -2945,7 +4283,7 @@
           <w:szCs w:val="28"/>
           <w:rFonts w:ascii="Calibri" w:cs="Calibri" w:eastAsia="Calibri" w:hAnsi="Calibri"/>
         </w:rPr>
-        <w:t xml:space="preserve">KPANDAI: ONE REPORTEDLY KILLED IN KUMDI FARMLAND DISPUTE</w:t>
+        <w:t xml:space="preserve">SEVEN SHOT DEAD BY GUNMEN AT CHURCH FUNERAL IN JORDAN, OFFICIALS SAY</w:t>
       </w:r>
     </w:p>
     <w:p>
@@ -2961,7 +4299,7 @@
         </w:rPr>
         <w:t xml:space="preserve">▪  Source : </w:t>
       </w:r>
-      <w:hyperlink w:history="1" r:id="rIdtqv5hfjw5cvbb32sub0gj">
+      <w:hyperlink w:history="1" r:id="rIdlqjohiyhwuievoyimnzw9">
         <w:r>
           <w:rPr>
             <w:u w:val="single"/>
@@ -2980,7 +4318,7 @@
           <w:szCs w:val="26"/>
           <w:rFonts w:ascii="Calibri" w:cs="Calibri" w:eastAsia="Calibri" w:hAnsi="Calibri"/>
         </w:rPr>
-        <w:t xml:space="preserve"> — 23 octobre 2026, 5 h UTC</w:t>
+        <w:t xml:space="preserve"> — 23 octobre 2026, 18 h UTC</w:t>
       </w:r>
     </w:p>
     <w:p>
@@ -3007,7 +4345,7 @@
           <w:szCs w:val="28"/>
           <w:rFonts w:ascii="Calibri" w:cs="Calibri" w:eastAsia="Calibri" w:hAnsi="Calibri"/>
         </w:rPr>
-        <w:t xml:space="preserve">NAIMOS VOWS SELF-DEFENCE AGAINST HOSTILE ATTACKS AS ANTI-GALAMSEY OPERATIONS INTENSIFY</w:t>
+        <w:t xml:space="preserve">NPP WALEWALE CONSTITUENCY CONDEMNS PERSONAL ATTACKS AGAINST MP, URGES PARTY DISCIPLINE</w:t>
       </w:r>
     </w:p>
     <w:p>
@@ -3023,7 +4361,463 @@
         </w:rPr>
         <w:t xml:space="preserve">▪  Source : </w:t>
       </w:r>
-      <w:hyperlink w:history="1" r:id="rIdsauluccooeemkg41wi3sv">
+      <w:hyperlink w:history="1" r:id="rIduc1ju-l2azop5aq0jyquh">
+        <w:r>
+          <w:rPr>
+            <w:u w:val="single"/>
+            <w:color w:val="1F6B5E"/>
+            <w:sz w:val="26"/>
+            <w:szCs w:val="26"/>
+            <w:rFonts w:ascii="Calibri" w:cs="Calibri" w:eastAsia="Calibri" w:hAnsi="Calibri"/>
+          </w:rPr>
+          <w:t xml:space="preserve">JoyOnline</w:t>
+        </w:r>
+      </w:hyperlink>
+      <w:r>
+        <w:rPr>
+          <w:color w:val="1F2937"/>
+          <w:sz w:val="26"/>
+          <w:szCs w:val="26"/>
+          <w:rFonts w:ascii="Calibri" w:cs="Calibri" w:eastAsia="Calibri" w:hAnsi="Calibri"/>
+        </w:rPr>
+        <w:t xml:space="preserve"> — 23 octobre 2026, 15 h UTC</w:t>
+      </w:r>
+    </w:p>
+    <w:p>
+      <w:pPr>
+        <w:spacing w:before="160"/>
+        <w:ind w:left="360"/>
+      </w:pPr>
+      <w:r>
+        <w:rPr>
+          <w:color w:val="1F6B5E"/>
+          <w:sz w:val="28"/>
+          <w:szCs w:val="28"/>
+          <w:rFonts w:ascii="Calibri" w:cs="Calibri" w:eastAsia="Calibri" w:hAnsi="Calibri"/>
+        </w:rPr>
+        <w:t xml:space="preserve">❑  </w:t>
+      </w:r>
+      <w:r>
+        <w:rPr>
+          <w:b/>
+          <w:bCs/>
+          <w:u w:val="single"/>
+          <w:color w:val="1F6B5E"/>
+          <w:sz w:val="28"/>
+          <w:szCs w:val="28"/>
+          <w:rFonts w:ascii="Calibri" w:cs="Calibri" w:eastAsia="Calibri" w:hAnsi="Calibri"/>
+        </w:rPr>
+        <w:t xml:space="preserve">GAF TO STAGE LAND COMBAT FIREPOWER DEMONSTRATION AT BUNDASE ON OCTOBER 30</w:t>
+      </w:r>
+    </w:p>
+    <w:p>
+      <w:pPr>
+        <w:ind w:left="720"/>
+      </w:pPr>
+      <w:r>
+        <w:rPr>
+          <w:color w:val="1F2937"/>
+          <w:sz w:val="26"/>
+          <w:szCs w:val="26"/>
+          <w:rFonts w:ascii="Calibri" w:cs="Calibri" w:eastAsia="Calibri" w:hAnsi="Calibri"/>
+        </w:rPr>
+        <w:t xml:space="preserve">▪  Source : </w:t>
+      </w:r>
+      <w:hyperlink w:history="1" r:id="rIdgbrernoezwwcptqtsqmr4">
+        <w:r>
+          <w:rPr>
+            <w:u w:val="single"/>
+            <w:color w:val="1F6B5E"/>
+            <w:sz w:val="26"/>
+            <w:szCs w:val="26"/>
+            <w:rFonts w:ascii="Calibri" w:cs="Calibri" w:eastAsia="Calibri" w:hAnsi="Calibri"/>
+          </w:rPr>
+          <w:t xml:space="preserve">JoyOnline</w:t>
+        </w:r>
+      </w:hyperlink>
+      <w:r>
+        <w:rPr>
+          <w:color w:val="1F2937"/>
+          <w:sz w:val="26"/>
+          <w:szCs w:val="26"/>
+          <w:rFonts w:ascii="Calibri" w:cs="Calibri" w:eastAsia="Calibri" w:hAnsi="Calibri"/>
+        </w:rPr>
+        <w:t xml:space="preserve"> — 23 octobre 2026, 16 h UTC</w:t>
+      </w:r>
+    </w:p>
+    <w:p>
+      <w:pPr>
+        <w:spacing w:before="160"/>
+        <w:ind w:left="360"/>
+      </w:pPr>
+      <w:r>
+        <w:rPr>
+          <w:color w:val="1F6B5E"/>
+          <w:sz w:val="28"/>
+          <w:szCs w:val="28"/>
+          <w:rFonts w:ascii="Calibri" w:cs="Calibri" w:eastAsia="Calibri" w:hAnsi="Calibri"/>
+        </w:rPr>
+        <w:t xml:space="preserve">❑  </w:t>
+      </w:r>
+      <w:r>
+        <w:rPr>
+          <w:b/>
+          <w:bCs/>
+          <w:u w:val="single"/>
+          <w:color w:val="1F6B5E"/>
+          <w:sz w:val="28"/>
+          <w:szCs w:val="28"/>
+          <w:rFonts w:ascii="Calibri" w:cs="Calibri" w:eastAsia="Calibri" w:hAnsi="Calibri"/>
+        </w:rPr>
+        <w:t xml:space="preserve">LE PRÉSIDENT GHANÉEN AFFIRME QUE LE BARRAGE DE MEGECH, AU PAYS, INSPIRE LA RELANCE D'UN PROJET D'IRRIGATION ABANDONNÉ</w:t>
+      </w:r>
+    </w:p>
+    <w:p>
+      <w:pPr>
+        <w:ind w:left="720"/>
+      </w:pPr>
+      <w:r>
+        <w:rPr>
+          <w:color w:val="1F2937"/>
+          <w:sz w:val="26"/>
+          <w:szCs w:val="26"/>
+          <w:rFonts w:ascii="Calibri" w:cs="Calibri" w:eastAsia="Calibri" w:hAnsi="Calibri"/>
+        </w:rPr>
+        <w:t xml:space="preserve">▪  Source : </w:t>
+      </w:r>
+      <w:hyperlink w:history="1" r:id="rIdrkgtxf37kh1qdetmhzeuh">
+        <w:r>
+          <w:rPr>
+            <w:u w:val="single"/>
+            <w:color w:val="1F6B5E"/>
+            <w:sz w:val="26"/>
+            <w:szCs w:val="26"/>
+            <w:rFonts w:ascii="Calibri" w:cs="Calibri" w:eastAsia="Calibri" w:hAnsi="Calibri"/>
+          </w:rPr>
+          <w:t xml:space="preserve">AllAfrica (ET)</w:t>
+        </w:r>
+      </w:hyperlink>
+      <w:r>
+        <w:rPr>
+          <w:color w:val="1F2937"/>
+          <w:sz w:val="26"/>
+          <w:szCs w:val="26"/>
+          <w:rFonts w:ascii="Calibri" w:cs="Calibri" w:eastAsia="Calibri" w:hAnsi="Calibri"/>
+        </w:rPr>
+        <w:t xml:space="preserve"> — 23 octobre 2026, 21 h UTC</w:t>
+      </w:r>
+    </w:p>
+    <w:p>
+      <w:pPr>
+        <w:spacing w:before="160"/>
+        <w:ind w:left="360"/>
+      </w:pPr>
+      <w:r>
+        <w:rPr>
+          <w:color w:val="1F6B5E"/>
+          <w:sz w:val="28"/>
+          <w:szCs w:val="28"/>
+          <w:rFonts w:ascii="Calibri" w:cs="Calibri" w:eastAsia="Calibri" w:hAnsi="Calibri"/>
+        </w:rPr>
+        <w:t xml:space="preserve">❑  </w:t>
+      </w:r>
+      <w:r>
+        <w:rPr>
+          <w:b/>
+          <w:bCs/>
+          <w:u w:val="single"/>
+          <w:color w:val="1F6B5E"/>
+          <w:sz w:val="28"/>
+          <w:szCs w:val="28"/>
+          <w:rFonts w:ascii="Calibri" w:cs="Calibri" w:eastAsia="Calibri" w:hAnsi="Calibri"/>
+        </w:rPr>
+        <w:t xml:space="preserve">RICHARD KUMADOE BLAMES FLAWED RECRUITMENT FOR PROBLEMS AT BNI</w:t>
+      </w:r>
+    </w:p>
+    <w:p>
+      <w:pPr>
+        <w:ind w:left="720"/>
+      </w:pPr>
+      <w:r>
+        <w:rPr>
+          <w:color w:val="1F2937"/>
+          <w:sz w:val="26"/>
+          <w:szCs w:val="26"/>
+          <w:rFonts w:ascii="Calibri" w:cs="Calibri" w:eastAsia="Calibri" w:hAnsi="Calibri"/>
+        </w:rPr>
+        <w:t xml:space="preserve">▪  Source : </w:t>
+      </w:r>
+      <w:hyperlink w:history="1" r:id="rId-2g4bmwtiassww9saw_1_">
+        <w:r>
+          <w:rPr>
+            <w:u w:val="single"/>
+            <w:color w:val="1F6B5E"/>
+            <w:sz w:val="26"/>
+            <w:szCs w:val="26"/>
+            <w:rFonts w:ascii="Calibri" w:cs="Calibri" w:eastAsia="Calibri" w:hAnsi="Calibri"/>
+          </w:rPr>
+          <w:t xml:space="preserve">Ghanaian Times</w:t>
+        </w:r>
+      </w:hyperlink>
+      <w:r>
+        <w:rPr>
+          <w:color w:val="1F2937"/>
+          <w:sz w:val="26"/>
+          <w:szCs w:val="26"/>
+          <w:rFonts w:ascii="Calibri" w:cs="Calibri" w:eastAsia="Calibri" w:hAnsi="Calibri"/>
+        </w:rPr>
+        <w:t xml:space="preserve"> — 23 octobre 2026, 16 h UTC</w:t>
+      </w:r>
+    </w:p>
+    <w:p>
+      <w:pPr>
+        <w:pageBreakBefore/>
+        <w:spacing w:after="0" w:before="0"/>
+        <w:rPr>
+          <w:sz w:val="2"/>
+          <w:szCs w:val="2"/>
+        </w:rPr>
+      </w:pPr>
+    </w:p>
+    <w:tbl>
+      <w:tblPr>
+        <w:tblW w:type="dxa" w:w="17680"/>
+        <w:tblBorders>
+          <w:top w:val="single" w:color="auto" w:sz="4"/>
+          <w:left w:val="single" w:color="auto" w:sz="4"/>
+          <w:bottom w:val="single" w:color="auto" w:sz="4"/>
+          <w:right w:val="single" w:color="auto" w:sz="4"/>
+          <w:insideH w:val="single" w:color="auto" w:sz="4"/>
+          <w:insideV w:val="single" w:color="auto" w:sz="4"/>
+        </w:tblBorders>
+      </w:tblPr>
+      <w:tblGrid>
+        <w:gridCol w:w="1000"/>
+        <w:gridCol w:w="15180"/>
+        <w:gridCol w:w="1500"/>
+      </w:tblGrid>
+      <w:tr>
+        <w:tc>
+          <w:tcPr>
+            <w:tcW w:type="dxa" w:w="1000"/>
+            <w:tcBorders>
+              <w:top w:val="none" w:color="FFFFFF" w:sz="0"/>
+              <w:left w:val="none" w:color="FFFFFF" w:sz="0"/>
+              <w:bottom w:val="none" w:color="FFFFFF" w:sz="0"/>
+              <w:right w:val="none" w:color="FFFFFF" w:sz="0"/>
+            </w:tcBorders>
+            <w:shd w:fill="1F6B5E" w:color="auto" w:val="clear"/>
+            <w:vAlign w:val="center"/>
+          </w:tcPr>
+          <w:p>
+            <w:pPr>
+              <w:jc w:val="center"/>
+            </w:pPr>
+            <w:r>
+              <w:rPr>
+                <w:color w:val="FFFFFF"/>
+                <w:sz w:val="44"/>
+                <w:szCs w:val="44"/>
+                <w:rFonts w:ascii="Arial Narrow" w:cs="Arial Narrow" w:eastAsia="Arial Narrow" w:hAnsi="Arial Narrow"/>
+              </w:rPr>
+              <w:t xml:space="preserve">IV</w:t>
+            </w:r>
+          </w:p>
+        </w:tc>
+        <w:tc>
+          <w:tcPr>
+            <w:tcW w:type="dxa" w:w="15180"/>
+            <w:tcBorders>
+              <w:top w:val="none" w:color="FFFFFF" w:sz="0"/>
+              <w:left w:val="none" w:color="FFFFFF" w:sz="0"/>
+              <w:bottom w:val="none" w:color="FFFFFF" w:sz="0"/>
+              <w:right w:val="none" w:color="FFFFFF" w:sz="0"/>
+            </w:tcBorders>
+            <w:vAlign w:val="center"/>
+          </w:tcPr>
+          <w:p>
+            <w:pPr>
+              <w:ind w:left="200"/>
+            </w:pPr>
+            <w:r>
+              <w:rPr>
+                <w:color w:val="1F6B5E"/>
+                <w:sz w:val="56"/>
+                <w:szCs w:val="56"/>
+                <w:rFonts w:ascii="Arial Narrow" w:cs="Arial Narrow" w:eastAsia="Arial Narrow" w:hAnsi="Arial Narrow"/>
+              </w:rPr>
+              <w:t xml:space="preserve">Ghana</w:t>
+            </w:r>
+          </w:p>
+        </w:tc>
+        <w:tc>
+          <w:tcPr>
+            <w:tcW w:type="dxa" w:w="1500"/>
+            <w:tcBorders>
+              <w:top w:val="none" w:color="FFFFFF" w:sz="0"/>
+              <w:left w:val="none" w:color="FFFFFF" w:sz="0"/>
+              <w:bottom w:val="none" w:color="FFFFFF" w:sz="0"/>
+              <w:right w:val="none" w:color="FFFFFF" w:sz="0"/>
+            </w:tcBorders>
+            <w:vAlign w:val="center"/>
+          </w:tcPr>
+          <w:tbl>
+            <w:tblPr>
+              <w:tblW w:type="dxa" w:w="1200"/>
+              <w:tblBorders>
+                <w:top w:val="single" w:color="auto" w:sz="4"/>
+                <w:left w:val="single" w:color="auto" w:sz="4"/>
+                <w:bottom w:val="single" w:color="auto" w:sz="4"/>
+                <w:right w:val="single" w:color="auto" w:sz="4"/>
+                <w:insideH w:val="single" w:color="auto" w:sz="4"/>
+                <w:insideV w:val="single" w:color="auto" w:sz="4"/>
+              </w:tblBorders>
+            </w:tblPr>
+            <w:tblGrid>
+              <w:gridCol w:w="1200"/>
+            </w:tblGrid>
+            <w:tr>
+              <w:trPr>
+                <w:trHeight w:val="200" w:hRule="exact"/>
+              </w:trPr>
+              <w:tc>
+                <w:tcPr>
+                  <w:tcW w:type="dxa" w:w="1200"/>
+                  <w:tcBorders>
+                    <w:top w:val="single" w:color="1F2937" w:sz="6"/>
+                    <w:left w:val="single" w:color="1F2937" w:sz="6"/>
+                    <w:bottom w:val="single" w:color="1F2937" w:sz="6"/>
+                    <w:right w:val="single" w:color="1F2937" w:sz="6"/>
+                  </w:tcBorders>
+                  <w:shd w:fill="CE1126" w:color="auto" w:val="clear"/>
+                </w:tcPr>
+                <w:p>
+                  <w:r>
+                    <w:rPr>
+                      <w:color w:val="1F2937"/>
+                      <w:sz w:val="2"/>
+                      <w:szCs w:val="2"/>
+                      <w:rFonts w:ascii="Calibri" w:cs="Calibri" w:eastAsia="Calibri" w:hAnsi="Calibri"/>
+                    </w:rPr>
+                  </w:r>
+                </w:p>
+              </w:tc>
+            </w:tr>
+            <w:tr>
+              <w:trPr>
+                <w:trHeight w:val="200" w:hRule="exact"/>
+              </w:trPr>
+              <w:tc>
+                <w:tcPr>
+                  <w:tcW w:type="dxa" w:w="1200"/>
+                  <w:tcBorders>
+                    <w:top w:val="single" w:color="1F2937" w:sz="6"/>
+                    <w:left w:val="single" w:color="1F2937" w:sz="6"/>
+                    <w:bottom w:val="single" w:color="1F2937" w:sz="6"/>
+                    <w:right w:val="single" w:color="1F2937" w:sz="6"/>
+                  </w:tcBorders>
+                  <w:shd w:fill="FCD116" w:color="auto" w:val="clear"/>
+                </w:tcPr>
+                <w:p>
+                  <w:r>
+                    <w:rPr>
+                      <w:color w:val="1F2937"/>
+                      <w:sz w:val="2"/>
+                      <w:szCs w:val="2"/>
+                      <w:rFonts w:ascii="Calibri" w:cs="Calibri" w:eastAsia="Calibri" w:hAnsi="Calibri"/>
+                    </w:rPr>
+                  </w:r>
+                </w:p>
+              </w:tc>
+            </w:tr>
+            <w:tr>
+              <w:trPr>
+                <w:trHeight w:val="200" w:hRule="exact"/>
+              </w:trPr>
+              <w:tc>
+                <w:tcPr>
+                  <w:tcW w:type="dxa" w:w="1200"/>
+                  <w:tcBorders>
+                    <w:top w:val="single" w:color="1F2937" w:sz="6"/>
+                    <w:left w:val="single" w:color="1F2937" w:sz="6"/>
+                    <w:bottom w:val="single" w:color="1F2937" w:sz="6"/>
+                    <w:right w:val="single" w:color="1F2937" w:sz="6"/>
+                  </w:tcBorders>
+                  <w:shd w:fill="006B3F" w:color="auto" w:val="clear"/>
+                </w:tcPr>
+                <w:p>
+                  <w:r>
+                    <w:rPr>
+                      <w:color w:val="1F2937"/>
+                      <w:sz w:val="2"/>
+                      <w:szCs w:val="2"/>
+                      <w:rFonts w:ascii="Calibri" w:cs="Calibri" w:eastAsia="Calibri" w:hAnsi="Calibri"/>
+                    </w:rPr>
+                  </w:r>
+                </w:p>
+              </w:tc>
+            </w:tr>
+          </w:tbl>
+          <w:p/>
+        </w:tc>
+      </w:tr>
+    </w:tbl>
+    <w:p>
+      <w:pPr>
+        <w:pBdr>
+          <w:bottom w:val="single" w:color="A3A3A3" w:sz="4" w:space="1"/>
+        </w:pBdr>
+      </w:pPr>
+      <w:r>
+        <w:rPr>
+          <w:color w:val="1F2937"/>
+          <w:sz w:val="12"/>
+          <w:szCs w:val="12"/>
+          <w:rFonts w:ascii="Calibri" w:cs="Calibri" w:eastAsia="Calibri" w:hAnsi="Calibri"/>
+        </w:rPr>
+      </w:r>
+    </w:p>
+    <w:p>
+      <w:pPr>
+        <w:spacing w:before="160"/>
+        <w:ind w:left="360"/>
+      </w:pPr>
+      <w:r>
+        <w:rPr>
+          <w:color w:val="1F6B5E"/>
+          <w:sz w:val="28"/>
+          <w:szCs w:val="28"/>
+          <w:rFonts w:ascii="Calibri" w:cs="Calibri" w:eastAsia="Calibri" w:hAnsi="Calibri"/>
+        </w:rPr>
+        <w:t xml:space="preserve">❑  </w:t>
+      </w:r>
+      <w:r>
+        <w:rPr>
+          <w:b/>
+          <w:bCs/>
+          <w:u w:val="single"/>
+          <w:color w:val="1F6B5E"/>
+          <w:sz w:val="28"/>
+          <w:szCs w:val="28"/>
+          <w:rFonts w:ascii="Calibri" w:cs="Calibri" w:eastAsia="Calibri" w:hAnsi="Calibri"/>
+        </w:rPr>
+        <w:t xml:space="preserve">GOVERNMENT PAYS GH¢4.4BN TO SSNIT, SETTLES TIER-2 PENSION OBLIGATIONS – FINANCE MINISTER</w:t>
+      </w:r>
+    </w:p>
+    <w:p>
+      <w:pPr>
+        <w:ind w:left="720"/>
+      </w:pPr>
+      <w:r>
+        <w:rPr>
+          <w:color w:val="1F2937"/>
+          <w:sz w:val="26"/>
+          <w:szCs w:val="26"/>
+          <w:rFonts w:ascii="Calibri" w:cs="Calibri" w:eastAsia="Calibri" w:hAnsi="Calibri"/>
+        </w:rPr>
+        <w:t xml:space="preserve">▪  Source : </w:t>
+      </w:r>
+      <w:hyperlink w:history="1" r:id="rIdung6ub4gfhngeq08zd-_4">
         <w:r>
           <w:rPr>
             <w:u w:val="single"/>
@@ -3042,7 +4836,7 @@
           <w:szCs w:val="26"/>
           <w:rFonts w:ascii="Calibri" w:cs="Calibri" w:eastAsia="Calibri" w:hAnsi="Calibri"/>
         </w:rPr>
-        <w:t xml:space="preserve"> — 22 octobre 2026, 16 h UTC</w:t>
+        <w:t xml:space="preserve"> — 23 octobre 2026, 15 h UTC</w:t>
       </w:r>
     </w:p>
     <w:p>
@@ -3069,7 +4863,7 @@
           <w:szCs w:val="28"/>
           <w:rFonts w:ascii="Calibri" w:cs="Calibri" w:eastAsia="Calibri" w:hAnsi="Calibri"/>
         </w:rPr>
-        <w:t xml:space="preserve">GES TO REOPEN OBUASI SHTS NEXT WEEK AFTER AUGUST VIOLENCE</w:t>
+        <w:t xml:space="preserve">OBUASI SHTS HEADMASTER RAPE CASE SENT TO ATTORNEY GENERAL’S OFFICE</w:t>
       </w:r>
     </w:p>
     <w:p>
@@ -3085,69 +4879,7 @@
         </w:rPr>
         <w:t xml:space="preserve">▪  Source : </w:t>
       </w:r>
-      <w:hyperlink w:history="1" r:id="rId_pz3uwx5__edaplao1k74">
-        <w:r>
-          <w:rPr>
-            <w:u w:val="single"/>
-            <w:color w:val="1F6B5E"/>
-            <w:sz w:val="26"/>
-            <w:szCs w:val="26"/>
-            <w:rFonts w:ascii="Calibri" w:cs="Calibri" w:eastAsia="Calibri" w:hAnsi="Calibri"/>
-          </w:rPr>
-          <w:t xml:space="preserve">GBC Ghana Online</w:t>
-        </w:r>
-      </w:hyperlink>
-      <w:r>
-        <w:rPr>
-          <w:color w:val="1F2937"/>
-          <w:sz w:val="26"/>
-          <w:szCs w:val="26"/>
-          <w:rFonts w:ascii="Calibri" w:cs="Calibri" w:eastAsia="Calibri" w:hAnsi="Calibri"/>
-        </w:rPr>
-        <w:t xml:space="preserve"> — 23 octobre 2026, 4 h UTC</w:t>
-      </w:r>
-    </w:p>
-    <w:p>
-      <w:pPr>
-        <w:spacing w:before="160"/>
-        <w:ind w:left="360"/>
-      </w:pPr>
-      <w:r>
-        <w:rPr>
-          <w:color w:val="1F6B5E"/>
-          <w:sz w:val="28"/>
-          <w:szCs w:val="28"/>
-          <w:rFonts w:ascii="Calibri" w:cs="Calibri" w:eastAsia="Calibri" w:hAnsi="Calibri"/>
-        </w:rPr>
-        <w:t xml:space="preserve">❑  </w:t>
-      </w:r>
-      <w:r>
-        <w:rPr>
-          <w:b/>
-          <w:bCs/>
-          <w:u w:val="single"/>
-          <w:color w:val="1F6B5E"/>
-          <w:sz w:val="28"/>
-          <w:szCs w:val="28"/>
-          <w:rFonts w:ascii="Calibri" w:cs="Calibri" w:eastAsia="Calibri" w:hAnsi="Calibri"/>
-        </w:rPr>
-        <w:t xml:space="preserve">OBUASI SHTS HEADMASTER RAPE CASE SENT TO ATTORNEY GENERAL’S OFFICE</w:t>
-      </w:r>
-    </w:p>
-    <w:p>
-      <w:pPr>
-        <w:ind w:left="720"/>
-      </w:pPr>
-      <w:r>
-        <w:rPr>
-          <w:color w:val="1F2937"/>
-          <w:sz w:val="26"/>
-          <w:szCs w:val="26"/>
-          <w:rFonts w:ascii="Calibri" w:cs="Calibri" w:eastAsia="Calibri" w:hAnsi="Calibri"/>
-        </w:rPr>
-        <w:t xml:space="preserve">▪  Source : </w:t>
-      </w:r>
-      <w:hyperlink w:history="1" r:id="rIdbhjak0yale-3kt0tnhbsm">
+      <w:hyperlink w:history="1" r:id="rIdzgbnznq6nq2-l3ygrxywf">
         <w:r>
           <w:rPr>
             <w:u w:val="single"/>
@@ -3455,7 +5187,7 @@
           <w:szCs w:val="28"/>
           <w:rFonts w:ascii="Calibri" w:cs="Calibri" w:eastAsia="Calibri" w:hAnsi="Calibri"/>
         </w:rPr>
-        <w:t xml:space="preserve">TOGO- 31, 7 MILLIARDS FCFA POUR DÉSENCLAVER LES SAVANES : DES TRAVAUX ABANDONNÉS OU MAL FAITS</w:t>
+        <w:t xml:space="preserve">TOGO : AGRICULTURE, NUCLÉAIRE… LES DÉPUTÉS ADOPTENT QUATRE TEXTES STRATÉGIQUES</w:t>
       </w:r>
     </w:p>
     <w:p>
@@ -3471,69 +5203,7 @@
         </w:rPr>
         <w:t xml:space="preserve">▪  Source : </w:t>
       </w:r>
-      <w:hyperlink w:history="1" r:id="rIdk_gcnsf6hbk98lmuzatdo">
-        <w:r>
-          <w:rPr>
-            <w:u w:val="single"/>
-            <w:color w:val="1F6B5E"/>
-            <w:sz w:val="26"/>
-            <w:szCs w:val="26"/>
-            <w:rFonts w:ascii="Calibri" w:cs="Calibri" w:eastAsia="Calibri" w:hAnsi="Calibri"/>
-          </w:rPr>
-          <w:t xml:space="preserve">Togo Actualite</w:t>
-        </w:r>
-      </w:hyperlink>
-      <w:r>
-        <w:rPr>
-          <w:color w:val="1F2937"/>
-          <w:sz w:val="26"/>
-          <w:szCs w:val="26"/>
-          <w:rFonts w:ascii="Calibri" w:cs="Calibri" w:eastAsia="Calibri" w:hAnsi="Calibri"/>
-        </w:rPr>
-        <w:t xml:space="preserve"> — 22 octobre 2026, 12 h UTC</w:t>
-      </w:r>
-    </w:p>
-    <w:p>
-      <w:pPr>
-        <w:spacing w:before="160"/>
-        <w:ind w:left="360"/>
-      </w:pPr>
-      <w:r>
-        <w:rPr>
-          <w:color w:val="1F6B5E"/>
-          <w:sz w:val="28"/>
-          <w:szCs w:val="28"/>
-          <w:rFonts w:ascii="Calibri" w:cs="Calibri" w:eastAsia="Calibri" w:hAnsi="Calibri"/>
-        </w:rPr>
-        <w:t xml:space="preserve">❑  </w:t>
-      </w:r>
-      <w:r>
-        <w:rPr>
-          <w:b/>
-          <w:bCs/>
-          <w:u w:val="single"/>
-          <w:color w:val="1F6B5E"/>
-          <w:sz w:val="28"/>
-          <w:szCs w:val="28"/>
-          <w:rFonts w:ascii="Calibri" w:cs="Calibri" w:eastAsia="Calibri" w:hAnsi="Calibri"/>
-        </w:rPr>
-        <w:t xml:space="preserve">TOGO : 407 PERSONNES OPÉRÉES GRATUITEMENT DE LA CATARACTE À LOMÉ, CAP SUR KARA</w:t>
-      </w:r>
-    </w:p>
-    <w:p>
-      <w:pPr>
-        <w:ind w:left="720"/>
-      </w:pPr>
-      <w:r>
-        <w:rPr>
-          <w:color w:val="1F2937"/>
-          <w:sz w:val="26"/>
-          <w:szCs w:val="26"/>
-          <w:rFonts w:ascii="Calibri" w:cs="Calibri" w:eastAsia="Calibri" w:hAnsi="Calibri"/>
-        </w:rPr>
-        <w:t xml:space="preserve">▪  Source : </w:t>
-      </w:r>
-      <w:hyperlink w:history="1" r:id="rId2pqwk13wsuow6axc9pajt">
+      <w:hyperlink w:history="1" r:id="rIdiicehawzdn-0jqe9monrt">
         <w:r>
           <w:rPr>
             <w:u w:val="single"/>
@@ -3552,7 +5222,641 @@
           <w:szCs w:val="26"/>
           <w:rFonts w:ascii="Calibri" w:cs="Calibri" w:eastAsia="Calibri" w:hAnsi="Calibri"/>
         </w:rPr>
-        <w:t xml:space="preserve"> — 22 octobre 2026, 7 h UTC</w:t>
+        <w:t xml:space="preserve"> — 23 octobre 2026, 17 h UTC</w:t>
+      </w:r>
+    </w:p>
+    <w:p>
+      <w:pPr>
+        <w:spacing w:before="160"/>
+        <w:ind w:left="360"/>
+      </w:pPr>
+      <w:r>
+        <w:rPr>
+          <w:color w:val="1F6B5E"/>
+          <w:sz w:val="28"/>
+          <w:szCs w:val="28"/>
+          <w:rFonts w:ascii="Calibri" w:cs="Calibri" w:eastAsia="Calibri" w:hAnsi="Calibri"/>
+        </w:rPr>
+        <w:t xml:space="preserve">❑  </w:t>
+      </w:r>
+      <w:r>
+        <w:rPr>
+          <w:b/>
+          <w:bCs/>
+          <w:u w:val="single"/>
+          <w:color w:val="1F6B5E"/>
+          <w:sz w:val="28"/>
+          <w:szCs w:val="28"/>
+          <w:rFonts w:ascii="Calibri" w:cs="Calibri" w:eastAsia="Calibri" w:hAnsi="Calibri"/>
+        </w:rPr>
+        <w:t xml:space="preserve">TOGO / LOI D’ORIENTATION AGRICOLE : LA MARCHE VERS LA SOUVERAINETÉ ALIMENTAIRE</w:t>
+      </w:r>
+    </w:p>
+    <w:p>
+      <w:pPr>
+        <w:ind w:left="720"/>
+      </w:pPr>
+      <w:r>
+        <w:rPr>
+          <w:color w:val="1F2937"/>
+          <w:sz w:val="26"/>
+          <w:szCs w:val="26"/>
+          <w:rFonts w:ascii="Calibri" w:cs="Calibri" w:eastAsia="Calibri" w:hAnsi="Calibri"/>
+        </w:rPr>
+        <w:t xml:space="preserve">▪  Source : </w:t>
+      </w:r>
+      <w:hyperlink w:history="1" r:id="rIdfvyg6exsb6wergqitu1tq">
+        <w:r>
+          <w:rPr>
+            <w:u w:val="single"/>
+            <w:color w:val="1F6B5E"/>
+            <w:sz w:val="26"/>
+            <w:szCs w:val="26"/>
+            <w:rFonts w:ascii="Calibri" w:cs="Calibri" w:eastAsia="Calibri" w:hAnsi="Calibri"/>
+          </w:rPr>
+          <w:t xml:space="preserve">Le Nouveau Reporter</w:t>
+        </w:r>
+      </w:hyperlink>
+      <w:r>
+        <w:rPr>
+          <w:color w:val="1F2937"/>
+          <w:sz w:val="26"/>
+          <w:szCs w:val="26"/>
+          <w:rFonts w:ascii="Calibri" w:cs="Calibri" w:eastAsia="Calibri" w:hAnsi="Calibri"/>
+        </w:rPr>
+        <w:t xml:space="preserve"> — 23 octobre 2026, 17 h UTC</w:t>
+      </w:r>
+    </w:p>
+    <w:p>
+      <w:pPr>
+        <w:spacing w:before="160"/>
+        <w:ind w:left="360"/>
+      </w:pPr>
+      <w:r>
+        <w:rPr>
+          <w:color w:val="1F6B5E"/>
+          <w:sz w:val="28"/>
+          <w:szCs w:val="28"/>
+          <w:rFonts w:ascii="Calibri" w:cs="Calibri" w:eastAsia="Calibri" w:hAnsi="Calibri"/>
+        </w:rPr>
+        <w:t xml:space="preserve">❑  </w:t>
+      </w:r>
+      <w:r>
+        <w:rPr>
+          <w:b/>
+          <w:bCs/>
+          <w:u w:val="single"/>
+          <w:color w:val="1F6B5E"/>
+          <w:sz w:val="28"/>
+          <w:szCs w:val="28"/>
+          <w:rFonts w:ascii="Calibri" w:cs="Calibri" w:eastAsia="Calibri" w:hAnsi="Calibri"/>
+        </w:rPr>
+        <w:t xml:space="preserve">KLOTO : UNE DÉLÉGATION DE LA COOPÉRATION ALLEMANDE VISITE DES INITIATIVES DE DÉVELOPPEMENT</w:t>
+      </w:r>
+    </w:p>
+    <w:p>
+      <w:pPr>
+        <w:ind w:left="720"/>
+      </w:pPr>
+      <w:r>
+        <w:rPr>
+          <w:color w:val="1F2937"/>
+          <w:sz w:val="26"/>
+          <w:szCs w:val="26"/>
+          <w:rFonts w:ascii="Calibri" w:cs="Calibri" w:eastAsia="Calibri" w:hAnsi="Calibri"/>
+        </w:rPr>
+        <w:t xml:space="preserve">▪  Source : </w:t>
+      </w:r>
+      <w:hyperlink w:history="1" r:id="rId1jusmfwxz0grhkxbixbtf">
+        <w:r>
+          <w:rPr>
+            <w:u w:val="single"/>
+            <w:color w:val="1F6B5E"/>
+            <w:sz w:val="26"/>
+            <w:szCs w:val="26"/>
+            <w:rFonts w:ascii="Calibri" w:cs="Calibri" w:eastAsia="Calibri" w:hAnsi="Calibri"/>
+          </w:rPr>
+          <w:t xml:space="preserve">ATOP — Agence Togolaise Presse</w:t>
+        </w:r>
+      </w:hyperlink>
+      <w:r>
+        <w:rPr>
+          <w:color w:val="1F2937"/>
+          <w:sz w:val="26"/>
+          <w:szCs w:val="26"/>
+          <w:rFonts w:ascii="Calibri" w:cs="Calibri" w:eastAsia="Calibri" w:hAnsi="Calibri"/>
+        </w:rPr>
+        <w:t xml:space="preserve"> — 23 octobre 2026, 14 h UTC</w:t>
+      </w:r>
+    </w:p>
+    <w:p>
+      <w:pPr>
+        <w:spacing w:before="160"/>
+        <w:ind w:left="360"/>
+      </w:pPr>
+      <w:r>
+        <w:rPr>
+          <w:color w:val="1F6B5E"/>
+          <w:sz w:val="28"/>
+          <w:szCs w:val="28"/>
+          <w:rFonts w:ascii="Calibri" w:cs="Calibri" w:eastAsia="Calibri" w:hAnsi="Calibri"/>
+        </w:rPr>
+        <w:t xml:space="preserve">❑  </w:t>
+      </w:r>
+      <w:r>
+        <w:rPr>
+          <w:b/>
+          <w:bCs/>
+          <w:u w:val="single"/>
+          <w:color w:val="1F6B5E"/>
+          <w:sz w:val="28"/>
+          <w:szCs w:val="28"/>
+          <w:rFonts w:ascii="Calibri" w:cs="Calibri" w:eastAsia="Calibri" w:hAnsi="Calibri"/>
+        </w:rPr>
+        <w:t xml:space="preserve">ASSEMBLÉE NATIONALE : LA LOI D’ORIENTATION AGRICOLE ET TROIS TEXTES SUR LE NUCLÉAIRE ADOPTÉS</w:t>
+      </w:r>
+    </w:p>
+    <w:p>
+      <w:pPr>
+        <w:ind w:left="720"/>
+      </w:pPr>
+      <w:r>
+        <w:rPr>
+          <w:color w:val="1F2937"/>
+          <w:sz w:val="26"/>
+          <w:szCs w:val="26"/>
+          <w:rFonts w:ascii="Calibri" w:cs="Calibri" w:eastAsia="Calibri" w:hAnsi="Calibri"/>
+        </w:rPr>
+        <w:t xml:space="preserve">▪  Source : </w:t>
+      </w:r>
+      <w:hyperlink w:history="1" r:id="rIdgrbail7safgqsppodudkf">
+        <w:r>
+          <w:rPr>
+            <w:u w:val="single"/>
+            <w:color w:val="1F6B5E"/>
+            <w:sz w:val="26"/>
+            <w:szCs w:val="26"/>
+            <w:rFonts w:ascii="Calibri" w:cs="Calibri" w:eastAsia="Calibri" w:hAnsi="Calibri"/>
+          </w:rPr>
+          <w:t xml:space="preserve">ATOP — Agence Togolaise Presse</w:t>
+        </w:r>
+      </w:hyperlink>
+      <w:r>
+        <w:rPr>
+          <w:color w:val="1F2937"/>
+          <w:sz w:val="26"/>
+          <w:szCs w:val="26"/>
+          <w:rFonts w:ascii="Calibri" w:cs="Calibri" w:eastAsia="Calibri" w:hAnsi="Calibri"/>
+        </w:rPr>
+        <w:t xml:space="preserve"> — 23 octobre 2026, 14 h UTC</w:t>
+      </w:r>
+    </w:p>
+    <w:p>
+      <w:pPr>
+        <w:spacing w:before="160"/>
+        <w:ind w:left="360"/>
+      </w:pPr>
+      <w:r>
+        <w:rPr>
+          <w:color w:val="1F6B5E"/>
+          <w:sz w:val="28"/>
+          <w:szCs w:val="28"/>
+          <w:rFonts w:ascii="Calibri" w:cs="Calibri" w:eastAsia="Calibri" w:hAnsi="Calibri"/>
+        </w:rPr>
+        <w:t xml:space="preserve">❑  </w:t>
+      </w:r>
+      <w:r>
+        <w:rPr>
+          <w:b/>
+          <w:bCs/>
+          <w:u w:val="single"/>
+          <w:color w:val="1F6B5E"/>
+          <w:sz w:val="28"/>
+          <w:szCs w:val="28"/>
+          <w:rFonts w:ascii="Calibri" w:cs="Calibri" w:eastAsia="Calibri" w:hAnsi="Calibri"/>
+        </w:rPr>
+        <w:t xml:space="preserve">TOGO : QUATRE CONSULTANTS RECHERCHÉS POUR LE DÉPLOIEMENT DU SYSTÈME E-GP</w:t>
+      </w:r>
+    </w:p>
+    <w:p>
+      <w:pPr>
+        <w:ind w:left="720"/>
+      </w:pPr>
+      <w:r>
+        <w:rPr>
+          <w:color w:val="1F2937"/>
+          <w:sz w:val="26"/>
+          <w:szCs w:val="26"/>
+          <w:rFonts w:ascii="Calibri" w:cs="Calibri" w:eastAsia="Calibri" w:hAnsi="Calibri"/>
+        </w:rPr>
+        <w:t xml:space="preserve">▪  Source : </w:t>
+      </w:r>
+      <w:hyperlink w:history="1" r:id="rIdvpmlinfgqfqsnq8yideol">
+        <w:r>
+          <w:rPr>
+            <w:u w:val="single"/>
+            <w:color w:val="1F6B5E"/>
+            <w:sz w:val="26"/>
+            <w:szCs w:val="26"/>
+            <w:rFonts w:ascii="Calibri" w:cs="Calibri" w:eastAsia="Calibri" w:hAnsi="Calibri"/>
+          </w:rPr>
+          <w:t xml:space="preserve">togoscoop.tg</w:t>
+        </w:r>
+      </w:hyperlink>
+      <w:r>
+        <w:rPr>
+          <w:color w:val="1F2937"/>
+          <w:sz w:val="26"/>
+          <w:szCs w:val="26"/>
+          <w:rFonts w:ascii="Calibri" w:cs="Calibri" w:eastAsia="Calibri" w:hAnsi="Calibri"/>
+        </w:rPr>
+        <w:t xml:space="preserve"> — 23 octobre 2026, 10 h UTC</w:t>
+      </w:r>
+    </w:p>
+    <w:p>
+      <w:pPr>
+        <w:pageBreakBefore/>
+        <w:spacing w:after="0" w:before="0"/>
+        <w:rPr>
+          <w:sz w:val="2"/>
+          <w:szCs w:val="2"/>
+        </w:rPr>
+      </w:pPr>
+    </w:p>
+    <w:tbl>
+      <w:tblPr>
+        <w:tblW w:type="dxa" w:w="17680"/>
+        <w:tblBorders>
+          <w:top w:val="single" w:color="auto" w:sz="4"/>
+          <w:left w:val="single" w:color="auto" w:sz="4"/>
+          <w:bottom w:val="single" w:color="auto" w:sz="4"/>
+          <w:right w:val="single" w:color="auto" w:sz="4"/>
+          <w:insideH w:val="single" w:color="auto" w:sz="4"/>
+          <w:insideV w:val="single" w:color="auto" w:sz="4"/>
+        </w:tblBorders>
+      </w:tblPr>
+      <w:tblGrid>
+        <w:gridCol w:w="1000"/>
+        <w:gridCol w:w="15180"/>
+        <w:gridCol w:w="1500"/>
+      </w:tblGrid>
+      <w:tr>
+        <w:tc>
+          <w:tcPr>
+            <w:tcW w:type="dxa" w:w="1000"/>
+            <w:tcBorders>
+              <w:top w:val="none" w:color="FFFFFF" w:sz="0"/>
+              <w:left w:val="none" w:color="FFFFFF" w:sz="0"/>
+              <w:bottom w:val="none" w:color="FFFFFF" w:sz="0"/>
+              <w:right w:val="none" w:color="FFFFFF" w:sz="0"/>
+            </w:tcBorders>
+            <w:shd w:fill="1F6B5E" w:color="auto" w:val="clear"/>
+            <w:vAlign w:val="center"/>
+          </w:tcPr>
+          <w:p>
+            <w:pPr>
+              <w:jc w:val="center"/>
+            </w:pPr>
+            <w:r>
+              <w:rPr>
+                <w:color w:val="FFFFFF"/>
+                <w:sz w:val="44"/>
+                <w:szCs w:val="44"/>
+                <w:rFonts w:ascii="Arial Narrow" w:cs="Arial Narrow" w:eastAsia="Arial Narrow" w:hAnsi="Arial Narrow"/>
+              </w:rPr>
+              <w:t xml:space="preserve">V</w:t>
+            </w:r>
+          </w:p>
+        </w:tc>
+        <w:tc>
+          <w:tcPr>
+            <w:tcW w:type="dxa" w:w="15180"/>
+            <w:tcBorders>
+              <w:top w:val="none" w:color="FFFFFF" w:sz="0"/>
+              <w:left w:val="none" w:color="FFFFFF" w:sz="0"/>
+              <w:bottom w:val="none" w:color="FFFFFF" w:sz="0"/>
+              <w:right w:val="none" w:color="FFFFFF" w:sz="0"/>
+            </w:tcBorders>
+            <w:vAlign w:val="center"/>
+          </w:tcPr>
+          <w:p>
+            <w:pPr>
+              <w:ind w:left="200"/>
+            </w:pPr>
+            <w:r>
+              <w:rPr>
+                <w:color w:val="1F6B5E"/>
+                <w:sz w:val="56"/>
+                <w:szCs w:val="56"/>
+                <w:rFonts w:ascii="Arial Narrow" w:cs="Arial Narrow" w:eastAsia="Arial Narrow" w:hAnsi="Arial Narrow"/>
+              </w:rPr>
+              <w:t xml:space="preserve">Togo</w:t>
+            </w:r>
+          </w:p>
+        </w:tc>
+        <w:tc>
+          <w:tcPr>
+            <w:tcW w:type="dxa" w:w="1500"/>
+            <w:tcBorders>
+              <w:top w:val="none" w:color="FFFFFF" w:sz="0"/>
+              <w:left w:val="none" w:color="FFFFFF" w:sz="0"/>
+              <w:bottom w:val="none" w:color="FFFFFF" w:sz="0"/>
+              <w:right w:val="none" w:color="FFFFFF" w:sz="0"/>
+            </w:tcBorders>
+            <w:vAlign w:val="center"/>
+          </w:tcPr>
+          <w:tbl>
+            <w:tblPr>
+              <w:tblW w:type="dxa" w:w="1200"/>
+              <w:tblBorders>
+                <w:top w:val="single" w:color="auto" w:sz="4"/>
+                <w:left w:val="single" w:color="auto" w:sz="4"/>
+                <w:bottom w:val="single" w:color="auto" w:sz="4"/>
+                <w:right w:val="single" w:color="auto" w:sz="4"/>
+                <w:insideH w:val="single" w:color="auto" w:sz="4"/>
+                <w:insideV w:val="single" w:color="auto" w:sz="4"/>
+              </w:tblBorders>
+            </w:tblPr>
+            <w:tblGrid>
+              <w:gridCol w:w="1200"/>
+            </w:tblGrid>
+            <w:tr>
+              <w:trPr>
+                <w:trHeight w:val="120" w:hRule="exact"/>
+              </w:trPr>
+              <w:tc>
+                <w:tcPr>
+                  <w:tcW w:type="dxa" w:w="1200"/>
+                  <w:tcBorders>
+                    <w:top w:val="single" w:color="1F2937" w:sz="6"/>
+                    <w:left w:val="single" w:color="1F2937" w:sz="6"/>
+                    <w:bottom w:val="single" w:color="1F2937" w:sz="6"/>
+                    <w:right w:val="single" w:color="1F2937" w:sz="6"/>
+                  </w:tcBorders>
+                  <w:shd w:fill="006A4E" w:color="auto" w:val="clear"/>
+                </w:tcPr>
+                <w:p>
+                  <w:r>
+                    <w:rPr>
+                      <w:color w:val="1F2937"/>
+                      <w:sz w:val="2"/>
+                      <w:szCs w:val="2"/>
+                      <w:rFonts w:ascii="Calibri" w:cs="Calibri" w:eastAsia="Calibri" w:hAnsi="Calibri"/>
+                    </w:rPr>
+                  </w:r>
+                </w:p>
+              </w:tc>
+            </w:tr>
+            <w:tr>
+              <w:trPr>
+                <w:trHeight w:val="120" w:hRule="exact"/>
+              </w:trPr>
+              <w:tc>
+                <w:tcPr>
+                  <w:tcW w:type="dxa" w:w="1200"/>
+                  <w:tcBorders>
+                    <w:top w:val="single" w:color="1F2937" w:sz="6"/>
+                    <w:left w:val="single" w:color="1F2937" w:sz="6"/>
+                    <w:bottom w:val="single" w:color="1F2937" w:sz="6"/>
+                    <w:right w:val="single" w:color="1F2937" w:sz="6"/>
+                  </w:tcBorders>
+                  <w:shd w:fill="FFCE00" w:color="auto" w:val="clear"/>
+                </w:tcPr>
+                <w:p>
+                  <w:r>
+                    <w:rPr>
+                      <w:color w:val="1F2937"/>
+                      <w:sz w:val="2"/>
+                      <w:szCs w:val="2"/>
+                      <w:rFonts w:ascii="Calibri" w:cs="Calibri" w:eastAsia="Calibri" w:hAnsi="Calibri"/>
+                    </w:rPr>
+                  </w:r>
+                </w:p>
+              </w:tc>
+            </w:tr>
+            <w:tr>
+              <w:trPr>
+                <w:trHeight w:val="120" w:hRule="exact"/>
+              </w:trPr>
+              <w:tc>
+                <w:tcPr>
+                  <w:tcW w:type="dxa" w:w="1200"/>
+                  <w:tcBorders>
+                    <w:top w:val="single" w:color="1F2937" w:sz="6"/>
+                    <w:left w:val="single" w:color="1F2937" w:sz="6"/>
+                    <w:bottom w:val="single" w:color="1F2937" w:sz="6"/>
+                    <w:right w:val="single" w:color="1F2937" w:sz="6"/>
+                  </w:tcBorders>
+                  <w:shd w:fill="006A4E" w:color="auto" w:val="clear"/>
+                </w:tcPr>
+                <w:p>
+                  <w:r>
+                    <w:rPr>
+                      <w:color w:val="1F2937"/>
+                      <w:sz w:val="2"/>
+                      <w:szCs w:val="2"/>
+                      <w:rFonts w:ascii="Calibri" w:cs="Calibri" w:eastAsia="Calibri" w:hAnsi="Calibri"/>
+                    </w:rPr>
+                  </w:r>
+                </w:p>
+              </w:tc>
+            </w:tr>
+            <w:tr>
+              <w:trPr>
+                <w:trHeight w:val="120" w:hRule="exact"/>
+              </w:trPr>
+              <w:tc>
+                <w:tcPr>
+                  <w:tcW w:type="dxa" w:w="1200"/>
+                  <w:tcBorders>
+                    <w:top w:val="single" w:color="1F2937" w:sz="6"/>
+                    <w:left w:val="single" w:color="1F2937" w:sz="6"/>
+                    <w:bottom w:val="single" w:color="1F2937" w:sz="6"/>
+                    <w:right w:val="single" w:color="1F2937" w:sz="6"/>
+                  </w:tcBorders>
+                  <w:shd w:fill="FFCE00" w:color="auto" w:val="clear"/>
+                </w:tcPr>
+                <w:p>
+                  <w:r>
+                    <w:rPr>
+                      <w:color w:val="1F2937"/>
+                      <w:sz w:val="2"/>
+                      <w:szCs w:val="2"/>
+                      <w:rFonts w:ascii="Calibri" w:cs="Calibri" w:eastAsia="Calibri" w:hAnsi="Calibri"/>
+                    </w:rPr>
+                  </w:r>
+                </w:p>
+              </w:tc>
+            </w:tr>
+            <w:tr>
+              <w:trPr>
+                <w:trHeight w:val="120" w:hRule="exact"/>
+              </w:trPr>
+              <w:tc>
+                <w:tcPr>
+                  <w:tcW w:type="dxa" w:w="1200"/>
+                  <w:tcBorders>
+                    <w:top w:val="single" w:color="1F2937" w:sz="6"/>
+                    <w:left w:val="single" w:color="1F2937" w:sz="6"/>
+                    <w:bottom w:val="single" w:color="1F2937" w:sz="6"/>
+                    <w:right w:val="single" w:color="1F2937" w:sz="6"/>
+                  </w:tcBorders>
+                  <w:shd w:fill="006A4E" w:color="auto" w:val="clear"/>
+                </w:tcPr>
+                <w:p>
+                  <w:r>
+                    <w:rPr>
+                      <w:color w:val="1F2937"/>
+                      <w:sz w:val="2"/>
+                      <w:szCs w:val="2"/>
+                      <w:rFonts w:ascii="Calibri" w:cs="Calibri" w:eastAsia="Calibri" w:hAnsi="Calibri"/>
+                    </w:rPr>
+                  </w:r>
+                </w:p>
+              </w:tc>
+            </w:tr>
+          </w:tbl>
+          <w:p/>
+        </w:tc>
+      </w:tr>
+    </w:tbl>
+    <w:p>
+      <w:pPr>
+        <w:pBdr>
+          <w:bottom w:val="single" w:color="A3A3A3" w:sz="4" w:space="1"/>
+        </w:pBdr>
+      </w:pPr>
+      <w:r>
+        <w:rPr>
+          <w:color w:val="1F2937"/>
+          <w:sz w:val="12"/>
+          <w:szCs w:val="12"/>
+          <w:rFonts w:ascii="Calibri" w:cs="Calibri" w:eastAsia="Calibri" w:hAnsi="Calibri"/>
+        </w:rPr>
+      </w:r>
+    </w:p>
+    <w:p>
+      <w:pPr>
+        <w:spacing w:before="160"/>
+        <w:ind w:left="360"/>
+      </w:pPr>
+      <w:r>
+        <w:rPr>
+          <w:color w:val="1F6B5E"/>
+          <w:sz w:val="28"/>
+          <w:szCs w:val="28"/>
+          <w:rFonts w:ascii="Calibri" w:cs="Calibri" w:eastAsia="Calibri" w:hAnsi="Calibri"/>
+        </w:rPr>
+        <w:t xml:space="preserve">❑  </w:t>
+      </w:r>
+      <w:r>
+        <w:rPr>
+          <w:b/>
+          <w:bCs/>
+          <w:u w:val="single"/>
+          <w:color w:val="1F6B5E"/>
+          <w:sz w:val="28"/>
+          <w:szCs w:val="28"/>
+          <w:rFonts w:ascii="Calibri" w:cs="Calibri" w:eastAsia="Calibri" w:hAnsi="Calibri"/>
+        </w:rPr>
+        <w:t xml:space="preserve">BUDGET 2027 AU TOGO : 2 684,1 MILLIARDS FCFA PRÉVUS, LES INVESTISSEMENTS CIBLÉS</w:t>
+      </w:r>
+    </w:p>
+    <w:p>
+      <w:pPr>
+        <w:ind w:left="720"/>
+      </w:pPr>
+      <w:r>
+        <w:rPr>
+          <w:color w:val="1F2937"/>
+          <w:sz w:val="26"/>
+          <w:szCs w:val="26"/>
+          <w:rFonts w:ascii="Calibri" w:cs="Calibri" w:eastAsia="Calibri" w:hAnsi="Calibri"/>
+        </w:rPr>
+        <w:t xml:space="preserve">▪  Source : </w:t>
+      </w:r>
+      <w:hyperlink w:history="1" r:id="rIdjze1rnhqxfa5-v2yinqyu">
+        <w:r>
+          <w:rPr>
+            <w:u w:val="single"/>
+            <w:color w:val="1F6B5E"/>
+            <w:sz w:val="26"/>
+            <w:szCs w:val="26"/>
+            <w:rFonts w:ascii="Calibri" w:cs="Calibri" w:eastAsia="Calibri" w:hAnsi="Calibri"/>
+          </w:rPr>
+          <w:t xml:space="preserve">24heureinfo.com</w:t>
+        </w:r>
+      </w:hyperlink>
+      <w:r>
+        <w:rPr>
+          <w:color w:val="1F2937"/>
+          <w:sz w:val="26"/>
+          <w:szCs w:val="26"/>
+          <w:rFonts w:ascii="Calibri" w:cs="Calibri" w:eastAsia="Calibri" w:hAnsi="Calibri"/>
+        </w:rPr>
+        <w:t xml:space="preserve"> — 23 octobre 2026, 9 h UTC</w:t>
+      </w:r>
+    </w:p>
+    <w:p>
+      <w:pPr>
+        <w:spacing w:before="160"/>
+        <w:ind w:left="360"/>
+      </w:pPr>
+      <w:r>
+        <w:rPr>
+          <w:color w:val="1F6B5E"/>
+          <w:sz w:val="28"/>
+          <w:szCs w:val="28"/>
+          <w:rFonts w:ascii="Calibri" w:cs="Calibri" w:eastAsia="Calibri" w:hAnsi="Calibri"/>
+        </w:rPr>
+        <w:t xml:space="preserve">❑  </w:t>
+      </w:r>
+      <w:r>
+        <w:rPr>
+          <w:b/>
+          <w:bCs/>
+          <w:u w:val="single"/>
+          <w:color w:val="1F6B5E"/>
+          <w:sz w:val="28"/>
+          <w:szCs w:val="28"/>
+          <w:rFonts w:ascii="Calibri" w:cs="Calibri" w:eastAsia="Calibri" w:hAnsi="Calibri"/>
+        </w:rPr>
+        <w:t xml:space="preserve">LOMÉ TRAQUE L'ARGENT SALE DE LA CRIMINALITÉ MARITIME</w:t>
+      </w:r>
+    </w:p>
+    <w:p>
+      <w:pPr>
+        <w:ind w:left="720"/>
+      </w:pPr>
+      <w:r>
+        <w:rPr>
+          <w:color w:val="1F2937"/>
+          <w:sz w:val="26"/>
+          <w:szCs w:val="26"/>
+          <w:rFonts w:ascii="Calibri" w:cs="Calibri" w:eastAsia="Calibri" w:hAnsi="Calibri"/>
+        </w:rPr>
+        <w:t xml:space="preserve">▪  Source : </w:t>
+      </w:r>
+      <w:hyperlink w:history="1" r:id="rIdlk5y8llbjuizaio59h2jo">
+        <w:r>
+          <w:rPr>
+            <w:u w:val="single"/>
+            <w:color w:val="1F6B5E"/>
+            <w:sz w:val="26"/>
+            <w:szCs w:val="26"/>
+            <w:rFonts w:ascii="Calibri" w:cs="Calibri" w:eastAsia="Calibri" w:hAnsi="Calibri"/>
+          </w:rPr>
+          <w:t xml:space="preserve">AllAfrica (TG)</w:t>
+        </w:r>
+      </w:hyperlink>
+      <w:r>
+        <w:rPr>
+          <w:color w:val="1F2937"/>
+          <w:sz w:val="26"/>
+          <w:szCs w:val="26"/>
+          <w:rFonts w:ascii="Calibri" w:cs="Calibri" w:eastAsia="Calibri" w:hAnsi="Calibri"/>
+        </w:rPr>
+        <w:t xml:space="preserve"> — 23 octobre 2026, 9 h UTC</w:t>
       </w:r>
     </w:p>
     <w:p>
@@ -3775,63 +6079,17 @@
     <w:p>
       <w:pPr>
         <w:spacing w:before="160"/>
-        <w:ind w:left="360"/>
-      </w:pPr>
-      <w:r>
-        <w:rPr>
-          <w:color w:val="1F6B5E"/>
-          <w:sz w:val="28"/>
-          <w:szCs w:val="28"/>
-          <w:rFonts w:ascii="Calibri" w:cs="Calibri" w:eastAsia="Calibri" w:hAnsi="Calibri"/>
-        </w:rPr>
-        <w:t xml:space="preserve">❑  </w:t>
-      </w:r>
-      <w:r>
-        <w:rPr>
-          <w:b/>
-          <w:bCs/>
-          <w:u w:val="single"/>
-          <w:color w:val="1F6B5E"/>
-          <w:sz w:val="28"/>
-          <w:szCs w:val="28"/>
-          <w:rFonts w:ascii="Calibri" w:cs="Calibri" w:eastAsia="Calibri" w:hAnsi="Calibri"/>
-        </w:rPr>
-        <w:t xml:space="preserve">PORT DE COTONOU : L’ENLÈVEMENT DES MARCHANDISES DÉSORMAIS POSSIBLE LES WEEK-ENDS</w:t>
-      </w:r>
-    </w:p>
-    <w:p>
-      <w:pPr>
-        <w:ind w:left="720"/>
-      </w:pPr>
-      <w:r>
-        <w:rPr>
-          <w:color w:val="1F2937"/>
-          <w:sz w:val="26"/>
-          <w:szCs w:val="26"/>
-          <w:rFonts w:ascii="Calibri" w:cs="Calibri" w:eastAsia="Calibri" w:hAnsi="Calibri"/>
-        </w:rPr>
-        <w:t xml:space="preserve">▪  Source : </w:t>
-      </w:r>
-      <w:hyperlink w:history="1" r:id="rIdura4xfanrg6y0zcldid2f">
-        <w:r>
-          <w:rPr>
-            <w:u w:val="single"/>
-            <w:color w:val="1F6B5E"/>
-            <w:sz w:val="26"/>
-            <w:szCs w:val="26"/>
-            <w:rFonts w:ascii="Calibri" w:cs="Calibri" w:eastAsia="Calibri" w:hAnsi="Calibri"/>
-          </w:rPr>
-          <w:t xml:space="preserve">24heureinfo.com</w:t>
-        </w:r>
-      </w:hyperlink>
-      <w:r>
-        <w:rPr>
-          <w:color w:val="1F2937"/>
-          <w:sz w:val="26"/>
-          <w:szCs w:val="26"/>
-          <w:rFonts w:ascii="Calibri" w:cs="Calibri" w:eastAsia="Calibri" w:hAnsi="Calibri"/>
-        </w:rPr>
-        <w:t xml:space="preserve"> — 22 octobre 2026, 17 h UTC</w:t>
+      </w:pPr>
+      <w:r>
+        <w:rPr>
+          <w:i/>
+          <w:iCs/>
+          <w:color w:val="6B7280"/>
+          <w:sz w:val="24"/>
+          <w:szCs w:val="24"/>
+          <w:rFonts w:ascii="Calibri" w:cs="Calibri" w:eastAsia="Calibri" w:hAnsi="Calibri"/>
+        </w:rPr>
+        <w:t xml:space="preserve">Aucun fait marquant relevé sur la période.</w:t>
       </w:r>
     </w:p>
     <w:p>
@@ -3881,8 +6139,8 @@
             <w:r>
               <w:rPr>
                 <w:color w:val="FFFFFF"/>
-                <w:sz w:val="44"/>
-                <w:szCs w:val="44"/>
+                <w:sz w:val="36"/>
+                <w:szCs w:val="36"/>
                 <w:rFonts w:ascii="Arial Narrow" w:cs="Arial Narrow" w:eastAsia="Arial Narrow" w:hAnsi="Arial Narrow"/>
               </w:rPr>
               <w:t xml:space="preserve">VII</w:t>
@@ -4058,7 +6316,7 @@
           <w:szCs w:val="28"/>
           <w:rFonts w:ascii="Calibri" w:cs="Calibri" w:eastAsia="Calibri" w:hAnsi="Calibri"/>
         </w:rPr>
-        <w:t xml:space="preserve">KINDIA : UNE DISPUTE AUTOUR D’UN SUPPOSÉ RIVAL VIRE AU MEURTRE, LE SUSPECT RACONTE</w:t>
+        <w:t xml:space="preserve">CELLCOM GUINÉE : LA FESATEL ALERTE SUR LES SALAIRES IMPAYÉS ET RÉCLAME L’OUVERTURE URGENTE DE NÉGOCIATIONS</w:t>
       </w:r>
     </w:p>
     <w:p>
@@ -4074,7 +6332,131 @@
         </w:rPr>
         <w:t xml:space="preserve">▪  Source : </w:t>
       </w:r>
-      <w:hyperlink w:history="1" r:id="rIdz7ho4fhyqqylltaqhunfm">
+      <w:hyperlink w:history="1" r:id="rId85riu31gh0otcefqosz4e">
+        <w:r>
+          <w:rPr>
+            <w:u w:val="single"/>
+            <w:color w:val="1F6B5E"/>
+            <w:sz w:val="26"/>
+            <w:szCs w:val="26"/>
+            <w:rFonts w:ascii="Calibri" w:cs="Calibri" w:eastAsia="Calibri" w:hAnsi="Calibri"/>
+          </w:rPr>
+          <w:t xml:space="preserve">Guineematin.com</w:t>
+        </w:r>
+      </w:hyperlink>
+      <w:r>
+        <w:rPr>
+          <w:color w:val="1F2937"/>
+          <w:sz w:val="26"/>
+          <w:szCs w:val="26"/>
+          <w:rFonts w:ascii="Calibri" w:cs="Calibri" w:eastAsia="Calibri" w:hAnsi="Calibri"/>
+        </w:rPr>
+        <w:t xml:space="preserve"> — 23 octobre 2026, 19 h UTC</w:t>
+      </w:r>
+    </w:p>
+    <w:p>
+      <w:pPr>
+        <w:spacing w:before="160"/>
+        <w:ind w:left="360"/>
+      </w:pPr>
+      <w:r>
+        <w:rPr>
+          <w:color w:val="1F6B5E"/>
+          <w:sz w:val="28"/>
+          <w:szCs w:val="28"/>
+          <w:rFonts w:ascii="Calibri" w:cs="Calibri" w:eastAsia="Calibri" w:hAnsi="Calibri"/>
+        </w:rPr>
+        <w:t xml:space="preserve">❑  </w:t>
+      </w:r>
+      <w:r>
+        <w:rPr>
+          <w:b/>
+          <w:bCs/>
+          <w:u w:val="single"/>
+          <w:color w:val="1F6B5E"/>
+          <w:sz w:val="28"/>
+          <w:szCs w:val="28"/>
+          <w:rFonts w:ascii="Calibri" w:cs="Calibri" w:eastAsia="Calibri" w:hAnsi="Calibri"/>
+        </w:rPr>
+        <w:t xml:space="preserve">CONAKRY : TRAQUÉE PAR GPS, UNE MOTO VOLÉE PERMET LE DÉMANTÈLEMENT D’UNE CACHE D’ENGINS SUSPECTS À LAMBANYI</w:t>
+      </w:r>
+    </w:p>
+    <w:p>
+      <w:pPr>
+        <w:ind w:left="720"/>
+      </w:pPr>
+      <w:r>
+        <w:rPr>
+          <w:color w:val="1F2937"/>
+          <w:sz w:val="26"/>
+          <w:szCs w:val="26"/>
+          <w:rFonts w:ascii="Calibri" w:cs="Calibri" w:eastAsia="Calibri" w:hAnsi="Calibri"/>
+        </w:rPr>
+        <w:t xml:space="preserve">▪  Source : </w:t>
+      </w:r>
+      <w:hyperlink w:history="1" r:id="rId7xaqegxyhso7bswdtu9gs">
+        <w:r>
+          <w:rPr>
+            <w:u w:val="single"/>
+            <w:color w:val="1F6B5E"/>
+            <w:sz w:val="26"/>
+            <w:szCs w:val="26"/>
+            <w:rFonts w:ascii="Calibri" w:cs="Calibri" w:eastAsia="Calibri" w:hAnsi="Calibri"/>
+          </w:rPr>
+          <w:t xml:space="preserve">Guineematin.com</w:t>
+        </w:r>
+      </w:hyperlink>
+      <w:r>
+        <w:rPr>
+          <w:color w:val="1F2937"/>
+          <w:sz w:val="26"/>
+          <w:szCs w:val="26"/>
+          <w:rFonts w:ascii="Calibri" w:cs="Calibri" w:eastAsia="Calibri" w:hAnsi="Calibri"/>
+        </w:rPr>
+        <w:t xml:space="preserve"> — 23 octobre 2026, 18 h UTC</w:t>
+      </w:r>
+    </w:p>
+    <w:p>
+      <w:pPr>
+        <w:spacing w:before="160"/>
+        <w:ind w:left="360"/>
+      </w:pPr>
+      <w:r>
+        <w:rPr>
+          <w:color w:val="1F6B5E"/>
+          <w:sz w:val="28"/>
+          <w:szCs w:val="28"/>
+          <w:rFonts w:ascii="Calibri" w:cs="Calibri" w:eastAsia="Calibri" w:hAnsi="Calibri"/>
+        </w:rPr>
+        <w:t xml:space="preserve">❑  </w:t>
+      </w:r>
+      <w:r>
+        <w:rPr>
+          <w:b/>
+          <w:bCs/>
+          <w:u w:val="single"/>
+          <w:color w:val="1F6B5E"/>
+          <w:sz w:val="28"/>
+          <w:szCs w:val="28"/>
+          <w:rFonts w:ascii="Calibri" w:cs="Calibri" w:eastAsia="Calibri" w:hAnsi="Calibri"/>
+        </w:rPr>
+        <w:t xml:space="preserve">« RIP » SUR SES PHOTOS : PATHÉ MOLOKO RÉAPPARAÎT ET LIVRE UN MESSAGE</w:t>
+      </w:r>
+    </w:p>
+    <w:p>
+      <w:pPr>
+        <w:ind w:left="720"/>
+      </w:pPr>
+      <w:r>
+        <w:rPr>
+          <w:color w:val="1F2937"/>
+          <w:sz w:val="26"/>
+          <w:szCs w:val="26"/>
+          <w:rFonts w:ascii="Calibri" w:cs="Calibri" w:eastAsia="Calibri" w:hAnsi="Calibri"/>
+        </w:rPr>
+        <w:t xml:space="preserve">▪  Source : </w:t>
+      </w:r>
+      <w:hyperlink w:history="1" r:id="rIdqsyqoyl8x6akncqxrlkem">
         <w:r>
           <w:rPr>
             <w:u w:val="single"/>
@@ -4093,7 +6475,7 @@
           <w:szCs w:val="26"/>
           <w:rFonts w:ascii="Calibri" w:cs="Calibri" w:eastAsia="Calibri" w:hAnsi="Calibri"/>
         </w:rPr>
-        <w:t xml:space="preserve"> — 22 octobre 2026, 11 h UTC</w:t>
+        <w:t xml:space="preserve"> — 23 octobre 2026, 12 h UTC</w:t>
       </w:r>
     </w:p>
     <w:p>
@@ -4120,7 +6502,7 @@
           <w:szCs w:val="28"/>
           <w:rFonts w:ascii="Calibri" w:cs="Calibri" w:eastAsia="Calibri" w:hAnsi="Calibri"/>
         </w:rPr>
-        <w:t xml:space="preserve">TÉLIMÉLÉ : LE PRÉFET MOBILISE LES CADRES AUTOUR DE LA SÉCURITÉ ET DE LA GESTION DES BIENS PUBLICS</w:t>
+        <w:t xml:space="preserve">MARCHÉ DE MATOTO : MOHAMED SOUMAH LIBÉRÉ, LES COMMERÇANTS TOUJOURS SOUS PRESSION</w:t>
       </w:r>
     </w:p>
     <w:p>
@@ -4136,7 +6518,7 @@
         </w:rPr>
         <w:t xml:space="preserve">▪  Source : </w:t>
       </w:r>
-      <w:hyperlink w:history="1" r:id="rIdwnhbnf1mfq9fhu1meqcwe">
+      <w:hyperlink w:history="1" r:id="rId7myxcznsgr7xrrxjokyuj">
         <w:r>
           <w:rPr>
             <w:u w:val="single"/>
@@ -4145,7 +6527,7 @@
             <w:szCs w:val="26"/>
             <w:rFonts w:ascii="Calibri" w:cs="Calibri" w:eastAsia="Calibri" w:hAnsi="Calibri"/>
           </w:rPr>
-          <w:t xml:space="preserve">Guineematin.com</w:t>
+          <w:t xml:space="preserve">Guinee7.com</w:t>
         </w:r>
       </w:hyperlink>
       <w:r>
@@ -4155,7 +6537,7 @@
           <w:szCs w:val="26"/>
           <w:rFonts w:ascii="Calibri" w:cs="Calibri" w:eastAsia="Calibri" w:hAnsi="Calibri"/>
         </w:rPr>
-        <w:t xml:space="preserve"> — 23 octobre 2026, 6 h UTC</w:t>
+        <w:t xml:space="preserve"> — 23 octobre 2026, 10 h UTC</w:t>
       </w:r>
     </w:p>
     <w:p>
@@ -4198,7 +6580,7 @@
         </w:rPr>
         <w:t xml:space="preserve">▪  Source : </w:t>
       </w:r>
-      <w:hyperlink w:history="1" r:id="rIdvtib8csofgrhir93anidf">
+      <w:hyperlink w:history="1" r:id="rIdu85wgsjawwprfaikjt4cq">
         <w:r>
           <w:rPr>
             <w:u w:val="single"/>
@@ -4218,68 +6600,6 @@
           <w:rFonts w:ascii="Calibri" w:cs="Calibri" w:eastAsia="Calibri" w:hAnsi="Calibri"/>
         </w:rPr>
         <w:t xml:space="preserve"> — 22 octobre 2026, 17 h UTC</w:t>
-      </w:r>
-    </w:p>
-    <w:p>
-      <w:pPr>
-        <w:spacing w:before="160"/>
-        <w:ind w:left="360"/>
-      </w:pPr>
-      <w:r>
-        <w:rPr>
-          <w:color w:val="1F6B5E"/>
-          <w:sz w:val="28"/>
-          <w:szCs w:val="28"/>
-          <w:rFonts w:ascii="Calibri" w:cs="Calibri" w:eastAsia="Calibri" w:hAnsi="Calibri"/>
-        </w:rPr>
-        <w:t xml:space="preserve">❑  </w:t>
-      </w:r>
-      <w:r>
-        <w:rPr>
-          <w:b/>
-          <w:bCs/>
-          <w:u w:val="single"/>
-          <w:color w:val="1F6B5E"/>
-          <w:sz w:val="28"/>
-          <w:szCs w:val="28"/>
-          <w:rFonts w:ascii="Calibri" w:cs="Calibri" w:eastAsia="Calibri" w:hAnsi="Calibri"/>
-        </w:rPr>
-        <w:t xml:space="preserve">CRIEF : MAMADOU SALIOU DIAKITÉ SUCCÈDE À FRANCIS KOVA ZOUMANIGUI AU POSTE DE PRÉSIDENT</w:t>
-      </w:r>
-    </w:p>
-    <w:p>
-      <w:pPr>
-        <w:ind w:left="720"/>
-      </w:pPr>
-      <w:r>
-        <w:rPr>
-          <w:color w:val="1F2937"/>
-          <w:sz w:val="26"/>
-          <w:szCs w:val="26"/>
-          <w:rFonts w:ascii="Calibri" w:cs="Calibri" w:eastAsia="Calibri" w:hAnsi="Calibri"/>
-        </w:rPr>
-        <w:t xml:space="preserve">▪  Source : </w:t>
-      </w:r>
-      <w:hyperlink w:history="1" r:id="rIdhtdwp9zfuljxuhdgsyt9c">
-        <w:r>
-          <w:rPr>
-            <w:u w:val="single"/>
-            <w:color w:val="1F6B5E"/>
-            <w:sz w:val="26"/>
-            <w:szCs w:val="26"/>
-            <w:rFonts w:ascii="Calibri" w:cs="Calibri" w:eastAsia="Calibri" w:hAnsi="Calibri"/>
-          </w:rPr>
-          <w:t xml:space="preserve">Guineelive</w:t>
-        </w:r>
-      </w:hyperlink>
-      <w:r>
-        <w:rPr>
-          <w:color w:val="1F2937"/>
-          <w:sz w:val="26"/>
-          <w:szCs w:val="26"/>
-          <w:rFonts w:ascii="Calibri" w:cs="Calibri" w:eastAsia="Calibri" w:hAnsi="Calibri"/>
-        </w:rPr>
-        <w:t xml:space="preserve"> — 22 octobre 2026, 0 h UTC</w:t>
       </w:r>
     </w:p>
     <w:p>
@@ -4329,8 +6649,8 @@
             <w:r>
               <w:rPr>
                 <w:color w:val="FFFFFF"/>
-                <w:sz w:val="44"/>
-                <w:szCs w:val="44"/>
+                <w:sz w:val="28"/>
+                <w:szCs w:val="28"/>
                 <w:rFonts w:ascii="Arial Narrow" w:cs="Arial Narrow" w:eastAsia="Arial Narrow" w:hAnsi="Arial Narrow"/>
               </w:rPr>
               <w:t xml:space="preserve">VIII</w:t>
@@ -4568,7 +6888,7 @@
           <w:szCs w:val="28"/>
           <w:rFonts w:ascii="Calibri" w:cs="Calibri" w:eastAsia="Calibri" w:hAnsi="Calibri"/>
         </w:rPr>
-        <w:t xml:space="preserve">LIBERIA: WAR VICTIMS, SURVIVORS PROTEST AT COURT OFFICE, CAPITOL AS HOUSE CHAIRMAN PLEDGES TO PUT COURT BILL BEFORE PLENARY TUESDAY.</w:t>
+        <w:t xml:space="preserve">LIBERIA: JUDGE CITES EVIDENCE IN FINDING NSA STAFF PETER BON JALLAH GUILTY OF STATUTORY RAPE, KIDNAPPING</w:t>
       </w:r>
     </w:p>
     <w:p>
@@ -4584,7 +6904,7 @@
         </w:rPr>
         <w:t xml:space="preserve">▪  Source : </w:t>
       </w:r>
-      <w:hyperlink w:history="1" r:id="rIdvoyfpmzaihxmsvxbqmoup">
+      <w:hyperlink w:history="1" r:id="rIddrwccuzvkle8c-dqow69z">
         <w:r>
           <w:rPr>
             <w:u w:val="single"/>
@@ -4603,7 +6923,7 @@
           <w:szCs w:val="26"/>
           <w:rFonts w:ascii="Calibri" w:cs="Calibri" w:eastAsia="Calibri" w:hAnsi="Calibri"/>
         </w:rPr>
-        <w:t xml:space="preserve"> — 23 octobre 2026, 5 h UTC</w:t>
+        <w:t xml:space="preserve"> — 23 octobre 2026, 15 h UTC</w:t>
       </w:r>
     </w:p>
     <w:p>
@@ -4630,6 +6950,130 @@
           <w:szCs w:val="28"/>
           <w:rFonts w:ascii="Calibri" w:cs="Calibri" w:eastAsia="Calibri" w:hAnsi="Calibri"/>
         </w:rPr>
+        <w:t xml:space="preserve">LIBERIA: COURT FINDS PETER BON JALLAH GUILTY OF STATUTORY RAPE, KIDNAPPING</w:t>
+      </w:r>
+    </w:p>
+    <w:p>
+      <w:pPr>
+        <w:ind w:left="720"/>
+      </w:pPr>
+      <w:r>
+        <w:rPr>
+          <w:color w:val="1F2937"/>
+          <w:sz w:val="26"/>
+          <w:szCs w:val="26"/>
+          <w:rFonts w:ascii="Calibri" w:cs="Calibri" w:eastAsia="Calibri" w:hAnsi="Calibri"/>
+        </w:rPr>
+        <w:t xml:space="preserve">▪  Source : </w:t>
+      </w:r>
+      <w:hyperlink w:history="1" r:id="rIduf-xmsfib-_bfn4kbulln">
+        <w:r>
+          <w:rPr>
+            <w:u w:val="single"/>
+            <w:color w:val="1F6B5E"/>
+            <w:sz w:val="26"/>
+            <w:szCs w:val="26"/>
+            <w:rFonts w:ascii="Calibri" w:cs="Calibri" w:eastAsia="Calibri" w:hAnsi="Calibri"/>
+          </w:rPr>
+          <w:t xml:space="preserve">FrontPageAfrica — Liberia</w:t>
+        </w:r>
+      </w:hyperlink>
+      <w:r>
+        <w:rPr>
+          <w:color w:val="1F2937"/>
+          <w:sz w:val="26"/>
+          <w:szCs w:val="26"/>
+          <w:rFonts w:ascii="Calibri" w:cs="Calibri" w:eastAsia="Calibri" w:hAnsi="Calibri"/>
+        </w:rPr>
+        <w:t xml:space="preserve"> — 23 octobre 2026, 11 h UTC</w:t>
+      </w:r>
+    </w:p>
+    <w:p>
+      <w:pPr>
+        <w:spacing w:before="160"/>
+        <w:ind w:left="360"/>
+      </w:pPr>
+      <w:r>
+        <w:rPr>
+          <w:color w:val="1F6B5E"/>
+          <w:sz w:val="28"/>
+          <w:szCs w:val="28"/>
+          <w:rFonts w:ascii="Calibri" w:cs="Calibri" w:eastAsia="Calibri" w:hAnsi="Calibri"/>
+        </w:rPr>
+        <w:t xml:space="preserve">❑  </w:t>
+      </w:r>
+      <w:r>
+        <w:rPr>
+          <w:b/>
+          <w:bCs/>
+          <w:u w:val="single"/>
+          <w:color w:val="1F6B5E"/>
+          <w:sz w:val="28"/>
+          <w:szCs w:val="28"/>
+          <w:rFonts w:ascii="Calibri" w:cs="Calibri" w:eastAsia="Calibri" w:hAnsi="Calibri"/>
+        </w:rPr>
+        <w:t xml:space="preserve">LIBERIA: WAR VICTIMS, SURVIVORS PROTEST AT COURT OFFICE, CAPITOL AS HOUSE CHAIRMAN PLEDGES TO PUT COURT BILL BEFORE PLENARY TUESDAY</w:t>
+      </w:r>
+    </w:p>
+    <w:p>
+      <w:pPr>
+        <w:ind w:left="720"/>
+      </w:pPr>
+      <w:r>
+        <w:rPr>
+          <w:color w:val="1F2937"/>
+          <w:sz w:val="26"/>
+          <w:szCs w:val="26"/>
+          <w:rFonts w:ascii="Calibri" w:cs="Calibri" w:eastAsia="Calibri" w:hAnsi="Calibri"/>
+        </w:rPr>
+        <w:t xml:space="preserve">▪  Source : </w:t>
+      </w:r>
+      <w:hyperlink w:history="1" r:id="rId0dhc49v5hr8_92pdfxxxa">
+        <w:r>
+          <w:rPr>
+            <w:u w:val="single"/>
+            <w:color w:val="1F6B5E"/>
+            <w:sz w:val="26"/>
+            <w:szCs w:val="26"/>
+            <w:rFonts w:ascii="Calibri" w:cs="Calibri" w:eastAsia="Calibri" w:hAnsi="Calibri"/>
+          </w:rPr>
+          <w:t xml:space="preserve">FrontPageAfrica — Liberia</w:t>
+        </w:r>
+      </w:hyperlink>
+      <w:r>
+        <w:rPr>
+          <w:color w:val="1F2937"/>
+          <w:sz w:val="26"/>
+          <w:szCs w:val="26"/>
+          <w:rFonts w:ascii="Calibri" w:cs="Calibri" w:eastAsia="Calibri" w:hAnsi="Calibri"/>
+        </w:rPr>
+        <w:t xml:space="preserve"> — 23 octobre 2026, 5 h UTC</w:t>
+      </w:r>
+    </w:p>
+    <w:p>
+      <w:pPr>
+        <w:spacing w:before="160"/>
+        <w:ind w:left="360"/>
+      </w:pPr>
+      <w:r>
+        <w:rPr>
+          <w:color w:val="1F6B5E"/>
+          <w:sz w:val="28"/>
+          <w:szCs w:val="28"/>
+          <w:rFonts w:ascii="Calibri" w:cs="Calibri" w:eastAsia="Calibri" w:hAnsi="Calibri"/>
+        </w:rPr>
+        <w:t xml:space="preserve">❑  </w:t>
+      </w:r>
+      <w:r>
+        <w:rPr>
+          <w:b/>
+          <w:bCs/>
+          <w:u w:val="single"/>
+          <w:color w:val="1F6B5E"/>
+          <w:sz w:val="28"/>
+          <w:szCs w:val="28"/>
+          <w:rFonts w:ascii="Calibri" w:cs="Calibri" w:eastAsia="Calibri" w:hAnsi="Calibri"/>
+        </w:rPr>
         <w:t xml:space="preserve">AFL FIRES TWO SOLDIERS OVER ASSAULT</w:t>
       </w:r>
     </w:p>
@@ -4646,7 +7090,7 @@
         </w:rPr>
         <w:t xml:space="preserve">▪  Source : </w:t>
       </w:r>
-      <w:hyperlink w:history="1" r:id="rIdkxheeimqjrt6vt_o_bybi">
+      <w:hyperlink w:history="1" r:id="rIdvr4mcvemdtlsogjhtavud">
         <w:r>
           <w:rPr>
             <w:u w:val="single"/>
@@ -4892,7 +7336,7 @@
           <w:szCs w:val="28"/>
           <w:rFonts w:ascii="Calibri" w:cs="Calibri" w:eastAsia="Calibri" w:hAnsi="Calibri"/>
         </w:rPr>
-        <w:t xml:space="preserve">MAMADOU GUÈYE ANCIEN DIRECTEUR DES DOMAINES RESTE LIBRE : COUP D'ARRÊT DE LA COUR SUPRÊME AU RECOURS CONTRE SA LIBERTÉ PROVISOIRE</w:t>
+        <w:t xml:space="preserve">ATTAQUE À TRAPPES ET À LA VERRIÈRE : QUI EST KÉVIN T., LE SUSPECT AUTEUR DE LA FUSILLADE ?</w:t>
       </w:r>
     </w:p>
     <w:p>
@@ -4908,7 +7352,7 @@
         </w:rPr>
         <w:t xml:space="preserve">▪  Source : </w:t>
       </w:r>
-      <w:hyperlink w:history="1" r:id="rIdzuqwiw9kwtny8zdlp-isl">
+      <w:hyperlink w:history="1" r:id="rIduaeustfe9e9n5vjsokhzv">
         <w:r>
           <w:rPr>
             <w:u w:val="single"/>
@@ -4917,7 +7361,7 @@
             <w:szCs w:val="26"/>
             <w:rFonts w:ascii="Calibri" w:cs="Calibri" w:eastAsia="Calibri" w:hAnsi="Calibri"/>
           </w:rPr>
-          <w:t xml:space="preserve">Dakar Actu</w:t>
+          <w:t xml:space="preserve">Seneweb</w:t>
         </w:r>
       </w:hyperlink>
       <w:r>
@@ -4927,7 +7371,7 @@
           <w:szCs w:val="26"/>
           <w:rFonts w:ascii="Calibri" w:cs="Calibri" w:eastAsia="Calibri" w:hAnsi="Calibri"/>
         </w:rPr>
-        <w:t xml:space="preserve"> — 22 octobre 2026, 19 h UTC</w:t>
+        <w:t xml:space="preserve"> — 24 octobre 2026, 0 h UTC</w:t>
       </w:r>
     </w:p>
     <w:p>
@@ -4954,6 +7398,68 @@
           <w:szCs w:val="28"/>
           <w:rFonts w:ascii="Calibri" w:cs="Calibri" w:eastAsia="Calibri" w:hAnsi="Calibri"/>
         </w:rPr>
+        <w:t xml:space="preserve">EBOLA AU NIGERIA, GRÈVE AU SÉNÉGAL, FRAPPE SUR UN MARCHÉ AU SOUDAN : L'HEBDO AFRIQUE</w:t>
+      </w:r>
+    </w:p>
+    <w:p>
+      <w:pPr>
+        <w:ind w:left="720"/>
+      </w:pPr>
+      <w:r>
+        <w:rPr>
+          <w:color w:val="1F2937"/>
+          <w:sz w:val="26"/>
+          <w:szCs w:val="26"/>
+          <w:rFonts w:ascii="Calibri" w:cs="Calibri" w:eastAsia="Calibri" w:hAnsi="Calibri"/>
+        </w:rPr>
+        <w:t xml:space="preserve">▪  Source : </w:t>
+      </w:r>
+      <w:hyperlink w:history="1" r:id="rId1syvom5e5zatsd2sxzz2w">
+        <w:r>
+          <w:rPr>
+            <w:u w:val="single"/>
+            <w:color w:val="1F6B5E"/>
+            <w:sz w:val="26"/>
+            <w:szCs w:val="26"/>
+            <w:rFonts w:ascii="Calibri" w:cs="Calibri" w:eastAsia="Calibri" w:hAnsi="Calibri"/>
+          </w:rPr>
+          <w:t xml:space="preserve">France 24</w:t>
+        </w:r>
+      </w:hyperlink>
+      <w:r>
+        <w:rPr>
+          <w:color w:val="1F2937"/>
+          <w:sz w:val="26"/>
+          <w:szCs w:val="26"/>
+          <w:rFonts w:ascii="Calibri" w:cs="Calibri" w:eastAsia="Calibri" w:hAnsi="Calibri"/>
+        </w:rPr>
+        <w:t xml:space="preserve"> — 23 octobre 2026, 9 h UTC</w:t>
+      </w:r>
+    </w:p>
+    <w:p>
+      <w:pPr>
+        <w:spacing w:before="160"/>
+        <w:ind w:left="360"/>
+      </w:pPr>
+      <w:r>
+        <w:rPr>
+          <w:color w:val="1F6B5E"/>
+          <w:sz w:val="28"/>
+          <w:szCs w:val="28"/>
+          <w:rFonts w:ascii="Calibri" w:cs="Calibri" w:eastAsia="Calibri" w:hAnsi="Calibri"/>
+        </w:rPr>
+        <w:t xml:space="preserve">❑  </w:t>
+      </w:r>
+      <w:r>
+        <w:rPr>
+          <w:b/>
+          <w:bCs/>
+          <w:u w:val="single"/>
+          <w:color w:val="1F6B5E"/>
+          <w:sz w:val="28"/>
+          <w:szCs w:val="28"/>
+          <w:rFonts w:ascii="Calibri" w:cs="Calibri" w:eastAsia="Calibri" w:hAnsi="Calibri"/>
+        </w:rPr>
         <w:t xml:space="preserve">SÉNÉGAL: 14 MORTS ET 368 CAS DE DIPHTÉRIE DANS 13 RÉGIONS</w:t>
       </w:r>
     </w:p>
@@ -4970,7 +7476,7 @@
         </w:rPr>
         <w:t xml:space="preserve">▪  Source : </w:t>
       </w:r>
-      <w:hyperlink w:history="1" r:id="rIdzajcy4eghkh7bgfwdxkt2">
+      <w:hyperlink w:history="1" r:id="rIdks-ovfktz7_y4ihgzpsxe">
         <w:r>
           <w:rPr>
             <w:u w:val="single"/>
@@ -5016,7 +7522,7 @@
           <w:szCs w:val="28"/>
           <w:rFonts w:ascii="Calibri" w:cs="Calibri" w:eastAsia="Calibri" w:hAnsi="Calibri"/>
         </w:rPr>
-        <w:t xml:space="preserve">EN GARDE À VUE : L’AVOCAT DE DIODIO GLOW SKIN ALERTE SUR SON ÉTAT DE SANTÉ</w:t>
+        <w:t xml:space="preserve">SIX MORTS DANS UNE COLLISION ENTRE UN CAMION ET UN MINICAR À NDANDE</w:t>
       </w:r>
     </w:p>
     <w:p>
@@ -5032,7 +7538,7 @@
         </w:rPr>
         <w:t xml:space="preserve">▪  Source : </w:t>
       </w:r>
-      <w:hyperlink w:history="1" r:id="rIdbbaor8tadlddd_n5khuft">
+      <w:hyperlink w:history="1" r:id="rIdphx3qum07uvcaqublweb4">
         <w:r>
           <w:rPr>
             <w:u w:val="single"/>
@@ -5041,7 +7547,7 @@
             <w:szCs w:val="26"/>
             <w:rFonts w:ascii="Calibri" w:cs="Calibri" w:eastAsia="Calibri" w:hAnsi="Calibri"/>
           </w:rPr>
-          <w:t xml:space="preserve">Seneweb</w:t>
+          <w:t xml:space="preserve">APS — Agence Sénégalaise Presse</w:t>
         </w:r>
       </w:hyperlink>
       <w:r>
@@ -5051,7 +7557,7 @@
           <w:szCs w:val="26"/>
           <w:rFonts w:ascii="Calibri" w:cs="Calibri" w:eastAsia="Calibri" w:hAnsi="Calibri"/>
         </w:rPr>
-        <w:t xml:space="preserve"> — 23 octobre 2026, 0 h UTC</w:t>
+        <w:t xml:space="preserve"> — 23 octobre 2026, 23 h UTC</w:t>
       </w:r>
     </w:p>
     <w:p>
@@ -5078,7 +7584,7 @@
           <w:szCs w:val="28"/>
           <w:rFonts w:ascii="Calibri" w:cs="Calibri" w:eastAsia="Calibri" w:hAnsi="Calibri"/>
         </w:rPr>
-        <w:t xml:space="preserve">ALERTE AUX UTILISATEURS : VOICI LA NOUVELLE VAGUE DE TENTATIVES D’ARNAQUES SUR LA MESSAGERIE WHATSAPP</w:t>
+        <w:t xml:space="preserve">CRISE DU LOGEMENT AU SÉNÉGAL : 500 000 LOGEMENTS MANQUANTS, L’ÉTAT DÉVOILE SA STRATÉGIE</w:t>
       </w:r>
     </w:p>
     <w:p>
@@ -5094,7 +7600,7 @@
         </w:rPr>
         <w:t xml:space="preserve">▪  Source : </w:t>
       </w:r>
-      <w:hyperlink w:history="1" r:id="rIdhi14ahhwyotvjdvep9tgb">
+      <w:hyperlink w:history="1" r:id="rIdemerluf3gvjtlzlzueqyh">
         <w:r>
           <w:rPr>
             <w:u w:val="single"/>
@@ -5113,69 +7619,7 @@
           <w:szCs w:val="26"/>
           <w:rFonts w:ascii="Calibri" w:cs="Calibri" w:eastAsia="Calibri" w:hAnsi="Calibri"/>
         </w:rPr>
-        <w:t xml:space="preserve"> — 22 octobre 2026, 21 h UTC</w:t>
-      </w:r>
-    </w:p>
-    <w:p>
-      <w:pPr>
-        <w:spacing w:before="160"/>
-        <w:ind w:left="360"/>
-      </w:pPr>
-      <w:r>
-        <w:rPr>
-          <w:color w:val="1F6B5E"/>
-          <w:sz w:val="28"/>
-          <w:szCs w:val="28"/>
-          <w:rFonts w:ascii="Calibri" w:cs="Calibri" w:eastAsia="Calibri" w:hAnsi="Calibri"/>
-        </w:rPr>
-        <w:t xml:space="preserve">❑  </w:t>
-      </w:r>
-      <w:r>
-        <w:rPr>
-          <w:b/>
-          <w:bCs/>
-          <w:u w:val="single"/>
-          <w:color w:val="1F6B5E"/>
-          <w:sz w:val="28"/>
-          <w:szCs w:val="28"/>
-          <w:rFonts w:ascii="Calibri" w:cs="Calibri" w:eastAsia="Calibri" w:hAnsi="Calibri"/>
-        </w:rPr>
-        <w:t xml:space="preserve">MBOUR : «J’AI L’HABITUDE DE COUCHER AVEC LES FEMMES DE MES FRÈRES»</w:t>
-      </w:r>
-    </w:p>
-    <w:p>
-      <w:pPr>
-        <w:ind w:left="720"/>
-      </w:pPr>
-      <w:r>
-        <w:rPr>
-          <w:color w:val="1F2937"/>
-          <w:sz w:val="26"/>
-          <w:szCs w:val="26"/>
-          <w:rFonts w:ascii="Calibri" w:cs="Calibri" w:eastAsia="Calibri" w:hAnsi="Calibri"/>
-        </w:rPr>
-        <w:t xml:space="preserve">▪  Source : </w:t>
-      </w:r>
-      <w:hyperlink w:history="1" r:id="rIdyxdtde8axsv_iukscztum">
-        <w:r>
-          <w:rPr>
-            <w:u w:val="single"/>
-            <w:color w:val="1F6B5E"/>
-            <w:sz w:val="26"/>
-            <w:szCs w:val="26"/>
-            <w:rFonts w:ascii="Calibri" w:cs="Calibri" w:eastAsia="Calibri" w:hAnsi="Calibri"/>
-          </w:rPr>
-          <w:t xml:space="preserve">Seneweb</w:t>
-        </w:r>
-      </w:hyperlink>
-      <w:r>
-        <w:rPr>
-          <w:color w:val="1F2937"/>
-          <w:sz w:val="26"/>
-          <w:szCs w:val="26"/>
-          <w:rFonts w:ascii="Calibri" w:cs="Calibri" w:eastAsia="Calibri" w:hAnsi="Calibri"/>
-        </w:rPr>
-        <w:t xml:space="preserve"> — 23 octobre 2026, 5 h UTC</w:t>
+        <w:t xml:space="preserve"> — 23 octobre 2026, 21 h UTC</w:t>
       </w:r>
     </w:p>
     <w:p>
@@ -5402,7 +7846,7 @@
           <w:szCs w:val="28"/>
           <w:rFonts w:ascii="Calibri" w:cs="Calibri" w:eastAsia="Calibri" w:hAnsi="Calibri"/>
         </w:rPr>
-        <w:t xml:space="preserve">CROUS SINE SALOUM - LES SYNDICALISTES DÉNONCENT LE RECOURS À LA RÉQUISITION !</w:t>
+        <w:t xml:space="preserve">GRÈVE GÉNÉRALE : LE FSDT REVENDIQUE UNE FORTE MOBILISATION AU TROISIÈME JOUR DU MOUVEMENT</w:t>
       </w:r>
     </w:p>
     <w:p>
@@ -5418,7 +7862,7 @@
         </w:rPr>
         <w:t xml:space="preserve">▪  Source : </w:t>
       </w:r>
-      <w:hyperlink w:history="1" r:id="rIdfubacj94u9mbqyl1ezdg3">
+      <w:hyperlink w:history="1" r:id="rIdmtbttjq1zm6fdclddvfys">
         <w:r>
           <w:rPr>
             <w:u w:val="single"/>
@@ -5427,7 +7871,7 @@
             <w:szCs w:val="26"/>
             <w:rFonts w:ascii="Calibri" w:cs="Calibri" w:eastAsia="Calibri" w:hAnsi="Calibri"/>
           </w:rPr>
-          <w:t xml:space="preserve">AllAfrica (SN)</w:t>
+          <w:t xml:space="preserve">Pressafrik</w:t>
         </w:r>
       </w:hyperlink>
       <w:r>
@@ -5437,7 +7881,7 @@
           <w:szCs w:val="26"/>
           <w:rFonts w:ascii="Calibri" w:cs="Calibri" w:eastAsia="Calibri" w:hAnsi="Calibri"/>
         </w:rPr>
-        <w:t xml:space="preserve"> — 22 octobre 2026, 22 h UTC</w:t>
+        <w:t xml:space="preserve"> — 23 octobre 2026, 21 h UTC</w:t>
       </w:r>
     </w:p>
     <w:p>
@@ -5464,7 +7908,7 @@
           <w:szCs w:val="28"/>
           <w:rFonts w:ascii="Calibri" w:cs="Calibri" w:eastAsia="Calibri" w:hAnsi="Calibri"/>
         </w:rPr>
-        <w:t xml:space="preserve">DÉBAT TÉLÉVISÉ SUR LA LFR : LA RÉPONSE DU PREMIER MINISTRE AL AMINOU LO À OUSMANE SONKO</w:t>
+        <w:t xml:space="preserve">3E JOUR DE GRÈVE : LE FSDT SE FÉLICITE D'UNE MOBILISATION MASSIVE</w:t>
       </w:r>
     </w:p>
     <w:p>
@@ -5480,7 +7924,7 @@
         </w:rPr>
         <w:t xml:space="preserve">▪  Source : </w:t>
       </w:r>
-      <w:hyperlink w:history="1" r:id="rIdcdskkdh_qflzv5x4yggq6">
+      <w:hyperlink w:history="1" r:id="rIdk_-jzm1s2l6pzpnbbyedl">
         <w:r>
           <w:rPr>
             <w:u w:val="single"/>
@@ -5489,7 +7933,7 @@
             <w:szCs w:val="26"/>
             <w:rFonts w:ascii="Calibri" w:cs="Calibri" w:eastAsia="Calibri" w:hAnsi="Calibri"/>
           </w:rPr>
-          <w:t xml:space="preserve">SeneNews</w:t>
+          <w:t xml:space="preserve">Seneweb</w:t>
         </w:r>
       </w:hyperlink>
       <w:r>
@@ -5499,7 +7943,7 @@
           <w:szCs w:val="26"/>
           <w:rFonts w:ascii="Calibri" w:cs="Calibri" w:eastAsia="Calibri" w:hAnsi="Calibri"/>
         </w:rPr>
-        <w:t xml:space="preserve"> — 22 octobre 2026, 21 h UTC</w:t>
+        <w:t xml:space="preserve"> — 23 octobre 2026, 21 h UTC</w:t>
       </w:r>
     </w:p>
     <w:p>
@@ -5526,7 +7970,7 @@
           <w:szCs w:val="28"/>
           <w:rFonts w:ascii="Calibri" w:cs="Calibri" w:eastAsia="Calibri" w:hAnsi="Calibri"/>
         </w:rPr>
-        <w:t xml:space="preserve">SENEGALESE WORKERS MARCH AGAINST RISING LIVING COSTS AHEAD OF GENERAL STRIKE</w:t>
+        <w:t xml:space="preserve">🔴EN DIRECT - "KADDU LAMB" : SPÉCIAL COMBAT AMA BALDÉ VS LAC 2 - EUMEU SÈNE VS JACKSON</w:t>
       </w:r>
     </w:p>
     <w:p>
@@ -5542,7 +7986,7 @@
         </w:rPr>
         <w:t xml:space="preserve">▪  Source : </w:t>
       </w:r>
-      <w:hyperlink w:history="1" r:id="rIdrgvpsrdyv-usonmkjkox8">
+      <w:hyperlink w:history="1" r:id="rId-mq6c7m5nyjcw3h5el3gm">
         <w:r>
           <w:rPr>
             <w:u w:val="single"/>
@@ -5551,7 +7995,7 @@
             <w:szCs w:val="26"/>
             <w:rFonts w:ascii="Calibri" w:cs="Calibri" w:eastAsia="Calibri" w:hAnsi="Calibri"/>
           </w:rPr>
-          <w:t xml:space="preserve">Gambia News - The Point</w:t>
+          <w:t xml:space="preserve">Pressafrik</w:t>
         </w:r>
       </w:hyperlink>
       <w:r>
@@ -5561,7 +8005,131 @@
           <w:szCs w:val="26"/>
           <w:rFonts w:ascii="Calibri" w:cs="Calibri" w:eastAsia="Calibri" w:hAnsi="Calibri"/>
         </w:rPr>
-        <w:t xml:space="preserve"> — 22 octobre 2026, 10 h UTC</w:t>
+        <w:t xml:space="preserve"> — 23 octobre 2026, 21 h UTC</w:t>
+      </w:r>
+    </w:p>
+    <w:p>
+      <w:pPr>
+        <w:spacing w:before="160"/>
+        <w:ind w:left="360"/>
+      </w:pPr>
+      <w:r>
+        <w:rPr>
+          <w:color w:val="1F6B5E"/>
+          <w:sz w:val="28"/>
+          <w:szCs w:val="28"/>
+          <w:rFonts w:ascii="Calibri" w:cs="Calibri" w:eastAsia="Calibri" w:hAnsi="Calibri"/>
+        </w:rPr>
+        <w:t xml:space="preserve">❑  </w:t>
+      </w:r>
+      <w:r>
+        <w:rPr>
+          <w:b/>
+          <w:bCs/>
+          <w:u w:val="single"/>
+          <w:color w:val="1F6B5E"/>
+          <w:sz w:val="28"/>
+          <w:szCs w:val="28"/>
+          <w:rFonts w:ascii="Calibri" w:cs="Calibri" w:eastAsia="Calibri" w:hAnsi="Calibri"/>
+        </w:rPr>
+        <w:t xml:space="preserve">​MÉDECIN BLESSÉ PAR BALLE À GUÉDIAWAYE : 48 HEURES DE GRÈVE ET UNE PROCÉDURE JUDICIAIRE ENCLENCHÉE</w:t>
+      </w:r>
+    </w:p>
+    <w:p>
+      <w:pPr>
+        <w:ind w:left="720"/>
+      </w:pPr>
+      <w:r>
+        <w:rPr>
+          <w:color w:val="1F2937"/>
+          <w:sz w:val="26"/>
+          <w:szCs w:val="26"/>
+          <w:rFonts w:ascii="Calibri" w:cs="Calibri" w:eastAsia="Calibri" w:hAnsi="Calibri"/>
+        </w:rPr>
+        <w:t xml:space="preserve">▪  Source : </w:t>
+      </w:r>
+      <w:hyperlink w:history="1" r:id="rId5cg1dwxo2wqvo8xzxsncy">
+        <w:r>
+          <w:rPr>
+            <w:u w:val="single"/>
+            <w:color w:val="1F6B5E"/>
+            <w:sz w:val="26"/>
+            <w:szCs w:val="26"/>
+            <w:rFonts w:ascii="Calibri" w:cs="Calibri" w:eastAsia="Calibri" w:hAnsi="Calibri"/>
+          </w:rPr>
+          <w:t xml:space="preserve">Pressafrik</w:t>
+        </w:r>
+      </w:hyperlink>
+      <w:r>
+        <w:rPr>
+          <w:color w:val="1F2937"/>
+          <w:sz w:val="26"/>
+          <w:szCs w:val="26"/>
+          <w:rFonts w:ascii="Calibri" w:cs="Calibri" w:eastAsia="Calibri" w:hAnsi="Calibri"/>
+        </w:rPr>
+        <w:t xml:space="preserve"> — 23 octobre 2026, 14 h UTC</w:t>
+      </w:r>
+    </w:p>
+    <w:p>
+      <w:pPr>
+        <w:spacing w:before="160"/>
+        <w:ind w:left="360"/>
+      </w:pPr>
+      <w:r>
+        <w:rPr>
+          <w:color w:val="1F6B5E"/>
+          <w:sz w:val="28"/>
+          <w:szCs w:val="28"/>
+          <w:rFonts w:ascii="Calibri" w:cs="Calibri" w:eastAsia="Calibri" w:hAnsi="Calibri"/>
+        </w:rPr>
+        <w:t xml:space="preserve">❑  </w:t>
+      </w:r>
+      <w:r>
+        <w:rPr>
+          <w:b/>
+          <w:bCs/>
+          <w:u w:val="single"/>
+          <w:color w:val="1F6B5E"/>
+          <w:sz w:val="28"/>
+          <w:szCs w:val="28"/>
+          <w:rFonts w:ascii="Calibri" w:cs="Calibri" w:eastAsia="Calibri" w:hAnsi="Calibri"/>
+        </w:rPr>
+        <w:t xml:space="preserve">UN VIOLENT ACCIDENT MORTEL S'EST PRODUIT CE VENDREDI VERS 21 HEURES SUR LA ROUTE KÉBÉMER-NDANDE.</w:t>
+      </w:r>
+    </w:p>
+    <w:p>
+      <w:pPr>
+        <w:ind w:left="720"/>
+      </w:pPr>
+      <w:r>
+        <w:rPr>
+          <w:color w:val="1F2937"/>
+          <w:sz w:val="26"/>
+          <w:szCs w:val="26"/>
+          <w:rFonts w:ascii="Calibri" w:cs="Calibri" w:eastAsia="Calibri" w:hAnsi="Calibri"/>
+        </w:rPr>
+        <w:t xml:space="preserve">▪  Source : </w:t>
+      </w:r>
+      <w:hyperlink w:history="1" r:id="rIdg6e0gbv7_4sqlrecmgnx_">
+        <w:r>
+          <w:rPr>
+            <w:u w:val="single"/>
+            <w:color w:val="1F6B5E"/>
+            <w:sz w:val="26"/>
+            <w:szCs w:val="26"/>
+            <w:rFonts w:ascii="Calibri" w:cs="Calibri" w:eastAsia="Calibri" w:hAnsi="Calibri"/>
+          </w:rPr>
+          <w:t xml:space="preserve">Seneweb</w:t>
+        </w:r>
+      </w:hyperlink>
+      <w:r>
+        <w:rPr>
+          <w:color w:val="1F2937"/>
+          <w:sz w:val="26"/>
+          <w:szCs w:val="26"/>
+          <w:rFonts w:ascii="Calibri" w:cs="Calibri" w:eastAsia="Calibri" w:hAnsi="Calibri"/>
+        </w:rPr>
+        <w:t xml:space="preserve"> — 24 octobre 2026, 0 h UTC</w:t>
       </w:r>
     </w:p>
     <w:p>
@@ -5758,7 +8326,7 @@
               <w:szCs w:val="20"/>
               <w:rFonts w:ascii="Calibri" w:cs="Calibri" w:eastAsia="Calibri" w:hAnsi="Calibri"/>
             </w:rPr>
-            <w:t xml:space="preserve">|  23/10/26   |   </w:t>
+            <w:t xml:space="preserve">|  24/10/26   |   </w:t>
           </w:r>
           <w:r>
             <w:rPr>

</xml_diff>